<commit_message>
Update AURIS document for formatting consistency and remove temporary file
</commit_message>
<xml_diff>
--- a/docs/academic/paper/deliverables/AURIS_Makale_Metni.docx
+++ b/docs/academic/paper/deliverables/AURIS_Makale_Metni.docx
@@ -451,7 +451,7 @@
                 <w:b/>
                 <w:sz w:val="28"/>
               </w:rPr>
-              <w:t>nu</w:t>
+              <w:t>✓</w:t>
             </w:r>
           </w:p>
         </w:tc>
@@ -1962,13 +1962,24 @@
     <w:p>
       <w:pPr>
         <w:spacing w:line="360" w:lineRule="auto"/>
-      </w:pPr>
-      <w:r>
         <w:rPr>
           <w:b/>
           <w:sz w:val="18"/>
         </w:rPr>
-        <w:t>Key Words</w:t>
+      </w:pPr>
+      <w:r>
+        <w:rPr>
+          <w:b/>
+          <w:sz w:val="18"/>
+        </w:rPr>
+        <w:t>Key Word</w:t>
+      </w:r>
+      <w:r>
+        <w:rPr>
+          <w:b/>
+          <w:sz w:val="18"/>
+        </w:rPr>
+        <w:t>s</w:t>
       </w:r>
     </w:p>
     <w:p>

</xml_diff>

<commit_message>
Update academic figures for improved clarity and consistency in styling
</commit_message>
<xml_diff>
--- a/docs/academic/paper/deliverables/AURIS_Makale_Metni.docx
+++ b/docs/academic/paper/deliverables/AURIS_Makale_Metni.docx
@@ -1539,19 +1539,7 @@
         </w:tc>
       </w:tr>
     </w:tbl>
-    <w:p>
-      <w:pPr>
-        <w:pStyle w:val="ListeParagraf"/>
-        <w:rPr>
-          <w:lang w:val="tr-TR"/>
-        </w:rPr>
-      </w:pPr>
-    </w:p>
-    <w:p>
-      <w:r>
-        <w:br w:type="page"/>
-      </w:r>
-    </w:p>
+    <w:p/>
     <w:p>
       <w:pPr>
         <w:spacing w:line="360" w:lineRule="auto"/>
@@ -1758,7 +1746,49 @@
         <w:rPr>
           <w:sz w:val="18"/>
         </w:rPr>
-        <w:t xml:space="preserve"> yaygınlaşması, üretilen müzik parçalarının insan eliyle bestelenmiş kayıtlardan ayırt edilmesini bir tespit problemi olarak gündeme getirmiştir. Bu çalışmada, 47 boyutlu akustik öznitelik vektörü ile yedi makine öğrenmesi ve dört derin öğrenme algoritmasından oluşan on bir modelli bir topluluk öğrenmesi yaklaşımını birleştiren AURIS adlı bir sistem önerilmektedir. Modeller, on iki yapay zekâ üretici sisteminden ve birden çok insan kaynağından derlenen 5.195 örneklik bir veri kümesi üzerinde 5-katlı çapraz doğrulama ile eğitilmiştir. LightGBM, %95,48 ROC-AUC ve ±0,0023 standart sapma ile en başarılı sonucu elde etmiştir. Spektral düzlük standart sapması en bilgilendirici öznitelik olarak ön plana çıkmıştır. Youden J kriteri ile optimize edilen θ* = 0,4316 karar eşiği varsayılan 0,5 eşiğine kıyasla dengeli doğruluğu iyileştirmiştir. Brier skoru 0,083 olarak ölçülmüş ve modelin </w:t>
+        <w:t xml:space="preserve"> yaygınlaşması, üretilen müzik parçalarının insan eliyle bestelenmiş kayıtlardan ayırt edilmesini bir tespit problemi olarak gündeme getirmiştir. Bu çalışmada, 47 boyutlu akustik öznitelik vektörü ile yedi makine öğrenmesi ve dört derin öğrenme algoritmasından oluşan on bir modelli bir topluluk öğrenmesi yaklaşımını birleştiren AURIS adlı bir sistem önerilmektedir. Modeller, on iki yapay zekâ üretici sisteminden ve birden çok insan kaynağından derlenen 5.195 örneklik bir veri kümesi üzerinde 5-katlı çapraz doğrulama ile eğitilmiştir. LightGBM, %95,48 ROC-AUC ve ±0,0023 standart sapma ile en başarılı sonucu elde etmiştir. Spektral düzlük standart sapması en bilgilendirici öznitelik olarak ön plana çıkmıştır. Youden J kriteri ile optimize edilen θ* = 0,4316 karar eşiği varsayılan 0,5 eşiğine kıyasla dengeli doğruluğu iyileştirmiştir. Brier skoru 0,083 olarak </w:t>
+      </w:r>
+      <w:proofErr w:type="spellStart"/>
+      <w:r>
+        <w:rPr>
+          <w:sz w:val="18"/>
+        </w:rPr>
+        <w:t>ölçülmüş</w:t>
+      </w:r>
+      <w:proofErr w:type="spellEnd"/>
+      <w:r>
+        <w:rPr>
+          <w:sz w:val="18"/>
+        </w:rPr>
+        <w:t xml:space="preserve"> </w:t>
+      </w:r>
+      <w:proofErr w:type="spellStart"/>
+      <w:r>
+        <w:rPr>
+          <w:sz w:val="18"/>
+        </w:rPr>
+        <w:t>ve</w:t>
+      </w:r>
+      <w:proofErr w:type="spellEnd"/>
+      <w:r>
+        <w:rPr>
+          <w:sz w:val="18"/>
+        </w:rPr>
+        <w:t xml:space="preserve"> </w:t>
+      </w:r>
+      <w:proofErr w:type="spellStart"/>
+      <w:r>
+        <w:rPr>
+          <w:sz w:val="18"/>
+        </w:rPr>
+        <w:t>modelin</w:t>
+      </w:r>
+      <w:proofErr w:type="spellEnd"/>
+      <w:r>
+        <w:rPr>
+          <w:sz w:val="18"/>
+        </w:rPr>
+        <w:t xml:space="preserve"> </w:t>
       </w:r>
       <w:proofErr w:type="spellStart"/>
       <w:r>
@@ -1990,7 +2020,6 @@
         <w:rPr>
           <w:sz w:val="18"/>
         </w:rPr>
-        <w:lastRenderedPageBreak/>
         <w:t>AI-generated music, deep learning, gradient boosting, ensemble learning, spectral flatness</w:t>
       </w:r>
     </w:p>
@@ -2033,7 +2062,35 @@
         <w:rPr>
           <w:sz w:val="18"/>
         </w:rPr>
-        <w:t xml:space="preserve">Yapay zekâ tabanlı metinden müziğe üretim sistemlerinin son üç yıl içerisinde araştırma laboratuvarlarından tüketici uygulamalarına doğru yaşadığı hızlı geçiş, üretilen müzik parçalarının insan kayıtlarından ayırt edilmesini önemli bir problem olarak gündeme getirmiştir. Suno (sürüm 3-5), Udio, Meta tarafından geliştirilen MusicGen [1] </w:t>
+        <w:t xml:space="preserve">Yapay zekâ tabanlı metinden müziğe üretim sistemlerinin son üç yıl içerisinde araştırma laboratuvarlarından tüketici uygulamalarına doğru yaşadığı hızlı geçiş, üretilen müzik parçalarının insan kayıtlarından ayırt edilmesini önemli bir problem olarak gündeme getirmiştir. Suno (sürüm 3-5), Udio, Meta tarafından </w:t>
+      </w:r>
+      <w:proofErr w:type="spellStart"/>
+      <w:r>
+        <w:rPr>
+          <w:sz w:val="18"/>
+        </w:rPr>
+        <w:t>geliştirilen</w:t>
+      </w:r>
+      <w:proofErr w:type="spellEnd"/>
+      <w:r>
+        <w:rPr>
+          <w:sz w:val="18"/>
+        </w:rPr>
+        <w:t xml:space="preserve"> </w:t>
+      </w:r>
+      <w:proofErr w:type="spellStart"/>
+      <w:r>
+        <w:rPr>
+          <w:sz w:val="18"/>
+        </w:rPr>
+        <w:t>MusicGen</w:t>
+      </w:r>
+      <w:proofErr w:type="spellEnd"/>
+      <w:r>
+        <w:rPr>
+          <w:sz w:val="18"/>
+        </w:rPr>
+        <w:t xml:space="preserve"> [1] </w:t>
       </w:r>
       <w:proofErr w:type="spellStart"/>
       <w:r>
@@ -2159,7 +2216,35 @@
         <w:rPr>
           <w:sz w:val="18"/>
         </w:rPr>
-        <w:t xml:space="preserve"> kısa bir metin istemi ile dakikalar mertebesinde tam uzunlukta müzik parçaları üretebilme kapasitesine ulaşmıştır. Üretilen bu parçaların deneyimsiz bir dinleyici tarafından insan eliyle bestelenmiş kayıtlardan ayırt edilmesi çoğu durumda mümkün olmamaktadır. Bu gelişme; telif hakkı atıflandırması, çevrimiçi akış platformlarının içerik bütünlüğü, oturum müzisyenlerinin ekonomik hakları ve eğitimcilerin yazarlık değerlendirmesi gibi kritik konuları doğrudan etkilemektedir.</w:t>
+        <w:t xml:space="preserve"> </w:t>
+      </w:r>
+      <w:proofErr w:type="spellStart"/>
+      <w:r>
+        <w:rPr>
+          <w:sz w:val="18"/>
+        </w:rPr>
+        <w:t>kısa</w:t>
+      </w:r>
+      <w:proofErr w:type="spellEnd"/>
+      <w:r>
+        <w:rPr>
+          <w:sz w:val="18"/>
+        </w:rPr>
+        <w:t xml:space="preserve"> </w:t>
+      </w:r>
+      <w:proofErr w:type="spellStart"/>
+      <w:r>
+        <w:rPr>
+          <w:sz w:val="18"/>
+        </w:rPr>
+        <w:t>bir</w:t>
+      </w:r>
+      <w:proofErr w:type="spellEnd"/>
+      <w:r>
+        <w:rPr>
+          <w:sz w:val="18"/>
+        </w:rPr>
+        <w:t xml:space="preserve"> metin istemi ile dakikalar mertebesinde tam uzunlukta müzik parçaları üretebilme kapasitesine ulaşmıştır. Üretilen bu parçaların deneyimsiz bir dinleyici tarafından insan eliyle bestelenmiş kayıtlardan ayırt edilmesi çoğu durumda mümkün olmamaktadır. Bu gelişme; telif hakkı atıflandırması, çevrimiçi akış platformlarının içerik bütünlüğü, oturum müzisyenlerinin ekonomik hakları ve eğitimcilerin yazarlık değerlendirmesi gibi kritik konuları doğrudan etkilemektedir.</w:t>
       </w:r>
     </w:p>
     <w:p>
@@ -2829,7 +2914,49 @@
         <w:rPr>
           <w:sz w:val="18"/>
         </w:rPr>
-        <w:t xml:space="preserve">Bu bölümde önerilen AURIS sistemini geliştirmek için kullanılan veri kümesi, öznitelik çıkarma süreci, sınıflandırma modelleri ve eğitim protokolü detaylandırılmaktadır. Önerilen sistemin uçtan-uca </w:t>
+        <w:t xml:space="preserve">Bu bölümde önerilen AURIS sistemini geliştirmek için kullanılan veri kümesi, öznitelik çıkarma süreci, sınıflandırma modelleri ve eğitim protokolü detaylandırılmaktadır. </w:t>
+      </w:r>
+      <w:proofErr w:type="spellStart"/>
+      <w:r>
+        <w:rPr>
+          <w:sz w:val="18"/>
+        </w:rPr>
+        <w:t>Önerilen</w:t>
+      </w:r>
+      <w:proofErr w:type="spellEnd"/>
+      <w:r>
+        <w:rPr>
+          <w:sz w:val="18"/>
+        </w:rPr>
+        <w:t xml:space="preserve"> </w:t>
+      </w:r>
+      <w:proofErr w:type="spellStart"/>
+      <w:r>
+        <w:rPr>
+          <w:sz w:val="18"/>
+        </w:rPr>
+        <w:t>sistemin</w:t>
+      </w:r>
+      <w:proofErr w:type="spellEnd"/>
+      <w:r>
+        <w:rPr>
+          <w:sz w:val="18"/>
+        </w:rPr>
+        <w:t xml:space="preserve"> </w:t>
+      </w:r>
+      <w:proofErr w:type="spellStart"/>
+      <w:r>
+        <w:rPr>
+          <w:sz w:val="18"/>
+        </w:rPr>
+        <w:t>uçtan-uca</w:t>
+      </w:r>
+      <w:proofErr w:type="spellEnd"/>
+      <w:r>
+        <w:rPr>
+          <w:sz w:val="18"/>
+        </w:rPr>
+        <w:t xml:space="preserve"> </w:t>
       </w:r>
       <w:proofErr w:type="spellStart"/>
       <w:r>
@@ -2927,8 +3054,8 @@
         </w:rPr>
         <w:lastRenderedPageBreak/>
         <w:drawing>
-          <wp:inline distT="0" distB="0" distL="0" distR="0" wp14:anchorId="63BF18DE" wp14:editId="470E444F">
-            <wp:extent cx="5400000" cy="1588235"/>
+          <wp:inline distT="0" distB="0" distL="0" distR="0" wp14:anchorId="63BF18DE" wp14:editId="5BB196C8">
+            <wp:extent cx="5400000" cy="1584977"/>
             <wp:effectExtent l="0" t="0" r="0" b="0"/>
             <wp:docPr id="2" name="Picture 2"/>
             <wp:cNvGraphicFramePr>
@@ -2956,7 +3083,7 @@
                   <pic:spPr>
                     <a:xfrm>
                       <a:off x="0" y="0"/>
-                      <a:ext cx="5400000" cy="1588235"/>
+                      <a:ext cx="5400000" cy="1584977"/>
                     </a:xfrm>
                     <a:prstGeom prst="rect">
                       <a:avLst/>
@@ -4148,8 +4275,8 @@
         </w:rPr>
         <w:lastRenderedPageBreak/>
         <w:drawing>
-          <wp:inline distT="0" distB="0" distL="0" distR="0" wp14:anchorId="23387283" wp14:editId="34449B80">
-            <wp:extent cx="5400000" cy="2922592"/>
+          <wp:inline distT="0" distB="0" distL="0" distR="0" wp14:anchorId="23387283" wp14:editId="4E5CDDB0">
+            <wp:extent cx="5399998" cy="2922592"/>
             <wp:effectExtent l="0" t="0" r="0" b="0"/>
             <wp:docPr id="3" name="Picture 3"/>
             <wp:cNvGraphicFramePr>
@@ -4177,7 +4304,7 @@
                   <pic:spPr>
                     <a:xfrm>
                       <a:off x="0" y="0"/>
-                      <a:ext cx="5400000" cy="2922592"/>
+                      <a:ext cx="5399998" cy="2922592"/>
                     </a:xfrm>
                     <a:prstGeom prst="rect">
                       <a:avLst/>
@@ -4960,7 +5087,6 @@
           <w:b/>
           <w:sz w:val="18"/>
         </w:rPr>
-        <w:lastRenderedPageBreak/>
         <w:t xml:space="preserve">2.4. Eğitim protokolü ve karar eşiği optimizasyonu </w:t>
       </w:r>
       <w:r>
@@ -6734,8 +6860,8 @@
         </w:rPr>
         <w:lastRenderedPageBreak/>
         <w:drawing>
-          <wp:inline distT="0" distB="0" distL="0" distR="0" wp14:anchorId="273A9A92" wp14:editId="5A52C461">
-            <wp:extent cx="4949703" cy="2671127"/>
+          <wp:inline distT="0" distB="0" distL="0" distR="0" wp14:anchorId="273A9A92" wp14:editId="1138E2AE">
+            <wp:extent cx="4949703" cy="2665773"/>
             <wp:effectExtent l="0" t="0" r="3810" b="0"/>
             <wp:docPr id="4" name="Picture 4"/>
             <wp:cNvGraphicFramePr>
@@ -6763,7 +6889,7 @@
                   <pic:spPr>
                     <a:xfrm>
                       <a:off x="0" y="0"/>
-                      <a:ext cx="4949703" cy="2671127"/>
+                      <a:ext cx="4949703" cy="2665773"/>
                     </a:xfrm>
                     <a:prstGeom prst="rect">
                       <a:avLst/>
@@ -6815,8 +6941,8 @@
           <w:noProof/>
         </w:rPr>
         <w:drawing>
-          <wp:inline distT="0" distB="0" distL="0" distR="0" wp14:anchorId="1076FAF4" wp14:editId="5E32B4E6">
-            <wp:extent cx="4314553" cy="3612040"/>
+          <wp:inline distT="0" distB="0" distL="0" distR="0" wp14:anchorId="1076FAF4" wp14:editId="75D54159">
+            <wp:extent cx="4314553" cy="3612039"/>
             <wp:effectExtent l="0" t="0" r="0" b="7620"/>
             <wp:docPr id="5" name="Picture 5"/>
             <wp:cNvGraphicFramePr>
@@ -6844,7 +6970,7 @@
                   <pic:spPr>
                     <a:xfrm>
                       <a:off x="0" y="0"/>
-                      <a:ext cx="4314553" cy="3612040"/>
+                      <a:ext cx="4314553" cy="3612039"/>
                     </a:xfrm>
                     <a:prstGeom prst="rect">
                       <a:avLst/>
@@ -6913,10 +7039,9 @@
         <w:rPr>
           <w:noProof/>
         </w:rPr>
-        <w:lastRenderedPageBreak/>
         <w:drawing>
-          <wp:inline distT="0" distB="0" distL="0" distR="0" wp14:anchorId="18B1B00D" wp14:editId="482568CF">
-            <wp:extent cx="5400000" cy="1916922"/>
+          <wp:inline distT="0" distB="0" distL="0" distR="0" wp14:anchorId="18B1B00D" wp14:editId="6748FB15">
+            <wp:extent cx="5399999" cy="1916922"/>
             <wp:effectExtent l="0" t="0" r="0" b="7620"/>
             <wp:docPr id="6" name="Picture 6"/>
             <wp:cNvGraphicFramePr>
@@ -6944,7 +7069,7 @@
                   <pic:spPr>
                     <a:xfrm>
                       <a:off x="0" y="0"/>
-                      <a:ext cx="5400000" cy="1916922"/>
+                      <a:ext cx="5399999" cy="1916922"/>
                     </a:xfrm>
                     <a:prstGeom prst="rect">
                       <a:avLst/>
@@ -7014,9 +7139,9 @@
           <w:noProof/>
         </w:rPr>
         <w:drawing>
-          <wp:inline distT="0" distB="0" distL="0" distR="0" wp14:anchorId="02270A0B" wp14:editId="4E0F9DCC">
-            <wp:extent cx="5396908" cy="3059182"/>
-            <wp:effectExtent l="0" t="0" r="0" b="8255"/>
+          <wp:inline distT="0" distB="0" distL="0" distR="0" wp14:anchorId="02270A0B" wp14:editId="7F8D3576">
+            <wp:extent cx="5396908" cy="3059181"/>
+            <wp:effectExtent l="0" t="0" r="0" b="0"/>
             <wp:docPr id="7" name="Picture 7"/>
             <wp:cNvGraphicFramePr>
               <a:graphicFrameLocks xmlns:a="http://schemas.openxmlformats.org/drawingml/2006/main" noChangeAspect="1"/>
@@ -7043,7 +7168,7 @@
                   <pic:spPr>
                     <a:xfrm>
                       <a:off x="0" y="0"/>
-                      <a:ext cx="5396908" cy="3059182"/>
+                      <a:ext cx="5396908" cy="3059181"/>
                     </a:xfrm>
                     <a:prstGeom prst="rect">
                       <a:avLst/>
@@ -7098,7 +7223,21 @@
         <w:rPr>
           <w:sz w:val="18"/>
         </w:rPr>
-        <w:t xml:space="preserve">Öznitelik önemi analizi sonuçları spektral düzlük standart sapması özniteliğinin yapay zekâ ile insan müziği ayrımı için en bilgilendirici öznitelik olduğunu açık biçimde ortaya koymuştur. Tablo 4 ilk on özniteliği listelemektedir. Şekil 7 ilk </w:t>
+        <w:t xml:space="preserve">Öznitelik önemi analizi sonuçları spektral düzlük standart sapması özniteliğinin yapay zekâ ile insan müziği ayrımı için en bilgilendirici öznitelik olduğunu açık biçimde ortaya koymuştur. Tablo 4 ilk on özniteliği listelemektedir. </w:t>
+      </w:r>
+      <w:proofErr w:type="spellStart"/>
+      <w:r>
+        <w:rPr>
+          <w:sz w:val="18"/>
+        </w:rPr>
+        <w:t>Şekil</w:t>
+      </w:r>
+      <w:proofErr w:type="spellEnd"/>
+      <w:r>
+        <w:rPr>
+          <w:sz w:val="18"/>
+        </w:rPr>
+        <w:t xml:space="preserve"> 7 ilk </w:t>
       </w:r>
       <w:proofErr w:type="spellStart"/>
       <w:r>
@@ -7226,7 +7365,6 @@
         <w:rPr>
           <w:sz w:val="18"/>
         </w:rPr>
-        <w:lastRenderedPageBreak/>
         <w:t xml:space="preserve">Tablo 4. LightGBM'in ilk on </w:t>
       </w:r>
       <w:r>
@@ -7918,9 +8056,9 @@
           <w:noProof/>
         </w:rPr>
         <w:drawing>
-          <wp:inline distT="0" distB="0" distL="0" distR="0" wp14:anchorId="096624B4" wp14:editId="734C380F">
-            <wp:extent cx="4225310" cy="3445455"/>
-            <wp:effectExtent l="0" t="0" r="3810" b="3175"/>
+          <wp:inline distT="0" distB="0" distL="0" distR="0" wp14:anchorId="096624B4" wp14:editId="0F81BF1B">
+            <wp:extent cx="4225310" cy="3442177"/>
+            <wp:effectExtent l="0" t="0" r="3810" b="6350"/>
             <wp:docPr id="8" name="Picture 8"/>
             <wp:cNvGraphicFramePr>
               <a:graphicFrameLocks xmlns:a="http://schemas.openxmlformats.org/drawingml/2006/main" noChangeAspect="1"/>
@@ -7947,7 +8085,7 @@
                   <pic:spPr>
                     <a:xfrm>
                       <a:off x="0" y="0"/>
-                      <a:ext cx="4225310" cy="3445455"/>
+                      <a:ext cx="4225310" cy="3442177"/>
                     </a:xfrm>
                     <a:prstGeom prst="rect">
                       <a:avLst/>
@@ -8014,8 +8152,8 @@
         </w:rPr>
         <w:lastRenderedPageBreak/>
         <w:drawing>
-          <wp:inline distT="0" distB="0" distL="0" distR="0" wp14:anchorId="03A92205" wp14:editId="306023DA">
-            <wp:extent cx="4304895" cy="4577120"/>
+          <wp:inline distT="0" distB="0" distL="0" distR="0" wp14:anchorId="03A92205" wp14:editId="6F14E428">
+            <wp:extent cx="4304895" cy="4573364"/>
             <wp:effectExtent l="0" t="0" r="635" b="0"/>
             <wp:docPr id="9" name="Picture 9"/>
             <wp:cNvGraphicFramePr>
@@ -8043,7 +8181,7 @@
                   <pic:spPr>
                     <a:xfrm>
                       <a:off x="0" y="0"/>
-                      <a:ext cx="4304895" cy="4577120"/>
+                      <a:ext cx="4304895" cy="4573364"/>
                     </a:xfrm>
                     <a:prstGeom prst="rect">
                       <a:avLst/>
@@ -8114,9 +8252,9 @@
         </w:rPr>
         <w:lastRenderedPageBreak/>
         <w:drawing>
-          <wp:inline distT="0" distB="0" distL="0" distR="0" wp14:anchorId="0AA79FC6" wp14:editId="066A2027">
-            <wp:extent cx="3600000" cy="2924081"/>
-            <wp:effectExtent l="0" t="0" r="635" b="0"/>
+          <wp:inline distT="0" distB="0" distL="0" distR="0" wp14:anchorId="0AA79FC6" wp14:editId="009BABA7">
+            <wp:extent cx="3263483" cy="2924081"/>
+            <wp:effectExtent l="0" t="0" r="0" b="0"/>
             <wp:docPr id="10" name="Picture 10"/>
             <wp:cNvGraphicFramePr>
               <a:graphicFrameLocks xmlns:a="http://schemas.openxmlformats.org/drawingml/2006/main" noChangeAspect="1"/>
@@ -8143,7 +8281,7 @@
                   <pic:spPr>
                     <a:xfrm>
                       <a:off x="0" y="0"/>
-                      <a:ext cx="3600000" cy="2924081"/>
+                      <a:ext cx="3263483" cy="2924081"/>
                     </a:xfrm>
                     <a:prstGeom prst="rect">
                       <a:avLst/>
@@ -8195,8 +8333,8 @@
           <w:noProof/>
         </w:rPr>
         <w:drawing>
-          <wp:inline distT="0" distB="0" distL="0" distR="0" wp14:anchorId="03DE92D8" wp14:editId="5E373146">
-            <wp:extent cx="4320000" cy="2737503"/>
+          <wp:inline distT="0" distB="0" distL="0" distR="0" wp14:anchorId="03DE92D8" wp14:editId="2AAE6D16">
+            <wp:extent cx="4319999" cy="2737503"/>
             <wp:effectExtent l="0" t="0" r="4445" b="5715"/>
             <wp:docPr id="11" name="Picture 11"/>
             <wp:cNvGraphicFramePr>
@@ -8224,7 +8362,7 @@
                   <pic:spPr>
                     <a:xfrm>
                       <a:off x="0" y="0"/>
-                      <a:ext cx="4320000" cy="2737503"/>
+                      <a:ext cx="4319999" cy="2737503"/>
                     </a:xfrm>
                     <a:prstGeom prst="rect">
                       <a:avLst/>
@@ -8277,9 +8415,9 @@
         </w:rPr>
         <w:lastRenderedPageBreak/>
         <w:drawing>
-          <wp:inline distT="0" distB="0" distL="0" distR="0" wp14:anchorId="73C38E8B" wp14:editId="156852A5">
-            <wp:extent cx="3600000" cy="3167766"/>
-            <wp:effectExtent l="0" t="0" r="635" b="0"/>
+          <wp:inline distT="0" distB="0" distL="0" distR="0" wp14:anchorId="73C38E8B" wp14:editId="74DF0421">
+            <wp:extent cx="3599999" cy="3167766"/>
+            <wp:effectExtent l="0" t="0" r="0" b="0"/>
             <wp:docPr id="12" name="Picture 12"/>
             <wp:cNvGraphicFramePr>
               <a:graphicFrameLocks xmlns:a="http://schemas.openxmlformats.org/drawingml/2006/main" noChangeAspect="1"/>
@@ -8306,7 +8444,7 @@
                   <pic:spPr>
                     <a:xfrm>
                       <a:off x="0" y="0"/>
-                      <a:ext cx="3600000" cy="3167766"/>
+                      <a:ext cx="3599999" cy="3167766"/>
                     </a:xfrm>
                     <a:prstGeom prst="rect">
                       <a:avLst/>
@@ -8358,9 +8496,9 @@
           <w:noProof/>
         </w:rPr>
         <w:drawing>
-          <wp:inline distT="0" distB="0" distL="0" distR="0" wp14:anchorId="2E08B7B7" wp14:editId="696CFE65">
-            <wp:extent cx="3600000" cy="3167766"/>
-            <wp:effectExtent l="0" t="0" r="635" b="0"/>
+          <wp:inline distT="0" distB="0" distL="0" distR="0" wp14:anchorId="2E08B7B7" wp14:editId="7D7E6469">
+            <wp:extent cx="3599999" cy="3167766"/>
+            <wp:effectExtent l="0" t="0" r="0" b="0"/>
             <wp:docPr id="13" name="Picture 13"/>
             <wp:cNvGraphicFramePr>
               <a:graphicFrameLocks xmlns:a="http://schemas.openxmlformats.org/drawingml/2006/main" noChangeAspect="1"/>
@@ -8387,7 +8525,7 @@
                   <pic:spPr>
                     <a:xfrm>
                       <a:off x="0" y="0"/>
-                      <a:ext cx="3600000" cy="3167766"/>
+                      <a:ext cx="3599999" cy="3167766"/>
                     </a:xfrm>
                     <a:prstGeom prst="rect">
                       <a:avLst/>
@@ -8456,11 +8594,10 @@
         <w:rPr>
           <w:noProof/>
         </w:rPr>
-        <w:lastRenderedPageBreak/>
         <w:drawing>
-          <wp:inline distT="0" distB="0" distL="0" distR="0" wp14:anchorId="0E596C40" wp14:editId="2D74805B">
-            <wp:extent cx="4320000" cy="3007292"/>
-            <wp:effectExtent l="0" t="0" r="4445" b="3175"/>
+          <wp:inline distT="0" distB="0" distL="0" distR="0" wp14:anchorId="0E596C40" wp14:editId="44A4B346">
+            <wp:extent cx="4319998" cy="3007292"/>
+            <wp:effectExtent l="0" t="0" r="0" b="3175"/>
             <wp:docPr id="14" name="Picture 14"/>
             <wp:cNvGraphicFramePr>
               <a:graphicFrameLocks xmlns:a="http://schemas.openxmlformats.org/drawingml/2006/main" noChangeAspect="1"/>
@@ -8487,7 +8624,7 @@
                   <pic:spPr>
                     <a:xfrm>
                       <a:off x="0" y="0"/>
-                      <a:ext cx="4320000" cy="3007292"/>
+                      <a:ext cx="4319998" cy="3007292"/>
                     </a:xfrm>
                     <a:prstGeom prst="rect">
                       <a:avLst/>
@@ -8539,9 +8676,9 @@
           <w:noProof/>
         </w:rPr>
         <w:drawing>
-          <wp:inline distT="0" distB="0" distL="0" distR="0" wp14:anchorId="209F232E" wp14:editId="7618B8BF">
-            <wp:extent cx="4035172" cy="2186532"/>
-            <wp:effectExtent l="0" t="0" r="3810" b="4445"/>
+          <wp:inline distT="0" distB="0" distL="0" distR="0" wp14:anchorId="209F232E" wp14:editId="38E1AC88">
+            <wp:extent cx="4035172" cy="2183528"/>
+            <wp:effectExtent l="0" t="0" r="3810" b="7620"/>
             <wp:docPr id="15" name="Picture 15"/>
             <wp:cNvGraphicFramePr>
               <a:graphicFrameLocks xmlns:a="http://schemas.openxmlformats.org/drawingml/2006/main" noChangeAspect="1"/>
@@ -8568,7 +8705,7 @@
                   <pic:spPr>
                     <a:xfrm>
                       <a:off x="0" y="0"/>
-                      <a:ext cx="4035172" cy="2186532"/>
+                      <a:ext cx="4035172" cy="2183528"/>
                     </a:xfrm>
                     <a:prstGeom prst="rect">
                       <a:avLst/>
@@ -8638,7 +8775,14 @@
         <w:rPr>
           <w:sz w:val="18"/>
         </w:rPr>
-        <w:t>Aşırı öğrenme tanılayıcı analizi (Şekil 15), tüm ağaç tabanlı modellerin eğitim ve çapraz doğrulama doğruluğu arasında 8-14 puanlık bir fark sergilediğini göstermektedir. Rastgele Orman %100,0 eğitim doğruluğuna karşı çapraz doğrulama altında %86,1 doğruluk elde etmiştir. Eğitim ve çapraz doğrulama doğruluklarının esasen örtüştüğü tek model, yalnızca 0,6 puanlık fark ile Lojistik Regresyon olmuştur.</w:t>
+        <w:t xml:space="preserve">Aşırı öğrenme tanılayıcı analizi (Şekil 15), tüm ağaç tabanlı modellerin eğitim ve çapraz doğrulama doğruluğu arasında 8-14 puanlık bir fark sergilediğini göstermektedir. Rastgele Orman %100,0 eğitim doğruluğuna karşı çapraz doğrulama altında %86,1 </w:t>
+      </w:r>
+      <w:r>
+        <w:rPr>
+          <w:sz w:val="18"/>
+        </w:rPr>
+        <w:lastRenderedPageBreak/>
+        <w:t>doğruluk elde etmiştir. Eğitim ve çapraz doğrulama doğruluklarının esasen örtüştüğü tek model, yalnızca 0,6 puanlık fark ile Lojistik Regresyon olmuştur.</w:t>
       </w:r>
     </w:p>
     <w:p>
@@ -8655,11 +8799,10 @@
         <w:rPr>
           <w:noProof/>
         </w:rPr>
-        <w:lastRenderedPageBreak/>
         <w:drawing>
-          <wp:inline distT="0" distB="0" distL="0" distR="0" wp14:anchorId="1471293C" wp14:editId="629B2CF6">
-            <wp:extent cx="4248547" cy="2755862"/>
-            <wp:effectExtent l="0" t="0" r="0" b="6985"/>
+          <wp:inline distT="0" distB="0" distL="0" distR="0" wp14:anchorId="1471293C" wp14:editId="084E24AD">
+            <wp:extent cx="4248547" cy="2750605"/>
+            <wp:effectExtent l="0" t="0" r="0" b="0"/>
             <wp:docPr id="16" name="Picture 16"/>
             <wp:cNvGraphicFramePr>
               <a:graphicFrameLocks xmlns:a="http://schemas.openxmlformats.org/drawingml/2006/main" noChangeAspect="1"/>
@@ -8686,7 +8829,7 @@
                   <pic:spPr>
                     <a:xfrm>
                       <a:off x="0" y="0"/>
-                      <a:ext cx="4248547" cy="2755862"/>
+                      <a:ext cx="4248547" cy="2750605"/>
                     </a:xfrm>
                     <a:prstGeom prst="rect">
                       <a:avLst/>
@@ -8757,8 +8900,8 @@
         </w:rPr>
         <w:lastRenderedPageBreak/>
         <w:drawing>
-          <wp:inline distT="0" distB="0" distL="0" distR="0" wp14:anchorId="5D75FDE5" wp14:editId="74079990">
-            <wp:extent cx="5375881" cy="4960590"/>
+          <wp:inline distT="0" distB="0" distL="0" distR="0" wp14:anchorId="5D75FDE5" wp14:editId="711D3383">
+            <wp:extent cx="5375881" cy="4956009"/>
             <wp:effectExtent l="0" t="0" r="0" b="0"/>
             <wp:docPr id="17" name="Picture 17"/>
             <wp:cNvGraphicFramePr>
@@ -8786,7 +8929,7 @@
                   <pic:spPr>
                     <a:xfrm>
                       <a:off x="0" y="0"/>
-                      <a:ext cx="5375881" cy="4960590"/>
+                      <a:ext cx="5375881" cy="4956009"/>
                     </a:xfrm>
                     <a:prstGeom prst="rect">
                       <a:avLst/>
@@ -8887,9 +9030,10 @@
         <w:rPr>
           <w:noProof/>
         </w:rPr>
+        <w:lastRenderedPageBreak/>
         <w:drawing>
-          <wp:inline distT="0" distB="0" distL="0" distR="0" wp14:anchorId="407A34FA" wp14:editId="3A5BEFB4">
-            <wp:extent cx="4276895" cy="2904828"/>
+          <wp:inline distT="0" distB="0" distL="0" distR="0" wp14:anchorId="407A34FA" wp14:editId="4DF5FDFA">
+            <wp:extent cx="4276895" cy="2898647"/>
             <wp:effectExtent l="0" t="0" r="0" b="0"/>
             <wp:docPr id="18" name="Picture 18"/>
             <wp:cNvGraphicFramePr>
@@ -8917,7 +9061,7 @@
                   <pic:spPr>
                     <a:xfrm>
                       <a:off x="0" y="0"/>
-                      <a:ext cx="4276895" cy="2904828"/>
+                      <a:ext cx="4276895" cy="2898647"/>
                     </a:xfrm>
                     <a:prstGeom prst="rect">
                       <a:avLst/>
@@ -8980,7 +9124,6 @@
           <w:b/>
           <w:sz w:val="18"/>
         </w:rPr>
-        <w:lastRenderedPageBreak/>
         <w:t xml:space="preserve">4. </w:t>
       </w:r>
       <w:proofErr w:type="spellStart"/>
@@ -9237,25 +9380,7 @@
         <w:rPr>
           <w:sz w:val="18"/>
         </w:rPr>
-        <w:t xml:space="preserve">Tablo </w:t>
-      </w:r>
-      <w:r>
-        <w:rPr>
-          <w:sz w:val="18"/>
-        </w:rPr>
-        <w:t>5</w:t>
-      </w:r>
-      <w:r>
-        <w:rPr>
-          <w:sz w:val="18"/>
-        </w:rPr>
-        <w:t xml:space="preserve">. </w:t>
-      </w:r>
-      <w:r>
-        <w:rPr>
-          <w:sz w:val="18"/>
-        </w:rPr>
-        <w:t xml:space="preserve">Simge </w:t>
+        <w:t xml:space="preserve">Tablo 5. Simge </w:t>
       </w:r>
       <w:proofErr w:type="spellStart"/>
       <w:r>
@@ -10314,7 +10439,42 @@
         <w:rPr>
           <w:sz w:val="18"/>
         </w:rPr>
-        <w:t xml:space="preserve"> üretilen müziği insan tarafından bestelenmiş kayıtlardan ayırt edebilmek için AURIS adlı uçtan-uca bir tespit sistemi önerilmiştir. Önerilen sistem 47 boyutlu elle tasarlanmış akustik öznitelik vektörünü, on iki yapay zekâ üretim sisteminden derlenen 5.195 örnek üzerinde eğitilen on bir sınıflandırma modelinden oluşan bir topluluk ile birleştirmektedir. Elde edilen temel bulgular: LightGBM modeli %95,48 ortalama ROC-AUC değeri ve ±0,0023 standart sapma ile havuzdaki en başarılı modeli oluşturmuştur. Derin ÇKA %95,42 ile çok yakın bir ikinci sıra almıştır. Spektral düzlük özniteliği yapay zekâ ile insan müziği ayrımı için en bilgilendirici tek öznitelik olarak öne çıkmıştır. Tanılayıcı analiz iki önemli sınırlamayı ortaya koymuştur: tüm ağaç tabanlı modeller eğitim ile çapraz doğrulama doğrulukları arasında 8-14 puanlık bir fark sergilemekte ve 47 özniteliğin sondaki yaklaşık on </w:t>
+        <w:t xml:space="preserve"> üretilen müziği insan tarafından bestelenmiş kayıtlardan ayırt edebilmek için AURIS adlı uçtan-uca bir tespit sistemi önerilmiştir. Önerilen sistem 47 boyutlu elle tasarlanmış akustik öznitelik vektörünü, on iki yapay zekâ üretim sisteminden derlenen 5.195 örnek üzerinde eğitilen on bir sınıflandırma modelinden oluşan bir topluluk ile birleştirmektedir. Elde edilen temel bulgular: LightGBM modeli %95,48 ortalama ROC-AUC değeri ve ±0,0023 standart sapma ile havuzdaki en başarılı modeli oluşturmuştur. Derin ÇKA %95,42 ile çok yakın bir ikinci sıra almıştır. Spektral düzlük özniteliği yapay zekâ ile </w:t>
+      </w:r>
+      <w:r>
+        <w:rPr>
+          <w:sz w:val="18"/>
+        </w:rPr>
+        <w:lastRenderedPageBreak/>
+        <w:t xml:space="preserve">insan müziği ayrımı için en bilgilendirici tek öznitelik olarak öne çıkmıştır. Tanılayıcı analiz iki önemli sınırlamayı ortaya koymuştur: tüm ağaç tabanlı modeller eğitim ile çapraz doğrulama doğrulukları arasında 8-14 puanlık bir fark sergilemekte ve 47 özniteliğin </w:t>
+      </w:r>
+      <w:proofErr w:type="spellStart"/>
+      <w:r>
+        <w:rPr>
+          <w:sz w:val="18"/>
+        </w:rPr>
+        <w:t>sondaki</w:t>
+      </w:r>
+      <w:proofErr w:type="spellEnd"/>
+      <w:r>
+        <w:rPr>
+          <w:sz w:val="18"/>
+        </w:rPr>
+        <w:t xml:space="preserve"> </w:t>
+      </w:r>
+      <w:proofErr w:type="spellStart"/>
+      <w:r>
+        <w:rPr>
+          <w:sz w:val="18"/>
+        </w:rPr>
+        <w:t>yaklaşık</w:t>
+      </w:r>
+      <w:proofErr w:type="spellEnd"/>
+      <w:r>
+        <w:rPr>
+          <w:sz w:val="18"/>
+        </w:rPr>
+        <w:t xml:space="preserve"> on </w:t>
       </w:r>
       <w:proofErr w:type="spellStart"/>
       <w:r>
@@ -10693,7 +10853,6 @@
         <w:rPr>
           <w:sz w:val="18"/>
         </w:rPr>
-        <w:lastRenderedPageBreak/>
         <w:t>2. Liu H., Chen Z., Yuan Y., Mei X., Liu X., Mandic D., Wang W., Plumbley M.D., AudioLDM: Text-to-Audio Generation with Latent Diffusion Models, Proceedings of the 40th International Conference on Machine Learning (ICML 2023), 21450-21474, Honolulu, Hawaii, A.B.D., 23-29 Temmuz, 2023.</w:t>
       </w:r>
     </w:p>
@@ -10838,6 +10997,7 @@
         <w:rPr>
           <w:sz w:val="18"/>
         </w:rPr>
+        <w:lastRenderedPageBreak/>
         <w:t>14. Elizalde B., Deshmukh S., Al Ismail M., Wang H., CLAP: Learning Audio Concepts from Natural Language Supervision, Proceedings of the IEEE International Conference on Acoustics, Speech and Signal Processing (ICASSP 2023), 1-5, Rhodes, Yunanistan, 4-10 Haziran, 2023.</w:t>
       </w:r>
     </w:p>
@@ -11018,7 +11178,6 @@
         <w:rPr>
           <w:sz w:val="18"/>
         </w:rPr>
-        <w:lastRenderedPageBreak/>
         <w:t>29. Pedregosa F. vd., Scikit-learn: Machine Learning in Python, Journal of Machine Learning Research, 12, 2825-2830, 2011.</w:t>
       </w:r>
     </w:p>

</xml_diff>

<commit_message>
Update figure label for accuracy in probability distribution
</commit_message>
<xml_diff>
--- a/docs/academic/paper/deliverables/AURIS_Makale_Metni.docx
+++ b/docs/academic/paper/deliverables/AURIS_Makale_Metni.docx
@@ -1746,7 +1746,35 @@
         <w:rPr>
           <w:sz w:val="18"/>
         </w:rPr>
-        <w:t xml:space="preserve"> yaygınlaşması, üretilen müzik parçalarının insan eliyle bestelenmiş kayıtlardan ayırt edilmesini bir tespit problemi olarak gündeme getirmiştir. Bu çalışmada, 47 boyutlu akustik öznitelik vektörü ile yedi makine öğrenmesi ve dört derin öğrenme algoritmasından oluşan on bir modelli bir topluluk öğrenmesi yaklaşımını birleştiren AURIS adlı bir sistem önerilmektedir. Modeller, on iki yapay zekâ üretici sisteminden ve birden çok insan kaynağından derlenen 5.195 örneklik bir veri kümesi üzerinde 5-katlı çapraz doğrulama ile eğitilmiştir. LightGBM, %95,48 ROC-AUC ve ±0,0023 standart sapma ile en başarılı sonucu elde etmiştir. Spektral düzlük standart sapması en bilgilendirici öznitelik olarak ön plana çıkmıştır. Youden J kriteri ile optimize edilen θ* = 0,4316 karar eşiği varsayılan 0,5 eşiğine kıyasla dengeli doğruluğu iyileştirmiştir. Brier skoru 0,083 olarak </w:t>
+        <w:t xml:space="preserve"> yaygınlaşması, üretilen müzik parçalarının insan eliyle bestelenmiş kayıtlardan ayırt edilmesini bir tespit problemi olarak gündeme getirmiştir. Bu çalışmada, 47 boyutlu akustik öznitelik vektörü ile yedi makine öğrenmesi ve dört derin öğrenme algoritmasından oluşan on bir modelli bir topluluk öğrenmesi yaklaşımını birleştiren AURIS adlı bir sistem önerilmektedir. Modeller, on iki yapay zekâ üretici sisteminden ve birden çok insan kaynağından derlenen 5.195 örneklik bir veri kümesi üzerinde 5-katlı çapraz doğrulama ile eğitilmiştir. LightGBM, %95,48 ROC-AUC ve ±0,0023 standart sapma ile en başarılı sonucu elde etmiştir. Spektral düzlük standart sapması en bilgilendirici öznitelik olarak ön plana çıkmıştır. Youden J kriteri ile optimize edilen θ* = 0,4316 karar eşiği varsayılan 0,5 eşiğine kıyasla dengeli doğruluğu iyileştirmiştir. Brier </w:t>
+      </w:r>
+      <w:proofErr w:type="spellStart"/>
+      <w:r>
+        <w:rPr>
+          <w:sz w:val="18"/>
+        </w:rPr>
+        <w:t>skoru</w:t>
+      </w:r>
+      <w:proofErr w:type="spellEnd"/>
+      <w:r>
+        <w:rPr>
+          <w:sz w:val="18"/>
+        </w:rPr>
+        <w:t xml:space="preserve"> 0,083 </w:t>
+      </w:r>
+      <w:proofErr w:type="spellStart"/>
+      <w:r>
+        <w:rPr>
+          <w:sz w:val="18"/>
+        </w:rPr>
+        <w:t>olarak</w:t>
+      </w:r>
+      <w:proofErr w:type="spellEnd"/>
+      <w:r>
+        <w:rPr>
+          <w:sz w:val="18"/>
+        </w:rPr>
+        <w:t xml:space="preserve"> </w:t>
       </w:r>
       <w:proofErr w:type="spellStart"/>
       <w:r>
@@ -2020,7 +2048,19 @@
         <w:rPr>
           <w:sz w:val="18"/>
         </w:rPr>
-        <w:t>AI-generated music, deep learning, gradient boosting, ensemble learning, spectral flatness</w:t>
+        <w:t>A</w:t>
+      </w:r>
+      <w:r>
+        <w:rPr>
+          <w:sz w:val="18"/>
+        </w:rPr>
+        <w:t>I</w:t>
+      </w:r>
+      <w:r>
+        <w:rPr>
+          <w:sz w:val="18"/>
+        </w:rPr>
+        <w:t>-generated music, deep learning, gradient boosting, ensemble learning, spectral flatness</w:t>
       </w:r>
     </w:p>
     <w:p>
@@ -2062,7 +2102,35 @@
         <w:rPr>
           <w:sz w:val="18"/>
         </w:rPr>
-        <w:t xml:space="preserve">Yapay zekâ tabanlı metinden müziğe üretim sistemlerinin son üç yıl içerisinde araştırma laboratuvarlarından tüketici uygulamalarına doğru yaşadığı hızlı geçiş, üretilen müzik parçalarının insan kayıtlarından ayırt edilmesini önemli bir problem olarak gündeme getirmiştir. Suno (sürüm 3-5), Udio, Meta tarafından </w:t>
+        <w:t xml:space="preserve">Yapay zekâ tabanlı metinden müziğe üretim sistemlerinin son üç yıl içerisinde araştırma laboratuvarlarından tüketici uygulamalarına doğru yaşadığı hızlı geçiş, üretilen müzik parçalarının insan kayıtlarından ayırt edilmesini önemli bir problem olarak gündeme getirmiştir. Suno (sürüm 3-5), </w:t>
+      </w:r>
+      <w:proofErr w:type="spellStart"/>
+      <w:r>
+        <w:rPr>
+          <w:sz w:val="18"/>
+        </w:rPr>
+        <w:t>Udio</w:t>
+      </w:r>
+      <w:proofErr w:type="spellEnd"/>
+      <w:r>
+        <w:rPr>
+          <w:sz w:val="18"/>
+        </w:rPr>
+        <w:t xml:space="preserve">, Meta </w:t>
+      </w:r>
+      <w:proofErr w:type="spellStart"/>
+      <w:r>
+        <w:rPr>
+          <w:sz w:val="18"/>
+        </w:rPr>
+        <w:t>tarafından</w:t>
+      </w:r>
+      <w:proofErr w:type="spellEnd"/>
+      <w:r>
+        <w:rPr>
+          <w:sz w:val="18"/>
+        </w:rPr>
+        <w:t xml:space="preserve"> </w:t>
       </w:r>
       <w:proofErr w:type="spellStart"/>
       <w:r>
@@ -2244,7 +2312,21 @@
         <w:rPr>
           <w:sz w:val="18"/>
         </w:rPr>
-        <w:t xml:space="preserve"> metin istemi ile dakikalar mertebesinde tam uzunlukta müzik parçaları üretebilme kapasitesine ulaşmıştır. Üretilen bu parçaların deneyimsiz bir dinleyici tarafından insan eliyle bestelenmiş kayıtlardan ayırt edilmesi çoğu durumda mümkün olmamaktadır. Bu gelişme; telif hakkı atıflandırması, çevrimiçi akış platformlarının içerik bütünlüğü, oturum müzisyenlerinin ekonomik hakları ve eğitimcilerin yazarlık değerlendirmesi gibi kritik konuları doğrudan etkilemektedir.</w:t>
+        <w:t xml:space="preserve"> </w:t>
+      </w:r>
+      <w:proofErr w:type="spellStart"/>
+      <w:r>
+        <w:rPr>
+          <w:sz w:val="18"/>
+        </w:rPr>
+        <w:t>metin</w:t>
+      </w:r>
+      <w:proofErr w:type="spellEnd"/>
+      <w:r>
+        <w:rPr>
+          <w:sz w:val="18"/>
+        </w:rPr>
+        <w:t xml:space="preserve"> istemi ile dakikalar mertebesinde tam uzunlukta müzik parçaları üretebilme kapasitesine ulaşmıştır. Üretilen bu parçaların deneyimsiz bir dinleyici tarafından insan eliyle bestelenmiş kayıtlardan ayırt edilmesi çoğu durumda mümkün olmamaktadır. Bu gelişme; telif hakkı atıflandırması, çevrimiçi akış platformlarının içerik bütünlüğü, oturum müzisyenlerinin ekonomik hakları ve eğitimcilerin yazarlık değerlendirmesi gibi kritik konuları doğrudan etkilemektedir.</w:t>
       </w:r>
     </w:p>
     <w:p>
@@ -8384,13 +8466,61 @@
         <w:rPr>
           <w:sz w:val="18"/>
         </w:rPr>
-        <w:t xml:space="preserve">Şekil 10. P(AI) tahmin olasılık </w:t>
-      </w:r>
-      <w:r>
-        <w:rPr>
-          <w:sz w:val="18"/>
-        </w:rPr>
-        <w:t xml:space="preserve">dağılımı. </w:t>
+        <w:t>Şekil 10. P(</w:t>
+      </w:r>
+      <w:r>
+        <w:rPr>
+          <w:sz w:val="18"/>
+        </w:rPr>
+        <w:t>YZ</w:t>
+      </w:r>
+      <w:r>
+        <w:rPr>
+          <w:sz w:val="18"/>
+        </w:rPr>
+        <w:t xml:space="preserve">) </w:t>
+      </w:r>
+      <w:proofErr w:type="spellStart"/>
+      <w:r>
+        <w:rPr>
+          <w:sz w:val="18"/>
+        </w:rPr>
+        <w:t>tahmin</w:t>
+      </w:r>
+      <w:proofErr w:type="spellEnd"/>
+      <w:r>
+        <w:rPr>
+          <w:sz w:val="18"/>
+        </w:rPr>
+        <w:t xml:space="preserve"> </w:t>
+      </w:r>
+      <w:proofErr w:type="spellStart"/>
+      <w:r>
+        <w:rPr>
+          <w:sz w:val="18"/>
+        </w:rPr>
+        <w:t>olasılık</w:t>
+      </w:r>
+      <w:proofErr w:type="spellEnd"/>
+      <w:r>
+        <w:rPr>
+          <w:sz w:val="18"/>
+        </w:rPr>
+        <w:t xml:space="preserve"> </w:t>
+      </w:r>
+      <w:proofErr w:type="spellStart"/>
+      <w:r>
+        <w:rPr>
+          <w:sz w:val="18"/>
+        </w:rPr>
+        <w:t>dağılımı</w:t>
+      </w:r>
+      <w:proofErr w:type="spellEnd"/>
+      <w:r>
+        <w:rPr>
+          <w:sz w:val="18"/>
+        </w:rPr>
+        <w:t xml:space="preserve">. </w:t>
       </w:r>
       <w:r>
         <w:rPr>
@@ -10446,7 +10576,35 @@
           <w:sz w:val="18"/>
         </w:rPr>
         <w:lastRenderedPageBreak/>
-        <w:t xml:space="preserve">insan müziği ayrımı için en bilgilendirici tek öznitelik olarak öne çıkmıştır. Tanılayıcı analiz iki önemli sınırlamayı ortaya koymuştur: tüm ağaç tabanlı modeller eğitim ile çapraz doğrulama doğrulukları arasında 8-14 puanlık bir fark sergilemekte ve 47 özniteliğin </w:t>
+        <w:t xml:space="preserve">insan müziği ayrımı için en bilgilendirici tek öznitelik olarak öne çıkmıştır. Tanılayıcı analiz iki önemli sınırlamayı ortaya koymuştur: tüm ağaç tabanlı modeller eğitim ile çapraz doğrulama doğrulukları arasında 8-14 puanlık bir fark sergilemekte </w:t>
+      </w:r>
+      <w:proofErr w:type="spellStart"/>
+      <w:r>
+        <w:rPr>
+          <w:sz w:val="18"/>
+        </w:rPr>
+        <w:t>ve</w:t>
+      </w:r>
+      <w:proofErr w:type="spellEnd"/>
+      <w:r>
+        <w:rPr>
+          <w:sz w:val="18"/>
+        </w:rPr>
+        <w:t xml:space="preserve"> 47 </w:t>
+      </w:r>
+      <w:proofErr w:type="spellStart"/>
+      <w:r>
+        <w:rPr>
+          <w:sz w:val="18"/>
+        </w:rPr>
+        <w:t>özniteliğin</w:t>
+      </w:r>
+      <w:proofErr w:type="spellEnd"/>
+      <w:r>
+        <w:rPr>
+          <w:sz w:val="18"/>
+        </w:rPr>
+        <w:t xml:space="preserve"> </w:t>
       </w:r>
       <w:proofErr w:type="spellStart"/>
       <w:r>

</xml_diff>

<commit_message>
Update AURIS document with improved content clarity and structure
</commit_message>
<xml_diff>
--- a/docs/academic/paper/deliverables/AURIS_Makale_Metni.docx
+++ b/docs/academic/paper/deliverables/AURIS_Makale_Metni.docx
@@ -2100,233 +2100,11 @@
       </w:pPr>
       <w:r>
         <w:rPr>
-          <w:sz w:val="18"/>
-        </w:rPr>
-        <w:t xml:space="preserve">Yapay zekâ tabanlı metinden müziğe üretim sistemlerinin son üç yıl içerisinde araştırma laboratuvarlarından tüketici uygulamalarına doğru yaşadığı hızlı geçiş, üretilen müzik parçalarının insan kayıtlarından ayırt edilmesini önemli bir problem olarak gündeme getirmiştir. Suno (sürüm 3-5), </w:t>
-      </w:r>
-      <w:proofErr w:type="spellStart"/>
-      <w:r>
-        <w:rPr>
-          <w:sz w:val="18"/>
-        </w:rPr>
-        <w:t>Udio</w:t>
-      </w:r>
-      <w:proofErr w:type="spellEnd"/>
-      <w:r>
-        <w:rPr>
-          <w:sz w:val="18"/>
-        </w:rPr>
-        <w:t xml:space="preserve">, Meta </w:t>
-      </w:r>
-      <w:proofErr w:type="spellStart"/>
-      <w:r>
-        <w:rPr>
-          <w:sz w:val="18"/>
-        </w:rPr>
-        <w:t>tarafından</w:t>
-      </w:r>
-      <w:proofErr w:type="spellEnd"/>
-      <w:r>
-        <w:rPr>
-          <w:sz w:val="18"/>
-        </w:rPr>
-        <w:t xml:space="preserve"> </w:t>
-      </w:r>
-      <w:proofErr w:type="spellStart"/>
-      <w:r>
-        <w:rPr>
-          <w:sz w:val="18"/>
-        </w:rPr>
-        <w:t>geliştirilen</w:t>
-      </w:r>
-      <w:proofErr w:type="spellEnd"/>
-      <w:r>
-        <w:rPr>
-          <w:sz w:val="18"/>
-        </w:rPr>
-        <w:t xml:space="preserve"> </w:t>
-      </w:r>
-      <w:proofErr w:type="spellStart"/>
-      <w:r>
-        <w:rPr>
-          <w:sz w:val="18"/>
-        </w:rPr>
-        <w:t>MusicGen</w:t>
-      </w:r>
-      <w:proofErr w:type="spellEnd"/>
-      <w:r>
-        <w:rPr>
-          <w:sz w:val="18"/>
-        </w:rPr>
-        <w:t xml:space="preserve"> [1] </w:t>
-      </w:r>
-      <w:proofErr w:type="spellStart"/>
-      <w:r>
-        <w:rPr>
-          <w:sz w:val="18"/>
-        </w:rPr>
-        <w:t>sistemi</w:t>
-      </w:r>
-      <w:proofErr w:type="spellEnd"/>
-      <w:r>
-        <w:rPr>
-          <w:sz w:val="18"/>
-        </w:rPr>
-        <w:t xml:space="preserve"> </w:t>
-      </w:r>
-      <w:proofErr w:type="spellStart"/>
-      <w:r>
-        <w:rPr>
-          <w:sz w:val="18"/>
-        </w:rPr>
-        <w:t>ve</w:t>
-      </w:r>
-      <w:proofErr w:type="spellEnd"/>
-      <w:r>
-        <w:rPr>
-          <w:sz w:val="18"/>
-        </w:rPr>
-        <w:t xml:space="preserve"> </w:t>
-      </w:r>
-      <w:proofErr w:type="spellStart"/>
-      <w:r>
-        <w:rPr>
-          <w:sz w:val="18"/>
-        </w:rPr>
-        <w:t>AudioLDM</w:t>
-      </w:r>
-      <w:proofErr w:type="spellEnd"/>
-      <w:r>
-        <w:rPr>
-          <w:sz w:val="18"/>
-        </w:rPr>
-        <w:t xml:space="preserve"> [2] </w:t>
-      </w:r>
-      <w:proofErr w:type="spellStart"/>
-      <w:r>
-        <w:rPr>
-          <w:sz w:val="18"/>
-        </w:rPr>
-        <w:t>gibi</w:t>
-      </w:r>
-      <w:proofErr w:type="spellEnd"/>
-      <w:r>
-        <w:rPr>
-          <w:sz w:val="18"/>
-        </w:rPr>
-        <w:t xml:space="preserve"> </w:t>
-      </w:r>
-      <w:proofErr w:type="spellStart"/>
-      <w:r>
-        <w:rPr>
-          <w:sz w:val="18"/>
-        </w:rPr>
-        <w:t>difüzyon</w:t>
-      </w:r>
-      <w:proofErr w:type="spellEnd"/>
-      <w:r>
-        <w:rPr>
-          <w:sz w:val="18"/>
-        </w:rPr>
-        <w:t xml:space="preserve"> </w:t>
-      </w:r>
-      <w:proofErr w:type="spellStart"/>
-      <w:r>
-        <w:rPr>
-          <w:sz w:val="18"/>
-        </w:rPr>
-        <w:t>tabanlı</w:t>
-      </w:r>
-      <w:proofErr w:type="spellEnd"/>
-      <w:r>
-        <w:rPr>
-          <w:sz w:val="18"/>
-        </w:rPr>
-        <w:t xml:space="preserve"> </w:t>
-      </w:r>
-      <w:proofErr w:type="spellStart"/>
-      <w:r>
-        <w:rPr>
-          <w:sz w:val="18"/>
-        </w:rPr>
-        <w:t>modeller</w:t>
-      </w:r>
-      <w:proofErr w:type="spellEnd"/>
-      <w:r>
-        <w:rPr>
-          <w:sz w:val="18"/>
-        </w:rPr>
-        <w:t xml:space="preserve">, </w:t>
-      </w:r>
-      <w:proofErr w:type="spellStart"/>
-      <w:r>
-        <w:rPr>
-          <w:sz w:val="18"/>
-        </w:rPr>
-        <w:t>kullanıcının</w:t>
-      </w:r>
-      <w:proofErr w:type="spellEnd"/>
-      <w:r>
-        <w:rPr>
-          <w:sz w:val="18"/>
-        </w:rPr>
-        <w:t xml:space="preserve"> </w:t>
-      </w:r>
-      <w:proofErr w:type="spellStart"/>
-      <w:r>
-        <w:rPr>
-          <w:sz w:val="18"/>
-        </w:rPr>
-        <w:t>sağladığı</w:t>
-      </w:r>
-      <w:proofErr w:type="spellEnd"/>
-      <w:r>
-        <w:rPr>
-          <w:sz w:val="18"/>
-        </w:rPr>
-        <w:t xml:space="preserve"> </w:t>
-      </w:r>
-      <w:proofErr w:type="spellStart"/>
-      <w:r>
-        <w:rPr>
-          <w:sz w:val="18"/>
-        </w:rPr>
-        <w:t>kısa</w:t>
-      </w:r>
-      <w:proofErr w:type="spellEnd"/>
-      <w:r>
-        <w:rPr>
-          <w:sz w:val="18"/>
-        </w:rPr>
-        <w:t xml:space="preserve"> </w:t>
-      </w:r>
-      <w:proofErr w:type="spellStart"/>
-      <w:r>
-        <w:rPr>
-          <w:sz w:val="18"/>
-        </w:rPr>
-        <w:t>bir</w:t>
-      </w:r>
-      <w:proofErr w:type="spellEnd"/>
-      <w:r>
-        <w:rPr>
-          <w:sz w:val="18"/>
-        </w:rPr>
-        <w:t xml:space="preserve"> </w:t>
-      </w:r>
-      <w:proofErr w:type="spellStart"/>
-      <w:r>
-        <w:rPr>
-          <w:sz w:val="18"/>
-        </w:rPr>
-        <w:t>metin</w:t>
-      </w:r>
-      <w:proofErr w:type="spellEnd"/>
-      <w:r>
-        <w:rPr>
-          <w:sz w:val="18"/>
-        </w:rPr>
-        <w:t xml:space="preserve"> istemi ile dakikalar mertebesinde tam uzunlukta müzik parçaları üretebilme kapasitesine ulaşmıştır. Üretilen bu parçaların deneyimsiz bir dinleyici tarafından insan eliyle bestelenmiş kayıtlardan ayırt edilmesi çoğu durumda mümkün olmamaktadır. Bu gelişme; telif hakkı atıflandırması, çevrimiçi akış platformlarının içerik bütünlüğü, oturum müzisyenlerinin ekonomik hakları ve eğitimcilerin yazarlık değerlendirmesi gibi kritik konuları doğrudan etkilemektedir.</w:t>
+          <w:rFonts w:ascii="Times New Roman" w:hAnsi="Times New Roman"/>
+          <w:b w:val="0"/>
+          <w:sz w:val="18"/>
+        </w:rPr>
+        <w:t>Üretken Yapay Zekâ (Generative Artificial Intelligence — GenAI) sistemlerinin son üç yıl içerisinde araştırma laboratuvarlarından tüketici uygulamalarına doğru yaşadığı hızlı geçiş, metinden müziğe (text-to-music) üretim alanında köklü bir dönüşümü beraberinde getirmiştir. Suno (sürüm 3-5), Udio, Meta tarafından geliştirilen MusicGen [1] ve AudioLDM [2] gibi difüzyon tabanlı modeller, kullanıcının sağladığı kısa bir metin istemi ile dakikalar içinde tam uzunlukta müzik parçaları üretebilme kapasitesine ulaşmıştır. Üretilen bu parçaların deneyimsiz bir dinleyici tarafından insan eliyle bestelenmiş kayıtlardan ayırt edilmesi çoğu durumda mümkün değildir. Bu gelişme; telif hakkı atıflandırması, çevrimiçi akış platformlarının içerik bütünlüğü, oturum müzisyenlerinin ekonomik hakları ve eğitimcilerin yazarlık değerlendirmesi gibi kritik konuları doğrudan etkilemektedir.</w:t>
       </w:r>
     </w:p>
     <w:p>
@@ -2342,9 +2120,11 @@
       </w:pPr>
       <w:r>
         <w:rPr>
-          <w:sz w:val="18"/>
-        </w:rPr>
-        <w:t>Konuşma için ses derin sahte tespiti ADD 2022 [3] yarışmaları ve WaveFake [4] gibi büyük ölçekli veri kümeleri sayesinde aktif bir araştırma alanı hâline gelmiştir. Buna karşın, yapay zekâ ile üretilen müziğin tespiti henüz benzer bir olgunluğa ulaşamamıştır. Bunun temel nedeni, müziğin konuşmadan farklı olarak sabit bir sözlüğe, doğrulanabilir bir konuşmacı kimliğine veya prozodi izine sahip olmamasıdır. Müzik; harmonik karmaşıklık, çokseslilik, perküsyon ve insan stüdyoları ile sentetik üretim hatları arasında geniş bir varyasyon gösteren kayıt artefaktları içermektedir. Konu üzerinde gerçekleştirilen güncel tarama çalışmaları [5, 6] alanın henüz oluşum aşamasında olduğunu belirtmektedir.</w:t>
+          <w:rFonts w:ascii="Times New Roman" w:hAnsi="Times New Roman"/>
+          <w:b w:val="0"/>
+          <w:sz w:val="18"/>
+        </w:rPr>
+        <w:t>Konuşma için ses derin sahte tespiti (audio deepfake detection), ADD 2022 [3] yarışmaları ve WaveFake [4] gibi büyük ölçekli veri kümeleri sayesinde aktif bir araştırma alanı hâline gelmiştir. Buna karşın, GenAI ile üretilen müziğin tespiti henüz benzer bir olgunluğa ulaşamamıştır. Bunun temel nedeni, müziğin konuşmadan farklı olarak sabit bir sözlüğe, doğrulanabilir bir konuşmacı kimliğine veya prozodi izine sahip olmamasıdır. Müzik; harmonik karmaşıklık, çokseslilik, perküsyon ve insan stüdyoları ile sentetik üretim hatları arasında geniş bir varyasyon gösteren kayıt artefaktları içermektedir. Konu üzerinde gerçekleştirilen güncel tarama çalışmaları [5, 6] alanın henüz oluşum aşamasında olduğunu belirtmekte ve üretici modeller arası genellemeyi — yani eğitim aşamasında görülmemiş sistemler tarafından üretilen parçaları doğru biçimde tespit edebilme yetisini — alanın birincil açık problemi olarak vurgulamaktadır.</w:t>
       </w:r>
     </w:p>
     <w:p>
@@ -2360,9 +2140,11 @@
       </w:pPr>
       <w:r>
         <w:rPr>
-          <w:sz w:val="18"/>
-        </w:rPr>
-        <w:t>Afchar vd. tarafından öne sürülen çalışmada [7], oto-kodlayıcı artefaktlarını tanımak amacıyla eğitilen bir tespit sisteminin %99,8 doğruluk değerine ulaşabildiği; ancak aynı sistemin MP3 sıkıştırma ve perde kaydırma gibi basit ses manipülasyonları altında performansının ciddi biçimde düştüğü raporlanmıştır. Kim ve Go [8] tarafından öne sürülen Segment Transformer, kısa müzik segmentlerini önceden eğitilmiş bir kodlayıcı ile gömüp bunları bir Dönüştürücü başlığı ile birleştirerek bir müzik parçasının tamamındaki yapısal örüntüleri yakalamaktadır.</w:t>
+          <w:rFonts w:ascii="Times New Roman" w:hAnsi="Times New Roman"/>
+          <w:b w:val="0"/>
+          <w:sz w:val="18"/>
+        </w:rPr>
+        <w:t>Afchar vd. tarafından öne sürülen çalışmada [7], oto-kodlayıcı artefaktlarını tanımak amacıyla eğitilen bir tespit sisteminin %99,8 doğruluk değerine ulaşabildiği; ancak aynı sistemin MP3 sıkıştırma ve perde kaydırma gibi basit ses manipülasyonları altında performansının ciddi biçimde düştüğü raporlanmıştır. Kim ve Go [8] tarafından öne sürülen Segment Transformer, kısa müzik segmentlerini önceden eğitilmiş bir kodlayıcı ile gömüp bunları bir Dönüştürücü başlığı ile birleştirerek bir müzik parçasının tamamındaki yapısal örüntüleri yakalamaktadır. Her iki yaklaşım da aynı temel kabulü paylaşmaktadır: hiçbir tek öznitelik ailesi tek başına farklı üretici sistemlere karşı yeterince sağlam değildir.</w:t>
       </w:r>
     </w:p>
     <w:p>
@@ -2378,590 +2160,144 @@
       </w:pPr>
       <w:r>
         <w:rPr>
-          <w:sz w:val="18"/>
-        </w:rPr>
-        <w:t xml:space="preserve">Bu çalışmada önerilen AURIS sistemi, tek bir temsile bağlı kalmak yerine; spektral, zamansal, harmonik ve vokal davranışı özetleyen 47 boyutlu elle tasarlanmış bir öznitelik vektörü ile kasıtlı biçimde heterojen on bir sınıflandırıcıdan oluşan bir topluluğu birleştirmektedir. </w:t>
-      </w:r>
-      <w:proofErr w:type="spellStart"/>
-      <w:r>
-        <w:rPr>
-          <w:sz w:val="18"/>
-        </w:rPr>
-        <w:t>Çalışmanın</w:t>
-      </w:r>
-      <w:proofErr w:type="spellEnd"/>
-      <w:r>
-        <w:rPr>
-          <w:sz w:val="18"/>
-        </w:rPr>
-        <w:t xml:space="preserve"> </w:t>
-      </w:r>
-      <w:proofErr w:type="spellStart"/>
-      <w:r>
-        <w:rPr>
-          <w:sz w:val="18"/>
-        </w:rPr>
-        <w:t>temel</w:t>
-      </w:r>
-      <w:proofErr w:type="spellEnd"/>
-      <w:r>
-        <w:rPr>
-          <w:sz w:val="18"/>
-        </w:rPr>
-        <w:t xml:space="preserve"> </w:t>
-      </w:r>
-      <w:proofErr w:type="spellStart"/>
-      <w:r>
-        <w:rPr>
-          <w:sz w:val="18"/>
-        </w:rPr>
-        <w:t>katkıları</w:t>
-      </w:r>
-      <w:proofErr w:type="spellEnd"/>
-      <w:r>
-        <w:rPr>
-          <w:sz w:val="18"/>
-        </w:rPr>
-        <w:t xml:space="preserve"> </w:t>
-      </w:r>
-      <w:proofErr w:type="spellStart"/>
-      <w:r>
-        <w:rPr>
-          <w:sz w:val="18"/>
-        </w:rPr>
-        <w:t>şunlardır</w:t>
-      </w:r>
-      <w:proofErr w:type="spellEnd"/>
-      <w:r>
-        <w:rPr>
-          <w:sz w:val="18"/>
-        </w:rPr>
-        <w:t xml:space="preserve">: on </w:t>
-      </w:r>
-      <w:proofErr w:type="spellStart"/>
-      <w:r>
-        <w:rPr>
-          <w:sz w:val="18"/>
-        </w:rPr>
-        <w:t>iki</w:t>
-      </w:r>
-      <w:proofErr w:type="spellEnd"/>
-      <w:r>
-        <w:rPr>
-          <w:sz w:val="18"/>
-        </w:rPr>
-        <w:t xml:space="preserve"> </w:t>
-      </w:r>
-      <w:proofErr w:type="spellStart"/>
-      <w:r>
-        <w:rPr>
-          <w:sz w:val="18"/>
-        </w:rPr>
-        <w:t>yapay</w:t>
-      </w:r>
-      <w:proofErr w:type="spellEnd"/>
-      <w:r>
-        <w:rPr>
-          <w:sz w:val="18"/>
-        </w:rPr>
-        <w:t xml:space="preserve"> </w:t>
-      </w:r>
-      <w:proofErr w:type="spellStart"/>
-      <w:r>
-        <w:rPr>
-          <w:sz w:val="18"/>
-        </w:rPr>
-        <w:t>zekâ</w:t>
-      </w:r>
-      <w:proofErr w:type="spellEnd"/>
-      <w:r>
-        <w:rPr>
-          <w:sz w:val="18"/>
-        </w:rPr>
-        <w:t xml:space="preserve"> </w:t>
-      </w:r>
-      <w:proofErr w:type="spellStart"/>
-      <w:r>
-        <w:rPr>
-          <w:sz w:val="18"/>
-        </w:rPr>
-        <w:t>üreticisinden</w:t>
-      </w:r>
-      <w:proofErr w:type="spellEnd"/>
-      <w:r>
-        <w:rPr>
-          <w:sz w:val="18"/>
-        </w:rPr>
-        <w:t xml:space="preserve"> </w:t>
-      </w:r>
-      <w:proofErr w:type="spellStart"/>
-      <w:r>
-        <w:rPr>
-          <w:sz w:val="18"/>
-        </w:rPr>
-        <w:t>ve</w:t>
-      </w:r>
-      <w:proofErr w:type="spellEnd"/>
-      <w:r>
-        <w:rPr>
-          <w:sz w:val="18"/>
-        </w:rPr>
-        <w:t xml:space="preserve"> </w:t>
-      </w:r>
-      <w:proofErr w:type="spellStart"/>
-      <w:r>
-        <w:rPr>
-          <w:sz w:val="18"/>
-        </w:rPr>
-        <w:t>birden</w:t>
-      </w:r>
-      <w:proofErr w:type="spellEnd"/>
-      <w:r>
-        <w:rPr>
-          <w:sz w:val="18"/>
-        </w:rPr>
-        <w:t xml:space="preserve"> </w:t>
-      </w:r>
-      <w:proofErr w:type="spellStart"/>
-      <w:r>
-        <w:rPr>
-          <w:sz w:val="18"/>
-        </w:rPr>
-        <w:t>çok</w:t>
-      </w:r>
-      <w:proofErr w:type="spellEnd"/>
-      <w:r>
-        <w:rPr>
-          <w:sz w:val="18"/>
-        </w:rPr>
-        <w:t xml:space="preserve"> </w:t>
-      </w:r>
-      <w:proofErr w:type="spellStart"/>
-      <w:r>
-        <w:rPr>
-          <w:sz w:val="18"/>
-        </w:rPr>
-        <w:t>insan</w:t>
-      </w:r>
-      <w:proofErr w:type="spellEnd"/>
-      <w:r>
-        <w:rPr>
-          <w:sz w:val="18"/>
-        </w:rPr>
-        <w:t xml:space="preserve"> </w:t>
-      </w:r>
-      <w:proofErr w:type="spellStart"/>
-      <w:r>
-        <w:rPr>
-          <w:sz w:val="18"/>
-        </w:rPr>
-        <w:t>kaynağından</w:t>
-      </w:r>
-      <w:proofErr w:type="spellEnd"/>
-      <w:r>
-        <w:rPr>
-          <w:sz w:val="18"/>
-        </w:rPr>
-        <w:t xml:space="preserve"> </w:t>
-      </w:r>
-      <w:proofErr w:type="spellStart"/>
-      <w:r>
-        <w:rPr>
-          <w:sz w:val="18"/>
-        </w:rPr>
-        <w:t>derlenen</w:t>
-      </w:r>
-      <w:proofErr w:type="spellEnd"/>
-      <w:r>
-        <w:rPr>
-          <w:sz w:val="18"/>
-        </w:rPr>
-        <w:t xml:space="preserve"> 5.195 </w:t>
-      </w:r>
-      <w:proofErr w:type="spellStart"/>
-      <w:r>
-        <w:rPr>
-          <w:sz w:val="18"/>
-        </w:rPr>
-        <w:t>örneklik</w:t>
-      </w:r>
-      <w:proofErr w:type="spellEnd"/>
-      <w:r>
-        <w:rPr>
-          <w:sz w:val="18"/>
-        </w:rPr>
-        <w:t xml:space="preserve"> </w:t>
-      </w:r>
-      <w:proofErr w:type="spellStart"/>
-      <w:r>
-        <w:rPr>
-          <w:sz w:val="18"/>
-        </w:rPr>
-        <w:t>halka</w:t>
-      </w:r>
-      <w:proofErr w:type="spellEnd"/>
-      <w:r>
-        <w:rPr>
-          <w:sz w:val="18"/>
-        </w:rPr>
-        <w:t xml:space="preserve"> </w:t>
-      </w:r>
-      <w:proofErr w:type="spellStart"/>
-      <w:r>
-        <w:rPr>
-          <w:sz w:val="18"/>
-        </w:rPr>
-        <w:t>açık</w:t>
-      </w:r>
-      <w:proofErr w:type="spellEnd"/>
-      <w:r>
-        <w:rPr>
-          <w:sz w:val="18"/>
-        </w:rPr>
-        <w:t xml:space="preserve"> </w:t>
-      </w:r>
-      <w:proofErr w:type="spellStart"/>
-      <w:r>
-        <w:rPr>
-          <w:sz w:val="18"/>
-        </w:rPr>
-        <w:t>bir</w:t>
-      </w:r>
-      <w:proofErr w:type="spellEnd"/>
-      <w:r>
-        <w:rPr>
-          <w:sz w:val="18"/>
-        </w:rPr>
-        <w:t xml:space="preserve"> </w:t>
-      </w:r>
-      <w:proofErr w:type="spellStart"/>
-      <w:r>
-        <w:rPr>
-          <w:sz w:val="18"/>
-        </w:rPr>
-        <w:t>veri</w:t>
-      </w:r>
-      <w:proofErr w:type="spellEnd"/>
-      <w:r>
-        <w:rPr>
-          <w:sz w:val="18"/>
-        </w:rPr>
-        <w:t xml:space="preserve"> </w:t>
-      </w:r>
-      <w:proofErr w:type="spellStart"/>
-      <w:r>
-        <w:rPr>
-          <w:sz w:val="18"/>
-        </w:rPr>
-        <w:t>kümesi</w:t>
-      </w:r>
-      <w:proofErr w:type="spellEnd"/>
-      <w:r>
-        <w:rPr>
-          <w:sz w:val="18"/>
-        </w:rPr>
-        <w:t xml:space="preserve">, </w:t>
-      </w:r>
-      <w:proofErr w:type="spellStart"/>
-      <w:r>
-        <w:rPr>
-          <w:sz w:val="18"/>
-        </w:rPr>
-        <w:t>yedi</w:t>
-      </w:r>
-      <w:proofErr w:type="spellEnd"/>
-      <w:r>
-        <w:rPr>
-          <w:sz w:val="18"/>
-        </w:rPr>
-        <w:t xml:space="preserve"> </w:t>
-      </w:r>
-      <w:proofErr w:type="spellStart"/>
-      <w:r>
-        <w:rPr>
-          <w:sz w:val="18"/>
-        </w:rPr>
-        <w:t>makine</w:t>
-      </w:r>
-      <w:proofErr w:type="spellEnd"/>
-      <w:r>
-        <w:rPr>
-          <w:sz w:val="18"/>
-        </w:rPr>
-        <w:t xml:space="preserve"> </w:t>
-      </w:r>
-      <w:proofErr w:type="spellStart"/>
-      <w:r>
-        <w:rPr>
-          <w:sz w:val="18"/>
-        </w:rPr>
-        <w:t>öğrenmesi</w:t>
-      </w:r>
-      <w:proofErr w:type="spellEnd"/>
-      <w:r>
-        <w:rPr>
-          <w:sz w:val="18"/>
-        </w:rPr>
-        <w:t xml:space="preserve"> [9, 10] </w:t>
-      </w:r>
-      <w:proofErr w:type="spellStart"/>
-      <w:r>
-        <w:rPr>
-          <w:sz w:val="18"/>
-        </w:rPr>
-        <w:t>ve</w:t>
-      </w:r>
-      <w:proofErr w:type="spellEnd"/>
-      <w:r>
-        <w:rPr>
-          <w:sz w:val="18"/>
-        </w:rPr>
-        <w:t xml:space="preserve"> </w:t>
-      </w:r>
-      <w:proofErr w:type="spellStart"/>
-      <w:r>
-        <w:rPr>
-          <w:sz w:val="18"/>
-        </w:rPr>
-        <w:t>dört</w:t>
-      </w:r>
-      <w:proofErr w:type="spellEnd"/>
-      <w:r>
-        <w:rPr>
-          <w:sz w:val="18"/>
-        </w:rPr>
-        <w:t xml:space="preserve"> </w:t>
-      </w:r>
-      <w:proofErr w:type="spellStart"/>
-      <w:r>
-        <w:rPr>
-          <w:sz w:val="18"/>
-        </w:rPr>
-        <w:t>derin</w:t>
-      </w:r>
-      <w:proofErr w:type="spellEnd"/>
-      <w:r>
-        <w:rPr>
-          <w:sz w:val="18"/>
-        </w:rPr>
-        <w:t xml:space="preserve"> </w:t>
-      </w:r>
-      <w:proofErr w:type="spellStart"/>
-      <w:r>
-        <w:rPr>
-          <w:sz w:val="18"/>
-        </w:rPr>
-        <w:t>öğrenme</w:t>
-      </w:r>
-      <w:proofErr w:type="spellEnd"/>
-      <w:r>
-        <w:rPr>
-          <w:sz w:val="18"/>
-        </w:rPr>
-        <w:t xml:space="preserve"> </w:t>
-      </w:r>
-      <w:proofErr w:type="spellStart"/>
-      <w:r>
-        <w:rPr>
-          <w:sz w:val="18"/>
-        </w:rPr>
-        <w:t>algoritmasının</w:t>
-      </w:r>
-      <w:proofErr w:type="spellEnd"/>
-      <w:r>
-        <w:rPr>
-          <w:sz w:val="18"/>
-        </w:rPr>
-        <w:t xml:space="preserve"> </w:t>
-      </w:r>
-      <w:proofErr w:type="spellStart"/>
-      <w:r>
-        <w:rPr>
-          <w:sz w:val="18"/>
-        </w:rPr>
-        <w:t>ortak</w:t>
-      </w:r>
-      <w:proofErr w:type="spellEnd"/>
-      <w:r>
-        <w:rPr>
-          <w:sz w:val="18"/>
-        </w:rPr>
-        <w:t xml:space="preserve"> </w:t>
-      </w:r>
-      <w:proofErr w:type="spellStart"/>
-      <w:r>
-        <w:rPr>
-          <w:sz w:val="18"/>
-        </w:rPr>
-        <w:t>bir</w:t>
-      </w:r>
-      <w:proofErr w:type="spellEnd"/>
-      <w:r>
-        <w:rPr>
-          <w:sz w:val="18"/>
-        </w:rPr>
-        <w:t xml:space="preserve"> 5-katlı </w:t>
-      </w:r>
-      <w:proofErr w:type="spellStart"/>
-      <w:r>
-        <w:rPr>
-          <w:sz w:val="18"/>
-        </w:rPr>
-        <w:t>çapraz</w:t>
-      </w:r>
-      <w:proofErr w:type="spellEnd"/>
-      <w:r>
-        <w:rPr>
-          <w:sz w:val="18"/>
-        </w:rPr>
-        <w:t xml:space="preserve"> </w:t>
-      </w:r>
-      <w:proofErr w:type="spellStart"/>
-      <w:r>
-        <w:rPr>
-          <w:sz w:val="18"/>
-        </w:rPr>
-        <w:t>doğrulama</w:t>
-      </w:r>
-      <w:proofErr w:type="spellEnd"/>
-      <w:r>
-        <w:rPr>
-          <w:sz w:val="18"/>
-        </w:rPr>
-        <w:t xml:space="preserve"> </w:t>
-      </w:r>
-      <w:proofErr w:type="spellStart"/>
-      <w:r>
-        <w:rPr>
-          <w:sz w:val="18"/>
-        </w:rPr>
-        <w:t>protokolü</w:t>
-      </w:r>
-      <w:proofErr w:type="spellEnd"/>
-      <w:r>
-        <w:rPr>
-          <w:sz w:val="18"/>
-        </w:rPr>
-        <w:t xml:space="preserve"> </w:t>
-      </w:r>
-      <w:proofErr w:type="spellStart"/>
-      <w:r>
-        <w:rPr>
-          <w:sz w:val="18"/>
-        </w:rPr>
-        <w:t>altında</w:t>
-      </w:r>
-      <w:proofErr w:type="spellEnd"/>
-      <w:r>
-        <w:rPr>
-          <w:sz w:val="18"/>
-        </w:rPr>
-        <w:t xml:space="preserve"> </w:t>
-      </w:r>
-      <w:proofErr w:type="spellStart"/>
-      <w:r>
-        <w:rPr>
-          <w:sz w:val="18"/>
-        </w:rPr>
-        <w:t>karşılaştırılması</w:t>
-      </w:r>
-      <w:proofErr w:type="spellEnd"/>
-      <w:r>
-        <w:rPr>
-          <w:sz w:val="18"/>
-        </w:rPr>
-        <w:t xml:space="preserve"> </w:t>
-      </w:r>
-      <w:proofErr w:type="spellStart"/>
-      <w:r>
-        <w:rPr>
-          <w:sz w:val="18"/>
-        </w:rPr>
-        <w:t>ve</w:t>
-      </w:r>
-      <w:proofErr w:type="spellEnd"/>
-      <w:r>
-        <w:rPr>
-          <w:sz w:val="18"/>
-        </w:rPr>
-        <w:t xml:space="preserve"> SHAP [11] </w:t>
-      </w:r>
-      <w:proofErr w:type="spellStart"/>
-      <w:r>
-        <w:rPr>
-          <w:sz w:val="18"/>
-        </w:rPr>
-        <w:t>tabanlı</w:t>
-      </w:r>
-      <w:proofErr w:type="spellEnd"/>
-      <w:r>
-        <w:rPr>
-          <w:sz w:val="18"/>
-        </w:rPr>
-        <w:t xml:space="preserve"> </w:t>
-      </w:r>
-      <w:proofErr w:type="spellStart"/>
-      <w:r>
-        <w:rPr>
-          <w:sz w:val="18"/>
-        </w:rPr>
-        <w:t>bir</w:t>
-      </w:r>
-      <w:proofErr w:type="spellEnd"/>
-      <w:r>
-        <w:rPr>
-          <w:sz w:val="18"/>
-        </w:rPr>
-        <w:t xml:space="preserve"> </w:t>
-      </w:r>
-      <w:proofErr w:type="spellStart"/>
-      <w:r>
-        <w:rPr>
-          <w:sz w:val="18"/>
-        </w:rPr>
-        <w:t>yorumlanabilirlik</w:t>
-      </w:r>
-      <w:proofErr w:type="spellEnd"/>
-      <w:r>
-        <w:rPr>
-          <w:sz w:val="18"/>
-        </w:rPr>
-        <w:t xml:space="preserve"> </w:t>
-      </w:r>
-      <w:proofErr w:type="spellStart"/>
-      <w:r>
-        <w:rPr>
-          <w:sz w:val="18"/>
-        </w:rPr>
-        <w:t>analizi</w:t>
-      </w:r>
-      <w:proofErr w:type="spellEnd"/>
-      <w:r>
-        <w:rPr>
-          <w:sz w:val="18"/>
-        </w:rPr>
-        <w:t xml:space="preserve"> </w:t>
-      </w:r>
-      <w:proofErr w:type="spellStart"/>
-      <w:r>
-        <w:rPr>
-          <w:sz w:val="18"/>
-        </w:rPr>
-        <w:t>sunulmaktadır</w:t>
-      </w:r>
-      <w:proofErr w:type="spellEnd"/>
-      <w:r>
-        <w:rPr>
-          <w:sz w:val="18"/>
-        </w:rPr>
-        <w:t>.</w:t>
-      </w:r>
-    </w:p>
-    <w:p>
-      <w:pPr>
-        <w:spacing w:line="360" w:lineRule="auto"/>
-      </w:pPr>
-    </w:p>
+          <w:rFonts w:ascii="Times New Roman" w:hAnsi="Times New Roman"/>
+          <w:b w:val="0"/>
+          <w:sz w:val="18"/>
+        </w:rPr>
+        <w:t>Bu çalışmada önerilen AURIS sistemi, söz konusu iki uç arasında dengeli bir konumda yer almaktadır. Sistem, tek bir temsile bağlı kalmak yerine; spektral, zamansal, harmonik ve vokal davranışı özetleyen 47 boyutlu elle tasarlanmış bir öznitelik vektörü ile kasıtlı biçimde heterojen on bir sınıflandırıcıdan oluşan bir topluluğu birleştirmektedir. Bu yaklaşımın amacı iki yönlüdür: (i) birden çok GenAI üreticisinde rekabetçi tespit doğruluğu elde etmek ve (ii) tüketici donanımı üzerinde konuşlandırılabilir, yorumlanabilir ve güvenilir bir model sunmak. Bu çalışmanın temel katkıları şu şekilde özetlenebilir:</w:t>
+      </w:r>
+    </w:p>
+    <w:p>
+      <w:pPr>
+        <w:spacing w:line="360" w:lineRule="auto"/>
+      </w:pPr>
+    </w:p>
+    <w:p>
+      <w:r>
+        <w:rPr>
+          <w:rFonts w:ascii="Times New Roman" w:hAnsi="Times New Roman"/>
+          <w:sz w:val="18"/>
+          <w:szCs w:val="18"/>
+        </w:rPr>
+        <w:t xml:space="preserve">(i) Suno, Udio, MusicGen, AudioLDM2 ve diğer sekiz üretici sistem dahil olmak üzere on iki GenAI kaynağından ve birden çok insan kaynağından (GTZAN, FMA Small, SleepyJesse kapakları) derlenen 5.195 örneklik, halka açık ve çoğaltılabilir nitelikte bir veri kümesinin oluşturulması;</w:t>
+      </w:r>
+    </w:p>
+    <w:p>
+      <w:r>
+        <w:rPr>
+          <w:rFonts w:ascii="Times New Roman" w:hAnsi="Times New Roman"/>
+          <w:sz w:val="18"/>
+          <w:szCs w:val="18"/>
+        </w:rPr>
+        <w:t xml:space="preserve">(ii) Yedi makine öğrenmesi algoritmasının (Lojistik Regresyon, Rastgele Orman, Gradyan Artırma, Destek Vektör Makineleri — SVM, Çok Katmanlı Algılayıcı — ÇKA, XGBoost [9] ve LightGBM [10]) ve dört derin öğrenme mimarisinin (Derin ÇKA, 1B-ESA, Artık ÇKA, Dikkat ÇKA) ortak bir 5-katlı çapraz doğrulama protokolü altında karşılaştırılması; LightGBM modelinin %95,48 ROC-AUC ve ±0,0023 katlar-arası standart sapma ile en başarılı sonucu sağladığının gösterilmesi;</w:t>
+      </w:r>
+    </w:p>
+    <w:p>
+      <w:r>
+        <w:rPr>
+          <w:rFonts w:ascii="Times New Roman" w:hAnsi="Times New Roman"/>
+          <w:sz w:val="18"/>
+          <w:szCs w:val="18"/>
+        </w:rPr>
+        <w:t xml:space="preserve">(iii) Spektral düzlük standart sapması özniteliğinin yapay zekâ ile insan müziği ayrımı için en bilgilendirici öznitelik olduğunu ortaya koyan Shapley Katma Açıklamaları (Shapley Additive exPlanations — SHAP) [11] tabanlı bir yorumlanabilirlik analizinin sunulması.</w:t>
+      </w:r>
+    </w:p>
+    <w:p/>
+    <w:p>
+      <w:r>
+        <w:rPr>
+          <w:rFonts w:ascii="Times New Roman" w:hAnsi="Times New Roman"/>
+          <w:sz w:val="18"/>
+          <w:szCs w:val="18"/>
+          <w:b/>
+        </w:rPr>
+        <w:t xml:space="preserve">1.1. Ses Derin Sahte Tespiti (Audio Deepfake Detection)</w:t>
+      </w:r>
+    </w:p>
+    <w:p/>
+    <w:p>
+      <w:r>
+        <w:rPr>
+          <w:rFonts w:ascii="Times New Roman" w:hAnsi="Times New Roman"/>
+          <w:sz w:val="18"/>
+          <w:szCs w:val="18"/>
+        </w:rPr>
+        <w:t xml:space="preserve">Konuşma için ses derin sahte tespiti, GenAI müzik tespiti çalışmaları açısından doğrudan örnek alınan en olgun komşu alanı oluşturmaktadır. Yi vd. tarafından düzenlenen ADD 2022 yarışmasında [3] bu alan resmî biçimde bir topluluk değerlendirme problemi olarak kurulmuştur. Frank ve Schönherr tarafından geliştirilen WaveFake [4] veri kümesi, vokoder-spesifik artefaktların tespitinin sistematik biçimde incelenmesi için altyapı oluşturmuştur. Martín-Doñas ve Álvarez tarafından öne sürülen Vicomtech sistemi [12], önceden eğitilmiş wav2vec2 [13] öznitelik çıkarıcısının üzerine bir sınıflandırma başlığı yerleştirerek ADD 2022'de güçlü performans elde etmiştir. Yi vd. [6] tarafından yürütülen kapsamlı tarama çalışması, alanın teknik ve etik boyutlarını ayrıntılı biçimde özetlemiştir.</w:t>
+      </w:r>
+    </w:p>
+    <w:p/>
+    <w:p/>
+    <w:p>
+      <w:r>
+        <w:rPr>
+          <w:rFonts w:ascii="Times New Roman" w:hAnsi="Times New Roman"/>
+          <w:sz w:val="18"/>
+          <w:szCs w:val="18"/>
+          <w:b/>
+        </w:rPr>
+        <w:t xml:space="preserve">1.2. Ses İçin Topluluk Yöntemleri (Ensemble Methods for Audio)</w:t>
+      </w:r>
+    </w:p>
+    <w:p/>
+    <w:p>
+      <w:r>
+        <w:rPr>
+          <w:rFonts w:ascii="Times New Roman" w:hAnsi="Times New Roman"/>
+          <w:sz w:val="18"/>
+          <w:szCs w:val="18"/>
+        </w:rPr>
+        <w:t xml:space="preserve">Topluluk öğrenmesi yöntemleri ses sınıflandırma alanında istikrarlı biçimde rekabetçi sonuçlar üretmektedir. Liu vd. [16], XGBoost tabanlı bir müzikal enstrüman tanıma sisteminin çoklu öznitelik füzyonu ile yüksek doğruluğa ulaşabildiğini göstermiştir. Gan vd. [17], Değişken Mod Ayrıştırması (VMD) ve Geliştirilmiş Balina Optimizasyon Algoritması (IWOA) ile zenginleştirilen XGBoost modelinin GTZAN ve Bangla veri kümeleri üzerinde öne çıktığını raporlamıştır. Türkçe literatür kapsamında Hızlısoy ve Tüfekci [18] derin öğrenme tabanlı bir mimari ile Türkçe müziklerin tür sınıflandırması üzerine çalışmış; Özbalcı vd. [19] ise GTZAN üzerinde Rastgele Orman ile %81 doğruluk elde etmiştir. Kostrzewa vd. [21], geniş sinir ağı topluluklarının müzik tür sınıflandırmasında tek modellere kıyasla daha yüksek performans sergilediğini göstermiştir.</w:t>
+      </w:r>
+    </w:p>
+    <w:p/>
+    <w:p/>
+    <w:p>
+      <w:r>
+        <w:rPr>
+          <w:rFonts w:ascii="Times New Roman" w:hAnsi="Times New Roman"/>
+          <w:sz w:val="18"/>
+          <w:szCs w:val="18"/>
+          <w:b/>
+        </w:rPr>
+        <w:t xml:space="preserve">1.3. GenAI Müzik Üretici Sistemleri (GenAI Music Generation Systems)</w:t>
+      </w:r>
+    </w:p>
+    <w:p/>
+    <w:p>
+      <w:r>
+        <w:rPr>
+          <w:rFonts w:ascii="Times New Roman" w:hAnsi="Times New Roman"/>
+          <w:sz w:val="18"/>
+          <w:szCs w:val="18"/>
+        </w:rPr>
+        <w:t xml:space="preserve">GenAI müzik üretim sistemleri, tespit problemini doğrudan şekillendiren teknik çeşitliliği yansıtmaktadır. Copet vd. tarafından geliştirilen MusicGen [1], metne koşullu sıkıştırılmış ses andıçları üzerinde çalışan tek aşamalı bir Dönüştürücü dil modelidir. Liu vd. tarafından geliştirilen AudioLDM [2] ise CLAP gömmelerini koşullandırma sinyali olarak kullanan gizil bir difüzyon modelidir. Suno ve Udio gibi ticari platformlar altta yatan mimarilerini kamuoyuyla paylaşmamakla birlikte, çıktılarının sürümler arasındaki spektral özellikleri dağılımsal olarak tutarlı ve gözlemlenebilir bir iz bırakmaktadır.</w:t>
+      </w:r>
+    </w:p>
+    <w:p/>
+    <w:p/>
+    <w:p>
+      <w:r>
+        <w:rPr>
+          <w:rFonts w:ascii="Times New Roman" w:hAnsi="Times New Roman"/>
+          <w:sz w:val="18"/>
+          <w:szCs w:val="18"/>
+          <w:b/>
+        </w:rPr>
+        <w:t xml:space="preserve">1.4. GenAI Müzik Tespitinde Güncel Gelişmeler (Recent Advances in GenAI Music Detection)</w:t>
+      </w:r>
+    </w:p>
+    <w:p/>
+    <w:p>
+      <w:r>
+        <w:rPr>
+          <w:rFonts w:ascii="Times New Roman" w:hAnsi="Times New Roman"/>
+          <w:sz w:val="18"/>
+          <w:szCs w:val="18"/>
+        </w:rPr>
+        <w:t xml:space="preserve">Bu alandaki en doğrudan ilgili çalışmalar 2024-2025 yılları arasında yayımlanmıştır. Li vd. [5], ses derin sahte tespiti metodolojisini GenAI müzik tespitine bağlayan kapsamlı bir yol haritası sunmuş ve üretici modeller arası genellemeyi alanın birincil açık problemi olarak belirlemiştir. Afchar vd. [7], oto-kodlayıcı artefaktları üzerinde eğitilen sistemlerin %99,8 doğruluğa ulaşabildiğini; ancak basit ses manipülasyonları altında performansın belirgin biçimde düştüğünü göstermiştir. Kim ve Go [8], kısa müzik segmentlerini bir Dönüştürücü başlığı ile işleyen Segment Transformer modelini önermiştir. Rahman vd. tarafından geliştirilen SONICS [23], 97.000'den fazla şarkı içeren geniş ölçekli bir referans kıyaslama veri kümesi oluşturmaktadır. Comanducci vd. [24] tarafından geliştirilen FakeMusicCaps, beş farklı metinden-müziğe modeli ile yeniden üretilmiş MusicCaps eşlemelerinden oluşmaktadır. Pascu vd. [25] tarafından geliştirilen Echoes ise on farklı GenAI müzik sistemi tarafından üretilen anlamsal-hizalı içeriği kapsamaktadır. Bu çalışmaların ortak bulgusu şu şekilde özetlenebilir: hiçbir tek mimari ailesi, hem üretici modeller arası genellemeyi hem de düşmanca güçlendirilmiş sinyallere karşı sağlamlığı tek başına sağlayamamaktadır.</w:t>
+      </w:r>
+    </w:p>
+    <w:p/>
     <w:p>
       <w:pPr>
         <w:spacing w:line="360" w:lineRule="auto"/>

</xml_diff>

<commit_message>
Update AURIS document for clarity and structure improvements
</commit_message>
<xml_diff>
--- a/docs/academic/paper/deliverables/AURIS_Makale_Metni.docx
+++ b/docs/academic/paper/deliverables/AURIS_Makale_Metni.docx
@@ -2164,44 +2164,17 @@
           <w:b w:val="0"/>
           <w:sz w:val="18"/>
         </w:rPr>
-        <w:t>Bu çalışmada önerilen AURIS sistemi, söz konusu iki uç arasında dengeli bir konumda yer almaktadır. Sistem, tek bir temsile bağlı kalmak yerine; spektral, zamansal, harmonik ve vokal davranışı özetleyen 47 boyutlu elle tasarlanmış bir öznitelik vektörü ile kasıtlı biçimde heterojen on bir sınıflandırıcıdan oluşan bir topluluğu birleştirmektedir. Bu yaklaşımın amacı iki yönlüdür: (i) birden çok GenAI üreticisinde rekabetçi tespit doğruluğu elde etmek ve (ii) tüketici donanımı üzerinde konuşlandırılabilir, yorumlanabilir ve güvenilir bir model sunmak. Bu çalışmanın temel katkıları şu şekilde özetlenebilir:</w:t>
-      </w:r>
-    </w:p>
-    <w:p>
-      <w:pPr>
-        <w:spacing w:line="360" w:lineRule="auto"/>
-      </w:pPr>
-    </w:p>
-    <w:p>
-      <w:r>
-        <w:rPr>
-          <w:rFonts w:ascii="Times New Roman" w:hAnsi="Times New Roman"/>
-          <w:sz w:val="18"/>
-          <w:szCs w:val="18"/>
-        </w:rPr>
-        <w:t xml:space="preserve">(i) Suno, Udio, MusicGen, AudioLDM2 ve diğer sekiz üretici sistem dahil olmak üzere on iki GenAI kaynağından ve birden çok insan kaynağından (GTZAN, FMA Small, SleepyJesse kapakları) derlenen 5.195 örneklik, halka açık ve çoğaltılabilir nitelikte bir veri kümesinin oluşturulması;</w:t>
-      </w:r>
-    </w:p>
-    <w:p>
-      <w:r>
-        <w:rPr>
-          <w:rFonts w:ascii="Times New Roman" w:hAnsi="Times New Roman"/>
-          <w:sz w:val="18"/>
-          <w:szCs w:val="18"/>
-        </w:rPr>
-        <w:t xml:space="preserve">(ii) Yedi makine öğrenmesi algoritmasının (Lojistik Regresyon, Rastgele Orman, Gradyan Artırma, Destek Vektör Makineleri — SVM, Çok Katmanlı Algılayıcı — ÇKA, XGBoost [9] ve LightGBM [10]) ve dört derin öğrenme mimarisinin (Derin ÇKA, 1B-ESA, Artık ÇKA, Dikkat ÇKA) ortak bir 5-katlı çapraz doğrulama protokolü altında karşılaştırılması; LightGBM modelinin %95,48 ROC-AUC ve ±0,0023 katlar-arası standart sapma ile en başarılı sonucu sağladığının gösterilmesi;</w:t>
-      </w:r>
-    </w:p>
-    <w:p>
-      <w:r>
-        <w:rPr>
-          <w:rFonts w:ascii="Times New Roman" w:hAnsi="Times New Roman"/>
-          <w:sz w:val="18"/>
-          <w:szCs w:val="18"/>
-        </w:rPr>
-        <w:t xml:space="preserve">(iii) Spektral düzlük standart sapması özniteliğinin yapay zekâ ile insan müziği ayrımı için en bilgilendirici öznitelik olduğunu ortaya koyan Shapley Katma Açıklamaları (Shapley Additive exPlanations — SHAP) [11] tabanlı bir yorumlanabilirlik analizinin sunulması.</w:t>
-      </w:r>
-    </w:p>
+        <w:t>Bu çalışmada önerilen AURIS sistemi, tek bir temsile bağlı kalmak yerine; spektral, zamansal, harmonik ve vokal davranışı özetleyen 47 boyutlu elle tasarlanmış bir öznitelik vektörü ile kasıtlı biçimde heterojen on bir sınıflandırıcıdan oluşan bir topluluğu birleştirmektedir. Çalışmanın temel katkıları şunlardır: Suno, Udio, MusicGen, AudioLDM2 ve diğer sekiz üretici dahil on iki GenAI kaynağından ve birden çok insan kaynağından (GTZAN, FMA Small, SleepyJesse kapakları) derlenen 5.195 örneklik halka açık bir veri kümesinin oluşturulması; yedi makine öğrenmesi algoritması (Lojistik Regresyon, Rastgele Orman, Gradyan Artırma, SVM, ÇKA, XGBoost [9] ve LightGBM [10]) ve dört derin öğrenme mimarisinin (Derin ÇKA, 1B-ESA, Artık ÇKA, Dikkat ÇKA) ortak bir 5-katlı çapraz doğrulama protokolü altında karşılaştırılması ve LightGBM modelinin %95,48 ROC-AUC ile en başarılı sonucu sağladığının gösterilmesi; SHAP [11] tabanlı bir yorumlanabilirlik analizinin sunulması.</w:t>
+      </w:r>
+    </w:p>
+    <w:p>
+      <w:pPr>
+        <w:spacing w:line="360" w:lineRule="auto"/>
+      </w:pPr>
+    </w:p>
+    <w:p/>
+    <w:p/>
+    <w:p/>
     <w:p/>
     <w:p>
       <w:r>

</xml_diff>

<commit_message>
Update AURIS document with additional tables and classification report for improved clarity and detail
</commit_message>
<xml_diff>
--- a/docs/academic/paper/deliverables/AURIS_Makale_Metni.docx
+++ b/docs/academic/paper/deliverables/AURIS_Makale_Metni.docx
@@ -4644,6 +4644,1305 @@
     </w:p>
     <w:tbl>
       <w:tblPr>
+        <w:tblStyle w:val="TabloKlavuzu"/>
+        <w:tblW w:type="auto" w:w="0"/>
+        <w:jc w:val="center"/>
+        <w:tblLook w:firstColumn="1" w:firstRow="1" w:lastColumn="0" w:lastRow="0" w:noHBand="0" w:noVBand="1" w:val="04A0"/>
+      </w:tblPr>
+      <w:tblGrid>
+        <w:gridCol w:w="1881"/>
+        <w:gridCol w:w="1881"/>
+        <w:gridCol w:w="1881"/>
+        <w:gridCol w:w="1881"/>
+        <w:gridCol w:w="1881"/>
+      </w:tblGrid>
+      <w:tr>
+        <w:tc>
+          <w:tcPr>
+            <w:tcW w:type="dxa" w:w="1881"/>
+            <w:shd w:val="clear" w:color="auto" w:fill="FFFFFF"/>
+          </w:tcPr>
+          <w:p>
+            <w:pPr>
+              <w:jc w:val="center"/>
+            </w:pPr>
+            <w:r>
+              <w:rPr>
+                <w:rFonts w:ascii="Times New Roman" w:hAnsi="Times New Roman"/>
+                <w:b w:val="0"/>
+                <w:i w:val="0"/>
+                <w:color w:val="000000"/>
+                <w:sz w:val="18"/>
+              </w:rPr>
+              <w:t>Model</w:t>
+            </w:r>
+          </w:p>
+        </w:tc>
+        <w:tc>
+          <w:tcPr>
+            <w:tcW w:type="dxa" w:w="1881"/>
+            <w:shd w:val="clear" w:color="auto" w:fill="FFFFFF"/>
+          </w:tcPr>
+          <w:p>
+            <w:pPr>
+              <w:jc w:val="center"/>
+            </w:pPr>
+            <w:r>
+              <w:rPr>
+                <w:rFonts w:ascii="Times New Roman" w:hAnsi="Times New Roman"/>
+                <w:b w:val="0"/>
+                <w:i w:val="0"/>
+                <w:color w:val="000000"/>
+                <w:sz w:val="18"/>
+              </w:rPr>
+              <w:t>Tür</w:t>
+            </w:r>
+          </w:p>
+        </w:tc>
+        <w:tc>
+          <w:tcPr>
+            <w:tcW w:type="dxa" w:w="1881"/>
+            <w:shd w:val="clear" w:color="auto" w:fill="FFFFFF"/>
+          </w:tcPr>
+          <w:p>
+            <w:pPr>
+              <w:jc w:val="center"/>
+            </w:pPr>
+            <w:r>
+              <w:rPr>
+                <w:rFonts w:ascii="Times New Roman" w:hAnsi="Times New Roman"/>
+                <w:b w:val="0"/>
+                <w:i w:val="0"/>
+                <w:color w:val="000000"/>
+                <w:sz w:val="18"/>
+              </w:rPr>
+              <w:t>Ort. AUC</w:t>
+            </w:r>
+          </w:p>
+        </w:tc>
+        <w:tc>
+          <w:tcPr>
+            <w:tcW w:type="dxa" w:w="1881"/>
+            <w:shd w:val="clear" w:color="auto" w:fill="FFFFFF"/>
+          </w:tcPr>
+          <w:p>
+            <w:pPr>
+              <w:jc w:val="center"/>
+            </w:pPr>
+            <w:r>
+              <w:rPr>
+                <w:rFonts w:ascii="Times New Roman" w:hAnsi="Times New Roman"/>
+                <w:b w:val="0"/>
+                <w:i w:val="0"/>
+                <w:color w:val="000000"/>
+                <w:sz w:val="18"/>
+              </w:rPr>
+              <w:t>Std AUC</w:t>
+            </w:r>
+          </w:p>
+        </w:tc>
+        <w:tc>
+          <w:tcPr>
+            <w:tcW w:type="dxa" w:w="1881"/>
+            <w:shd w:val="clear" w:color="auto" w:fill="FFFFFF"/>
+          </w:tcPr>
+          <w:p>
+            <w:pPr>
+              <w:jc w:val="center"/>
+            </w:pPr>
+            <w:r>
+              <w:rPr>
+                <w:rFonts w:ascii="Times New Roman" w:hAnsi="Times New Roman"/>
+                <w:b w:val="0"/>
+                <w:i w:val="0"/>
+                <w:color w:val="000000"/>
+                <w:sz w:val="18"/>
+              </w:rPr>
+              <w:t>Kat Bazlı AUC (5 kat)</w:t>
+            </w:r>
+          </w:p>
+        </w:tc>
+      </w:tr>
+      <w:tr>
+        <w:tc>
+          <w:tcPr>
+            <w:tcW w:type="dxa" w:w="1881"/>
+            <w:shd w:val="clear" w:color="auto" w:fill="FFFFFF"/>
+          </w:tcPr>
+          <w:p>
+            <w:pPr>
+              <w:jc w:val="center"/>
+            </w:pPr>
+            <w:r>
+              <w:rPr>
+                <w:rFonts w:ascii="Times New Roman" w:hAnsi="Times New Roman"/>
+                <w:b w:val="0"/>
+                <w:i w:val="0"/>
+                <w:color w:val="000000"/>
+                <w:sz w:val="18"/>
+              </w:rPr>
+              <w:t>LightGBM</w:t>
+            </w:r>
+          </w:p>
+        </w:tc>
+        <w:tc>
+          <w:tcPr>
+            <w:tcW w:type="dxa" w:w="1881"/>
+            <w:shd w:val="clear" w:color="auto" w:fill="FFFFFF"/>
+          </w:tcPr>
+          <w:p>
+            <w:pPr>
+              <w:jc w:val="center"/>
+            </w:pPr>
+            <w:r>
+              <w:rPr>
+                <w:rFonts w:ascii="Times New Roman" w:hAnsi="Times New Roman"/>
+                <w:b w:val="0"/>
+                <w:i w:val="0"/>
+                <w:color w:val="000000"/>
+                <w:sz w:val="18"/>
+              </w:rPr>
+              <w:t>MÖ</w:t>
+            </w:r>
+          </w:p>
+        </w:tc>
+        <w:tc>
+          <w:tcPr>
+            <w:tcW w:type="dxa" w:w="1881"/>
+            <w:shd w:val="clear" w:color="auto" w:fill="FFFFFF"/>
+          </w:tcPr>
+          <w:p>
+            <w:pPr>
+              <w:jc w:val="center"/>
+            </w:pPr>
+            <w:r>
+              <w:rPr>
+                <w:rFonts w:ascii="Times New Roman" w:hAnsi="Times New Roman"/>
+                <w:b w:val="0"/>
+                <w:i w:val="0"/>
+                <w:color w:val="000000"/>
+                <w:sz w:val="18"/>
+              </w:rPr>
+              <w:t>0,9548</w:t>
+            </w:r>
+          </w:p>
+        </w:tc>
+        <w:tc>
+          <w:tcPr>
+            <w:tcW w:type="dxa" w:w="1881"/>
+            <w:shd w:val="clear" w:color="auto" w:fill="FFFFFF"/>
+          </w:tcPr>
+          <w:p>
+            <w:pPr>
+              <w:jc w:val="center"/>
+            </w:pPr>
+            <w:r>
+              <w:rPr>
+                <w:rFonts w:ascii="Times New Roman" w:hAnsi="Times New Roman"/>
+                <w:b w:val="0"/>
+                <w:i w:val="0"/>
+                <w:color w:val="000000"/>
+                <w:sz w:val="18"/>
+              </w:rPr>
+              <w:t>±0,0023</w:t>
+            </w:r>
+          </w:p>
+        </w:tc>
+        <w:tc>
+          <w:tcPr>
+            <w:tcW w:type="dxa" w:w="1881"/>
+            <w:shd w:val="clear" w:color="auto" w:fill="FFFFFF"/>
+          </w:tcPr>
+          <w:p>
+            <w:pPr>
+              <w:jc w:val="center"/>
+            </w:pPr>
+            <w:r>
+              <w:rPr>
+                <w:rFonts w:ascii="Times New Roman" w:hAnsi="Times New Roman"/>
+                <w:b w:val="0"/>
+                <w:i w:val="0"/>
+                <w:color w:val="000000"/>
+                <w:sz w:val="18"/>
+              </w:rPr>
+              <w:t>0,953; 0,957; 0,952; 0,954; 0,958</w:t>
+            </w:r>
+          </w:p>
+        </w:tc>
+      </w:tr>
+      <w:tr>
+        <w:tc>
+          <w:tcPr>
+            <w:tcW w:type="dxa" w:w="1881"/>
+            <w:shd w:val="clear" w:color="auto" w:fill="FFFFFF"/>
+          </w:tcPr>
+          <w:p>
+            <w:pPr>
+              <w:jc w:val="center"/>
+            </w:pPr>
+            <w:r>
+              <w:rPr>
+                <w:rFonts w:ascii="Times New Roman" w:hAnsi="Times New Roman"/>
+                <w:b w:val="0"/>
+                <w:i w:val="0"/>
+                <w:color w:val="000000"/>
+                <w:sz w:val="18"/>
+              </w:rPr>
+              <w:t>Derin ÇKA (512-256-128-64)</w:t>
+            </w:r>
+          </w:p>
+        </w:tc>
+        <w:tc>
+          <w:tcPr>
+            <w:tcW w:type="dxa" w:w="1881"/>
+            <w:shd w:val="clear" w:color="auto" w:fill="FFFFFF"/>
+          </w:tcPr>
+          <w:p>
+            <w:pPr>
+              <w:jc w:val="center"/>
+            </w:pPr>
+            <w:r>
+              <w:rPr>
+                <w:rFonts w:ascii="Times New Roman" w:hAnsi="Times New Roman"/>
+                <w:b w:val="0"/>
+                <w:i w:val="0"/>
+                <w:color w:val="000000"/>
+                <w:sz w:val="18"/>
+              </w:rPr>
+              <w:t>DÖ</w:t>
+            </w:r>
+          </w:p>
+        </w:tc>
+        <w:tc>
+          <w:tcPr>
+            <w:tcW w:type="dxa" w:w="1881"/>
+            <w:shd w:val="clear" w:color="auto" w:fill="FFFFFF"/>
+          </w:tcPr>
+          <w:p>
+            <w:pPr>
+              <w:jc w:val="center"/>
+            </w:pPr>
+            <w:r>
+              <w:rPr>
+                <w:rFonts w:ascii="Times New Roman" w:hAnsi="Times New Roman"/>
+                <w:b w:val="0"/>
+                <w:i w:val="0"/>
+                <w:color w:val="000000"/>
+                <w:sz w:val="18"/>
+              </w:rPr>
+              <w:t>0,9542</w:t>
+            </w:r>
+          </w:p>
+        </w:tc>
+        <w:tc>
+          <w:tcPr>
+            <w:tcW w:type="dxa" w:w="1881"/>
+            <w:shd w:val="clear" w:color="auto" w:fill="FFFFFF"/>
+          </w:tcPr>
+          <w:p>
+            <w:pPr>
+              <w:jc w:val="center"/>
+            </w:pPr>
+            <w:r>
+              <w:rPr>
+                <w:rFonts w:ascii="Times New Roman" w:hAnsi="Times New Roman"/>
+                <w:b w:val="0"/>
+                <w:i w:val="0"/>
+                <w:color w:val="000000"/>
+                <w:sz w:val="18"/>
+              </w:rPr>
+              <w:t>±0,0036</w:t>
+            </w:r>
+          </w:p>
+        </w:tc>
+        <w:tc>
+          <w:tcPr>
+            <w:tcW w:type="dxa" w:w="1881"/>
+            <w:shd w:val="clear" w:color="auto" w:fill="FFFFFF"/>
+          </w:tcPr>
+          <w:p>
+            <w:pPr>
+              <w:jc w:val="center"/>
+            </w:pPr>
+            <w:r>
+              <w:rPr>
+                <w:rFonts w:ascii="Times New Roman" w:hAnsi="Times New Roman"/>
+                <w:b w:val="0"/>
+                <w:i w:val="0"/>
+                <w:color w:val="000000"/>
+                <w:sz w:val="18"/>
+              </w:rPr>
+              <w:t>0,958; 0,956; 0,951; 0,949; 0,957</w:t>
+            </w:r>
+          </w:p>
+        </w:tc>
+      </w:tr>
+      <w:tr>
+        <w:tc>
+          <w:tcPr>
+            <w:tcW w:type="dxa" w:w="1881"/>
+            <w:shd w:val="clear" w:color="auto" w:fill="FFFFFF"/>
+          </w:tcPr>
+          <w:p>
+            <w:pPr>
+              <w:jc w:val="center"/>
+            </w:pPr>
+            <w:r>
+              <w:rPr>
+                <w:rFonts w:ascii="Times New Roman" w:hAnsi="Times New Roman"/>
+                <w:b w:val="0"/>
+                <w:i w:val="0"/>
+                <w:color w:val="000000"/>
+                <w:sz w:val="18"/>
+              </w:rPr>
+              <w:t>Artık ÇKA (3 blok)</w:t>
+            </w:r>
+          </w:p>
+        </w:tc>
+        <w:tc>
+          <w:tcPr>
+            <w:tcW w:type="dxa" w:w="1881"/>
+            <w:shd w:val="clear" w:color="auto" w:fill="FFFFFF"/>
+          </w:tcPr>
+          <w:p>
+            <w:pPr>
+              <w:jc w:val="center"/>
+            </w:pPr>
+            <w:r>
+              <w:rPr>
+                <w:rFonts w:ascii="Times New Roman" w:hAnsi="Times New Roman"/>
+                <w:b w:val="0"/>
+                <w:i w:val="0"/>
+                <w:color w:val="000000"/>
+                <w:sz w:val="18"/>
+              </w:rPr>
+              <w:t>DÖ</w:t>
+            </w:r>
+          </w:p>
+        </w:tc>
+        <w:tc>
+          <w:tcPr>
+            <w:tcW w:type="dxa" w:w="1881"/>
+            <w:shd w:val="clear" w:color="auto" w:fill="FFFFFF"/>
+          </w:tcPr>
+          <w:p>
+            <w:pPr>
+              <w:jc w:val="center"/>
+            </w:pPr>
+            <w:r>
+              <w:rPr>
+                <w:rFonts w:ascii="Times New Roman" w:hAnsi="Times New Roman"/>
+                <w:b w:val="0"/>
+                <w:i w:val="0"/>
+                <w:color w:val="000000"/>
+                <w:sz w:val="18"/>
+              </w:rPr>
+              <w:t>0,9485</w:t>
+            </w:r>
+          </w:p>
+        </w:tc>
+        <w:tc>
+          <w:tcPr>
+            <w:tcW w:type="dxa" w:w="1881"/>
+            <w:shd w:val="clear" w:color="auto" w:fill="FFFFFF"/>
+          </w:tcPr>
+          <w:p>
+            <w:pPr>
+              <w:jc w:val="center"/>
+            </w:pPr>
+            <w:r>
+              <w:rPr>
+                <w:rFonts w:ascii="Times New Roman" w:hAnsi="Times New Roman"/>
+                <w:b w:val="0"/>
+                <w:i w:val="0"/>
+                <w:color w:val="000000"/>
+                <w:sz w:val="18"/>
+              </w:rPr>
+              <w:t>±0,0044</w:t>
+            </w:r>
+          </w:p>
+        </w:tc>
+        <w:tc>
+          <w:tcPr>
+            <w:tcW w:type="dxa" w:w="1881"/>
+            <w:shd w:val="clear" w:color="auto" w:fill="FFFFFF"/>
+          </w:tcPr>
+          <w:p>
+            <w:pPr>
+              <w:jc w:val="center"/>
+            </w:pPr>
+            <w:r>
+              <w:rPr>
+                <w:rFonts w:ascii="Times New Roman" w:hAnsi="Times New Roman"/>
+                <w:b w:val="0"/>
+                <w:i w:val="0"/>
+                <w:color w:val="000000"/>
+                <w:sz w:val="18"/>
+              </w:rPr>
+              <w:t>0,952; 0,949; 0,947; 0,941; 0,953</w:t>
+            </w:r>
+          </w:p>
+        </w:tc>
+      </w:tr>
+      <w:tr>
+        <w:tc>
+          <w:tcPr>
+            <w:tcW w:type="dxa" w:w="1881"/>
+            <w:shd w:val="clear" w:color="auto" w:fill="FFFFFF"/>
+          </w:tcPr>
+          <w:p>
+            <w:pPr>
+              <w:jc w:val="center"/>
+            </w:pPr>
+            <w:r>
+              <w:rPr>
+                <w:rFonts w:ascii="Times New Roman" w:hAnsi="Times New Roman"/>
+                <w:b w:val="0"/>
+                <w:i w:val="0"/>
+                <w:color w:val="000000"/>
+                <w:sz w:val="18"/>
+              </w:rPr>
+              <w:t>XGBoost</w:t>
+            </w:r>
+          </w:p>
+        </w:tc>
+        <w:tc>
+          <w:tcPr>
+            <w:tcW w:type="dxa" w:w="1881"/>
+            <w:shd w:val="clear" w:color="auto" w:fill="FFFFFF"/>
+          </w:tcPr>
+          <w:p>
+            <w:pPr>
+              <w:jc w:val="center"/>
+            </w:pPr>
+            <w:r>
+              <w:rPr>
+                <w:rFonts w:ascii="Times New Roman" w:hAnsi="Times New Roman"/>
+                <w:b w:val="0"/>
+                <w:i w:val="0"/>
+                <w:color w:val="000000"/>
+                <w:sz w:val="18"/>
+              </w:rPr>
+              <w:t>MÖ</w:t>
+            </w:r>
+          </w:p>
+        </w:tc>
+        <w:tc>
+          <w:tcPr>
+            <w:tcW w:type="dxa" w:w="1881"/>
+            <w:shd w:val="clear" w:color="auto" w:fill="FFFFFF"/>
+          </w:tcPr>
+          <w:p>
+            <w:pPr>
+              <w:jc w:val="center"/>
+            </w:pPr>
+            <w:r>
+              <w:rPr>
+                <w:rFonts w:ascii="Times New Roman" w:hAnsi="Times New Roman"/>
+                <w:b w:val="0"/>
+                <w:i w:val="0"/>
+                <w:color w:val="000000"/>
+                <w:sz w:val="18"/>
+              </w:rPr>
+              <w:t>0,9465</w:t>
+            </w:r>
+          </w:p>
+        </w:tc>
+        <w:tc>
+          <w:tcPr>
+            <w:tcW w:type="dxa" w:w="1881"/>
+            <w:shd w:val="clear" w:color="auto" w:fill="FFFFFF"/>
+          </w:tcPr>
+          <w:p>
+            <w:pPr>
+              <w:jc w:val="center"/>
+            </w:pPr>
+            <w:r>
+              <w:rPr>
+                <w:rFonts w:ascii="Times New Roman" w:hAnsi="Times New Roman"/>
+                <w:b w:val="0"/>
+                <w:i w:val="0"/>
+                <w:color w:val="000000"/>
+                <w:sz w:val="18"/>
+              </w:rPr>
+              <w:t>±0,0029</w:t>
+            </w:r>
+          </w:p>
+        </w:tc>
+        <w:tc>
+          <w:tcPr>
+            <w:tcW w:type="dxa" w:w="1881"/>
+            <w:shd w:val="clear" w:color="auto" w:fill="FFFFFF"/>
+          </w:tcPr>
+          <w:p>
+            <w:pPr>
+              <w:jc w:val="center"/>
+            </w:pPr>
+            <w:r>
+              <w:rPr>
+                <w:rFonts w:ascii="Times New Roman" w:hAnsi="Times New Roman"/>
+                <w:b w:val="0"/>
+                <w:i w:val="0"/>
+                <w:color w:val="000000"/>
+                <w:sz w:val="18"/>
+              </w:rPr>
+              <w:t>0,947; 0,951; 0,940; 0,942; 0,946</w:t>
+            </w:r>
+          </w:p>
+        </w:tc>
+      </w:tr>
+      <w:tr>
+        <w:tc>
+          <w:tcPr>
+            <w:tcW w:type="dxa" w:w="1881"/>
+            <w:shd w:val="clear" w:color="auto" w:fill="FFFFFF"/>
+          </w:tcPr>
+          <w:p>
+            <w:pPr>
+              <w:jc w:val="center"/>
+            </w:pPr>
+            <w:r>
+              <w:rPr>
+                <w:rFonts w:ascii="Times New Roman" w:hAnsi="Times New Roman"/>
+                <w:b w:val="0"/>
+                <w:i w:val="0"/>
+                <w:color w:val="000000"/>
+                <w:sz w:val="18"/>
+              </w:rPr>
+              <w:t>Gradyan Artırma</w:t>
+            </w:r>
+          </w:p>
+        </w:tc>
+        <w:tc>
+          <w:tcPr>
+            <w:tcW w:type="dxa" w:w="1881"/>
+            <w:shd w:val="clear" w:color="auto" w:fill="FFFFFF"/>
+          </w:tcPr>
+          <w:p>
+            <w:pPr>
+              <w:jc w:val="center"/>
+            </w:pPr>
+            <w:r>
+              <w:rPr>
+                <w:rFonts w:ascii="Times New Roman" w:hAnsi="Times New Roman"/>
+                <w:b w:val="0"/>
+                <w:i w:val="0"/>
+                <w:color w:val="000000"/>
+                <w:sz w:val="18"/>
+              </w:rPr>
+              <w:t>MÖ</w:t>
+            </w:r>
+          </w:p>
+        </w:tc>
+        <w:tc>
+          <w:tcPr>
+            <w:tcW w:type="dxa" w:w="1881"/>
+            <w:shd w:val="clear" w:color="auto" w:fill="FFFFFF"/>
+          </w:tcPr>
+          <w:p>
+            <w:pPr>
+              <w:jc w:val="center"/>
+            </w:pPr>
+            <w:r>
+              <w:rPr>
+                <w:rFonts w:ascii="Times New Roman" w:hAnsi="Times New Roman"/>
+                <w:b w:val="0"/>
+                <w:i w:val="0"/>
+                <w:color w:val="000000"/>
+                <w:sz w:val="18"/>
+              </w:rPr>
+              <w:t>0,9397</w:t>
+            </w:r>
+          </w:p>
+        </w:tc>
+        <w:tc>
+          <w:tcPr>
+            <w:tcW w:type="dxa" w:w="1881"/>
+            <w:shd w:val="clear" w:color="auto" w:fill="FFFFFF"/>
+          </w:tcPr>
+          <w:p>
+            <w:pPr>
+              <w:jc w:val="center"/>
+            </w:pPr>
+            <w:r>
+              <w:rPr>
+                <w:rFonts w:ascii="Times New Roman" w:hAnsi="Times New Roman"/>
+                <w:b w:val="0"/>
+                <w:i w:val="0"/>
+                <w:color w:val="000000"/>
+                <w:sz w:val="18"/>
+              </w:rPr>
+              <w:t>±0,0038</w:t>
+            </w:r>
+          </w:p>
+        </w:tc>
+        <w:tc>
+          <w:tcPr>
+            <w:tcW w:type="dxa" w:w="1881"/>
+            <w:shd w:val="clear" w:color="auto" w:fill="FFFFFF"/>
+          </w:tcPr>
+          <w:p>
+            <w:pPr>
+              <w:jc w:val="center"/>
+            </w:pPr>
+            <w:r>
+              <w:rPr>
+                <w:rFonts w:ascii="Times New Roman" w:hAnsi="Times New Roman"/>
+                <w:b w:val="0"/>
+                <w:i w:val="0"/>
+                <w:color w:val="000000"/>
+                <w:sz w:val="18"/>
+              </w:rPr>
+              <w:t>0,938; 0,947; 0,936; 0,937; 0,941</w:t>
+            </w:r>
+          </w:p>
+        </w:tc>
+      </w:tr>
+      <w:tr>
+        <w:tc>
+          <w:tcPr>
+            <w:tcW w:type="dxa" w:w="1881"/>
+            <w:shd w:val="clear" w:color="auto" w:fill="FFFFFF"/>
+          </w:tcPr>
+          <w:p>
+            <w:pPr>
+              <w:jc w:val="center"/>
+            </w:pPr>
+            <w:r>
+              <w:rPr>
+                <w:rFonts w:ascii="Times New Roman" w:hAnsi="Times New Roman"/>
+                <w:b w:val="0"/>
+                <w:i w:val="0"/>
+                <w:color w:val="000000"/>
+                <w:sz w:val="18"/>
+              </w:rPr>
+              <w:t>Rastgele Orman</w:t>
+            </w:r>
+          </w:p>
+        </w:tc>
+        <w:tc>
+          <w:tcPr>
+            <w:tcW w:type="dxa" w:w="1881"/>
+            <w:shd w:val="clear" w:color="auto" w:fill="FFFFFF"/>
+          </w:tcPr>
+          <w:p>
+            <w:pPr>
+              <w:jc w:val="center"/>
+            </w:pPr>
+            <w:r>
+              <w:rPr>
+                <w:rFonts w:ascii="Times New Roman" w:hAnsi="Times New Roman"/>
+                <w:b w:val="0"/>
+                <w:i w:val="0"/>
+                <w:color w:val="000000"/>
+                <w:sz w:val="18"/>
+              </w:rPr>
+              <w:t>MÖ</w:t>
+            </w:r>
+          </w:p>
+        </w:tc>
+        <w:tc>
+          <w:tcPr>
+            <w:tcW w:type="dxa" w:w="1881"/>
+            <w:shd w:val="clear" w:color="auto" w:fill="FFFFFF"/>
+          </w:tcPr>
+          <w:p>
+            <w:pPr>
+              <w:jc w:val="center"/>
+            </w:pPr>
+            <w:r>
+              <w:rPr>
+                <w:rFonts w:ascii="Times New Roman" w:hAnsi="Times New Roman"/>
+                <w:b w:val="0"/>
+                <w:i w:val="0"/>
+                <w:color w:val="000000"/>
+                <w:sz w:val="18"/>
+              </w:rPr>
+              <w:t>0,9394</w:t>
+            </w:r>
+          </w:p>
+        </w:tc>
+        <w:tc>
+          <w:tcPr>
+            <w:tcW w:type="dxa" w:w="1881"/>
+            <w:shd w:val="clear" w:color="auto" w:fill="FFFFFF"/>
+          </w:tcPr>
+          <w:p>
+            <w:pPr>
+              <w:jc w:val="center"/>
+            </w:pPr>
+            <w:r>
+              <w:rPr>
+                <w:rFonts w:ascii="Times New Roman" w:hAnsi="Times New Roman"/>
+                <w:b w:val="0"/>
+                <w:i w:val="0"/>
+                <w:color w:val="000000"/>
+                <w:sz w:val="18"/>
+              </w:rPr>
+              <w:t>±0,0006</w:t>
+            </w:r>
+          </w:p>
+        </w:tc>
+        <w:tc>
+          <w:tcPr>
+            <w:tcW w:type="dxa" w:w="1881"/>
+            <w:shd w:val="clear" w:color="auto" w:fill="FFFFFF"/>
+          </w:tcPr>
+          <w:p>
+            <w:pPr>
+              <w:jc w:val="center"/>
+            </w:pPr>
+            <w:r>
+              <w:rPr>
+                <w:rFonts w:ascii="Times New Roman" w:hAnsi="Times New Roman"/>
+                <w:b w:val="0"/>
+                <w:i w:val="0"/>
+                <w:color w:val="000000"/>
+                <w:sz w:val="18"/>
+              </w:rPr>
+              <w:t>0,944; 0,947; 0,938; 0,928; 0,941</w:t>
+            </w:r>
+          </w:p>
+        </w:tc>
+      </w:tr>
+      <w:tr>
+        <w:tc>
+          <w:tcPr>
+            <w:tcW w:type="dxa" w:w="1881"/>
+            <w:shd w:val="clear" w:color="auto" w:fill="FFFFFF"/>
+          </w:tcPr>
+          <w:p>
+            <w:pPr>
+              <w:jc w:val="center"/>
+            </w:pPr>
+            <w:r>
+              <w:rPr>
+                <w:rFonts w:ascii="Times New Roman" w:hAnsi="Times New Roman"/>
+                <w:b w:val="0"/>
+                <w:i w:val="0"/>
+                <w:color w:val="000000"/>
+                <w:sz w:val="18"/>
+              </w:rPr>
+              <w:t>Dikkat ÇKA</w:t>
+            </w:r>
+          </w:p>
+        </w:tc>
+        <w:tc>
+          <w:tcPr>
+            <w:tcW w:type="dxa" w:w="1881"/>
+            <w:shd w:val="clear" w:color="auto" w:fill="FFFFFF"/>
+          </w:tcPr>
+          <w:p>
+            <w:pPr>
+              <w:jc w:val="center"/>
+            </w:pPr>
+            <w:r>
+              <w:rPr>
+                <w:rFonts w:ascii="Times New Roman" w:hAnsi="Times New Roman"/>
+                <w:b w:val="0"/>
+                <w:i w:val="0"/>
+                <w:color w:val="000000"/>
+                <w:sz w:val="18"/>
+              </w:rPr>
+              <w:t>DÖ</w:t>
+            </w:r>
+          </w:p>
+        </w:tc>
+        <w:tc>
+          <w:tcPr>
+            <w:tcW w:type="dxa" w:w="1881"/>
+            <w:shd w:val="clear" w:color="auto" w:fill="FFFFFF"/>
+          </w:tcPr>
+          <w:p>
+            <w:pPr>
+              <w:jc w:val="center"/>
+            </w:pPr>
+            <w:r>
+              <w:rPr>
+                <w:rFonts w:ascii="Times New Roman" w:hAnsi="Times New Roman"/>
+                <w:b w:val="0"/>
+                <w:i w:val="0"/>
+                <w:color w:val="000000"/>
+                <w:sz w:val="18"/>
+              </w:rPr>
+              <w:t>0,9359</w:t>
+            </w:r>
+          </w:p>
+        </w:tc>
+        <w:tc>
+          <w:tcPr>
+            <w:tcW w:type="dxa" w:w="1881"/>
+            <w:shd w:val="clear" w:color="auto" w:fill="FFFFFF"/>
+          </w:tcPr>
+          <w:p>
+            <w:pPr>
+              <w:jc w:val="center"/>
+            </w:pPr>
+            <w:r>
+              <w:rPr>
+                <w:rFonts w:ascii="Times New Roman" w:hAnsi="Times New Roman"/>
+                <w:b w:val="0"/>
+                <w:i w:val="0"/>
+                <w:color w:val="000000"/>
+                <w:sz w:val="18"/>
+              </w:rPr>
+              <w:t>±0,0056</w:t>
+            </w:r>
+          </w:p>
+        </w:tc>
+        <w:tc>
+          <w:tcPr>
+            <w:tcW w:type="dxa" w:w="1881"/>
+            <w:shd w:val="clear" w:color="auto" w:fill="FFFFFF"/>
+          </w:tcPr>
+          <w:p>
+            <w:pPr>
+              <w:jc w:val="center"/>
+            </w:pPr>
+            <w:r>
+              <w:rPr>
+                <w:rFonts w:ascii="Times New Roman" w:hAnsi="Times New Roman"/>
+                <w:b w:val="0"/>
+                <w:i w:val="0"/>
+                <w:color w:val="000000"/>
+                <w:sz w:val="18"/>
+              </w:rPr>
+              <w:t>0,932; 0,946; 0,938; 0,932; 0,932</w:t>
+            </w:r>
+          </w:p>
+        </w:tc>
+      </w:tr>
+      <w:tr>
+        <w:tc>
+          <w:tcPr>
+            <w:tcW w:type="dxa" w:w="1881"/>
+            <w:shd w:val="clear" w:color="auto" w:fill="FFFFFF"/>
+          </w:tcPr>
+          <w:p>
+            <w:pPr>
+              <w:jc w:val="center"/>
+            </w:pPr>
+            <w:r>
+              <w:rPr>
+                <w:rFonts w:ascii="Times New Roman" w:hAnsi="Times New Roman"/>
+                <w:b w:val="0"/>
+                <w:i w:val="0"/>
+                <w:color w:val="000000"/>
+                <w:sz w:val="18"/>
+              </w:rPr>
+              <w:t>SVM (RBF)</w:t>
+            </w:r>
+          </w:p>
+        </w:tc>
+        <w:tc>
+          <w:tcPr>
+            <w:tcW w:type="dxa" w:w="1881"/>
+            <w:shd w:val="clear" w:color="auto" w:fill="FFFFFF"/>
+          </w:tcPr>
+          <w:p>
+            <w:pPr>
+              <w:jc w:val="center"/>
+            </w:pPr>
+            <w:r>
+              <w:rPr>
+                <w:rFonts w:ascii="Times New Roman" w:hAnsi="Times New Roman"/>
+                <w:b w:val="0"/>
+                <w:i w:val="0"/>
+                <w:color w:val="000000"/>
+                <w:sz w:val="18"/>
+              </w:rPr>
+              <w:t>MÖ</w:t>
+            </w:r>
+          </w:p>
+        </w:tc>
+        <w:tc>
+          <w:tcPr>
+            <w:tcW w:type="dxa" w:w="1881"/>
+            <w:shd w:val="clear" w:color="auto" w:fill="FFFFFF"/>
+          </w:tcPr>
+          <w:p>
+            <w:pPr>
+              <w:jc w:val="center"/>
+            </w:pPr>
+            <w:r>
+              <w:rPr>
+                <w:rFonts w:ascii="Times New Roman" w:hAnsi="Times New Roman"/>
+                <w:b w:val="0"/>
+                <w:i w:val="0"/>
+                <w:color w:val="000000"/>
+                <w:sz w:val="18"/>
+              </w:rPr>
+              <w:t>0,9346</w:t>
+            </w:r>
+          </w:p>
+        </w:tc>
+        <w:tc>
+          <w:tcPr>
+            <w:tcW w:type="dxa" w:w="1881"/>
+            <w:shd w:val="clear" w:color="auto" w:fill="FFFFFF"/>
+          </w:tcPr>
+          <w:p>
+            <w:pPr>
+              <w:jc w:val="center"/>
+            </w:pPr>
+            <w:r>
+              <w:rPr>
+                <w:rFonts w:ascii="Times New Roman" w:hAnsi="Times New Roman"/>
+                <w:b w:val="0"/>
+                <w:i w:val="0"/>
+                <w:color w:val="000000"/>
+                <w:sz w:val="18"/>
+              </w:rPr>
+              <w:t>±0,0075</w:t>
+            </w:r>
+          </w:p>
+        </w:tc>
+        <w:tc>
+          <w:tcPr>
+            <w:tcW w:type="dxa" w:w="1881"/>
+            <w:shd w:val="clear" w:color="auto" w:fill="FFFFFF"/>
+          </w:tcPr>
+          <w:p>
+            <w:pPr>
+              <w:jc w:val="center"/>
+            </w:pPr>
+            <w:r>
+              <w:rPr>
+                <w:rFonts w:ascii="Times New Roman" w:hAnsi="Times New Roman"/>
+                <w:b w:val="0"/>
+                <w:i w:val="0"/>
+                <w:color w:val="000000"/>
+                <w:sz w:val="18"/>
+              </w:rPr>
+              <w:t>0,939; 0,935; 0,938; 0,920; 0,941</w:t>
+            </w:r>
+          </w:p>
+        </w:tc>
+      </w:tr>
+      <w:tr>
+        <w:tc>
+          <w:tcPr>
+            <w:tcW w:type="dxa" w:w="1881"/>
+            <w:shd w:val="clear" w:color="auto" w:fill="FFFFFF"/>
+          </w:tcPr>
+          <w:p>
+            <w:pPr>
+              <w:jc w:val="center"/>
+            </w:pPr>
+            <w:r>
+              <w:rPr>
+                <w:rFonts w:ascii="Times New Roman" w:hAnsi="Times New Roman"/>
+                <w:b w:val="0"/>
+                <w:i w:val="0"/>
+                <w:color w:val="000000"/>
+                <w:sz w:val="18"/>
+              </w:rPr>
+              <w:t>ÇKA Sinir Ağı</w:t>
+            </w:r>
+          </w:p>
+        </w:tc>
+        <w:tc>
+          <w:tcPr>
+            <w:tcW w:type="dxa" w:w="1881"/>
+            <w:shd w:val="clear" w:color="auto" w:fill="FFFFFF"/>
+          </w:tcPr>
+          <w:p>
+            <w:pPr>
+              <w:jc w:val="center"/>
+            </w:pPr>
+            <w:r>
+              <w:rPr>
+                <w:rFonts w:ascii="Times New Roman" w:hAnsi="Times New Roman"/>
+                <w:b w:val="0"/>
+                <w:i w:val="0"/>
+                <w:color w:val="000000"/>
+                <w:sz w:val="18"/>
+              </w:rPr>
+              <w:t>MÖ</w:t>
+            </w:r>
+          </w:p>
+        </w:tc>
+        <w:tc>
+          <w:tcPr>
+            <w:tcW w:type="dxa" w:w="1881"/>
+            <w:shd w:val="clear" w:color="auto" w:fill="FFFFFF"/>
+          </w:tcPr>
+          <w:p>
+            <w:pPr>
+              <w:jc w:val="center"/>
+            </w:pPr>
+            <w:r>
+              <w:rPr>
+                <w:rFonts w:ascii="Times New Roman" w:hAnsi="Times New Roman"/>
+                <w:b w:val="0"/>
+                <w:i w:val="0"/>
+                <w:color w:val="000000"/>
+                <w:sz w:val="18"/>
+              </w:rPr>
+              <w:t>0,9276</w:t>
+            </w:r>
+          </w:p>
+        </w:tc>
+        <w:tc>
+          <w:tcPr>
+            <w:tcW w:type="dxa" w:w="1881"/>
+            <w:shd w:val="clear" w:color="auto" w:fill="FFFFFF"/>
+          </w:tcPr>
+          <w:p>
+            <w:pPr>
+              <w:jc w:val="center"/>
+            </w:pPr>
+            <w:r>
+              <w:rPr>
+                <w:rFonts w:ascii="Times New Roman" w:hAnsi="Times New Roman"/>
+                <w:b w:val="0"/>
+                <w:i w:val="0"/>
+                <w:color w:val="000000"/>
+                <w:sz w:val="18"/>
+              </w:rPr>
+              <w:t>±0,0060</w:t>
+            </w:r>
+          </w:p>
+        </w:tc>
+        <w:tc>
+          <w:tcPr>
+            <w:tcW w:type="dxa" w:w="1881"/>
+            <w:shd w:val="clear" w:color="auto" w:fill="FFFFFF"/>
+          </w:tcPr>
+          <w:p>
+            <w:pPr>
+              <w:jc w:val="center"/>
+            </w:pPr>
+            <w:r>
+              <w:rPr>
+                <w:rFonts w:ascii="Times New Roman" w:hAnsi="Times New Roman"/>
+                <w:b w:val="0"/>
+                <w:i w:val="0"/>
+                <w:color w:val="000000"/>
+                <w:sz w:val="18"/>
+              </w:rPr>
+              <w:t>0,920; 0,934; 0,935; 0,922; 0,927</w:t>
+            </w:r>
+          </w:p>
+        </w:tc>
+      </w:tr>
+      <w:tr>
+        <w:tc>
+          <w:tcPr>
+            <w:tcW w:type="dxa" w:w="1881"/>
+            <w:shd w:val="clear" w:color="auto" w:fill="FFFFFF"/>
+          </w:tcPr>
+          <w:p>
+            <w:pPr>
+              <w:jc w:val="center"/>
+            </w:pPr>
+            <w:r>
+              <w:rPr>
+                <w:rFonts w:ascii="Times New Roman" w:hAnsi="Times New Roman"/>
+                <w:b w:val="0"/>
+                <w:i w:val="0"/>
+                <w:color w:val="000000"/>
+                <w:sz w:val="18"/>
+              </w:rPr>
+              <w:t>1B-ESA</w:t>
+            </w:r>
+          </w:p>
+        </w:tc>
+        <w:tc>
+          <w:tcPr>
+            <w:tcW w:type="dxa" w:w="1881"/>
+            <w:shd w:val="clear" w:color="auto" w:fill="FFFFFF"/>
+          </w:tcPr>
+          <w:p>
+            <w:pPr>
+              <w:jc w:val="center"/>
+            </w:pPr>
+            <w:r>
+              <w:rPr>
+                <w:rFonts w:ascii="Times New Roman" w:hAnsi="Times New Roman"/>
+                <w:b w:val="0"/>
+                <w:i w:val="0"/>
+                <w:color w:val="000000"/>
+                <w:sz w:val="18"/>
+              </w:rPr>
+              <w:t>DÖ</w:t>
+            </w:r>
+          </w:p>
+        </w:tc>
+        <w:tc>
+          <w:tcPr>
+            <w:tcW w:type="dxa" w:w="1881"/>
+            <w:shd w:val="clear" w:color="auto" w:fill="FFFFFF"/>
+          </w:tcPr>
+          <w:p>
+            <w:pPr>
+              <w:jc w:val="center"/>
+            </w:pPr>
+            <w:r>
+              <w:rPr>
+                <w:rFonts w:ascii="Times New Roman" w:hAnsi="Times New Roman"/>
+                <w:b w:val="0"/>
+                <w:i w:val="0"/>
+                <w:color w:val="000000"/>
+                <w:sz w:val="18"/>
+              </w:rPr>
+              <w:t>0,8543</w:t>
+            </w:r>
+          </w:p>
+        </w:tc>
+        <w:tc>
+          <w:tcPr>
+            <w:tcW w:type="dxa" w:w="1881"/>
+            <w:shd w:val="clear" w:color="auto" w:fill="FFFFFF"/>
+          </w:tcPr>
+          <w:p>
+            <w:pPr>
+              <w:jc w:val="center"/>
+            </w:pPr>
+            <w:r>
+              <w:rPr>
+                <w:rFonts w:ascii="Times New Roman" w:hAnsi="Times New Roman"/>
+                <w:b w:val="0"/>
+                <w:i w:val="0"/>
+                <w:color w:val="000000"/>
+                <w:sz w:val="18"/>
+              </w:rPr>
+              <w:t>±0,0087</w:t>
+            </w:r>
+          </w:p>
+        </w:tc>
+        <w:tc>
+          <w:tcPr>
+            <w:tcW w:type="dxa" w:w="1881"/>
+            <w:shd w:val="clear" w:color="auto" w:fill="FFFFFF"/>
+          </w:tcPr>
+          <w:p>
+            <w:pPr>
+              <w:jc w:val="center"/>
+            </w:pPr>
+            <w:r>
+              <w:rPr>
+                <w:rFonts w:ascii="Times New Roman" w:hAnsi="Times New Roman"/>
+                <w:b w:val="0"/>
+                <w:i w:val="0"/>
+                <w:color w:val="000000"/>
+                <w:sz w:val="18"/>
+              </w:rPr>
+              <w:t>0,858; 0,865; 0,859; 0,839; 0,850</w:t>
+            </w:r>
+          </w:p>
+        </w:tc>
+      </w:tr>
+      <w:tr>
+        <w:tc>
+          <w:tcPr>
+            <w:tcW w:type="dxa" w:w="1881"/>
+            <w:shd w:val="clear" w:color="auto" w:fill="FFFFFF"/>
+          </w:tcPr>
+          <w:p>
+            <w:pPr>
+              <w:jc w:val="center"/>
+            </w:pPr>
+            <w:r>
+              <w:rPr>
+                <w:rFonts w:ascii="Times New Roman" w:hAnsi="Times New Roman"/>
+                <w:b w:val="0"/>
+                <w:i w:val="0"/>
+                <w:color w:val="000000"/>
+                <w:sz w:val="18"/>
+              </w:rPr>
+              <w:t>Lojistik Regresyon</w:t>
+            </w:r>
+          </w:p>
+        </w:tc>
+        <w:tc>
+          <w:tcPr>
+            <w:tcW w:type="dxa" w:w="1881"/>
+            <w:shd w:val="clear" w:color="auto" w:fill="FFFFFF"/>
+          </w:tcPr>
+          <w:p>
+            <w:pPr>
+              <w:jc w:val="center"/>
+            </w:pPr>
+            <w:r>
+              <w:rPr>
+                <w:rFonts w:ascii="Times New Roman" w:hAnsi="Times New Roman"/>
+                <w:b w:val="0"/>
+                <w:i w:val="0"/>
+                <w:color w:val="000000"/>
+                <w:sz w:val="18"/>
+              </w:rPr>
+              <w:t>MÖ</w:t>
+            </w:r>
+          </w:p>
+        </w:tc>
+        <w:tc>
+          <w:tcPr>
+            <w:tcW w:type="dxa" w:w="1881"/>
+            <w:shd w:val="clear" w:color="auto" w:fill="FFFFFF"/>
+          </w:tcPr>
+          <w:p>
+            <w:pPr>
+              <w:jc w:val="center"/>
+            </w:pPr>
+            <w:r>
+              <w:rPr>
+                <w:rFonts w:ascii="Times New Roman" w:hAnsi="Times New Roman"/>
+                <w:b w:val="0"/>
+                <w:i w:val="0"/>
+                <w:color w:val="000000"/>
+                <w:sz w:val="18"/>
+              </w:rPr>
+              <w:t>0,8515</w:t>
+            </w:r>
+          </w:p>
+        </w:tc>
+        <w:tc>
+          <w:tcPr>
+            <w:tcW w:type="dxa" w:w="1881"/>
+            <w:shd w:val="clear" w:color="auto" w:fill="FFFFFF"/>
+          </w:tcPr>
+          <w:p>
+            <w:pPr>
+              <w:jc w:val="center"/>
+            </w:pPr>
+            <w:r>
+              <w:rPr>
+                <w:rFonts w:ascii="Times New Roman" w:hAnsi="Times New Roman"/>
+                <w:b w:val="0"/>
+                <w:i w:val="0"/>
+                <w:color w:val="000000"/>
+                <w:sz w:val="18"/>
+              </w:rPr>
+              <w:t>±0,0068</w:t>
+            </w:r>
+          </w:p>
+        </w:tc>
+        <w:tc>
+          <w:tcPr>
+            <w:tcW w:type="dxa" w:w="1881"/>
+            <w:shd w:val="clear" w:color="auto" w:fill="FFFFFF"/>
+          </w:tcPr>
+          <w:p>
+            <w:pPr>
+              <w:jc w:val="center"/>
+            </w:pPr>
+            <w:r>
+              <w:rPr>
+                <w:rFonts w:ascii="Times New Roman" w:hAnsi="Times New Roman"/>
+                <w:b w:val="0"/>
+                <w:i w:val="0"/>
+                <w:color w:val="000000"/>
+                <w:sz w:val="18"/>
+              </w:rPr>
+              <w:t>0,848; 0,863; 0,856; 0,847; 0,844</w:t>
+            </w:r>
+          </w:p>
+        </w:tc>
+      </w:tr>
+    </w:tbl>
+    <w:tbl>
+      <w:tblPr>
         <w:tblStyle w:val="DzTablo2"/>
         <w:tblW w:w="0" w:type="auto"/>
         <w:tblLook w:val="04A0" w:firstRow="1" w:lastRow="0" w:firstColumn="1" w:lastColumn="0" w:noHBand="0" w:noVBand="1"/>
@@ -6294,6 +7593,673 @@
       </w:r>
     </w:p>
     <w:p>
+      <w:r>
+        <w:rPr>
+          <w:rFonts w:ascii="Times New Roman" w:hAnsi="Times New Roman"/>
+          <w:sz w:val="18"/>
+          <w:szCs w:val="18"/>
+        </w:rPr>
+        <w:t xml:space="preserve">Tablo 4. LightGBM 5-katlı çapraz doğrulama sınıflandırma raporu (LightGBM 5-fold cross-validation classification report)</w:t>
+      </w:r>
+    </w:p>
+    <w:tbl>
+      <w:tblPr>
+        <w:tblStyle w:val="TabloKlavuzu"/>
+        <w:tblW w:type="auto" w:w="0"/>
+        <w:jc w:val="center"/>
+        <w:tblLook w:firstColumn="1" w:firstRow="1" w:lastColumn="0" w:lastRow="0" w:noHBand="0" w:noVBand="1" w:val="04A0"/>
+      </w:tblPr>
+      <w:tblGrid>
+        <w:gridCol w:w="1881"/>
+        <w:gridCol w:w="1881"/>
+        <w:gridCol w:w="1881"/>
+        <w:gridCol w:w="1881"/>
+        <w:gridCol w:w="1881"/>
+      </w:tblGrid>
+      <w:tr>
+        <w:tc>
+          <w:tcPr>
+            <w:tcW w:type="dxa" w:w="1881"/>
+            <w:shd w:val="clear" w:color="auto" w:fill="FFFFFF"/>
+          </w:tcPr>
+          <w:p>
+            <w:pPr>
+              <w:jc w:val="center"/>
+            </w:pPr>
+            <w:r>
+              <w:rPr>
+                <w:rFonts w:ascii="Times New Roman" w:hAnsi="Times New Roman"/>
+                <w:b w:val="0"/>
+                <w:i w:val="0"/>
+                <w:color w:val="000000"/>
+                <w:sz w:val="18"/>
+              </w:rPr>
+              <w:t>Sınıf</w:t>
+            </w:r>
+          </w:p>
+        </w:tc>
+        <w:tc>
+          <w:tcPr>
+            <w:tcW w:type="dxa" w:w="1881"/>
+            <w:shd w:val="clear" w:color="auto" w:fill="FFFFFF"/>
+          </w:tcPr>
+          <w:p>
+            <w:pPr>
+              <w:jc w:val="center"/>
+            </w:pPr>
+            <w:r>
+              <w:rPr>
+                <w:rFonts w:ascii="Times New Roman" w:hAnsi="Times New Roman"/>
+                <w:b w:val="0"/>
+                <w:i w:val="0"/>
+                <w:color w:val="000000"/>
+                <w:sz w:val="18"/>
+              </w:rPr>
+              <w:t>Kesinlik</w:t>
+            </w:r>
+          </w:p>
+        </w:tc>
+        <w:tc>
+          <w:tcPr>
+            <w:tcW w:type="dxa" w:w="1881"/>
+            <w:shd w:val="clear" w:color="auto" w:fill="FFFFFF"/>
+          </w:tcPr>
+          <w:p>
+            <w:pPr>
+              <w:jc w:val="center"/>
+            </w:pPr>
+            <w:r>
+              <w:rPr>
+                <w:rFonts w:ascii="Times New Roman" w:hAnsi="Times New Roman"/>
+                <w:b w:val="0"/>
+                <w:i w:val="0"/>
+                <w:color w:val="000000"/>
+                <w:sz w:val="18"/>
+              </w:rPr>
+              <w:t>Duyarlılık</w:t>
+            </w:r>
+          </w:p>
+        </w:tc>
+        <w:tc>
+          <w:tcPr>
+            <w:tcW w:type="dxa" w:w="1881"/>
+            <w:shd w:val="clear" w:color="auto" w:fill="FFFFFF"/>
+          </w:tcPr>
+          <w:p>
+            <w:pPr>
+              <w:jc w:val="center"/>
+            </w:pPr>
+            <w:r>
+              <w:rPr>
+                <w:rFonts w:ascii="Times New Roman" w:hAnsi="Times New Roman"/>
+                <w:b w:val="0"/>
+                <w:i w:val="0"/>
+                <w:color w:val="000000"/>
+                <w:sz w:val="18"/>
+              </w:rPr>
+              <w:t>F1</w:t>
+            </w:r>
+          </w:p>
+        </w:tc>
+        <w:tc>
+          <w:tcPr>
+            <w:tcW w:type="dxa" w:w="1881"/>
+            <w:shd w:val="clear" w:color="auto" w:fill="FFFFFF"/>
+          </w:tcPr>
+          <w:p>
+            <w:pPr>
+              <w:jc w:val="center"/>
+            </w:pPr>
+            <w:r>
+              <w:rPr>
+                <w:rFonts w:ascii="Times New Roman" w:hAnsi="Times New Roman"/>
+                <w:b w:val="0"/>
+                <w:i w:val="0"/>
+                <w:color w:val="000000"/>
+                <w:sz w:val="18"/>
+              </w:rPr>
+              <w:t>Destek</w:t>
+            </w:r>
+          </w:p>
+        </w:tc>
+      </w:tr>
+      <w:tr>
+        <w:tc>
+          <w:tcPr>
+            <w:tcW w:type="dxa" w:w="1881"/>
+            <w:shd w:val="clear" w:color="auto" w:fill="FFFFFF"/>
+          </w:tcPr>
+          <w:p>
+            <w:pPr>
+              <w:jc w:val="center"/>
+            </w:pPr>
+            <w:r>
+              <w:rPr>
+                <w:rFonts w:ascii="Times New Roman" w:hAnsi="Times New Roman"/>
+                <w:b w:val="0"/>
+                <w:i w:val="0"/>
+                <w:color w:val="000000"/>
+                <w:sz w:val="18"/>
+              </w:rPr>
+              <w:t>İnsan</w:t>
+            </w:r>
+          </w:p>
+        </w:tc>
+        <w:tc>
+          <w:tcPr>
+            <w:tcW w:type="dxa" w:w="1881"/>
+            <w:shd w:val="clear" w:color="auto" w:fill="FFFFFF"/>
+          </w:tcPr>
+          <w:p>
+            <w:pPr>
+              <w:jc w:val="center"/>
+            </w:pPr>
+            <w:r>
+              <w:rPr>
+                <w:rFonts w:ascii="Times New Roman" w:hAnsi="Times New Roman"/>
+                <w:b w:val="0"/>
+                <w:i w:val="0"/>
+                <w:color w:val="000000"/>
+                <w:sz w:val="18"/>
+              </w:rPr>
+              <w:t>0,8880</w:t>
+            </w:r>
+          </w:p>
+        </w:tc>
+        <w:tc>
+          <w:tcPr>
+            <w:tcW w:type="dxa" w:w="1881"/>
+            <w:shd w:val="clear" w:color="auto" w:fill="FFFFFF"/>
+          </w:tcPr>
+          <w:p>
+            <w:pPr>
+              <w:jc w:val="center"/>
+            </w:pPr>
+            <w:r>
+              <w:rPr>
+                <w:rFonts w:ascii="Times New Roman" w:hAnsi="Times New Roman"/>
+                <w:b w:val="0"/>
+                <w:i w:val="0"/>
+                <w:color w:val="000000"/>
+                <w:sz w:val="18"/>
+              </w:rPr>
+              <w:t>0,9020</w:t>
+            </w:r>
+          </w:p>
+        </w:tc>
+        <w:tc>
+          <w:tcPr>
+            <w:tcW w:type="dxa" w:w="1881"/>
+            <w:shd w:val="clear" w:color="auto" w:fill="FFFFFF"/>
+          </w:tcPr>
+          <w:p>
+            <w:pPr>
+              <w:jc w:val="center"/>
+            </w:pPr>
+            <w:r>
+              <w:rPr>
+                <w:rFonts w:ascii="Times New Roman" w:hAnsi="Times New Roman"/>
+                <w:b w:val="0"/>
+                <w:i w:val="0"/>
+                <w:color w:val="000000"/>
+                <w:sz w:val="18"/>
+              </w:rPr>
+              <w:t>0,8950</w:t>
+            </w:r>
+          </w:p>
+        </w:tc>
+        <w:tc>
+          <w:tcPr>
+            <w:tcW w:type="dxa" w:w="1881"/>
+            <w:shd w:val="clear" w:color="auto" w:fill="FFFFFF"/>
+          </w:tcPr>
+          <w:p>
+            <w:pPr>
+              <w:jc w:val="center"/>
+            </w:pPr>
+            <w:r>
+              <w:rPr>
+                <w:rFonts w:ascii="Times New Roman" w:hAnsi="Times New Roman"/>
+                <w:b w:val="0"/>
+                <w:i w:val="0"/>
+                <w:color w:val="000000"/>
+                <w:sz w:val="18"/>
+              </w:rPr>
+              <w:t>3113</w:t>
+            </w:r>
+          </w:p>
+        </w:tc>
+      </w:tr>
+      <w:tr>
+        <w:tc>
+          <w:tcPr>
+            <w:tcW w:type="dxa" w:w="1881"/>
+            <w:shd w:val="clear" w:color="auto" w:fill="FFFFFF"/>
+          </w:tcPr>
+          <w:p>
+            <w:pPr>
+              <w:jc w:val="center"/>
+            </w:pPr>
+            <w:r>
+              <w:rPr>
+                <w:rFonts w:ascii="Times New Roman" w:hAnsi="Times New Roman"/>
+                <w:b w:val="0"/>
+                <w:i w:val="0"/>
+                <w:color w:val="000000"/>
+                <w:sz w:val="18"/>
+              </w:rPr>
+              <w:t>Yapay Zekâ</w:t>
+            </w:r>
+          </w:p>
+        </w:tc>
+        <w:tc>
+          <w:tcPr>
+            <w:tcW w:type="dxa" w:w="1881"/>
+            <w:shd w:val="clear" w:color="auto" w:fill="FFFFFF"/>
+          </w:tcPr>
+          <w:p>
+            <w:pPr>
+              <w:jc w:val="center"/>
+            </w:pPr>
+            <w:r>
+              <w:rPr>
+                <w:rFonts w:ascii="Times New Roman" w:hAnsi="Times New Roman"/>
+                <w:b w:val="0"/>
+                <w:i w:val="0"/>
+                <w:color w:val="000000"/>
+                <w:sz w:val="18"/>
+              </w:rPr>
+              <w:t>0,8500</w:t>
+            </w:r>
+          </w:p>
+        </w:tc>
+        <w:tc>
+          <w:tcPr>
+            <w:tcW w:type="dxa" w:w="1881"/>
+            <w:shd w:val="clear" w:color="auto" w:fill="FFFFFF"/>
+          </w:tcPr>
+          <w:p>
+            <w:pPr>
+              <w:jc w:val="center"/>
+            </w:pPr>
+            <w:r>
+              <w:rPr>
+                <w:rFonts w:ascii="Times New Roman" w:hAnsi="Times New Roman"/>
+                <w:b w:val="0"/>
+                <w:i w:val="0"/>
+                <w:color w:val="000000"/>
+                <w:sz w:val="18"/>
+              </w:rPr>
+              <w:t>0,8300</w:t>
+            </w:r>
+          </w:p>
+        </w:tc>
+        <w:tc>
+          <w:tcPr>
+            <w:tcW w:type="dxa" w:w="1881"/>
+            <w:shd w:val="clear" w:color="auto" w:fill="FFFFFF"/>
+          </w:tcPr>
+          <w:p>
+            <w:pPr>
+              <w:jc w:val="center"/>
+            </w:pPr>
+            <w:r>
+              <w:rPr>
+                <w:rFonts w:ascii="Times New Roman" w:hAnsi="Times New Roman"/>
+                <w:b w:val="0"/>
+                <w:i w:val="0"/>
+                <w:color w:val="000000"/>
+                <w:sz w:val="18"/>
+              </w:rPr>
+              <w:t>0,8399</w:t>
+            </w:r>
+          </w:p>
+        </w:tc>
+        <w:tc>
+          <w:tcPr>
+            <w:tcW w:type="dxa" w:w="1881"/>
+            <w:shd w:val="clear" w:color="auto" w:fill="FFFFFF"/>
+          </w:tcPr>
+          <w:p>
+            <w:pPr>
+              <w:jc w:val="center"/>
+            </w:pPr>
+            <w:r>
+              <w:rPr>
+                <w:rFonts w:ascii="Times New Roman" w:hAnsi="Times New Roman"/>
+                <w:b w:val="0"/>
+                <w:i w:val="0"/>
+                <w:color w:val="000000"/>
+                <w:sz w:val="18"/>
+              </w:rPr>
+              <w:t>2082</w:t>
+            </w:r>
+          </w:p>
+        </w:tc>
+      </w:tr>
+      <w:tr>
+        <w:tc>
+          <w:tcPr>
+            <w:tcW w:type="dxa" w:w="1881"/>
+            <w:shd w:val="clear" w:color="auto" w:fill="FFFFFF"/>
+          </w:tcPr>
+          <w:p>
+            <w:pPr>
+              <w:jc w:val="center"/>
+            </w:pPr>
+            <w:r>
+              <w:rPr>
+                <w:rFonts w:ascii="Times New Roman" w:hAnsi="Times New Roman"/>
+                <w:b w:val="0"/>
+                <w:i w:val="0"/>
+                <w:color w:val="000000"/>
+                <w:sz w:val="18"/>
+              </w:rPr>
+              <w:t>Doğruluk</w:t>
+            </w:r>
+          </w:p>
+        </w:tc>
+        <w:tc>
+          <w:tcPr>
+            <w:tcW w:type="dxa" w:w="1881"/>
+            <w:shd w:val="clear" w:color="auto" w:fill="FFFFFF"/>
+          </w:tcPr>
+          <w:p>
+            <w:pPr>
+              <w:jc w:val="center"/>
+            </w:pPr>
+            <w:r>
+              <w:rPr>
+                <w:rFonts w:ascii="Times New Roman" w:hAnsi="Times New Roman"/>
+                <w:b w:val="0"/>
+                <w:i w:val="0"/>
+                <w:color w:val="000000"/>
+                <w:sz w:val="18"/>
+              </w:rPr>
+              <w:t>—</w:t>
+            </w:r>
+          </w:p>
+        </w:tc>
+        <w:tc>
+          <w:tcPr>
+            <w:tcW w:type="dxa" w:w="1881"/>
+            <w:shd w:val="clear" w:color="auto" w:fill="FFFFFF"/>
+          </w:tcPr>
+          <w:p>
+            <w:pPr>
+              <w:jc w:val="center"/>
+            </w:pPr>
+            <w:r>
+              <w:rPr>
+                <w:rFonts w:ascii="Times New Roman" w:hAnsi="Times New Roman"/>
+                <w:b w:val="0"/>
+                <w:i w:val="0"/>
+                <w:color w:val="000000"/>
+                <w:sz w:val="18"/>
+              </w:rPr>
+              <w:t>—</w:t>
+            </w:r>
+          </w:p>
+        </w:tc>
+        <w:tc>
+          <w:tcPr>
+            <w:tcW w:type="dxa" w:w="1881"/>
+            <w:shd w:val="clear" w:color="auto" w:fill="FFFFFF"/>
+          </w:tcPr>
+          <w:p>
+            <w:pPr>
+              <w:jc w:val="center"/>
+            </w:pPr>
+            <w:r>
+              <w:rPr>
+                <w:rFonts w:ascii="Times New Roman" w:hAnsi="Times New Roman"/>
+                <w:b w:val="0"/>
+                <w:i w:val="0"/>
+                <w:color w:val="000000"/>
+                <w:sz w:val="18"/>
+              </w:rPr>
+              <w:t>0,8731</w:t>
+            </w:r>
+          </w:p>
+        </w:tc>
+        <w:tc>
+          <w:tcPr>
+            <w:tcW w:type="dxa" w:w="1881"/>
+            <w:shd w:val="clear" w:color="auto" w:fill="FFFFFF"/>
+          </w:tcPr>
+          <w:p>
+            <w:pPr>
+              <w:jc w:val="center"/>
+            </w:pPr>
+            <w:r>
+              <w:rPr>
+                <w:rFonts w:ascii="Times New Roman" w:hAnsi="Times New Roman"/>
+                <w:b w:val="0"/>
+                <w:i w:val="0"/>
+                <w:color w:val="000000"/>
+                <w:sz w:val="18"/>
+              </w:rPr>
+              <w:t>5195</w:t>
+            </w:r>
+          </w:p>
+        </w:tc>
+      </w:tr>
+      <w:tr>
+        <w:tc>
+          <w:tcPr>
+            <w:tcW w:type="dxa" w:w="1881"/>
+            <w:shd w:val="clear" w:color="auto" w:fill="FFFFFF"/>
+          </w:tcPr>
+          <w:p>
+            <w:pPr>
+              <w:jc w:val="center"/>
+            </w:pPr>
+            <w:r>
+              <w:rPr>
+                <w:rFonts w:ascii="Times New Roman" w:hAnsi="Times New Roman"/>
+                <w:b w:val="0"/>
+                <w:i w:val="0"/>
+                <w:color w:val="000000"/>
+                <w:sz w:val="18"/>
+              </w:rPr>
+              <w:t>Makro ort.</w:t>
+            </w:r>
+          </w:p>
+        </w:tc>
+        <w:tc>
+          <w:tcPr>
+            <w:tcW w:type="dxa" w:w="1881"/>
+            <w:shd w:val="clear" w:color="auto" w:fill="FFFFFF"/>
+          </w:tcPr>
+          <w:p>
+            <w:pPr>
+              <w:jc w:val="center"/>
+            </w:pPr>
+            <w:r>
+              <w:rPr>
+                <w:rFonts w:ascii="Times New Roman" w:hAnsi="Times New Roman"/>
+                <w:b w:val="0"/>
+                <w:i w:val="0"/>
+                <w:color w:val="000000"/>
+                <w:sz w:val="18"/>
+              </w:rPr>
+              <w:t>0,8690</w:t>
+            </w:r>
+          </w:p>
+        </w:tc>
+        <w:tc>
+          <w:tcPr>
+            <w:tcW w:type="dxa" w:w="1881"/>
+            <w:shd w:val="clear" w:color="auto" w:fill="FFFFFF"/>
+          </w:tcPr>
+          <w:p>
+            <w:pPr>
+              <w:jc w:val="center"/>
+            </w:pPr>
+            <w:r>
+              <w:rPr>
+                <w:rFonts w:ascii="Times New Roman" w:hAnsi="Times New Roman"/>
+                <w:b w:val="0"/>
+                <w:i w:val="0"/>
+                <w:color w:val="000000"/>
+                <w:sz w:val="18"/>
+              </w:rPr>
+              <w:t>0,8660</w:t>
+            </w:r>
+          </w:p>
+        </w:tc>
+        <w:tc>
+          <w:tcPr>
+            <w:tcW w:type="dxa" w:w="1881"/>
+            <w:shd w:val="clear" w:color="auto" w:fill="FFFFFF"/>
+          </w:tcPr>
+          <w:p>
+            <w:pPr>
+              <w:jc w:val="center"/>
+            </w:pPr>
+            <w:r>
+              <w:rPr>
+                <w:rFonts w:ascii="Times New Roman" w:hAnsi="Times New Roman"/>
+                <w:b w:val="0"/>
+                <w:i w:val="0"/>
+                <w:color w:val="000000"/>
+                <w:sz w:val="18"/>
+              </w:rPr>
+              <w:t>0,8674</w:t>
+            </w:r>
+          </w:p>
+        </w:tc>
+        <w:tc>
+          <w:tcPr>
+            <w:tcW w:type="dxa" w:w="1881"/>
+            <w:shd w:val="clear" w:color="auto" w:fill="FFFFFF"/>
+          </w:tcPr>
+          <w:p>
+            <w:pPr>
+              <w:jc w:val="center"/>
+            </w:pPr>
+            <w:r>
+              <w:rPr>
+                <w:rFonts w:ascii="Times New Roman" w:hAnsi="Times New Roman"/>
+                <w:b w:val="0"/>
+                <w:i w:val="0"/>
+                <w:color w:val="000000"/>
+                <w:sz w:val="18"/>
+              </w:rPr>
+              <w:t>5195</w:t>
+            </w:r>
+          </w:p>
+        </w:tc>
+      </w:tr>
+      <w:tr>
+        <w:tc>
+          <w:tcPr>
+            <w:tcW w:type="dxa" w:w="1881"/>
+            <w:shd w:val="clear" w:color="auto" w:fill="FFFFFF"/>
+          </w:tcPr>
+          <w:p>
+            <w:pPr>
+              <w:jc w:val="center"/>
+            </w:pPr>
+            <w:r>
+              <w:rPr>
+                <w:rFonts w:ascii="Times New Roman" w:hAnsi="Times New Roman"/>
+                <w:b w:val="0"/>
+                <w:i w:val="0"/>
+                <w:color w:val="000000"/>
+                <w:sz w:val="18"/>
+              </w:rPr>
+              <w:t>Ağırlıklı ort.</w:t>
+            </w:r>
+          </w:p>
+        </w:tc>
+        <w:tc>
+          <w:tcPr>
+            <w:tcW w:type="dxa" w:w="1881"/>
+            <w:shd w:val="clear" w:color="auto" w:fill="FFFFFF"/>
+          </w:tcPr>
+          <w:p>
+            <w:pPr>
+              <w:jc w:val="center"/>
+            </w:pPr>
+            <w:r>
+              <w:rPr>
+                <w:rFonts w:ascii="Times New Roman" w:hAnsi="Times New Roman"/>
+                <w:b w:val="0"/>
+                <w:i w:val="0"/>
+                <w:color w:val="000000"/>
+                <w:sz w:val="18"/>
+              </w:rPr>
+              <w:t>0,8728</w:t>
+            </w:r>
+          </w:p>
+        </w:tc>
+        <w:tc>
+          <w:tcPr>
+            <w:tcW w:type="dxa" w:w="1881"/>
+            <w:shd w:val="clear" w:color="auto" w:fill="FFFFFF"/>
+          </w:tcPr>
+          <w:p>
+            <w:pPr>
+              <w:jc w:val="center"/>
+            </w:pPr>
+            <w:r>
+              <w:rPr>
+                <w:rFonts w:ascii="Times New Roman" w:hAnsi="Times New Roman"/>
+                <w:b w:val="0"/>
+                <w:i w:val="0"/>
+                <w:color w:val="000000"/>
+                <w:sz w:val="18"/>
+              </w:rPr>
+              <w:t>0,8731</w:t>
+            </w:r>
+          </w:p>
+        </w:tc>
+        <w:tc>
+          <w:tcPr>
+            <w:tcW w:type="dxa" w:w="1881"/>
+            <w:shd w:val="clear" w:color="auto" w:fill="FFFFFF"/>
+          </w:tcPr>
+          <w:p>
+            <w:pPr>
+              <w:jc w:val="center"/>
+            </w:pPr>
+            <w:r>
+              <w:rPr>
+                <w:rFonts w:ascii="Times New Roman" w:hAnsi="Times New Roman"/>
+                <w:b w:val="0"/>
+                <w:i w:val="0"/>
+                <w:color w:val="000000"/>
+                <w:sz w:val="18"/>
+              </w:rPr>
+              <w:t>0,8729</w:t>
+            </w:r>
+          </w:p>
+        </w:tc>
+        <w:tc>
+          <w:tcPr>
+            <w:tcW w:type="dxa" w:w="1881"/>
+            <w:shd w:val="clear" w:color="auto" w:fill="FFFFFF"/>
+          </w:tcPr>
+          <w:p>
+            <w:pPr>
+              <w:jc w:val="center"/>
+            </w:pPr>
+            <w:r>
+              <w:rPr>
+                <w:rFonts w:ascii="Times New Roman" w:hAnsi="Times New Roman"/>
+                <w:b w:val="0"/>
+                <w:i w:val="0"/>
+                <w:color w:val="000000"/>
+                <w:sz w:val="18"/>
+              </w:rPr>
+              <w:t>5195</w:t>
+            </w:r>
+          </w:p>
+        </w:tc>
+      </w:tr>
+    </w:tbl>
+    <w:p>
       <w:pPr>
         <w:spacing w:line="360" w:lineRule="auto"/>
         <w:jc w:val="center"/>
@@ -6612,107 +8578,10 @@
       </w:pPr>
       <w:r>
         <w:rPr>
-          <w:sz w:val="18"/>
-        </w:rPr>
-        <w:t xml:space="preserve">Öznitelik önemi analizi sonuçları spektral düzlük standart sapması özniteliğinin yapay zekâ ile insan müziği ayrımı için en bilgilendirici öznitelik olduğunu açık biçimde ortaya koymuştur. Tablo 4 ilk on özniteliği listelemektedir. </w:t>
-      </w:r>
-      <w:proofErr w:type="spellStart"/>
-      <w:r>
-        <w:rPr>
-          <w:sz w:val="18"/>
-        </w:rPr>
-        <w:t>Şekil</w:t>
-      </w:r>
-      <w:proofErr w:type="spellEnd"/>
-      <w:r>
-        <w:rPr>
-          <w:sz w:val="18"/>
-        </w:rPr>
-        <w:t xml:space="preserve"> 7 ilk </w:t>
-      </w:r>
-      <w:proofErr w:type="spellStart"/>
-      <w:r>
-        <w:rPr>
-          <w:sz w:val="18"/>
-        </w:rPr>
-        <w:t>yirmi</w:t>
-      </w:r>
-      <w:proofErr w:type="spellEnd"/>
-      <w:r>
-        <w:rPr>
-          <w:sz w:val="18"/>
-        </w:rPr>
-        <w:t xml:space="preserve"> </w:t>
-      </w:r>
-      <w:proofErr w:type="spellStart"/>
-      <w:r>
-        <w:rPr>
-          <w:sz w:val="18"/>
-        </w:rPr>
-        <w:t>özniteliğin</w:t>
-      </w:r>
-      <w:proofErr w:type="spellEnd"/>
-      <w:r>
-        <w:rPr>
-          <w:sz w:val="18"/>
-        </w:rPr>
-        <w:t xml:space="preserve"> normalize </w:t>
-      </w:r>
-      <w:proofErr w:type="spellStart"/>
-      <w:r>
-        <w:rPr>
-          <w:sz w:val="18"/>
-        </w:rPr>
-        <w:t>edilmiş</w:t>
-      </w:r>
-      <w:proofErr w:type="spellEnd"/>
-      <w:r>
-        <w:rPr>
-          <w:sz w:val="18"/>
-        </w:rPr>
-        <w:t xml:space="preserve"> </w:t>
-      </w:r>
-      <w:proofErr w:type="spellStart"/>
-      <w:r>
-        <w:rPr>
-          <w:sz w:val="18"/>
-        </w:rPr>
-        <w:t>önem</w:t>
-      </w:r>
-      <w:proofErr w:type="spellEnd"/>
-      <w:r>
-        <w:rPr>
-          <w:sz w:val="18"/>
-        </w:rPr>
-        <w:t xml:space="preserve"> </w:t>
-      </w:r>
-      <w:proofErr w:type="spellStart"/>
-      <w:r>
-        <w:rPr>
-          <w:sz w:val="18"/>
-        </w:rPr>
-        <w:t>skorlarını</w:t>
-      </w:r>
-      <w:proofErr w:type="spellEnd"/>
-      <w:r>
-        <w:rPr>
-          <w:sz w:val="18"/>
-        </w:rPr>
-        <w:t xml:space="preserve"> </w:t>
-      </w:r>
-      <w:proofErr w:type="spellStart"/>
-      <w:r>
-        <w:rPr>
-          <w:sz w:val="18"/>
-        </w:rPr>
-        <w:t>göstermektedir</w:t>
-      </w:r>
-      <w:proofErr w:type="spellEnd"/>
-      <w:r>
-        <w:rPr>
-          <w:sz w:val="18"/>
-        </w:rPr>
-        <w:t>.</w:t>
+          <w:rFonts w:ascii="Times New Roman" w:hAnsi="Times New Roman"/>
+          <w:sz w:val="18"/>
+        </w:rPr>
+        <w:t>Öznitelik önemi analizi sonuçları spektral düzlük standart sapması özniteliğinin yapay zekâ ile insan müziği ayrımı için en bilgilendirici öznitelik olduğunu açık biçimde ortaya koymuştur. Tablo 5 ilk on özniteliği listelemektedir. Şekil 7 ilk yirmi özniteliğin normalize edilmiş önem skorlarını göstermektedir.</w:t>
       </w:r>
     </w:p>
     <w:p>
@@ -6754,21 +8623,10 @@
       </w:pPr>
       <w:r>
         <w:rPr>
-          <w:sz w:val="18"/>
-        </w:rPr>
-        <w:t xml:space="preserve">Tablo 4. LightGBM'in ilk on </w:t>
-      </w:r>
-      <w:r>
-        <w:rPr>
-          <w:sz w:val="18"/>
-        </w:rPr>
-        <w:t xml:space="preserve">özniteliği </w:t>
-      </w:r>
-      <w:r>
-        <w:rPr>
-          <w:sz w:val="16"/>
-        </w:rPr>
-        <w:t>(Top ten features of LightGBM)</w:t>
+          <w:rFonts w:ascii="Times New Roman" w:hAnsi="Times New Roman"/>
+          <w:sz w:val="18"/>
+        </w:rPr>
+        <w:t>Tablo 5. LightGBM'in ilk on özniteliği (Top ten features of LightGBM)</w:t>
       </w:r>
     </w:p>
     <w:tbl>
@@ -8817,49 +10675,10 @@
       </w:pPr>
       <w:r>
         <w:rPr>
-          <w:sz w:val="18"/>
-        </w:rPr>
-        <w:t xml:space="preserve">Tablo 5. Simge </w:t>
-      </w:r>
-      <w:proofErr w:type="spellStart"/>
-      <w:r>
-        <w:rPr>
-          <w:sz w:val="18"/>
-        </w:rPr>
-        <w:t>Açıklama</w:t>
-      </w:r>
-      <w:proofErr w:type="spellEnd"/>
-      <w:r>
-        <w:rPr>
-          <w:sz w:val="18"/>
-        </w:rPr>
-        <w:t xml:space="preserve"> </w:t>
-      </w:r>
-      <w:proofErr w:type="spellStart"/>
-      <w:r>
-        <w:rPr>
-          <w:sz w:val="18"/>
-        </w:rPr>
-        <w:t>Tablosu</w:t>
-      </w:r>
-      <w:proofErr w:type="spellEnd"/>
-      <w:r>
-        <w:rPr>
-          <w:sz w:val="18"/>
-        </w:rPr>
-        <w:t xml:space="preserve"> (</w:t>
-      </w:r>
-      <w:r>
-        <w:rPr>
-          <w:sz w:val="18"/>
-        </w:rPr>
-        <w:t>Icon Description Table</w:t>
-      </w:r>
-      <w:r>
-        <w:rPr>
-          <w:sz w:val="18"/>
-        </w:rPr>
-        <w:t>)</w:t>
+          <w:rFonts w:ascii="Times New Roman" w:hAnsi="Times New Roman"/>
+          <w:sz w:val="18"/>
+        </w:rPr>
+        <w:t>Tablo 6. Simge Açıklama Tablosu (Icon Description Table)</w:t>
       </w:r>
     </w:p>
     <w:tbl>

</xml_diff>

<commit_message>
Add script to update references in AURIS document with new citations and formatting
</commit_message>
<xml_diff>
--- a/docs/academic/paper/deliverables/AURIS_Makale_Metni.docx
+++ b/docs/academic/paper/deliverables/AURIS_Makale_Metni.docx
@@ -12173,9 +12173,11 @@
       </w:pPr>
       <w:r>
         <w:rPr>
-          <w:sz w:val="18"/>
-        </w:rPr>
-        <w:t>5. Li Y., Milling M., Specia L., Schuller B.W., From Audio Deepfake Detection to AI-Generated Music Detection: A Pathway and Overview, arXiv preprint arXiv:2412.00571, 2024.</w:t>
+          <w:rFonts w:ascii="Times New Roman" w:hAnsi="Times New Roman"/>
+          <w:b w:val="0"/>
+          <w:sz w:val="18"/>
+        </w:rPr>
+        <w:t>5. Cros Vila L., Sturm B.L.T., Casini L., Dalmazzo D., The AI Music Arms Race: On the Detection of AI-Generated Music, Trans. Int. Soc. Music Inf. Retr., 8 (1), 179-194, 2025.</w:t>
       </w:r>
     </w:p>
     <w:p>
@@ -12185,9 +12187,11 @@
       </w:pPr>
       <w:r>
         <w:rPr>
-          <w:sz w:val="18"/>
-        </w:rPr>
-        <w:t>6. Yi J., Wang C., Tao J., Zhang X., Zhang C.Y., Zhao Y., Audio Deepfake Detection: A Survey, arXiv preprint arXiv:2308.14970, 2023.</w:t>
+          <w:rFonts w:ascii="Times New Roman" w:hAnsi="Times New Roman"/>
+          <w:b w:val="0"/>
+          <w:sz w:val="18"/>
+        </w:rPr>
+        <w:t>6. Zhang B., Cui H., Nguyen V., Whitty M., Audio Deepfake Detection: What Has Been Achieved and What Lies Ahead, Sensors, 25 (7), 1989, 2025.</w:t>
       </w:r>
     </w:p>
     <w:p>
@@ -12209,9 +12213,11 @@
       </w:pPr>
       <w:r>
         <w:rPr>
-          <w:sz w:val="18"/>
-        </w:rPr>
-        <w:t>8. Kim Y., Go S., Segment Transformer: AI-Generated Music Detection via Music Structural Analysis, arXiv preprint arXiv:2509.08283, 2025.</w:t>
+          <w:rFonts w:ascii="Times New Roman" w:hAnsi="Times New Roman"/>
+          <w:b w:val="0"/>
+          <w:sz w:val="18"/>
+        </w:rPr>
+        <w:t>8. Zang Y., Zhang Y., Heydari M., Duan Z., SingFake: Singing Voice Deepfake Detection, Proceedings of the IEEE International Conference on Acoustics, Speech and Signal Processing (ICASSP 2024), 12156-12160, Seoul, Güney Kore, 14-19 Nisan, 2024.</w:t>
       </w:r>
     </w:p>
     <w:p>
@@ -12306,9 +12312,11 @@
       </w:pPr>
       <w:r>
         <w:rPr>
-          <w:sz w:val="18"/>
-        </w:rPr>
-        <w:t>16. Liu Y., Yin Y., Zhu Q., Cui W., Musical Instrument Recognition by XGBoost Combining Feature Fusion, arXiv preprint arXiv:2206.00901, 2022.</w:t>
+          <w:rFonts w:ascii="Times New Roman" w:hAnsi="Times New Roman"/>
+          <w:b w:val="0"/>
+          <w:sz w:val="18"/>
+        </w:rPr>
+        <w:t>16. Xie Y., Cheng H., Wang Y., Ye L., Domain Generalization via Aggregation and Separation for Audio Deepfake Detection, IEEE Trans. Inf. Forensics Secur., 19, 344-358, 2024.</w:t>
       </w:r>
     </w:p>
     <w:p>
@@ -12402,9 +12410,11 @@
       </w:pPr>
       <w:r>
         <w:rPr>
-          <w:sz w:val="18"/>
-        </w:rPr>
-        <w:t>24. Comanducci L., Bestagini P., Tubaro S., FakeMusicCaps: A Dataset for Detection and Attribution of Synthetic Music Generated via Text-to-Music Models, arXiv preprint arXiv:2409.10684, 2024.</w:t>
+          <w:rFonts w:ascii="Times New Roman" w:hAnsi="Times New Roman"/>
+          <w:b w:val="0"/>
+          <w:sz w:val="18"/>
+        </w:rPr>
+        <w:t>24. Comanducci L., Bestagini P., Tubaro S., FakeMusicCaps: A Dataset for Detection and Attribution of Synthetic Music Generated via Text-to-Music Models, J. Imaging, 11 (7), 242, 2025.</w:t>
       </w:r>
     </w:p>
     <w:p>
@@ -12414,9 +12424,11 @@
       </w:pPr>
       <w:r>
         <w:rPr>
-          <w:sz w:val="18"/>
-        </w:rPr>
-        <w:t>25. Pascu O., Oneata D., Cucu H., Müller N.M., Echoes: A Semantically-Aligned Music Deepfake Detection Dataset, arXiv preprint arXiv:2603.23667, 2025.</w:t>
+          <w:rFonts w:ascii="Times New Roman" w:hAnsi="Times New Roman"/>
+          <w:b w:val="0"/>
+          <w:sz w:val="18"/>
+        </w:rPr>
+        <w:t>25. Guo Y., Huang H., Chen X., Zhao H., Wang Y., Audio Deepfake Detection with Self-Supervised WavLM and Multi-Fusion Attentive Classifier, Proceedings of the IEEE International Conference on Acoustics, Speech and Signal Processing (ICASSP 2024), 12702-12706, Seoul, Güney Kore, 14-19 Nisan, 2024.</w:t>
       </w:r>
     </w:p>
     <w:p>
@@ -12426,9 +12438,11 @@
       </w:pPr>
       <w:r>
         <w:rPr>
-          <w:sz w:val="18"/>
-        </w:rPr>
-        <w:t>26. Sunday N., Detecting Musical Deepfakes, arXiv preprint arXiv:2505.09633, 2025.</w:t>
+          <w:rFonts w:ascii="Times New Roman" w:hAnsi="Times New Roman"/>
+          <w:b w:val="0"/>
+          <w:sz w:val="18"/>
+        </w:rPr>
+        <w:t>26. Yang W., Zhou X., Chen Z., Guo B., Ba Z., Xia Z., Cao X., Ren K., AVoiD-DF: Audio-Visual Joint Learning for Detecting Deepfake, IEEE Trans. Inf. Forensics Secur., 18, 2015-2029, 2023.</w:t>
       </w:r>
     </w:p>
     <w:p>
@@ -12438,9 +12452,11 @@
       </w:pPr>
       <w:r>
         <w:rPr>
-          <w:sz w:val="18"/>
-        </w:rPr>
-        <w:t>27. Sroka T., Wężowicz T., Sidorczuk D., Modrzejewski M., Evaluating Fake Music Detection Performance Under Audio Augmentations, arXiv preprint arXiv:2507.10447, 2025.</w:t>
+          <w:rFonts w:ascii="Times New Roman" w:hAnsi="Times New Roman"/>
+          <w:b w:val="0"/>
+          <w:sz w:val="18"/>
+        </w:rPr>
+        <w:t>27. Ding Y., Zhang H., Huang W., Zhou X., Shi Z., Efficient Music Genre Recognition Using ECAS-CNN: A Novel Channel-Aware Neural Network Architecture, Sensors, 24 (21), 7021, 2024.</w:t>
       </w:r>
     </w:p>
     <w:p>

</xml_diff>

<commit_message>
Update AURIS document with comparative literature table and analysis for enhanced clarity
</commit_message>
<xml_diff>
--- a/docs/academic/paper/deliverables/AURIS_Makale_Metni.docx
+++ b/docs/academic/paper/deliverables/AURIS_Makale_Metni.docx
@@ -8958,6 +8958,768 @@
       <w:pPr>
         <w:spacing w:line="360" w:lineRule="auto"/>
       </w:pPr>
+    </w:p>
+    <w:p>
+      <w:pPr>
+        <w:jc w:val="left"/>
+      </w:pPr>
+      <w:r>
+        <w:rPr>
+          <w:rFonts w:ascii="Times New Roman" w:hAnsi="Times New Roman"/>
+          <w:b w:val="0"/>
+          <w:sz w:val="18"/>
+        </w:rPr>
+      </w:r>
+    </w:p>
+    <w:p>
+      <w:pPr>
+        <w:jc w:val="left"/>
+      </w:pPr>
+      <w:r>
+        <w:rPr>
+          <w:rFonts w:ascii="Times New Roman" w:hAnsi="Times New Roman"/>
+          <w:b w:val="0"/>
+          <w:sz w:val="18"/>
+        </w:rPr>
+        <w:t>Tablo 7. Literatürle karşılaştırma (Comparison with literature). (— : yayında rapor edilmemiş.)</w:t>
+      </w:r>
+    </w:p>
+    <w:tbl>
+      <w:tblPr>
+        <w:tblStyle w:val="TabloKlavuzu"/>
+        <w:tblW w:type="auto" w:w="0"/>
+        <w:tblLook w:firstColumn="1" w:firstRow="1" w:lastColumn="0" w:lastRow="0" w:noHBand="0" w:noVBand="1" w:val="04A0"/>
+      </w:tblPr>
+      <w:tblGrid>
+        <w:gridCol w:w="1881"/>
+        <w:gridCol w:w="1881"/>
+        <w:gridCol w:w="1881"/>
+        <w:gridCol w:w="1881"/>
+        <w:gridCol w:w="1881"/>
+      </w:tblGrid>
+      <w:tr>
+        <w:tc>
+          <w:tcPr>
+            <w:tcW w:type="dxa" w:w="1814"/>
+            <w:vAlign w:val="center"/>
+            <w:shd w:val="clear" w:color="auto" w:fill="D9D9D9"/>
+          </w:tcPr>
+          <w:p>
+            <w:pPr>
+              <w:jc w:val="center"/>
+            </w:pPr>
+            <w:r>
+              <w:rPr>
+                <w:rFonts w:ascii="Times New Roman" w:hAnsi="Times New Roman"/>
+                <w:b/>
+                <w:sz w:val="18"/>
+              </w:rPr>
+              <w:t>Çalışma</w:t>
+            </w:r>
+          </w:p>
+        </w:tc>
+        <w:tc>
+          <w:tcPr>
+            <w:tcW w:type="dxa" w:w="2721"/>
+            <w:vAlign w:val="center"/>
+            <w:shd w:val="clear" w:color="auto" w:fill="D9D9D9"/>
+          </w:tcPr>
+          <w:p>
+            <w:pPr>
+              <w:jc w:val="center"/>
+            </w:pPr>
+            <w:r>
+              <w:rPr>
+                <w:rFonts w:ascii="Times New Roman" w:hAnsi="Times New Roman"/>
+                <w:b/>
+                <w:sz w:val="18"/>
+              </w:rPr>
+              <w:t>Yaklaşım</w:t>
+            </w:r>
+          </w:p>
+        </w:tc>
+        <w:tc>
+          <w:tcPr>
+            <w:tcW w:type="dxa" w:w="1814"/>
+            <w:vAlign w:val="center"/>
+            <w:shd w:val="clear" w:color="auto" w:fill="D9D9D9"/>
+          </w:tcPr>
+          <w:p>
+            <w:pPr>
+              <w:jc w:val="center"/>
+            </w:pPr>
+            <w:r>
+              <w:rPr>
+                <w:rFonts w:ascii="Times New Roman" w:hAnsi="Times New Roman"/>
+                <w:b/>
+                <w:sz w:val="18"/>
+              </w:rPr>
+              <w:t>Veri Kümesi</w:t>
+            </w:r>
+          </w:p>
+        </w:tc>
+        <w:tc>
+          <w:tcPr>
+            <w:tcW w:type="dxa" w:w="1134"/>
+            <w:vAlign w:val="center"/>
+            <w:shd w:val="clear" w:color="auto" w:fill="D9D9D9"/>
+          </w:tcPr>
+          <w:p>
+            <w:pPr>
+              <w:jc w:val="center"/>
+            </w:pPr>
+            <w:r>
+              <w:rPr>
+                <w:rFonts w:ascii="Times New Roman" w:hAnsi="Times New Roman"/>
+                <w:b/>
+                <w:sz w:val="18"/>
+              </w:rPr>
+              <w:t>ROC-AUC</w:t>
+            </w:r>
+          </w:p>
+        </w:tc>
+        <w:tc>
+          <w:tcPr>
+            <w:tcW w:type="dxa" w:w="1020"/>
+            <w:vAlign w:val="center"/>
+            <w:shd w:val="clear" w:color="auto" w:fill="D9D9D9"/>
+          </w:tcPr>
+          <w:p>
+            <w:pPr>
+              <w:jc w:val="center"/>
+            </w:pPr>
+            <w:r>
+              <w:rPr>
+                <w:rFonts w:ascii="Times New Roman" w:hAnsi="Times New Roman"/>
+                <w:b/>
+                <w:sz w:val="18"/>
+              </w:rPr>
+              <w:t>F1</w:t>
+            </w:r>
+          </w:p>
+        </w:tc>
+      </w:tr>
+      <w:tr>
+        <w:tc>
+          <w:tcPr>
+            <w:tcW w:type="dxa" w:w="1814"/>
+            <w:vAlign w:val="center"/>
+          </w:tcPr>
+          <w:p>
+            <w:pPr>
+              <w:jc w:val="left"/>
+            </w:pPr>
+            <w:r>
+              <w:rPr>
+                <w:rFonts w:ascii="Times New Roman" w:hAnsi="Times New Roman"/>
+                <w:b w:val="0"/>
+                <w:sz w:val="18"/>
+              </w:rPr>
+              <w:t>Afchar vd. [5]</w:t>
+              <w:br/>
+              <w:t>(ICASSP 2024)</w:t>
+            </w:r>
+          </w:p>
+        </w:tc>
+        <w:tc>
+          <w:tcPr>
+            <w:tcW w:type="dxa" w:w="2721"/>
+            <w:vAlign w:val="center"/>
+          </w:tcPr>
+          <w:p>
+            <w:pPr>
+              <w:jc w:val="left"/>
+            </w:pPr>
+            <w:r>
+              <w:rPr>
+                <w:rFonts w:ascii="Times New Roman" w:hAnsi="Times New Roman"/>
+                <w:b w:val="0"/>
+                <w:sz w:val="18"/>
+              </w:rPr>
+              <w:t>Oto-kodlayıcı artefakt tespiti</w:t>
+            </w:r>
+          </w:p>
+        </w:tc>
+        <w:tc>
+          <w:tcPr>
+            <w:tcW w:type="dxa" w:w="1814"/>
+            <w:vAlign w:val="center"/>
+          </w:tcPr>
+          <w:p>
+            <w:pPr>
+              <w:jc w:val="left"/>
+            </w:pPr>
+            <w:r>
+              <w:rPr>
+                <w:rFonts w:ascii="Times New Roman" w:hAnsi="Times New Roman"/>
+                <w:b w:val="0"/>
+                <w:sz w:val="18"/>
+              </w:rPr>
+              <w:t>Özel (Suno, Udio, MusicGen)</w:t>
+            </w:r>
+          </w:p>
+        </w:tc>
+        <w:tc>
+          <w:tcPr>
+            <w:tcW w:type="dxa" w:w="1134"/>
+            <w:vAlign w:val="center"/>
+          </w:tcPr>
+          <w:p>
+            <w:pPr>
+              <w:jc w:val="center"/>
+            </w:pPr>
+            <w:r>
+              <w:rPr>
+                <w:rFonts w:ascii="Times New Roman" w:hAnsi="Times New Roman"/>
+                <w:b w:val="0"/>
+                <w:sz w:val="18"/>
+              </w:rPr>
+              <w:t>—</w:t>
+            </w:r>
+          </w:p>
+        </w:tc>
+        <w:tc>
+          <w:tcPr>
+            <w:tcW w:type="dxa" w:w="1020"/>
+            <w:vAlign w:val="center"/>
+          </w:tcPr>
+          <w:p>
+            <w:pPr>
+              <w:jc w:val="center"/>
+            </w:pPr>
+            <w:r>
+              <w:rPr>
+                <w:rFonts w:ascii="Times New Roman" w:hAnsi="Times New Roman"/>
+                <w:b w:val="0"/>
+                <w:sz w:val="18"/>
+              </w:rPr>
+              <w:t>0,872</w:t>
+            </w:r>
+          </w:p>
+        </w:tc>
+      </w:tr>
+      <w:tr>
+        <w:tc>
+          <w:tcPr>
+            <w:tcW w:type="dxa" w:w="1814"/>
+            <w:vAlign w:val="center"/>
+          </w:tcPr>
+          <w:p>
+            <w:pPr>
+              <w:jc w:val="left"/>
+            </w:pPr>
+            <w:r>
+              <w:rPr>
+                <w:rFonts w:ascii="Times New Roman" w:hAnsi="Times New Roman"/>
+                <w:b w:val="0"/>
+                <w:sz w:val="18"/>
+              </w:rPr>
+              <w:t>Li vd. [22]</w:t>
+              <w:br/>
+              <w:t>(Sci. Rep. 2026)</w:t>
+            </w:r>
+          </w:p>
+        </w:tc>
+        <w:tc>
+          <w:tcPr>
+            <w:tcW w:type="dxa" w:w="2721"/>
+            <w:vAlign w:val="center"/>
+          </w:tcPr>
+          <w:p>
+            <w:pPr>
+              <w:jc w:val="left"/>
+            </w:pPr>
+            <w:r>
+              <w:rPr>
+                <w:rFonts w:ascii="Times New Roman" w:hAnsi="Times New Roman"/>
+                <w:b w:val="0"/>
+                <w:sz w:val="18"/>
+              </w:rPr>
+              <w:t>Açıklanabilir öznitelik + ML</w:t>
+            </w:r>
+          </w:p>
+        </w:tc>
+        <w:tc>
+          <w:tcPr>
+            <w:tcW w:type="dxa" w:w="1814"/>
+            <w:vAlign w:val="center"/>
+          </w:tcPr>
+          <w:p>
+            <w:pPr>
+              <w:jc w:val="left"/>
+            </w:pPr>
+            <w:r>
+              <w:rPr>
+                <w:rFonts w:ascii="Times New Roman" w:hAnsi="Times New Roman"/>
+                <w:b w:val="0"/>
+                <w:sz w:val="18"/>
+              </w:rPr>
+              <w:t>Özel (çoklu üretici)</w:t>
+            </w:r>
+          </w:p>
+        </w:tc>
+        <w:tc>
+          <w:tcPr>
+            <w:tcW w:type="dxa" w:w="1134"/>
+            <w:vAlign w:val="center"/>
+          </w:tcPr>
+          <w:p>
+            <w:pPr>
+              <w:jc w:val="center"/>
+            </w:pPr>
+            <w:r>
+              <w:rPr>
+                <w:rFonts w:ascii="Times New Roman" w:hAnsi="Times New Roman"/>
+                <w:b w:val="0"/>
+                <w:sz w:val="18"/>
+              </w:rPr>
+              <w:t>0,931</w:t>
+            </w:r>
+          </w:p>
+        </w:tc>
+        <w:tc>
+          <w:tcPr>
+            <w:tcW w:type="dxa" w:w="1020"/>
+            <w:vAlign w:val="center"/>
+          </w:tcPr>
+          <w:p>
+            <w:pPr>
+              <w:jc w:val="center"/>
+            </w:pPr>
+            <w:r>
+              <w:rPr>
+                <w:rFonts w:ascii="Times New Roman" w:hAnsi="Times New Roman"/>
+                <w:b w:val="0"/>
+                <w:sz w:val="18"/>
+              </w:rPr>
+              <w:t>0,884</w:t>
+            </w:r>
+          </w:p>
+        </w:tc>
+      </w:tr>
+      <w:tr>
+        <w:tc>
+          <w:tcPr>
+            <w:tcW w:type="dxa" w:w="1814"/>
+            <w:vAlign w:val="center"/>
+          </w:tcPr>
+          <w:p>
+            <w:pPr>
+              <w:jc w:val="left"/>
+            </w:pPr>
+            <w:r>
+              <w:rPr>
+                <w:rFonts w:ascii="Times New Roman" w:hAnsi="Times New Roman"/>
+                <w:b w:val="0"/>
+                <w:sz w:val="18"/>
+              </w:rPr>
+              <w:t>Cros Vila vd. [33]</w:t>
+              <w:br/>
+              <w:t>(TISMIR 2025)</w:t>
+            </w:r>
+          </w:p>
+        </w:tc>
+        <w:tc>
+          <w:tcPr>
+            <w:tcW w:type="dxa" w:w="2721"/>
+            <w:vAlign w:val="center"/>
+          </w:tcPr>
+          <w:p>
+            <w:pPr>
+              <w:jc w:val="left"/>
+            </w:pPr>
+            <w:r>
+              <w:rPr>
+                <w:rFonts w:ascii="Times New Roman" w:hAnsi="Times New Roman"/>
+                <w:b w:val="0"/>
+                <w:sz w:val="18"/>
+              </w:rPr>
+              <w:t>Spektral + ritmik öznitelik + SVM</w:t>
+            </w:r>
+          </w:p>
+        </w:tc>
+        <w:tc>
+          <w:tcPr>
+            <w:tcW w:type="dxa" w:w="1814"/>
+            <w:vAlign w:val="center"/>
+          </w:tcPr>
+          <w:p>
+            <w:pPr>
+              <w:jc w:val="left"/>
+            </w:pPr>
+            <w:r>
+              <w:rPr>
+                <w:rFonts w:ascii="Times New Roman" w:hAnsi="Times New Roman"/>
+                <w:b w:val="0"/>
+                <w:sz w:val="18"/>
+              </w:rPr>
+              <w:t>Özel (Suno, MusicGen)</w:t>
+            </w:r>
+          </w:p>
+        </w:tc>
+        <w:tc>
+          <w:tcPr>
+            <w:tcW w:type="dxa" w:w="1134"/>
+            <w:vAlign w:val="center"/>
+          </w:tcPr>
+          <w:p>
+            <w:pPr>
+              <w:jc w:val="center"/>
+            </w:pPr>
+            <w:r>
+              <w:rPr>
+                <w:rFonts w:ascii="Times New Roman" w:hAnsi="Times New Roman"/>
+                <w:b w:val="0"/>
+                <w:sz w:val="18"/>
+              </w:rPr>
+              <w:t>0,941</w:t>
+            </w:r>
+          </w:p>
+        </w:tc>
+        <w:tc>
+          <w:tcPr>
+            <w:tcW w:type="dxa" w:w="1020"/>
+            <w:vAlign w:val="center"/>
+          </w:tcPr>
+          <w:p>
+            <w:pPr>
+              <w:jc w:val="center"/>
+            </w:pPr>
+            <w:r>
+              <w:rPr>
+                <w:rFonts w:ascii="Times New Roman" w:hAnsi="Times New Roman"/>
+                <w:b w:val="0"/>
+                <w:sz w:val="18"/>
+              </w:rPr>
+              <w:t>—</w:t>
+            </w:r>
+          </w:p>
+        </w:tc>
+      </w:tr>
+      <w:tr>
+        <w:tc>
+          <w:tcPr>
+            <w:tcW w:type="dxa" w:w="1814"/>
+            <w:vAlign w:val="center"/>
+          </w:tcPr>
+          <w:p>
+            <w:pPr>
+              <w:jc w:val="left"/>
+            </w:pPr>
+            <w:r>
+              <w:rPr>
+                <w:rFonts w:ascii="Times New Roman" w:hAnsi="Times New Roman"/>
+                <w:b w:val="0"/>
+                <w:sz w:val="18"/>
+              </w:rPr>
+              <w:t>SONICS [34]</w:t>
+              <w:br/>
+              <w:t>(ICLR 2025)</w:t>
+            </w:r>
+          </w:p>
+        </w:tc>
+        <w:tc>
+          <w:tcPr>
+            <w:tcW w:type="dxa" w:w="2721"/>
+            <w:vAlign w:val="center"/>
+          </w:tcPr>
+          <w:p>
+            <w:pPr>
+              <w:jc w:val="left"/>
+            </w:pPr>
+            <w:r>
+              <w:rPr>
+                <w:rFonts w:ascii="Times New Roman" w:hAnsi="Times New Roman"/>
+                <w:b w:val="0"/>
+                <w:sz w:val="18"/>
+              </w:rPr>
+              <w:t>Transformer tabanlı derin öğrenme</w:t>
+            </w:r>
+          </w:p>
+        </w:tc>
+        <w:tc>
+          <w:tcPr>
+            <w:tcW w:type="dxa" w:w="1814"/>
+            <w:vAlign w:val="center"/>
+          </w:tcPr>
+          <w:p>
+            <w:pPr>
+              <w:jc w:val="left"/>
+            </w:pPr>
+            <w:r>
+              <w:rPr>
+                <w:rFonts w:ascii="Times New Roman" w:hAnsi="Times New Roman"/>
+                <w:b w:val="0"/>
+                <w:sz w:val="18"/>
+              </w:rPr>
+              <w:t>SONICS (özel)</w:t>
+            </w:r>
+          </w:p>
+        </w:tc>
+        <w:tc>
+          <w:tcPr>
+            <w:tcW w:type="dxa" w:w="1134"/>
+            <w:vAlign w:val="center"/>
+          </w:tcPr>
+          <w:p>
+            <w:pPr>
+              <w:jc w:val="center"/>
+            </w:pPr>
+            <w:r>
+              <w:rPr>
+                <w:rFonts w:ascii="Times New Roman" w:hAnsi="Times New Roman"/>
+                <w:b w:val="0"/>
+                <w:sz w:val="18"/>
+              </w:rPr>
+              <w:t>0,960</w:t>
+            </w:r>
+          </w:p>
+        </w:tc>
+        <w:tc>
+          <w:tcPr>
+            <w:tcW w:type="dxa" w:w="1020"/>
+            <w:vAlign w:val="center"/>
+          </w:tcPr>
+          <w:p>
+            <w:pPr>
+              <w:jc w:val="center"/>
+            </w:pPr>
+            <w:r>
+              <w:rPr>
+                <w:rFonts w:ascii="Times New Roman" w:hAnsi="Times New Roman"/>
+                <w:b w:val="0"/>
+                <w:sz w:val="18"/>
+              </w:rPr>
+              <w:t>0,921</w:t>
+            </w:r>
+          </w:p>
+        </w:tc>
+      </w:tr>
+      <w:tr>
+        <w:tc>
+          <w:tcPr>
+            <w:tcW w:type="dxa" w:w="1814"/>
+            <w:vAlign w:val="center"/>
+          </w:tcPr>
+          <w:p>
+            <w:pPr>
+              <w:jc w:val="left"/>
+            </w:pPr>
+            <w:r>
+              <w:rPr>
+                <w:rFonts w:ascii="Times New Roman" w:hAnsi="Times New Roman"/>
+                <w:b w:val="0"/>
+                <w:sz w:val="18"/>
+              </w:rPr>
+              <w:t>FakeMusicCaps [35]</w:t>
+              <w:br/>
+              <w:t>(J. Imaging 2025)</w:t>
+            </w:r>
+          </w:p>
+        </w:tc>
+        <w:tc>
+          <w:tcPr>
+            <w:tcW w:type="dxa" w:w="2721"/>
+            <w:vAlign w:val="center"/>
+          </w:tcPr>
+          <w:p>
+            <w:pPr>
+              <w:jc w:val="left"/>
+            </w:pPr>
+            <w:r>
+              <w:rPr>
+                <w:rFonts w:ascii="Times New Roman" w:hAnsi="Times New Roman"/>
+                <w:b w:val="0"/>
+                <w:sz w:val="18"/>
+              </w:rPr>
+              <w:t>Çok modlu MusicCaps öznitelikleri</w:t>
+            </w:r>
+          </w:p>
+        </w:tc>
+        <w:tc>
+          <w:tcPr>
+            <w:tcW w:type="dxa" w:w="1814"/>
+            <w:vAlign w:val="center"/>
+          </w:tcPr>
+          <w:p>
+            <w:pPr>
+              <w:jc w:val="left"/>
+            </w:pPr>
+            <w:r>
+              <w:rPr>
+                <w:rFonts w:ascii="Times New Roman" w:hAnsi="Times New Roman"/>
+                <w:b w:val="0"/>
+                <w:sz w:val="18"/>
+              </w:rPr>
+              <w:t>FakeMusicCaps</w:t>
+            </w:r>
+          </w:p>
+        </w:tc>
+        <w:tc>
+          <w:tcPr>
+            <w:tcW w:type="dxa" w:w="1134"/>
+            <w:vAlign w:val="center"/>
+          </w:tcPr>
+          <w:p>
+            <w:pPr>
+              <w:jc w:val="center"/>
+            </w:pPr>
+            <w:r>
+              <w:rPr>
+                <w:rFonts w:ascii="Times New Roman" w:hAnsi="Times New Roman"/>
+                <w:b w:val="0"/>
+                <w:sz w:val="18"/>
+              </w:rPr>
+              <w:t>0,943</w:t>
+            </w:r>
+          </w:p>
+        </w:tc>
+        <w:tc>
+          <w:tcPr>
+            <w:tcW w:type="dxa" w:w="1020"/>
+            <w:vAlign w:val="center"/>
+          </w:tcPr>
+          <w:p>
+            <w:pPr>
+              <w:jc w:val="center"/>
+            </w:pPr>
+            <w:r>
+              <w:rPr>
+                <w:rFonts w:ascii="Times New Roman" w:hAnsi="Times New Roman"/>
+                <w:b w:val="0"/>
+                <w:sz w:val="18"/>
+              </w:rPr>
+              <w:t>0,906</w:t>
+            </w:r>
+          </w:p>
+        </w:tc>
+      </w:tr>
+      <w:tr>
+        <w:tc>
+          <w:tcPr>
+            <w:tcW w:type="dxa" w:w="1814"/>
+            <w:vAlign w:val="center"/>
+          </w:tcPr>
+          <w:p>
+            <w:pPr>
+              <w:jc w:val="left"/>
+            </w:pPr>
+            <w:r>
+              <w:rPr>
+                <w:rFonts w:ascii="Times New Roman" w:hAnsi="Times New Roman"/>
+                <w:b/>
+                <w:sz w:val="18"/>
+              </w:rPr>
+              <w:t>AURIS</w:t>
+              <w:br/>
+              <w:t>(Bu çalışma)</w:t>
+            </w:r>
+          </w:p>
+        </w:tc>
+        <w:tc>
+          <w:tcPr>
+            <w:tcW w:type="dxa" w:w="2721"/>
+            <w:vAlign w:val="center"/>
+          </w:tcPr>
+          <w:p>
+            <w:pPr>
+              <w:jc w:val="left"/>
+            </w:pPr>
+            <w:r>
+              <w:rPr>
+                <w:rFonts w:ascii="Times New Roman" w:hAnsi="Times New Roman"/>
+                <w:b/>
+                <w:sz w:val="18"/>
+              </w:rPr>
+              <w:t>47-boyutlu akustik öznitelik +</w:t>
+              <w:br/>
+              <w:t>11-model topluluk öğrenmesi</w:t>
+            </w:r>
+          </w:p>
+        </w:tc>
+        <w:tc>
+          <w:tcPr>
+            <w:tcW w:type="dxa" w:w="1814"/>
+            <w:vAlign w:val="center"/>
+          </w:tcPr>
+          <w:p>
+            <w:pPr>
+              <w:jc w:val="left"/>
+            </w:pPr>
+            <w:r>
+              <w:rPr>
+                <w:rFonts w:ascii="Times New Roman" w:hAnsi="Times New Roman"/>
+                <w:b/>
+                <w:sz w:val="18"/>
+              </w:rPr>
+              <w:t>Özel (5.195 örnek)</w:t>
+            </w:r>
+          </w:p>
+        </w:tc>
+        <w:tc>
+          <w:tcPr>
+            <w:tcW w:type="dxa" w:w="1134"/>
+            <w:vAlign w:val="center"/>
+          </w:tcPr>
+          <w:p>
+            <w:pPr>
+              <w:jc w:val="center"/>
+            </w:pPr>
+            <w:r>
+              <w:rPr>
+                <w:rFonts w:ascii="Times New Roman" w:hAnsi="Times New Roman"/>
+                <w:b/>
+                <w:sz w:val="18"/>
+              </w:rPr>
+              <w:t>0,9548</w:t>
+            </w:r>
+          </w:p>
+        </w:tc>
+        <w:tc>
+          <w:tcPr>
+            <w:tcW w:type="dxa" w:w="1020"/>
+            <w:vAlign w:val="center"/>
+          </w:tcPr>
+          <w:p>
+            <w:pPr>
+              <w:jc w:val="center"/>
+            </w:pPr>
+            <w:r>
+              <w:rPr>
+                <w:rFonts w:ascii="Times New Roman" w:hAnsi="Times New Roman"/>
+                <w:b/>
+                <w:sz w:val="18"/>
+              </w:rPr>
+              <w:t>0,8731</w:t>
+            </w:r>
+          </w:p>
+        </w:tc>
+      </w:tr>
+    </w:tbl>
+    <w:p>
+      <w:pPr>
+        <w:jc w:val="left"/>
+      </w:pPr>
+      <w:r>
+        <w:rPr>
+          <w:rFonts w:ascii="Times New Roman" w:hAnsi="Times New Roman"/>
+          <w:b w:val="0"/>
+          <w:sz w:val="18"/>
+        </w:rPr>
+      </w:r>
+    </w:p>
+    <w:p>
+      <w:pPr>
+        <w:jc w:val="left"/>
+      </w:pPr>
+      <w:r>
+        <w:rPr>
+          <w:rFonts w:ascii="Times New Roman" w:hAnsi="Times New Roman"/>
+          <w:b w:val="0"/>
+          <w:sz w:val="18"/>
+        </w:rPr>
+        <w:t xml:space="preserve">Tablo 7, AURIS sisteminin literatürdeki doğrudan ilgili çalışmalarla karşılaştırmasını sunmaktadır. AURIS, ROC-AUC (0,9548) açısından SONICS [34] (0,960) ve Cros Vila vd. [33] (0,941) ile rekabetçi bir konuma ulaşırken, uçtan-uca aküstiğe dayalı topluluk tasarımının yorumlanabilirlik ve düşük varyans açısından ek avantajlar sağladığını ortaya koymaktadır. </w:t>
+      </w:r>
     </w:p>
     <w:p>
       <w:pPr>

</xml_diff>

<commit_message>
Add scripts for document auditing and figure reference checks in AURIS document
</commit_message>
<xml_diff>
--- a/docs/academic/paper/deliverables/AURIS_Makale_Metni.docx
+++ b/docs/academic/paper/deliverables/AURIS_Makale_Metni.docx
@@ -1632,261 +1632,10 @@
       </w:pPr>
       <w:r>
         <w:rPr>
-          <w:sz w:val="18"/>
-        </w:rPr>
-        <w:t xml:space="preserve">Suno, </w:t>
-      </w:r>
-      <w:proofErr w:type="spellStart"/>
-      <w:r>
-        <w:rPr>
-          <w:sz w:val="18"/>
-        </w:rPr>
-        <w:t>Udio</w:t>
-      </w:r>
-      <w:proofErr w:type="spellEnd"/>
-      <w:r>
-        <w:rPr>
-          <w:sz w:val="18"/>
-        </w:rPr>
-        <w:t xml:space="preserve"> </w:t>
-      </w:r>
-      <w:proofErr w:type="spellStart"/>
-      <w:r>
-        <w:rPr>
-          <w:sz w:val="18"/>
-        </w:rPr>
-        <w:t>ve</w:t>
-      </w:r>
-      <w:proofErr w:type="spellEnd"/>
-      <w:r>
-        <w:rPr>
-          <w:sz w:val="18"/>
-        </w:rPr>
-        <w:t xml:space="preserve"> </w:t>
-      </w:r>
-      <w:proofErr w:type="spellStart"/>
-      <w:r>
-        <w:rPr>
-          <w:sz w:val="18"/>
-        </w:rPr>
-        <w:t>MusicGe</w:t>
-      </w:r>
-      <w:proofErr w:type="spellEnd"/>
-      <w:r>
-        <w:rPr>
-          <w:sz w:val="18"/>
-        </w:rPr>
-        <w:t xml:space="preserve"> </w:t>
-      </w:r>
-      <w:proofErr w:type="spellStart"/>
-      <w:r>
-        <w:rPr>
-          <w:sz w:val="18"/>
-        </w:rPr>
-        <w:t>gibi</w:t>
-      </w:r>
-      <w:proofErr w:type="spellEnd"/>
-      <w:r>
-        <w:rPr>
-          <w:sz w:val="18"/>
-        </w:rPr>
-        <w:t xml:space="preserve"> </w:t>
-      </w:r>
-      <w:proofErr w:type="spellStart"/>
-      <w:r>
-        <w:rPr>
-          <w:sz w:val="18"/>
-        </w:rPr>
-        <w:t>metinden</w:t>
-      </w:r>
-      <w:proofErr w:type="spellEnd"/>
-      <w:r>
-        <w:rPr>
-          <w:sz w:val="18"/>
-        </w:rPr>
-        <w:t xml:space="preserve"> </w:t>
-      </w:r>
-      <w:proofErr w:type="spellStart"/>
-      <w:r>
-        <w:rPr>
-          <w:sz w:val="18"/>
-        </w:rPr>
-        <w:t>müziğe</w:t>
-      </w:r>
-      <w:proofErr w:type="spellEnd"/>
-      <w:r>
-        <w:rPr>
-          <w:sz w:val="18"/>
-        </w:rPr>
-        <w:t xml:space="preserve"> </w:t>
-      </w:r>
-      <w:proofErr w:type="spellStart"/>
-      <w:r>
-        <w:rPr>
-          <w:sz w:val="18"/>
-        </w:rPr>
-        <w:t>üretim</w:t>
-      </w:r>
-      <w:proofErr w:type="spellEnd"/>
-      <w:r>
-        <w:rPr>
-          <w:sz w:val="18"/>
-        </w:rPr>
-        <w:t xml:space="preserve"> </w:t>
-      </w:r>
-      <w:proofErr w:type="spellStart"/>
-      <w:r>
-        <w:rPr>
-          <w:sz w:val="18"/>
-        </w:rPr>
-        <w:t>sistemlerinin</w:t>
-      </w:r>
-      <w:proofErr w:type="spellEnd"/>
-      <w:r>
-        <w:rPr>
-          <w:sz w:val="18"/>
-        </w:rPr>
-        <w:t xml:space="preserve"> yaygınlaşması, üretilen müzik parçalarının insan eliyle bestelenmiş kayıtlardan ayırt edilmesini bir tespit problemi olarak gündeme getirmiştir. Bu çalışmada, 47 boyutlu akustik öznitelik vektörü ile yedi makine öğrenmesi ve dört derin öğrenme algoritmasından oluşan on bir modelli bir topluluk öğrenmesi yaklaşımını birleştiren AURIS adlı bir sistem önerilmektedir. Modeller, on iki yapay zekâ üretici sisteminden ve birden çok insan kaynağından derlenen 5.195 örneklik bir veri kümesi üzerinde 5-katlı çapraz doğrulama ile eğitilmiştir. LightGBM, %95,48 ROC-AUC ve ±0,0023 standart sapma ile en başarılı sonucu elde etmiştir. Spektral düzlük standart sapması en bilgilendirici öznitelik olarak ön plana çıkmıştır. Youden J kriteri ile optimize edilen θ* = 0,4316 karar eşiği varsayılan 0,5 eşiğine kıyasla dengeli doğruluğu iyileştirmiştir. Brier </w:t>
-      </w:r>
-      <w:proofErr w:type="spellStart"/>
-      <w:r>
-        <w:rPr>
-          <w:sz w:val="18"/>
-        </w:rPr>
-        <w:t>skoru</w:t>
-      </w:r>
-      <w:proofErr w:type="spellEnd"/>
-      <w:r>
-        <w:rPr>
-          <w:sz w:val="18"/>
-        </w:rPr>
-        <w:t xml:space="preserve"> 0,083 </w:t>
-      </w:r>
-      <w:proofErr w:type="spellStart"/>
-      <w:r>
-        <w:rPr>
-          <w:sz w:val="18"/>
-        </w:rPr>
-        <w:t>olarak</w:t>
-      </w:r>
-      <w:proofErr w:type="spellEnd"/>
-      <w:r>
-        <w:rPr>
-          <w:sz w:val="18"/>
-        </w:rPr>
-        <w:t xml:space="preserve"> </w:t>
-      </w:r>
-      <w:proofErr w:type="spellStart"/>
-      <w:r>
-        <w:rPr>
-          <w:sz w:val="18"/>
-        </w:rPr>
-        <w:t>ölçülmüş</w:t>
-      </w:r>
-      <w:proofErr w:type="spellEnd"/>
-      <w:r>
-        <w:rPr>
-          <w:sz w:val="18"/>
-        </w:rPr>
-        <w:t xml:space="preserve"> </w:t>
-      </w:r>
-      <w:proofErr w:type="spellStart"/>
-      <w:r>
-        <w:rPr>
-          <w:sz w:val="18"/>
-        </w:rPr>
-        <w:t>ve</w:t>
-      </w:r>
-      <w:proofErr w:type="spellEnd"/>
-      <w:r>
-        <w:rPr>
-          <w:sz w:val="18"/>
-        </w:rPr>
-        <w:t xml:space="preserve"> </w:t>
-      </w:r>
-      <w:proofErr w:type="spellStart"/>
-      <w:r>
-        <w:rPr>
-          <w:sz w:val="18"/>
-        </w:rPr>
-        <w:t>modelin</w:t>
-      </w:r>
-      <w:proofErr w:type="spellEnd"/>
-      <w:r>
-        <w:rPr>
-          <w:sz w:val="18"/>
-        </w:rPr>
-        <w:t xml:space="preserve"> </w:t>
-      </w:r>
-      <w:proofErr w:type="spellStart"/>
-      <w:r>
-        <w:rPr>
-          <w:sz w:val="18"/>
-        </w:rPr>
-        <w:t>olasılık</w:t>
-      </w:r>
-      <w:proofErr w:type="spellEnd"/>
-      <w:r>
-        <w:rPr>
-          <w:sz w:val="18"/>
-        </w:rPr>
-        <w:t xml:space="preserve"> </w:t>
-      </w:r>
-      <w:proofErr w:type="spellStart"/>
-      <w:r>
-        <w:rPr>
-          <w:sz w:val="18"/>
-        </w:rPr>
-        <w:t>çıktılarının</w:t>
-      </w:r>
-      <w:proofErr w:type="spellEnd"/>
-      <w:r>
-        <w:rPr>
-          <w:sz w:val="18"/>
-        </w:rPr>
-        <w:t xml:space="preserve"> iyi </w:t>
-      </w:r>
-      <w:proofErr w:type="spellStart"/>
-      <w:r>
-        <w:rPr>
-          <w:sz w:val="18"/>
-        </w:rPr>
-        <w:t>kalibre</w:t>
-      </w:r>
-      <w:proofErr w:type="spellEnd"/>
-      <w:r>
-        <w:rPr>
-          <w:sz w:val="18"/>
-        </w:rPr>
-        <w:t xml:space="preserve"> </w:t>
-      </w:r>
-      <w:proofErr w:type="spellStart"/>
-      <w:r>
-        <w:rPr>
-          <w:sz w:val="18"/>
-        </w:rPr>
-        <w:t>olduğu</w:t>
-      </w:r>
-      <w:proofErr w:type="spellEnd"/>
-      <w:r>
-        <w:rPr>
-          <w:sz w:val="18"/>
-        </w:rPr>
-        <w:t xml:space="preserve"> </w:t>
-      </w:r>
-      <w:proofErr w:type="spellStart"/>
-      <w:r>
-        <w:rPr>
-          <w:sz w:val="18"/>
-        </w:rPr>
-        <w:t>doğrulanmıştır</w:t>
-      </w:r>
-      <w:proofErr w:type="spellEnd"/>
-      <w:r>
-        <w:rPr>
-          <w:sz w:val="18"/>
-        </w:rPr>
-        <w:t>.</w:t>
+          <w:rFonts w:ascii="Times New Roman" w:hAnsi="Times New Roman"/>
+          <w:sz w:val="18"/>
+        </w:rPr>
+        <w:t>Suno, Udio ve MusicGen gibi metinden müziğe üretim sistemlerinin yaygınlaşması, üretilen müzik parçalarının insan eliyle bestelenmiş kayıtlardan ayırt edilmesini bir tespit problemi olarak gündeme getirmiştir. Bu çalışmada, 47 boyutlu akustik öznitelik vektörü ile yedi makine öğrenmesi ve dört derin öğrenme algoritmasından oluşan on bir modelli bir topluluk öğrenmesi yaklaşımını birleştiren AURIS adlı bir sistem önerilmektedir. Modeller, on iki yapay zekâ üretici sisteminden ve birden çok insan kaynağından derlenen 5.195 örneklik bir veri kümesi üzerinde 5-katlı çapraz doğrulama ile eğitilmiştir. LightGBM, %95,48 ROC-AUC ve ±0,0023 standart sapma ile en başarılı sonucu elde etmiştir. Spektral düzlük standart sapması en bilgilendirici öznitelik olarak ön plana çıkmıştır. Youden J kriteri ile optimize edilen θ* = 0,4316 karar eşiği varsayılan 0,5 eşiğine kıyasla dengeli doğruluğu iyileştirmiştir. Brier skoru 0,083 olarak ölçülmüş ve modelin olasılık çıktılarının iyi kalibre olduğu doğrulanmıştır.</w:t>
       </w:r>
     </w:p>
     <w:p>
@@ -2513,79 +2262,11 @@
       </w:pPr>
       <w:r>
         <w:rPr>
+          <w:rFonts w:ascii="Times New Roman" w:hAnsi="Times New Roman"/>
           <w:b/>
-          <w:sz w:val="18"/>
-        </w:rPr>
-        <w:t xml:space="preserve">2.1. </w:t>
-      </w:r>
-      <w:proofErr w:type="spellStart"/>
-      <w:r>
-        <w:rPr>
-          <w:b/>
-          <w:sz w:val="18"/>
-        </w:rPr>
-        <w:t>Kullanılan</w:t>
-      </w:r>
-      <w:proofErr w:type="spellEnd"/>
-      <w:r>
-        <w:rPr>
-          <w:b/>
-          <w:sz w:val="18"/>
-        </w:rPr>
-        <w:t xml:space="preserve"> </w:t>
-      </w:r>
-      <w:proofErr w:type="spellStart"/>
-      <w:r>
-        <w:rPr>
-          <w:b/>
-          <w:sz w:val="18"/>
-        </w:rPr>
-        <w:t>veri</w:t>
-      </w:r>
-      <w:proofErr w:type="spellEnd"/>
-      <w:r>
-        <w:rPr>
-          <w:b/>
-          <w:sz w:val="18"/>
-        </w:rPr>
-        <w:t xml:space="preserve"> </w:t>
-      </w:r>
-      <w:proofErr w:type="spellStart"/>
-      <w:r>
-        <w:rPr>
-          <w:b/>
-          <w:sz w:val="18"/>
-        </w:rPr>
-        <w:t>kümesi</w:t>
-      </w:r>
-      <w:proofErr w:type="spellEnd"/>
-      <w:r>
-        <w:rPr>
-          <w:b/>
-          <w:sz w:val="18"/>
-        </w:rPr>
-        <w:t xml:space="preserve"> </w:t>
-      </w:r>
-      <w:r>
-        <w:rPr>
-          <w:b/>
-          <w:sz w:val="16"/>
-        </w:rPr>
-        <w:t xml:space="preserve">(Utilized </w:t>
-      </w:r>
-      <w:r>
-        <w:rPr>
-          <w:b/>
-          <w:sz w:val="16"/>
-        </w:rPr>
-        <w:t>D</w:t>
-      </w:r>
-      <w:r>
-        <w:rPr>
-          <w:b/>
-          <w:sz w:val="16"/>
-        </w:rPr>
-        <w:t>ataset)</w:t>
+          <w:sz w:val="20"/>
+        </w:rPr>
+        <w:t>2.1. Kullanılan Veri Kümesi (Utilized Dataset)</w:t>
       </w:r>
     </w:p>
     <w:p>
@@ -3616,17 +3297,11 @@
       </w:pPr>
       <w:r>
         <w:rPr>
+          <w:rFonts w:ascii="Times New Roman" w:hAnsi="Times New Roman"/>
           <w:b/>
-          <w:sz w:val="18"/>
-        </w:rPr>
-        <w:t xml:space="preserve">2.2. Öznitelik çıkarma </w:t>
-      </w:r>
-      <w:r>
-        <w:rPr>
-          <w:b/>
-          <w:sz w:val="16"/>
-        </w:rPr>
-        <w:t>(Feature extraction)</w:t>
+          <w:sz w:val="20"/>
+        </w:rPr>
+        <w:t>2.2. Öznitelik Çıkarma (Feature extraction)</w:t>
       </w:r>
     </w:p>
     <w:p>
@@ -3735,17 +3410,11 @@
       </w:pPr>
       <w:r>
         <w:rPr>
+          <w:rFonts w:ascii="Times New Roman" w:hAnsi="Times New Roman"/>
           <w:b/>
-          <w:sz w:val="18"/>
-        </w:rPr>
-        <w:t xml:space="preserve">2.3. Sınıflandırma modelleri </w:t>
-      </w:r>
-      <w:r>
-        <w:rPr>
-          <w:b/>
-          <w:sz w:val="16"/>
-        </w:rPr>
-        <w:t>(Classification models)</w:t>
+          <w:sz w:val="20"/>
+        </w:rPr>
+        <w:t>2.3. Sınıflandırma Modelleri (Classification models)</w:t>
       </w:r>
     </w:p>
     <w:p>
@@ -4530,82 +4199,11 @@
       </w:pPr>
       <w:r>
         <w:rPr>
+          <w:rFonts w:ascii="Times New Roman" w:hAnsi="Times New Roman"/>
           <w:b/>
-          <w:sz w:val="18"/>
-        </w:rPr>
-        <w:t xml:space="preserve">2.4. Eğitim protokolü ve karar eşiği optimizasyonu </w:t>
-      </w:r>
-      <w:r>
-        <w:rPr>
-          <w:b/>
-          <w:sz w:val="16"/>
-        </w:rPr>
-        <w:t xml:space="preserve">(Training </w:t>
-      </w:r>
-      <w:r>
-        <w:rPr>
-          <w:b/>
-          <w:sz w:val="16"/>
-        </w:rPr>
-        <w:t>P</w:t>
-      </w:r>
-      <w:r>
-        <w:rPr>
-          <w:b/>
-          <w:sz w:val="16"/>
-        </w:rPr>
-        <w:t xml:space="preserve">rotocol and </w:t>
-      </w:r>
-      <w:r>
-        <w:rPr>
-          <w:b/>
-          <w:sz w:val="16"/>
-        </w:rPr>
-        <w:t>D</w:t>
-      </w:r>
-      <w:r>
-        <w:rPr>
-          <w:b/>
-          <w:sz w:val="16"/>
-        </w:rPr>
-        <w:t xml:space="preserve">ecision </w:t>
-      </w:r>
-      <w:r>
-        <w:rPr>
-          <w:b/>
-          <w:sz w:val="16"/>
-        </w:rPr>
-        <w:t>T</w:t>
-      </w:r>
-      <w:r>
-        <w:rPr>
-          <w:b/>
-          <w:sz w:val="16"/>
-        </w:rPr>
-        <w:t xml:space="preserve">hreshold </w:t>
-      </w:r>
-      <w:proofErr w:type="spellStart"/>
-      <w:r>
-        <w:rPr>
-          <w:b/>
-          <w:sz w:val="16"/>
-        </w:rPr>
-        <w:t>O</w:t>
-      </w:r>
-      <w:r>
-        <w:rPr>
-          <w:b/>
-          <w:sz w:val="16"/>
-        </w:rPr>
-        <w:t>ptimisation</w:t>
-      </w:r>
-      <w:proofErr w:type="spellEnd"/>
-      <w:r>
-        <w:rPr>
-          <w:b/>
-          <w:sz w:val="16"/>
-        </w:rPr>
-        <w:t>)</w:t>
+          <w:sz w:val="20"/>
+        </w:rPr>
+        <w:t>2.4. Eğitim Protokolü ve Karar Eşiği Optimizasyonu (Training Protocol and Decision Threshold Optimisation)</w:t>
       </w:r>
     </w:p>
     <w:p>
@@ -7155,9 +6753,10 @@
       </w:pPr>
       <w:r>
         <w:rPr>
-          <w:sz w:val="18"/>
-        </w:rPr>
-        <w:t>Makine öğrenmesi ile derin öğrenme aileleri karşılaştırıldığında, yedi makine öğrenmesi sınıflandırıcısı %92,75 ortalama ROC-AUC değerine ulaşırken dört derin öğrenme mimarisi %92,32 değerinde kalmaktadır. 1B-ESA dışlandığında, kalan üç DL mimarisi %94,62 ortalama elde etmektedir. Bu bulgu, 47 boyutlu öznitelik vektörünün ayırt edici bilginin büyük kısmını kodladığını ve öznitelik mühendisliğinin model kapasitesinden daha belirleyici bir etken olduğunu göstermektedir.</w:t>
+          <w:rFonts w:ascii="Times New Roman" w:hAnsi="Times New Roman"/>
+          <w:sz w:val="18"/>
+        </w:rPr>
+        <w:t>Şekil 4, yedi makine öğrenmesi modelinin ROC eğrilerini karşılaştırmaktadır. Şekil 5, makine öğrenmesi ile derin öğrenme ailelerinin performans dağılımını göstermektedir. Makine öğrenmesi ile derin öğrenme aileleri karşılaştırıldığında, yedi makine öğrenmesi sınıflandırıcısı %92,75 ortalama ROC-AUC değerine ulaşırken dört derin öğrenme mimarisi %92,32 değerinde kalmaktadır. 1B-ESA dışlandığında, kalan üç DL mimarisi %94,62 ortalama elde etmektedir. Bu bulgu, 47 boyutlu öznitelik vektörünün ayırt edici bilginin büyük kısmını kodladığını ve öznitelik mühendisliğinin model kapasitesinden daha belirleyici bir etken olduğunu göstermektedir.</w:t>
       </w:r>
     </w:p>
     <w:p>
@@ -7256,7 +6855,35 @@
         <w:rPr>
           <w:sz w:val="18"/>
         </w:rPr>
-        <w:t xml:space="preserve">Katlar-arası kararlılık açısından LightGBM ±0,0023 standart sapma ile havuzdaki en kararlı modeldir; beş katı 0,9515 ile 0,9580 arasında dar bir aralıkta değişmektedir. XGBoost (±0,0029) ve Gradyan Artırma (±0,0038) onu izlemektedir. En değişken modeller 1B-ESA (±0,0087) ve SVM-RBF (±0,0075) olmuştur. Kararlılığa göre </w:t>
+        <w:t xml:space="preserve">Katlar-arası kararlılık açısından LightGBM ±0,0023 standart sapma ile havuzdaki en kararlı modeldir; beş katı 0,9515 ile 0,9580 arasında dar bir aralıkta değişmektedir. XGBoost (±0,0029) ve Gradyan Artırma (±0,0038) onu izlemektedir. En değişken modeller 1B-ESA (±0,0087) ve SVM-RBF (±0,0075) olmuştur. </w:t>
+      </w:r>
+      <w:proofErr w:type="spellStart"/>
+      <w:r>
+        <w:rPr>
+          <w:sz w:val="18"/>
+        </w:rPr>
+        <w:t>Kararlılığa</w:t>
+      </w:r>
+      <w:proofErr w:type="spellEnd"/>
+      <w:r>
+        <w:rPr>
+          <w:sz w:val="18"/>
+        </w:rPr>
+        <w:t xml:space="preserve"> </w:t>
+      </w:r>
+      <w:proofErr w:type="spellStart"/>
+      <w:r>
+        <w:rPr>
+          <w:sz w:val="18"/>
+        </w:rPr>
+        <w:t>göre</w:t>
+      </w:r>
+      <w:proofErr w:type="spellEnd"/>
+      <w:r>
+        <w:rPr>
+          <w:sz w:val="18"/>
+        </w:rPr>
+        <w:t xml:space="preserve"> </w:t>
       </w:r>
       <w:proofErr w:type="spellStart"/>
       <w:r>
@@ -8747,9 +8374,10 @@
       </w:pPr>
       <w:r>
         <w:rPr>
-          <w:sz w:val="18"/>
-        </w:rPr>
-        <w:t>Eşik taraması analizi (Şekil 13), F1 skorunun 0,40-0,50 aralığında bir plato oluşturduğunu göstermektedir. Üretici bazlı performans (Şekil 14) Suno parçalarında %93,0 duyarlılık, Echoes alt kümesinde ise %88,6 duyarlılık elde edildiğini; buna karşın deepfake alt kümesinde performansın %50,0 değerinde kaldığını ortaya koymaktadır. Bu sonuç üretici modeller arası genelleme zorluğunu doğrular niteliktedir.</w:t>
+          <w:rFonts w:ascii="Times New Roman" w:hAnsi="Times New Roman"/>
+          <w:sz w:val="18"/>
+        </w:rPr>
+        <w:t>Eşik taraması analizi (Şekil 12), F1 skorunun 0,40-0,50 aralığında bir plato oluşturduğunu göstermektedir. Üretici bazlı performans (Şekil 13) Suno parçalarında %93,0 duyarlılık, Echoes alt kümesinde ise %88,6 duyarlılık elde edildiğini; buna karşın deepfake alt kümesinde performansın %50,0 değerinde kaldığını ortaya koymaktadır. Bu sonuç üretici modeller arası genelleme zorluğunu doğrular niteliktedir.</w:t>
       </w:r>
     </w:p>
     <w:p>
@@ -8959,59 +8587,52 @@
         <w:spacing w:line="360" w:lineRule="auto"/>
       </w:pPr>
     </w:p>
-    <w:p>
-      <w:pPr>
-        <w:jc w:val="left"/>
-      </w:pPr>
-      <w:r>
-        <w:rPr>
-          <w:rFonts w:ascii="Times New Roman" w:hAnsi="Times New Roman"/>
-          <w:b w:val="0"/>
-          <w:sz w:val="18"/>
-        </w:rPr>
-      </w:r>
-    </w:p>
-    <w:p>
-      <w:pPr>
-        <w:jc w:val="left"/>
-      </w:pPr>
-      <w:r>
-        <w:rPr>
-          <w:rFonts w:ascii="Times New Roman" w:hAnsi="Times New Roman"/>
-          <w:b w:val="0"/>
-          <w:sz w:val="18"/>
-        </w:rPr>
-        <w:t>Tablo 7. Literatürle karşılaştırma (Comparison with literature). (— : yayında rapor edilmemiş.)</w:t>
+    <w:p/>
+    <w:p>
+      <w:pPr>
+        <w:jc w:val="center"/>
+      </w:pPr>
+      <w:r>
+        <w:rPr>
+          <w:sz w:val="18"/>
+        </w:rPr>
+        <w:t>Tablo 7. Literatürle karşılaştırma (Comparison with literature)</w:t>
       </w:r>
     </w:p>
     <w:tbl>
       <w:tblPr>
-        <w:tblStyle w:val="TabloKlavuzu"/>
-        <w:tblW w:type="auto" w:w="0"/>
-        <w:tblLook w:firstColumn="1" w:firstRow="1" w:lastColumn="0" w:lastRow="0" w:noHBand="0" w:noVBand="1" w:val="04A0"/>
+        <w:tblStyle w:val="DzTablo2"/>
+        <w:tblW w:w="0" w:type="auto"/>
+        <w:tblLook w:val="04A0" w:firstRow="1" w:lastRow="0" w:firstColumn="1" w:lastColumn="0" w:noHBand="0" w:noVBand="1"/>
       </w:tblPr>
       <w:tblGrid>
-        <w:gridCol w:w="1881"/>
-        <w:gridCol w:w="1881"/>
-        <w:gridCol w:w="1881"/>
-        <w:gridCol w:w="1881"/>
-        <w:gridCol w:w="1881"/>
+        <w:gridCol w:w="1814"/>
+        <w:gridCol w:w="2721"/>
+        <w:gridCol w:w="1814"/>
+        <w:gridCol w:w="1134"/>
+        <w:gridCol w:w="1020"/>
       </w:tblGrid>
       <w:tr>
-        <w:tc>
-          <w:tcPr>
-            <w:tcW w:type="dxa" w:w="1814"/>
-            <w:vAlign w:val="center"/>
-            <w:shd w:val="clear" w:color="auto" w:fill="D9D9D9"/>
-          </w:tcPr>
-          <w:p>
-            <w:pPr>
-              <w:jc w:val="center"/>
-            </w:pPr>
-            <w:r>
-              <w:rPr>
-                <w:rFonts w:ascii="Times New Roman" w:hAnsi="Times New Roman"/>
-                <w:b/>
+        <w:trPr>
+          <w:cnfStyle w:val="100000000000" w:firstRow="1" w:lastRow="0" w:firstColumn="0" w:lastColumn="0" w:oddVBand="0" w:evenVBand="0" w:oddHBand="0" w:evenHBand="0" w:firstRowFirstColumn="0" w:firstRowLastColumn="0" w:lastRowFirstColumn="0" w:lastRowLastColumn="0"/>
+        </w:trPr>
+        <w:tc>
+          <w:tcPr>
+            <w:cnfStyle w:val="001000000000" w:firstRow="0" w:lastRow="0" w:firstColumn="1" w:lastColumn="0" w:oddVBand="0" w:evenVBand="0" w:oddHBand="0" w:evenHBand="0" w:firstRowFirstColumn="0" w:firstRowLastColumn="0" w:lastRowFirstColumn="0" w:lastRowLastColumn="0"/>
+            <w:tcW w:w="1814" w:type="dxa"/>
+          </w:tcPr>
+          <w:p>
+            <w:pPr>
+              <w:jc w:val="center"/>
+              <w:rPr>
+                <w:b w:val="0"/>
+                <w:bCs w:val="0"/>
+              </w:rPr>
+            </w:pPr>
+            <w:r>
+              <w:rPr>
+                <w:b w:val="0"/>
+                <w:bCs w:val="0"/>
                 <w:sz w:val="18"/>
               </w:rPr>
               <w:t>Çalışma</w:t>
@@ -9020,18 +8641,21 @@
         </w:tc>
         <w:tc>
           <w:tcPr>
-            <w:tcW w:type="dxa" w:w="2721"/>
-            <w:vAlign w:val="center"/>
-            <w:shd w:val="clear" w:color="auto" w:fill="D9D9D9"/>
-          </w:tcPr>
-          <w:p>
-            <w:pPr>
-              <w:jc w:val="center"/>
-            </w:pPr>
-            <w:r>
-              <w:rPr>
-                <w:rFonts w:ascii="Times New Roman" w:hAnsi="Times New Roman"/>
-                <w:b/>
+            <w:tcW w:w="2721" w:type="dxa"/>
+          </w:tcPr>
+          <w:p>
+            <w:pPr>
+              <w:jc w:val="center"/>
+              <w:cnfStyle w:val="100000000000" w:firstRow="1" w:lastRow="0" w:firstColumn="0" w:lastColumn="0" w:oddVBand="0" w:evenVBand="0" w:oddHBand="0" w:evenHBand="0" w:firstRowFirstColumn="0" w:firstRowLastColumn="0" w:lastRowFirstColumn="0" w:lastRowLastColumn="0"/>
+              <w:rPr>
+                <w:b w:val="0"/>
+                <w:bCs w:val="0"/>
+              </w:rPr>
+            </w:pPr>
+            <w:r>
+              <w:rPr>
+                <w:b w:val="0"/>
+                <w:bCs w:val="0"/>
                 <w:sz w:val="18"/>
               </w:rPr>
               <w:t>Yaklaşım</w:t>
@@ -9040,18 +8664,21 @@
         </w:tc>
         <w:tc>
           <w:tcPr>
-            <w:tcW w:type="dxa" w:w="1814"/>
-            <w:vAlign w:val="center"/>
-            <w:shd w:val="clear" w:color="auto" w:fill="D9D9D9"/>
-          </w:tcPr>
-          <w:p>
-            <w:pPr>
-              <w:jc w:val="center"/>
-            </w:pPr>
-            <w:r>
-              <w:rPr>
-                <w:rFonts w:ascii="Times New Roman" w:hAnsi="Times New Roman"/>
-                <w:b/>
+            <w:tcW w:w="1814" w:type="dxa"/>
+          </w:tcPr>
+          <w:p>
+            <w:pPr>
+              <w:jc w:val="center"/>
+              <w:cnfStyle w:val="100000000000" w:firstRow="1" w:lastRow="0" w:firstColumn="0" w:lastColumn="0" w:oddVBand="0" w:evenVBand="0" w:oddHBand="0" w:evenHBand="0" w:firstRowFirstColumn="0" w:firstRowLastColumn="0" w:lastRowFirstColumn="0" w:lastRowLastColumn="0"/>
+              <w:rPr>
+                <w:b w:val="0"/>
+                <w:bCs w:val="0"/>
+              </w:rPr>
+            </w:pPr>
+            <w:r>
+              <w:rPr>
+                <w:b w:val="0"/>
+                <w:bCs w:val="0"/>
                 <w:sz w:val="18"/>
               </w:rPr>
               <w:t>Veri Kümesi</w:t>
@@ -9060,18 +8687,21 @@
         </w:tc>
         <w:tc>
           <w:tcPr>
-            <w:tcW w:type="dxa" w:w="1134"/>
-            <w:vAlign w:val="center"/>
-            <w:shd w:val="clear" w:color="auto" w:fill="D9D9D9"/>
-          </w:tcPr>
-          <w:p>
-            <w:pPr>
-              <w:jc w:val="center"/>
-            </w:pPr>
-            <w:r>
-              <w:rPr>
-                <w:rFonts w:ascii="Times New Roman" w:hAnsi="Times New Roman"/>
-                <w:b/>
+            <w:tcW w:w="1134" w:type="dxa"/>
+          </w:tcPr>
+          <w:p>
+            <w:pPr>
+              <w:jc w:val="center"/>
+              <w:cnfStyle w:val="100000000000" w:firstRow="1" w:lastRow="0" w:firstColumn="0" w:lastColumn="0" w:oddVBand="0" w:evenVBand="0" w:oddHBand="0" w:evenHBand="0" w:firstRowFirstColumn="0" w:firstRowLastColumn="0" w:lastRowFirstColumn="0" w:lastRowLastColumn="0"/>
+              <w:rPr>
+                <w:b w:val="0"/>
+                <w:bCs w:val="0"/>
+              </w:rPr>
+            </w:pPr>
+            <w:r>
+              <w:rPr>
+                <w:b w:val="0"/>
+                <w:bCs w:val="0"/>
                 <w:sz w:val="18"/>
               </w:rPr>
               <w:t>ROC-AUC</w:t>
@@ -9080,18 +8710,21 @@
         </w:tc>
         <w:tc>
           <w:tcPr>
-            <w:tcW w:type="dxa" w:w="1020"/>
-            <w:vAlign w:val="center"/>
-            <w:shd w:val="clear" w:color="auto" w:fill="D9D9D9"/>
-          </w:tcPr>
-          <w:p>
-            <w:pPr>
-              <w:jc w:val="center"/>
-            </w:pPr>
-            <w:r>
-              <w:rPr>
-                <w:rFonts w:ascii="Times New Roman" w:hAnsi="Times New Roman"/>
-                <w:b/>
+            <w:tcW w:w="1020" w:type="dxa"/>
+          </w:tcPr>
+          <w:p>
+            <w:pPr>
+              <w:jc w:val="center"/>
+              <w:cnfStyle w:val="100000000000" w:firstRow="1" w:lastRow="0" w:firstColumn="0" w:lastColumn="0" w:oddVBand="0" w:evenVBand="0" w:oddHBand="0" w:evenHBand="0" w:firstRowFirstColumn="0" w:firstRowLastColumn="0" w:lastRowFirstColumn="0" w:lastRowLastColumn="0"/>
+              <w:rPr>
+                <w:b w:val="0"/>
+                <w:bCs w:val="0"/>
+              </w:rPr>
+            </w:pPr>
+            <w:r>
+              <w:rPr>
+                <w:b w:val="0"/>
+                <w:bCs w:val="0"/>
                 <w:sz w:val="18"/>
               </w:rPr>
               <w:t>F1</w:t>
@@ -9100,22 +8733,27 @@
         </w:tc>
       </w:tr>
       <w:tr>
-        <w:tc>
-          <w:tcPr>
-            <w:tcW w:type="dxa" w:w="1814"/>
-            <w:vAlign w:val="center"/>
-          </w:tcPr>
-          <w:p>
-            <w:pPr>
-              <w:jc w:val="left"/>
-            </w:pPr>
-            <w:r>
-              <w:rPr>
-                <w:rFonts w:ascii="Times New Roman" w:hAnsi="Times New Roman"/>
+        <w:trPr>
+          <w:cnfStyle w:val="000000100000" w:firstRow="0" w:lastRow="0" w:firstColumn="0" w:lastColumn="0" w:oddVBand="0" w:evenVBand="0" w:oddHBand="1" w:evenHBand="0" w:firstRowFirstColumn="0" w:firstRowLastColumn="0" w:lastRowFirstColumn="0" w:lastRowLastColumn="0"/>
+        </w:trPr>
+        <w:tc>
+          <w:tcPr>
+            <w:cnfStyle w:val="001000000000" w:firstRow="0" w:lastRow="0" w:firstColumn="1" w:lastColumn="0" w:oddVBand="0" w:evenVBand="0" w:oddHBand="0" w:evenHBand="0" w:firstRowFirstColumn="0" w:firstRowLastColumn="0" w:lastRowFirstColumn="0" w:lastRowLastColumn="0"/>
+            <w:tcW w:w="1814" w:type="dxa"/>
+          </w:tcPr>
+          <w:p>
+            <w:r>
+              <w:rPr>
                 <w:b w:val="0"/>
                 <w:sz w:val="18"/>
               </w:rPr>
               <w:t>Afchar vd. [5]</w:t>
+            </w:r>
+            <w:r>
+              <w:rPr>
+                <w:b w:val="0"/>
+                <w:sz w:val="18"/>
+              </w:rPr>
               <w:br/>
               <w:t>(ICASSP 2024)</w:t>
             </w:r>
@@ -9123,17 +8761,14 @@
         </w:tc>
         <w:tc>
           <w:tcPr>
-            <w:tcW w:type="dxa" w:w="2721"/>
-            <w:vAlign w:val="center"/>
-          </w:tcPr>
-          <w:p>
-            <w:pPr>
-              <w:jc w:val="left"/>
-            </w:pPr>
-            <w:r>
-              <w:rPr>
-                <w:rFonts w:ascii="Times New Roman" w:hAnsi="Times New Roman"/>
-                <w:b w:val="0"/>
+            <w:tcW w:w="2721" w:type="dxa"/>
+          </w:tcPr>
+          <w:p>
+            <w:pPr>
+              <w:cnfStyle w:val="000000100000" w:firstRow="0" w:lastRow="0" w:firstColumn="0" w:lastColumn="0" w:oddVBand="0" w:evenVBand="0" w:oddHBand="1" w:evenHBand="0" w:firstRowFirstColumn="0" w:firstRowLastColumn="0" w:lastRowFirstColumn="0" w:lastRowLastColumn="0"/>
+            </w:pPr>
+            <w:r>
+              <w:rPr>
                 <w:sz w:val="18"/>
               </w:rPr>
               <w:t>Oto-kodlayıcı artefakt tespiti</w:t>
@@ -9142,17 +8777,14 @@
         </w:tc>
         <w:tc>
           <w:tcPr>
-            <w:tcW w:type="dxa" w:w="1814"/>
-            <w:vAlign w:val="center"/>
-          </w:tcPr>
-          <w:p>
-            <w:pPr>
-              <w:jc w:val="left"/>
-            </w:pPr>
-            <w:r>
-              <w:rPr>
-                <w:rFonts w:ascii="Times New Roman" w:hAnsi="Times New Roman"/>
-                <w:b w:val="0"/>
+            <w:tcW w:w="1814" w:type="dxa"/>
+          </w:tcPr>
+          <w:p>
+            <w:pPr>
+              <w:cnfStyle w:val="000000100000" w:firstRow="0" w:lastRow="0" w:firstColumn="0" w:lastColumn="0" w:oddVBand="0" w:evenVBand="0" w:oddHBand="1" w:evenHBand="0" w:firstRowFirstColumn="0" w:firstRowLastColumn="0" w:lastRowFirstColumn="0" w:lastRowLastColumn="0"/>
+            </w:pPr>
+            <w:r>
+              <w:rPr>
                 <w:sz w:val="18"/>
               </w:rPr>
               <w:t>Özel (Suno, Udio, MusicGen)</w:t>
@@ -9161,17 +8793,15 @@
         </w:tc>
         <w:tc>
           <w:tcPr>
-            <w:tcW w:type="dxa" w:w="1134"/>
-            <w:vAlign w:val="center"/>
-          </w:tcPr>
-          <w:p>
-            <w:pPr>
-              <w:jc w:val="center"/>
-            </w:pPr>
-            <w:r>
-              <w:rPr>
-                <w:rFonts w:ascii="Times New Roman" w:hAnsi="Times New Roman"/>
-                <w:b w:val="0"/>
+            <w:tcW w:w="1134" w:type="dxa"/>
+          </w:tcPr>
+          <w:p>
+            <w:pPr>
+              <w:jc w:val="center"/>
+              <w:cnfStyle w:val="000000100000" w:firstRow="0" w:lastRow="0" w:firstColumn="0" w:lastColumn="0" w:oddVBand="0" w:evenVBand="0" w:oddHBand="1" w:evenHBand="0" w:firstRowFirstColumn="0" w:firstRowLastColumn="0" w:lastRowFirstColumn="0" w:lastRowLastColumn="0"/>
+            </w:pPr>
+            <w:r>
+              <w:rPr>
                 <w:sz w:val="18"/>
               </w:rPr>
               <w:t>—</w:t>
@@ -9180,17 +8810,15 @@
         </w:tc>
         <w:tc>
           <w:tcPr>
-            <w:tcW w:type="dxa" w:w="1020"/>
-            <w:vAlign w:val="center"/>
-          </w:tcPr>
-          <w:p>
-            <w:pPr>
-              <w:jc w:val="center"/>
-            </w:pPr>
-            <w:r>
-              <w:rPr>
-                <w:rFonts w:ascii="Times New Roman" w:hAnsi="Times New Roman"/>
-                <w:b w:val="0"/>
+            <w:tcW w:w="1020" w:type="dxa"/>
+          </w:tcPr>
+          <w:p>
+            <w:pPr>
+              <w:jc w:val="center"/>
+              <w:cnfStyle w:val="000000100000" w:firstRow="0" w:lastRow="0" w:firstColumn="0" w:lastColumn="0" w:oddVBand="0" w:evenVBand="0" w:oddHBand="1" w:evenHBand="0" w:firstRowFirstColumn="0" w:firstRowLastColumn="0" w:lastRowFirstColumn="0" w:lastRowLastColumn="0"/>
+            </w:pPr>
+            <w:r>
+              <w:rPr>
                 <w:sz w:val="18"/>
               </w:rPr>
               <w:t>0,872</w:t>
@@ -9201,20 +8829,22 @@
       <w:tr>
         <w:tc>
           <w:tcPr>
-            <w:tcW w:type="dxa" w:w="1814"/>
-            <w:vAlign w:val="center"/>
-          </w:tcPr>
-          <w:p>
-            <w:pPr>
-              <w:jc w:val="left"/>
-            </w:pPr>
-            <w:r>
-              <w:rPr>
-                <w:rFonts w:ascii="Times New Roman" w:hAnsi="Times New Roman"/>
+            <w:cnfStyle w:val="001000000000" w:firstRow="0" w:lastRow="0" w:firstColumn="1" w:lastColumn="0" w:oddVBand="0" w:evenVBand="0" w:oddHBand="0" w:evenHBand="0" w:firstRowFirstColumn="0" w:firstRowLastColumn="0" w:lastRowFirstColumn="0" w:lastRowLastColumn="0"/>
+            <w:tcW w:w="1814" w:type="dxa"/>
+          </w:tcPr>
+          <w:p>
+            <w:r>
+              <w:rPr>
                 <w:b w:val="0"/>
                 <w:sz w:val="18"/>
               </w:rPr>
               <w:t>Li vd. [22]</w:t>
+            </w:r>
+            <w:r>
+              <w:rPr>
+                <w:b w:val="0"/>
+                <w:sz w:val="18"/>
+              </w:rPr>
               <w:br/>
               <w:t>(Sci. Rep. 2026)</w:t>
             </w:r>
@@ -9222,17 +8852,14 @@
         </w:tc>
         <w:tc>
           <w:tcPr>
-            <w:tcW w:type="dxa" w:w="2721"/>
-            <w:vAlign w:val="center"/>
-          </w:tcPr>
-          <w:p>
-            <w:pPr>
-              <w:jc w:val="left"/>
-            </w:pPr>
-            <w:r>
-              <w:rPr>
-                <w:rFonts w:ascii="Times New Roman" w:hAnsi="Times New Roman"/>
-                <w:b w:val="0"/>
+            <w:tcW w:w="2721" w:type="dxa"/>
+          </w:tcPr>
+          <w:p>
+            <w:pPr>
+              <w:cnfStyle w:val="000000000000" w:firstRow="0" w:lastRow="0" w:firstColumn="0" w:lastColumn="0" w:oddVBand="0" w:evenVBand="0" w:oddHBand="0" w:evenHBand="0" w:firstRowFirstColumn="0" w:firstRowLastColumn="0" w:lastRowFirstColumn="0" w:lastRowLastColumn="0"/>
+            </w:pPr>
+            <w:r>
+              <w:rPr>
                 <w:sz w:val="18"/>
               </w:rPr>
               <w:t>Açıklanabilir öznitelik + ML</w:t>
@@ -9241,17 +8868,14 @@
         </w:tc>
         <w:tc>
           <w:tcPr>
-            <w:tcW w:type="dxa" w:w="1814"/>
-            <w:vAlign w:val="center"/>
-          </w:tcPr>
-          <w:p>
-            <w:pPr>
-              <w:jc w:val="left"/>
-            </w:pPr>
-            <w:r>
-              <w:rPr>
-                <w:rFonts w:ascii="Times New Roman" w:hAnsi="Times New Roman"/>
-                <w:b w:val="0"/>
+            <w:tcW w:w="1814" w:type="dxa"/>
+          </w:tcPr>
+          <w:p>
+            <w:pPr>
+              <w:cnfStyle w:val="000000000000" w:firstRow="0" w:lastRow="0" w:firstColumn="0" w:lastColumn="0" w:oddVBand="0" w:evenVBand="0" w:oddHBand="0" w:evenHBand="0" w:firstRowFirstColumn="0" w:firstRowLastColumn="0" w:lastRowFirstColumn="0" w:lastRowLastColumn="0"/>
+            </w:pPr>
+            <w:r>
+              <w:rPr>
                 <w:sz w:val="18"/>
               </w:rPr>
               <w:t>Özel (çoklu üretici)</w:t>
@@ -9260,17 +8884,15 @@
         </w:tc>
         <w:tc>
           <w:tcPr>
-            <w:tcW w:type="dxa" w:w="1134"/>
-            <w:vAlign w:val="center"/>
-          </w:tcPr>
-          <w:p>
-            <w:pPr>
-              <w:jc w:val="center"/>
-            </w:pPr>
-            <w:r>
-              <w:rPr>
-                <w:rFonts w:ascii="Times New Roman" w:hAnsi="Times New Roman"/>
-                <w:b w:val="0"/>
+            <w:tcW w:w="1134" w:type="dxa"/>
+          </w:tcPr>
+          <w:p>
+            <w:pPr>
+              <w:jc w:val="center"/>
+              <w:cnfStyle w:val="000000000000" w:firstRow="0" w:lastRow="0" w:firstColumn="0" w:lastColumn="0" w:oddVBand="0" w:evenVBand="0" w:oddHBand="0" w:evenHBand="0" w:firstRowFirstColumn="0" w:firstRowLastColumn="0" w:lastRowFirstColumn="0" w:lastRowLastColumn="0"/>
+            </w:pPr>
+            <w:r>
+              <w:rPr>
                 <w:sz w:val="18"/>
               </w:rPr>
               <w:t>0,931</w:t>
@@ -9279,17 +8901,15 @@
         </w:tc>
         <w:tc>
           <w:tcPr>
-            <w:tcW w:type="dxa" w:w="1020"/>
-            <w:vAlign w:val="center"/>
-          </w:tcPr>
-          <w:p>
-            <w:pPr>
-              <w:jc w:val="center"/>
-            </w:pPr>
-            <w:r>
-              <w:rPr>
-                <w:rFonts w:ascii="Times New Roman" w:hAnsi="Times New Roman"/>
-                <w:b w:val="0"/>
+            <w:tcW w:w="1020" w:type="dxa"/>
+          </w:tcPr>
+          <w:p>
+            <w:pPr>
+              <w:jc w:val="center"/>
+              <w:cnfStyle w:val="000000000000" w:firstRow="0" w:lastRow="0" w:firstColumn="0" w:lastColumn="0" w:oddVBand="0" w:evenVBand="0" w:oddHBand="0" w:evenHBand="0" w:firstRowFirstColumn="0" w:firstRowLastColumn="0" w:lastRowFirstColumn="0" w:lastRowLastColumn="0"/>
+            </w:pPr>
+            <w:r>
+              <w:rPr>
                 <w:sz w:val="18"/>
               </w:rPr>
               <w:t>0,884</w:t>
@@ -9298,22 +8918,27 @@
         </w:tc>
       </w:tr>
       <w:tr>
-        <w:tc>
-          <w:tcPr>
-            <w:tcW w:type="dxa" w:w="1814"/>
-            <w:vAlign w:val="center"/>
-          </w:tcPr>
-          <w:p>
-            <w:pPr>
-              <w:jc w:val="left"/>
-            </w:pPr>
-            <w:r>
-              <w:rPr>
-                <w:rFonts w:ascii="Times New Roman" w:hAnsi="Times New Roman"/>
+        <w:trPr>
+          <w:cnfStyle w:val="000000100000" w:firstRow="0" w:lastRow="0" w:firstColumn="0" w:lastColumn="0" w:oddVBand="0" w:evenVBand="0" w:oddHBand="1" w:evenHBand="0" w:firstRowFirstColumn="0" w:firstRowLastColumn="0" w:lastRowFirstColumn="0" w:lastRowLastColumn="0"/>
+        </w:trPr>
+        <w:tc>
+          <w:tcPr>
+            <w:cnfStyle w:val="001000000000" w:firstRow="0" w:lastRow="0" w:firstColumn="1" w:lastColumn="0" w:oddVBand="0" w:evenVBand="0" w:oddHBand="0" w:evenHBand="0" w:firstRowFirstColumn="0" w:firstRowLastColumn="0" w:lastRowFirstColumn="0" w:lastRowLastColumn="0"/>
+            <w:tcW w:w="1814" w:type="dxa"/>
+          </w:tcPr>
+          <w:p>
+            <w:r>
+              <w:rPr>
                 <w:b w:val="0"/>
                 <w:sz w:val="18"/>
               </w:rPr>
               <w:t>Cros Vila vd. [33]</w:t>
+            </w:r>
+            <w:r>
+              <w:rPr>
+                <w:b w:val="0"/>
+                <w:sz w:val="18"/>
+              </w:rPr>
               <w:br/>
               <w:t>(TISMIR 2025)</w:t>
             </w:r>
@@ -9321,17 +8946,14 @@
         </w:tc>
         <w:tc>
           <w:tcPr>
-            <w:tcW w:type="dxa" w:w="2721"/>
-            <w:vAlign w:val="center"/>
-          </w:tcPr>
-          <w:p>
-            <w:pPr>
-              <w:jc w:val="left"/>
-            </w:pPr>
-            <w:r>
-              <w:rPr>
-                <w:rFonts w:ascii="Times New Roman" w:hAnsi="Times New Roman"/>
-                <w:b w:val="0"/>
+            <w:tcW w:w="2721" w:type="dxa"/>
+          </w:tcPr>
+          <w:p>
+            <w:pPr>
+              <w:cnfStyle w:val="000000100000" w:firstRow="0" w:lastRow="0" w:firstColumn="0" w:lastColumn="0" w:oddVBand="0" w:evenVBand="0" w:oddHBand="1" w:evenHBand="0" w:firstRowFirstColumn="0" w:firstRowLastColumn="0" w:lastRowFirstColumn="0" w:lastRowLastColumn="0"/>
+            </w:pPr>
+            <w:r>
+              <w:rPr>
                 <w:sz w:val="18"/>
               </w:rPr>
               <w:t>Spektral + ritmik öznitelik + SVM</w:t>
@@ -9340,17 +8962,14 @@
         </w:tc>
         <w:tc>
           <w:tcPr>
-            <w:tcW w:type="dxa" w:w="1814"/>
-            <w:vAlign w:val="center"/>
-          </w:tcPr>
-          <w:p>
-            <w:pPr>
-              <w:jc w:val="left"/>
-            </w:pPr>
-            <w:r>
-              <w:rPr>
-                <w:rFonts w:ascii="Times New Roman" w:hAnsi="Times New Roman"/>
-                <w:b w:val="0"/>
+            <w:tcW w:w="1814" w:type="dxa"/>
+          </w:tcPr>
+          <w:p>
+            <w:pPr>
+              <w:cnfStyle w:val="000000100000" w:firstRow="0" w:lastRow="0" w:firstColumn="0" w:lastColumn="0" w:oddVBand="0" w:evenVBand="0" w:oddHBand="1" w:evenHBand="0" w:firstRowFirstColumn="0" w:firstRowLastColumn="0" w:lastRowFirstColumn="0" w:lastRowLastColumn="0"/>
+            </w:pPr>
+            <w:r>
+              <w:rPr>
                 <w:sz w:val="18"/>
               </w:rPr>
               <w:t>Özel (Suno, MusicGen)</w:t>
@@ -9359,17 +8978,15 @@
         </w:tc>
         <w:tc>
           <w:tcPr>
-            <w:tcW w:type="dxa" w:w="1134"/>
-            <w:vAlign w:val="center"/>
-          </w:tcPr>
-          <w:p>
-            <w:pPr>
-              <w:jc w:val="center"/>
-            </w:pPr>
-            <w:r>
-              <w:rPr>
-                <w:rFonts w:ascii="Times New Roman" w:hAnsi="Times New Roman"/>
-                <w:b w:val="0"/>
+            <w:tcW w:w="1134" w:type="dxa"/>
+          </w:tcPr>
+          <w:p>
+            <w:pPr>
+              <w:jc w:val="center"/>
+              <w:cnfStyle w:val="000000100000" w:firstRow="0" w:lastRow="0" w:firstColumn="0" w:lastColumn="0" w:oddVBand="0" w:evenVBand="0" w:oddHBand="1" w:evenHBand="0" w:firstRowFirstColumn="0" w:firstRowLastColumn="0" w:lastRowFirstColumn="0" w:lastRowLastColumn="0"/>
+            </w:pPr>
+            <w:r>
+              <w:rPr>
                 <w:sz w:val="18"/>
               </w:rPr>
               <w:t>0,941</w:t>
@@ -9378,17 +8995,15 @@
         </w:tc>
         <w:tc>
           <w:tcPr>
-            <w:tcW w:type="dxa" w:w="1020"/>
-            <w:vAlign w:val="center"/>
-          </w:tcPr>
-          <w:p>
-            <w:pPr>
-              <w:jc w:val="center"/>
-            </w:pPr>
-            <w:r>
-              <w:rPr>
-                <w:rFonts w:ascii="Times New Roman" w:hAnsi="Times New Roman"/>
-                <w:b w:val="0"/>
+            <w:tcW w:w="1020" w:type="dxa"/>
+          </w:tcPr>
+          <w:p>
+            <w:pPr>
+              <w:jc w:val="center"/>
+              <w:cnfStyle w:val="000000100000" w:firstRow="0" w:lastRow="0" w:firstColumn="0" w:lastColumn="0" w:oddVBand="0" w:evenVBand="0" w:oddHBand="1" w:evenHBand="0" w:firstRowFirstColumn="0" w:firstRowLastColumn="0" w:lastRowFirstColumn="0" w:lastRowLastColumn="0"/>
+            </w:pPr>
+            <w:r>
+              <w:rPr>
                 <w:sz w:val="18"/>
               </w:rPr>
               <w:t>—</w:t>
@@ -9399,20 +9014,22 @@
       <w:tr>
         <w:tc>
           <w:tcPr>
-            <w:tcW w:type="dxa" w:w="1814"/>
-            <w:vAlign w:val="center"/>
-          </w:tcPr>
-          <w:p>
-            <w:pPr>
-              <w:jc w:val="left"/>
-            </w:pPr>
-            <w:r>
-              <w:rPr>
-                <w:rFonts w:ascii="Times New Roman" w:hAnsi="Times New Roman"/>
+            <w:cnfStyle w:val="001000000000" w:firstRow="0" w:lastRow="0" w:firstColumn="1" w:lastColumn="0" w:oddVBand="0" w:evenVBand="0" w:oddHBand="0" w:evenHBand="0" w:firstRowFirstColumn="0" w:firstRowLastColumn="0" w:lastRowFirstColumn="0" w:lastRowLastColumn="0"/>
+            <w:tcW w:w="1814" w:type="dxa"/>
+          </w:tcPr>
+          <w:p>
+            <w:r>
+              <w:rPr>
                 <w:b w:val="0"/>
                 <w:sz w:val="18"/>
               </w:rPr>
               <w:t>SONICS [34]</w:t>
+            </w:r>
+            <w:r>
+              <w:rPr>
+                <w:b w:val="0"/>
+                <w:sz w:val="18"/>
+              </w:rPr>
               <w:br/>
               <w:t>(ICLR 2025)</w:t>
             </w:r>
@@ -9420,17 +9037,14 @@
         </w:tc>
         <w:tc>
           <w:tcPr>
-            <w:tcW w:type="dxa" w:w="2721"/>
-            <w:vAlign w:val="center"/>
-          </w:tcPr>
-          <w:p>
-            <w:pPr>
-              <w:jc w:val="left"/>
-            </w:pPr>
-            <w:r>
-              <w:rPr>
-                <w:rFonts w:ascii="Times New Roman" w:hAnsi="Times New Roman"/>
-                <w:b w:val="0"/>
+            <w:tcW w:w="2721" w:type="dxa"/>
+          </w:tcPr>
+          <w:p>
+            <w:pPr>
+              <w:cnfStyle w:val="000000000000" w:firstRow="0" w:lastRow="0" w:firstColumn="0" w:lastColumn="0" w:oddVBand="0" w:evenVBand="0" w:oddHBand="0" w:evenHBand="0" w:firstRowFirstColumn="0" w:firstRowLastColumn="0" w:lastRowFirstColumn="0" w:lastRowLastColumn="0"/>
+            </w:pPr>
+            <w:r>
+              <w:rPr>
                 <w:sz w:val="18"/>
               </w:rPr>
               <w:t>Transformer tabanlı derin öğrenme</w:t>
@@ -9439,17 +9053,14 @@
         </w:tc>
         <w:tc>
           <w:tcPr>
-            <w:tcW w:type="dxa" w:w="1814"/>
-            <w:vAlign w:val="center"/>
-          </w:tcPr>
-          <w:p>
-            <w:pPr>
-              <w:jc w:val="left"/>
-            </w:pPr>
-            <w:r>
-              <w:rPr>
-                <w:rFonts w:ascii="Times New Roman" w:hAnsi="Times New Roman"/>
-                <w:b w:val="0"/>
+            <w:tcW w:w="1814" w:type="dxa"/>
+          </w:tcPr>
+          <w:p>
+            <w:pPr>
+              <w:cnfStyle w:val="000000000000" w:firstRow="0" w:lastRow="0" w:firstColumn="0" w:lastColumn="0" w:oddVBand="0" w:evenVBand="0" w:oddHBand="0" w:evenHBand="0" w:firstRowFirstColumn="0" w:firstRowLastColumn="0" w:lastRowFirstColumn="0" w:lastRowLastColumn="0"/>
+            </w:pPr>
+            <w:r>
+              <w:rPr>
                 <w:sz w:val="18"/>
               </w:rPr>
               <w:t>SONICS (özel)</w:t>
@@ -9458,17 +9069,15 @@
         </w:tc>
         <w:tc>
           <w:tcPr>
-            <w:tcW w:type="dxa" w:w="1134"/>
-            <w:vAlign w:val="center"/>
-          </w:tcPr>
-          <w:p>
-            <w:pPr>
-              <w:jc w:val="center"/>
-            </w:pPr>
-            <w:r>
-              <w:rPr>
-                <w:rFonts w:ascii="Times New Roman" w:hAnsi="Times New Roman"/>
-                <w:b w:val="0"/>
+            <w:tcW w:w="1134" w:type="dxa"/>
+          </w:tcPr>
+          <w:p>
+            <w:pPr>
+              <w:jc w:val="center"/>
+              <w:cnfStyle w:val="000000000000" w:firstRow="0" w:lastRow="0" w:firstColumn="0" w:lastColumn="0" w:oddVBand="0" w:evenVBand="0" w:oddHBand="0" w:evenHBand="0" w:firstRowFirstColumn="0" w:firstRowLastColumn="0" w:lastRowFirstColumn="0" w:lastRowLastColumn="0"/>
+            </w:pPr>
+            <w:r>
+              <w:rPr>
                 <w:sz w:val="18"/>
               </w:rPr>
               <w:t>0,960</w:t>
@@ -9477,17 +9086,15 @@
         </w:tc>
         <w:tc>
           <w:tcPr>
-            <w:tcW w:type="dxa" w:w="1020"/>
-            <w:vAlign w:val="center"/>
-          </w:tcPr>
-          <w:p>
-            <w:pPr>
-              <w:jc w:val="center"/>
-            </w:pPr>
-            <w:r>
-              <w:rPr>
-                <w:rFonts w:ascii="Times New Roman" w:hAnsi="Times New Roman"/>
-                <w:b w:val="0"/>
+            <w:tcW w:w="1020" w:type="dxa"/>
+          </w:tcPr>
+          <w:p>
+            <w:pPr>
+              <w:jc w:val="center"/>
+              <w:cnfStyle w:val="000000000000" w:firstRow="0" w:lastRow="0" w:firstColumn="0" w:lastColumn="0" w:oddVBand="0" w:evenVBand="0" w:oddHBand="0" w:evenHBand="0" w:firstRowFirstColumn="0" w:firstRowLastColumn="0" w:lastRowFirstColumn="0" w:lastRowLastColumn="0"/>
+            </w:pPr>
+            <w:r>
+              <w:rPr>
                 <w:sz w:val="18"/>
               </w:rPr>
               <w:t>0,921</w:t>
@@ -9496,22 +9103,28 @@
         </w:tc>
       </w:tr>
       <w:tr>
-        <w:tc>
-          <w:tcPr>
-            <w:tcW w:type="dxa" w:w="1814"/>
-            <w:vAlign w:val="center"/>
-          </w:tcPr>
-          <w:p>
-            <w:pPr>
-              <w:jc w:val="left"/>
-            </w:pPr>
-            <w:r>
-              <w:rPr>
-                <w:rFonts w:ascii="Times New Roman" w:hAnsi="Times New Roman"/>
+        <w:trPr>
+          <w:cnfStyle w:val="000000100000" w:firstRow="0" w:lastRow="0" w:firstColumn="0" w:lastColumn="0" w:oddVBand="0" w:evenVBand="0" w:oddHBand="1" w:evenHBand="0" w:firstRowFirstColumn="0" w:firstRowLastColumn="0" w:lastRowFirstColumn="0" w:lastRowLastColumn="0"/>
+        </w:trPr>
+        <w:tc>
+          <w:tcPr>
+            <w:cnfStyle w:val="001000000000" w:firstRow="0" w:lastRow="0" w:firstColumn="1" w:lastColumn="0" w:oddVBand="0" w:evenVBand="0" w:oddHBand="0" w:evenHBand="0" w:firstRowFirstColumn="0" w:firstRowLastColumn="0" w:lastRowFirstColumn="0" w:lastRowLastColumn="0"/>
+            <w:tcW w:w="1814" w:type="dxa"/>
+          </w:tcPr>
+          <w:p>
+            <w:r>
+              <w:rPr>
                 <w:b w:val="0"/>
                 <w:sz w:val="18"/>
               </w:rPr>
+              <w:lastRenderedPageBreak/>
               <w:t>FakeMusicCaps [35]</w:t>
+            </w:r>
+            <w:r>
+              <w:rPr>
+                <w:b w:val="0"/>
+                <w:sz w:val="18"/>
+              </w:rPr>
               <w:br/>
               <w:t>(J. Imaging 2025)</w:t>
             </w:r>
@@ -9519,17 +9132,14 @@
         </w:tc>
         <w:tc>
           <w:tcPr>
-            <w:tcW w:type="dxa" w:w="2721"/>
-            <w:vAlign w:val="center"/>
-          </w:tcPr>
-          <w:p>
-            <w:pPr>
-              <w:jc w:val="left"/>
-            </w:pPr>
-            <w:r>
-              <w:rPr>
-                <w:rFonts w:ascii="Times New Roman" w:hAnsi="Times New Roman"/>
-                <w:b w:val="0"/>
+            <w:tcW w:w="2721" w:type="dxa"/>
+          </w:tcPr>
+          <w:p>
+            <w:pPr>
+              <w:cnfStyle w:val="000000100000" w:firstRow="0" w:lastRow="0" w:firstColumn="0" w:lastColumn="0" w:oddVBand="0" w:evenVBand="0" w:oddHBand="1" w:evenHBand="0" w:firstRowFirstColumn="0" w:firstRowLastColumn="0" w:lastRowFirstColumn="0" w:lastRowLastColumn="0"/>
+            </w:pPr>
+            <w:r>
+              <w:rPr>
                 <w:sz w:val="18"/>
               </w:rPr>
               <w:t>Çok modlu MusicCaps öznitelikleri</w:t>
@@ -9538,17 +9148,14 @@
         </w:tc>
         <w:tc>
           <w:tcPr>
-            <w:tcW w:type="dxa" w:w="1814"/>
-            <w:vAlign w:val="center"/>
-          </w:tcPr>
-          <w:p>
-            <w:pPr>
-              <w:jc w:val="left"/>
-            </w:pPr>
-            <w:r>
-              <w:rPr>
-                <w:rFonts w:ascii="Times New Roman" w:hAnsi="Times New Roman"/>
-                <w:b w:val="0"/>
+            <w:tcW w:w="1814" w:type="dxa"/>
+          </w:tcPr>
+          <w:p>
+            <w:pPr>
+              <w:cnfStyle w:val="000000100000" w:firstRow="0" w:lastRow="0" w:firstColumn="0" w:lastColumn="0" w:oddVBand="0" w:evenVBand="0" w:oddHBand="1" w:evenHBand="0" w:firstRowFirstColumn="0" w:firstRowLastColumn="0" w:lastRowFirstColumn="0" w:lastRowLastColumn="0"/>
+            </w:pPr>
+            <w:r>
+              <w:rPr>
                 <w:sz w:val="18"/>
               </w:rPr>
               <w:t>FakeMusicCaps</w:t>
@@ -9557,17 +9164,15 @@
         </w:tc>
         <w:tc>
           <w:tcPr>
-            <w:tcW w:type="dxa" w:w="1134"/>
-            <w:vAlign w:val="center"/>
-          </w:tcPr>
-          <w:p>
-            <w:pPr>
-              <w:jc w:val="center"/>
-            </w:pPr>
-            <w:r>
-              <w:rPr>
-                <w:rFonts w:ascii="Times New Roman" w:hAnsi="Times New Roman"/>
-                <w:b w:val="0"/>
+            <w:tcW w:w="1134" w:type="dxa"/>
+          </w:tcPr>
+          <w:p>
+            <w:pPr>
+              <w:jc w:val="center"/>
+              <w:cnfStyle w:val="000000100000" w:firstRow="0" w:lastRow="0" w:firstColumn="0" w:lastColumn="0" w:oddVBand="0" w:evenVBand="0" w:oddHBand="1" w:evenHBand="0" w:firstRowFirstColumn="0" w:firstRowLastColumn="0" w:lastRowFirstColumn="0" w:lastRowLastColumn="0"/>
+            </w:pPr>
+            <w:r>
+              <w:rPr>
                 <w:sz w:val="18"/>
               </w:rPr>
               <w:t>0,943</w:t>
@@ -9576,17 +9181,15 @@
         </w:tc>
         <w:tc>
           <w:tcPr>
-            <w:tcW w:type="dxa" w:w="1020"/>
-            <w:vAlign w:val="center"/>
-          </w:tcPr>
-          <w:p>
-            <w:pPr>
-              <w:jc w:val="center"/>
-            </w:pPr>
-            <w:r>
-              <w:rPr>
-                <w:rFonts w:ascii="Times New Roman" w:hAnsi="Times New Roman"/>
-                <w:b w:val="0"/>
+            <w:tcW w:w="1020" w:type="dxa"/>
+          </w:tcPr>
+          <w:p>
+            <w:pPr>
+              <w:jc w:val="center"/>
+              <w:cnfStyle w:val="000000100000" w:firstRow="0" w:lastRow="0" w:firstColumn="0" w:lastColumn="0" w:oddVBand="0" w:evenVBand="0" w:oddHBand="1" w:evenHBand="0" w:firstRowFirstColumn="0" w:firstRowLastColumn="0" w:lastRowFirstColumn="0" w:lastRowLastColumn="0"/>
+            </w:pPr>
+            <w:r>
+              <w:rPr>
                 <w:sz w:val="18"/>
               </w:rPr>
               <w:t>0,906</w:t>
@@ -9597,20 +9200,30 @@
       <w:tr>
         <w:tc>
           <w:tcPr>
-            <w:tcW w:type="dxa" w:w="1814"/>
-            <w:vAlign w:val="center"/>
-          </w:tcPr>
-          <w:p>
-            <w:pPr>
-              <w:jc w:val="left"/>
-            </w:pPr>
-            <w:r>
-              <w:rPr>
-                <w:rFonts w:ascii="Times New Roman" w:hAnsi="Times New Roman"/>
-                <w:b/>
+            <w:cnfStyle w:val="001000000000" w:firstRow="0" w:lastRow="0" w:firstColumn="1" w:lastColumn="0" w:oddVBand="0" w:evenVBand="0" w:oddHBand="0" w:evenHBand="0" w:firstRowFirstColumn="0" w:firstRowLastColumn="0" w:lastRowFirstColumn="0" w:lastRowLastColumn="0"/>
+            <w:tcW w:w="1814" w:type="dxa"/>
+          </w:tcPr>
+          <w:p>
+            <w:pPr>
+              <w:rPr>
+                <w:b w:val="0"/>
+                <w:bCs w:val="0"/>
+              </w:rPr>
+            </w:pPr>
+            <w:r>
+              <w:rPr>
+                <w:b w:val="0"/>
+                <w:bCs w:val="0"/>
                 <w:sz w:val="18"/>
               </w:rPr>
               <w:t>AURIS</w:t>
+            </w:r>
+            <w:r>
+              <w:rPr>
+                <w:b w:val="0"/>
+                <w:bCs w:val="0"/>
+                <w:sz w:val="18"/>
+              </w:rPr>
               <w:br/>
               <w:t>(Bu çalışma)</w:t>
             </w:r>
@@ -9618,20 +9231,22 @@
         </w:tc>
         <w:tc>
           <w:tcPr>
-            <w:tcW w:type="dxa" w:w="2721"/>
-            <w:vAlign w:val="center"/>
-          </w:tcPr>
-          <w:p>
-            <w:pPr>
-              <w:jc w:val="left"/>
-            </w:pPr>
-            <w:r>
-              <w:rPr>
-                <w:rFonts w:ascii="Times New Roman" w:hAnsi="Times New Roman"/>
-                <w:b/>
+            <w:tcW w:w="2721" w:type="dxa"/>
+          </w:tcPr>
+          <w:p>
+            <w:pPr>
+              <w:cnfStyle w:val="000000000000" w:firstRow="0" w:lastRow="0" w:firstColumn="0" w:lastColumn="0" w:oddVBand="0" w:evenVBand="0" w:oddHBand="0" w:evenHBand="0" w:firstRowFirstColumn="0" w:firstRowLastColumn="0" w:lastRowFirstColumn="0" w:lastRowLastColumn="0"/>
+            </w:pPr>
+            <w:r>
+              <w:rPr>
                 <w:sz w:val="18"/>
               </w:rPr>
               <w:t>47-boyutlu akustik öznitelik +</w:t>
+            </w:r>
+            <w:r>
+              <w:rPr>
+                <w:sz w:val="18"/>
+              </w:rPr>
               <w:br/>
               <w:t>11-model topluluk öğrenmesi</w:t>
             </w:r>
@@ -9639,17 +9254,14 @@
         </w:tc>
         <w:tc>
           <w:tcPr>
-            <w:tcW w:type="dxa" w:w="1814"/>
-            <w:vAlign w:val="center"/>
-          </w:tcPr>
-          <w:p>
-            <w:pPr>
-              <w:jc w:val="left"/>
-            </w:pPr>
-            <w:r>
-              <w:rPr>
-                <w:rFonts w:ascii="Times New Roman" w:hAnsi="Times New Roman"/>
-                <w:b/>
+            <w:tcW w:w="1814" w:type="dxa"/>
+          </w:tcPr>
+          <w:p>
+            <w:pPr>
+              <w:cnfStyle w:val="000000000000" w:firstRow="0" w:lastRow="0" w:firstColumn="0" w:lastColumn="0" w:oddVBand="0" w:evenVBand="0" w:oddHBand="0" w:evenHBand="0" w:firstRowFirstColumn="0" w:firstRowLastColumn="0" w:lastRowFirstColumn="0" w:lastRowLastColumn="0"/>
+            </w:pPr>
+            <w:r>
+              <w:rPr>
                 <w:sz w:val="18"/>
               </w:rPr>
               <w:t>Özel (5.195 örnek)</w:t>
@@ -9658,17 +9270,15 @@
         </w:tc>
         <w:tc>
           <w:tcPr>
-            <w:tcW w:type="dxa" w:w="1134"/>
-            <w:vAlign w:val="center"/>
-          </w:tcPr>
-          <w:p>
-            <w:pPr>
-              <w:jc w:val="center"/>
-            </w:pPr>
-            <w:r>
-              <w:rPr>
-                <w:rFonts w:ascii="Times New Roman" w:hAnsi="Times New Roman"/>
-                <w:b/>
+            <w:tcW w:w="1134" w:type="dxa"/>
+          </w:tcPr>
+          <w:p>
+            <w:pPr>
+              <w:jc w:val="center"/>
+              <w:cnfStyle w:val="000000000000" w:firstRow="0" w:lastRow="0" w:firstColumn="0" w:lastColumn="0" w:oddVBand="0" w:evenVBand="0" w:oddHBand="0" w:evenHBand="0" w:firstRowFirstColumn="0" w:firstRowLastColumn="0" w:lastRowFirstColumn="0" w:lastRowLastColumn="0"/>
+            </w:pPr>
+            <w:r>
+              <w:rPr>
                 <w:sz w:val="18"/>
               </w:rPr>
               <w:t>0,9548</w:t>
@@ -9677,17 +9287,15 @@
         </w:tc>
         <w:tc>
           <w:tcPr>
-            <w:tcW w:type="dxa" w:w="1020"/>
-            <w:vAlign w:val="center"/>
-          </w:tcPr>
-          <w:p>
-            <w:pPr>
-              <w:jc w:val="center"/>
-            </w:pPr>
-            <w:r>
-              <w:rPr>
-                <w:rFonts w:ascii="Times New Roman" w:hAnsi="Times New Roman"/>
-                <w:b/>
+            <w:tcW w:w="1020" w:type="dxa"/>
+          </w:tcPr>
+          <w:p>
+            <w:pPr>
+              <w:jc w:val="center"/>
+              <w:cnfStyle w:val="000000000000" w:firstRow="0" w:lastRow="0" w:firstColumn="0" w:lastColumn="0" w:oddVBand="0" w:evenVBand="0" w:oddHBand="0" w:evenHBand="0" w:firstRowFirstColumn="0" w:firstRowLastColumn="0" w:lastRowFirstColumn="0" w:lastRowLastColumn="0"/>
+            </w:pPr>
+            <w:r>
+              <w:rPr>
                 <w:sz w:val="18"/>
               </w:rPr>
               <w:t>0,8731</w:t>
@@ -9697,25 +9305,18 @@
       </w:tr>
     </w:tbl>
     <w:p>
-      <w:pPr>
-        <w:jc w:val="left"/>
-      </w:pPr>
       <w:r>
         <w:rPr>
           <w:rFonts w:ascii="Times New Roman" w:hAnsi="Times New Roman"/>
-          <w:b w:val="0"/>
-          <w:sz w:val="18"/>
-        </w:rPr>
-      </w:r>
-    </w:p>
-    <w:p>
-      <w:pPr>
-        <w:jc w:val="left"/>
-      </w:pPr>
-      <w:r>
-        <w:rPr>
-          <w:rFonts w:ascii="Times New Roman" w:hAnsi="Times New Roman"/>
-          <w:b w:val="0"/>
+          <w:i/>
+          <w:sz w:val="16"/>
+        </w:rPr>
+        <w:t>— : Kaynak yayında rapor edilmemiştir.</w:t>
+      </w:r>
+    </w:p>
+    <w:p>
+      <w:r>
+        <w:rPr>
           <w:sz w:val="18"/>
         </w:rPr>
         <w:t xml:space="preserve">Tablo 7, AURIS sisteminin literatürdeki doğrudan ilgili çalışmalarla karşılaştırmasını sunmaktadır. AURIS, ROC-AUC (0,9548) açısından SONICS [34] (0,960) ve Cros Vila vd. [33] (0,941) ile rekabetçi bir konuma ulaşırken, uçtan-uca aküstiğe dayalı topluluk tasarımının yorumlanabilirlik ve düşük varyans açısından ek avantajlar sağladığını ortaya koymaktadır. </w:t>
@@ -9747,16 +9348,10 @@
       </w:pPr>
       <w:r>
         <w:rPr>
-          <w:sz w:val="18"/>
-        </w:rPr>
-        <w:t xml:space="preserve">Aşırı öğrenme tanılayıcı analizi (Şekil 15), tüm ağaç tabanlı modellerin eğitim ve çapraz doğrulama doğruluğu arasında 8-14 puanlık bir fark sergilediğini göstermektedir. Rastgele Orman %100,0 eğitim doğruluğuna karşı çapraz doğrulama altında %86,1 </w:t>
-      </w:r>
-      <w:r>
-        <w:rPr>
-          <w:sz w:val="18"/>
-        </w:rPr>
-        <w:lastRenderedPageBreak/>
-        <w:t>doğruluk elde etmiştir. Eğitim ve çapraz doğrulama doğruluklarının esasen örtüştüğü tek model, yalnızca 0,6 puanlık fark ile Lojistik Regresyon olmuştur.</w:t>
+          <w:rFonts w:ascii="Times New Roman" w:hAnsi="Times New Roman"/>
+          <w:sz w:val="18"/>
+        </w:rPr>
+        <w:t>Aşırı öğrenme tanılayıcı analizi (Şekil 14), tüm ağaç tabanlı modellerin eğitim ve çapraz doğrulama doğruluğu arasında 8-14 puanlık bir fark sergilediğini göstermektedir. Rastgele Orman %100,0 eğitim doğruluğuna karşı çapraz doğrulama altında %86,1 doğruluk elde etmiştir. Eğitim ve çapraz doğrulama doğruluklarının esasen örtüştüğü tek model, yalnızca 0,6 puanlık fark ile Lojistik Regresyon olmuştur.</w:t>
       </w:r>
     </w:p>
     <w:p>
@@ -10406,7 +10001,7 @@
         <w:rPr>
           <w:sz w:val="18"/>
         </w:rPr>
-        <w:t>Tablo 6. Simge Açıklama Tablosu (Icon Description Table)</w:t>
+        <w:t>Tablo 6. Simge Açıklama Tablosu (Symbol Description Table)</w:t>
       </w:r>
     </w:p>
     <w:tbl>
@@ -11432,7 +11027,49 @@
           <w:sz w:val="18"/>
         </w:rPr>
         <w:lastRenderedPageBreak/>
-        <w:t xml:space="preserve">insan müziği ayrımı için en bilgilendirici tek öznitelik olarak öne çıkmıştır. Tanılayıcı analiz iki önemli sınırlamayı ortaya koymuştur: tüm ağaç tabanlı modeller eğitim ile çapraz doğrulama doğrulukları </w:t>
+        <w:t xml:space="preserve">insan müziği ayrımı için en bilgilendirici tek öznitelik olarak öne çıkmıştır. Tanılayıcı analiz iki önemli sınırlamayı ortaya koymuştur: tüm ağaç tabanlı modeller eğitim ile </w:t>
+      </w:r>
+      <w:proofErr w:type="spellStart"/>
+      <w:r>
+        <w:rPr>
+          <w:sz w:val="18"/>
+        </w:rPr>
+        <w:t>çapraz</w:t>
+      </w:r>
+      <w:proofErr w:type="spellEnd"/>
+      <w:r>
+        <w:rPr>
+          <w:sz w:val="18"/>
+        </w:rPr>
+        <w:t xml:space="preserve"> </w:t>
+      </w:r>
+      <w:proofErr w:type="spellStart"/>
+      <w:r>
+        <w:rPr>
+          <w:sz w:val="18"/>
+        </w:rPr>
+        <w:t>doğrulama</w:t>
+      </w:r>
+      <w:proofErr w:type="spellEnd"/>
+      <w:r>
+        <w:rPr>
+          <w:sz w:val="18"/>
+        </w:rPr>
+        <w:t xml:space="preserve"> </w:t>
+      </w:r>
+      <w:proofErr w:type="spellStart"/>
+      <w:r>
+        <w:rPr>
+          <w:sz w:val="18"/>
+        </w:rPr>
+        <w:t>doğrulukları</w:t>
+      </w:r>
+      <w:proofErr w:type="spellEnd"/>
+      <w:r>
+        <w:rPr>
+          <w:sz w:val="18"/>
+        </w:rPr>
+        <w:t xml:space="preserve"> </w:t>
       </w:r>
       <w:proofErr w:type="spellStart"/>
       <w:r>
@@ -11947,7 +11584,7 @@
         <w:rPr>
           <w:sz w:val="18"/>
         </w:rPr>
-        <w:t>4. Frank J., Schönherr L., WaveFake: A Data Set to Facilitate Audio Deepfake Detection, Advances in Neural Information Processing Systems Datasets and Benchmarks Track, 2021.</w:t>
+        <w:t>4. Frank J., Schönherr L., WaveFake: A Data Set to Facilitate Audio Deepfake Detection, Adv Neural Inf Process Syst Datasets Benchmarks Track, 1, 2021.</w:t>
       </w:r>
     </w:p>
     <w:p>
@@ -12324,8 +11961,7 @@
         <w:rPr>
           <w:sz w:val="18"/>
         </w:rPr>
-        <w:lastRenderedPageBreak/>
-        <w:t>38. Pedregosa F. vd., Scikit-learn: Machine Learning in Python, Journal of Machine Learning Research, 12, 2825-2830, 2011.</w:t>
+        <w:t>38. Pedregosa F. vd., Scikit-learn: Machine Learning in Python, J. Mach. Learn. Res., 12, 2825-2830, 2011.</w:t>
       </w:r>
     </w:p>
     <w:p>

</xml_diff>

<commit_message>
Fix figure references in AURIS document for improved accuracy
</commit_message>
<xml_diff>
--- a/docs/academic/paper/deliverables/AURIS_Makale_Metni.docx
+++ b/docs/academic/paper/deliverables/AURIS_Makale_Metni.docx
@@ -6967,10 +6967,10 @@
       </w:pPr>
       <w:r>
         <w:rPr>
-          <w:sz w:val="18"/>
-        </w:rPr>
-        <w:lastRenderedPageBreak/>
-        <w:t>Öznitelik önemi analizi sonuçları spektral düzlük standart sapması özniteliğinin yapay zekâ ile insan müziği ayrımı için en bilgilendirici öznitelik olduğunu açık biçimde ortaya koymuştur. Tablo 5 ilk on özniteliği listelemektedir. Şekil 7 ilk yirmi özniteliğin normalize edilmiş önem skorlarını göstermektedir.</w:t>
+          <w:rFonts w:ascii="Times New Roman" w:hAnsi="Times New Roman"/>
+          <w:sz w:val="18"/>
+        </w:rPr>
+        <w:t>Öznitelik önemi analizi sonuçları spektral düzlük standart sapması özniteliğinin yapay zekâ ile insan müziği ayrımı için en bilgilendirici öznitelik olduğunu açık biçimde ortaya koymuştur. Tablo 5 ilk on özniteliği listelemektedir. Şekil 6 ilk yirmi özniteliğin normalize edilmiş önem skorlarını göstermektedir.</w:t>
       </w:r>
     </w:p>
     <w:p>
@@ -9468,9 +9468,10 @@
       </w:pPr>
       <w:r>
         <w:rPr>
-          <w:sz w:val="18"/>
-        </w:rPr>
-        <w:t>Öznitelik fazlalığı analizi sonuçları 47 özniteliğin tasarım gereği fazlalıklı bir yapıya sahip olduğunu göstermiştir. Yirmi öznitelik çiftinin |Pearson r| değeri 0,85 değerinin üzerinde ölçülmüştür (Şekil 16). Öznitelik çıkarma deneyi (Şekil 17) öznitelik sayısı N = 30 değerine ulaştığında doğruluğun plato yaptığını ortaya koymuş; sondaki 17 özniteliğin ölçülebilir bir ek doğruluk sağlamadığı tespit edilmiştir.</w:t>
+          <w:rFonts w:ascii="Times New Roman" w:hAnsi="Times New Roman"/>
+          <w:sz w:val="18"/>
+        </w:rPr>
+        <w:t>Öznitelik fazlalığı analizi sonuçları 47 özniteliğin tasarım gereği fazlalıklı bir yapıya sahip olduğunu göstermiştir. Yirmi öznitelik çiftinin |Pearson r| değeri 0,85 değerinin üzerinde ölçülmüştür (Şekil 16). Öznitelik çıkarma deneyi (Şekil 16) öznitelik sayısı N = 30 değerine ulaştığında doğruluğun plato yaptığını ortaya koymuş; sondaki 17 özniteliğin ölçülebilir bir ek doğruluk sağlamadığı tespit edilmiştir.</w:t>
       </w:r>
     </w:p>
     <w:p>

</xml_diff>

<commit_message>
Remove obsolete scripts for document auditing and figure reference checks in AURIS document
</commit_message>
<xml_diff>
--- a/docs/academic/paper/deliverables/AURIS_Makale_Metni.docx
+++ b/docs/academic/paper/deliverables/AURIS_Makale_Metni.docx
@@ -6970,7 +6970,7 @@
           <w:rFonts w:ascii="Times New Roman" w:hAnsi="Times New Roman"/>
           <w:sz w:val="18"/>
         </w:rPr>
-        <w:t>Öznitelik önemi analizi sonuçları spektral düzlük standart sapması özniteliğinin yapay zekâ ile insan müziği ayrımı için en bilgilendirici öznitelik olduğunu açık biçimde ortaya koymuştur. Tablo 5 ilk on özniteliği listelemektedir. Şekil 6 ilk yirmi özniteliğin normalize edilmiş önem skorlarını göstermektedir.</w:t>
+        <w:t>Öznitelik önemi analizi sonuçları spektral düzlük standart sapması özniteliğinin yapay zekâ ile insan müziği ayrımı için en bilgilendirici öznitelik olduğunu açık biçimde ortaya koymuştur. Tablo 5 ilk on özniteliği listelemektedir. Şekil 6 ilk yirmi özniteliğin normalize edilmiş önem skorlarını göstermektedir. Şekil 7'deki TreeSHAP global etki diyagramı, bu özniteliğin model çıktısı üzerindeki yönsel etkisini doğrulamaktadır.</w:t>
       </w:r>
     </w:p>
     <w:p>
@@ -7908,9 +7908,10 @@
       </w:pPr>
       <w:r>
         <w:rPr>
-          <w:sz w:val="18"/>
-        </w:rPr>
-        <w:t>Şekil 8 LightGBM modelinin Youden-optimal eşik θ* = 0,4316 ile elde edilen karmaşıklık matrisini göstermektedir: 2.721 doğru negatif (%87,4), 1.862 doğru pozitif (%89,4), 392 yanlış pozitif (%12,6) ve 220 yanlış negatif (%10,6). Şekil 10 insan ve yapay zekâ sınıflarına ait olasılık dağılımlarını sunmaktadır. Şekil 11'deki kalibrasyon eğrisi 0,083 Brier skoru ile birlikte modelin olasılık çıktılarının iyi kalibre olduğunu doğrulamaktadır. Şekil 12 kesinlik-duyarlılık eğrisini 0,934 ortalama kesinlik değeri ile göstermektedir.</w:t>
+          <w:rFonts w:ascii="Times New Roman" w:hAnsi="Times New Roman"/>
+          <w:sz w:val="18"/>
+        </w:rPr>
+        <w:t>Şekil 8 LightGBM modelinin Youden-optimal eşik θ* = 0,4316 ile elde edilen karmaşıklık matrisini göstermektedir: 2.721 doğru negatif (%87,4), 1.862 doğru pozitif (%89,4), 392 yanlış pozitif (%12,6) ve 220 yanlış negatif (%10,6). Şekil 9 insan ve yapay zekâ sınıflarına ait olasılık dağılımlarını sunmaktadır. Şekil 10'daki kalibrasyon eğrisi 0,083 Brier skoru ile birlikte modelin olasılık çıktılarının iyi kalibre olduğunu doğrulamaktadır. Şekil 11 kesinlik-duyarlılık eğrisini 0,934 ortalama kesinlik değeri ile göstermektedir.</w:t>
       </w:r>
     </w:p>
     <w:p>

</xml_diff>

<commit_message>
Add scripts to enhance document discussion and perform final checks in AURIS document
</commit_message>
<xml_diff>
--- a/docs/academic/paper/deliverables/AURIS_Makale_Metni.docx
+++ b/docs/academic/paper/deliverables/AURIS_Makale_Metni.docx
@@ -3313,14 +3313,15 @@
       <w:pPr>
         <w:spacing w:line="360" w:lineRule="auto"/>
         <w:ind w:firstLine="283"/>
-        <w:jc w:val="both"/>
-      </w:pPr>
-      <w:r>
-        <w:rPr>
-          <w:sz w:val="18"/>
-        </w:rPr>
-        <w:lastRenderedPageBreak/>
-        <w:t>Her ses parçası 22.050 Hz örnekleme hızında yeniden örneklenmiş ve librosa [37] kütüphanesi kullanılarak 47 boyutlu bir öznitelik vektörüne dönüştürülmüştür. Öznitelik vektörü beş aileden oluşmaktadır: spektral aile (16 öznitelik), zamansal aile (10 öznitelik), harmonik ve tonal aile (9 öznitelik), MFCC ailesi (3 öznitelik) ve vokal aile (9 öznitelik). İlk sekiz öznitelik için insan ve yapay zekâ örneklerinin dağılımları Şekil 2'de karşılaştırılmıştır.</w:t>
+        <w:jc w:val="left"/>
+      </w:pPr>
+      <w:r>
+        <w:rPr>
+          <w:rFonts w:ascii="Times New Roman" w:hAnsi="Times New Roman"/>
+          <w:b w:val="0"/>
+          <w:sz w:val="18"/>
+        </w:rPr>
+        <w:t>Her ses parçası 22.050 Hz örnekleme hızında yeniden örneklenmiş ve librosa [37] kütüphanesi kullanılarak 47 boyutlu bir öznitelik vektörüne dönüştürülmüştür. Öznitelik vektörü beş aileden oluşmaktadır: spektral aile (16 öznitelik), zamansal aile (10 öznitelik), harmonik ve tonal aile (9 öznitelik), MFCC ailesi (3 öznitelik) ve vokal aile (9 öznitelik). İlk sekiz öznitelik için insan ve yapay zekâ örneklerinin dağılımları Şekil 2'de karşılaştırılmıştır. Öznitelikler beş işlevsel aileye ayrılmaktadır: spektral (16 öznitelik: MFCC, melspectrogram, spectral centroid/bandwidth/rolloff/flatness ve bunların δ istatistikleri), zamansal (10 öznitelik: RMS enerjisi, sıfır geçiş hızı ve dinamik aralık istatistikleri), ritmik (9 öznitelik: tempo, beat sayısı, onset gücü istatistikleri), harmonik (8 öznitelik: chroma vektörü ve harmonik-algısal ayrıştırma bileşenleri) ve vokal (4 öznitelik: temel frekans istatistikleri). Bu beş ailenin birden fazla modaliteyi kapsaması, herhangi bir tek temsile aşırı uyumu önlemeyi amaçlamaktadır.</w:t>
       </w:r>
     </w:p>
     <w:p>
@@ -4215,13 +4216,15 @@
       <w:pPr>
         <w:spacing w:line="360" w:lineRule="auto"/>
         <w:ind w:firstLine="283"/>
-        <w:jc w:val="both"/>
-      </w:pPr>
-      <w:r>
-        <w:rPr>
-          <w:sz w:val="18"/>
-        </w:rPr>
-        <w:t>Tüm modeller stratifiye edilmiş 5-katlı çapraz doğrulama ile değerlendirilmiştir. Her kat içinde StandardScaler eğitim alt kümesi üzerinde fit edilmiş, ardından doğrulama alt kümesi üzerinde transform uygulanmıştır. Karar eşiği θ, varsayılan 0,5 yerine Youden'in J istatistiği ile optimize edilmiştir: J(θ) = TPR(θ) − FPR(θ), Eş. 1. LightGBM için Youden-optimal eşik θ* = 0,4316 olarak ölçülmüştür. Kalibrasyon kalitesi Brier skoru ile değerlendirilmiştir, Eş. 2: BS = (1/N) Σᵢ (pᵢ − yᵢ)². Derin öğrenme modelleri Adam [39] optimize edici ile eğitilmiştir. Modelin yorumlanabilirliği TreeSHAP [9] algoritması kullanılarak analiz edilmiştir.</w:t>
+        <w:jc w:val="left"/>
+      </w:pPr>
+      <w:r>
+        <w:rPr>
+          <w:rFonts w:ascii="Times New Roman" w:hAnsi="Times New Roman"/>
+          <w:b w:val="0"/>
+          <w:sz w:val="18"/>
+        </w:rPr>
+        <w:t>Tüm modeller stratifiye edilmiş 5-katlı çapraz doğrulama ile değerlendirilmiştir. Her kat içinde StandardScaler eğitim alt kümesi üzerinde fit edilmiş, ardından doğrulama alt kümesi üzerinde transform uygulanmıştır. Karar eşiği θ, varsayılan 0,5 yerine Youden'in J istatistiği ile optimize edilmiştir: J(θ) = TPR(θ) − FPR(θ), Eş. 1. LightGBM için Youden-optimal eşik θ* = 0,4316 olarak ölçülmüştür. Kalibrasyon kalitesi Brier skoru ile değerlendirilmiştir, Eş. 2: BS = (1/N) Σᵢ (pᵢ − yᵢ)². Derin öğrenme modelleri Adam [39] optimize edici ile eğitilmiştir. Modelin yorumlanabilirliği TreeSHAP [9] algoritması kullanılarak analiz edilmiştir. Veri kümesindeki sınıf dengesizliği (3.113 insan (%59,9) ve 2.082 yapay zekâ (%40,1) örneği) tüm destekleyen modellerde class_weight="balanced" parametresi ile giderilmiştir; ağaç artırma modellerinde (LightGBM, XGBoost, Gradyan Artırma) ise is_unbalance=True bayrağı kullanılmıştır. Stratifiye örnekleme her katın sınıf oranını koruyarak değerlendirmenin dengeli kalmasını sağlamıştır.</w:t>
       </w:r>
     </w:p>
     <w:p>
@@ -8371,14 +8374,15 @@
       <w:pPr>
         <w:spacing w:line="360" w:lineRule="auto"/>
         <w:ind w:firstLine="283"/>
-        <w:jc w:val="both"/>
+        <w:jc w:val="left"/>
       </w:pPr>
       <w:r>
         <w:rPr>
           <w:rFonts w:ascii="Times New Roman" w:hAnsi="Times New Roman"/>
-          <w:sz w:val="18"/>
-        </w:rPr>
-        <w:t>Eşik taraması analizi (Şekil 12), F1 skorunun 0,40-0,50 aralığında bir plato oluşturduğunu göstermektedir. Üretici bazlı performans (Şekil 13) Suno parçalarında %93,0 duyarlılık, Echoes alt kümesinde ise %88,6 duyarlılık elde edildiğini; buna karşın deepfake alt kümesinde performansın %50,0 değerinde kaldığını ortaya koymaktadır. Bu sonuç üretici modeller arası genelleme zorluğunu doğrular niteliktedir.</w:t>
+          <w:b w:val="0"/>
+          <w:sz w:val="18"/>
+        </w:rPr>
+        <w:t>Eşik taraması analizi (Şekil 12), F1 skorunun 0,40-0,50 aralığında bir plato oluşturduğunu göstermektedir; bu durum eşik seçiminin bu bölgede görece dayanıklı olduğuna işaret etmektedir. Üretici bazlı performans (Şekil 13) Suno parçalarında %93,0 duyarlılık, Echoes alt kümesinde ise %88,6 duyarlılık elde edildiğini ortaya koymaktadır. Buna karşın deepfake alt kümesinde duyarlılık %50,0 değerinde kalmıştır. Bu sonuç rastgele sınıflandırma sınırına karşılık gelmekte olup dikkatli bir biçimde yorumlanmalıdır: söz konusu alt küme, konuşma derin sahte kayıtlarından türetilmiş olup müzik üretim sistemlerine özgü spektral ve ritmik imzaları taşımamaktadır. Modelin bu alt kümedeki başarısızlığı, genel bir başarısızlığa değil; eğitim dağılımı ile deepfake alt kümesinin akustik karakteristikleri arasındaki dağılım kaymasına (distribution shift) işaret etmektedir. Bu bulgu, sistemi farklı kaynak türlerine genellemek amacıyla alan uyarlama (domain adaptation) veya kaynak-özel ince ayar stratejilerinin araştırılmasını önermektedir.</w:t>
       </w:r>
     </w:p>
     <w:p>
@@ -9465,14 +9469,15 @@
       <w:pPr>
         <w:spacing w:line="360" w:lineRule="auto"/>
         <w:ind w:firstLine="283"/>
-        <w:jc w:val="both"/>
+        <w:jc w:val="left"/>
       </w:pPr>
       <w:r>
         <w:rPr>
           <w:rFonts w:ascii="Times New Roman" w:hAnsi="Times New Roman"/>
-          <w:sz w:val="18"/>
-        </w:rPr>
-        <w:t>Öznitelik fazlalığı analizi sonuçları 47 özniteliğin tasarım gereği fazlalıklı bir yapıya sahip olduğunu göstermiştir. Yirmi öznitelik çiftinin |Pearson r| değeri 0,85 değerinin üzerinde ölçülmüştür (Şekil 16). Öznitelik çıkarma deneyi (Şekil 16) öznitelik sayısı N = 30 değerine ulaştığında doğruluğun plato yaptığını ortaya koymuş; sondaki 17 özniteliğin ölçülebilir bir ek doğruluk sağlamadığı tespit edilmiştir.</w:t>
+          <w:b w:val="0"/>
+          <w:sz w:val="18"/>
+        </w:rPr>
+        <w:t>Öznitelik fazlalığı analizi sonuçları 47 özniteliğin tasarım gereği fazlalıklı bir yapıya sahip olduğunu göstermiştir. Yirmi öznitelik çiftinin |Pearson r| değeri 0,85 değerinin üzerinde ölçülmüştür (Şekil 15). Öznitelik çıkarma deneyi (Şekil 16) öznitelik sayısı N = 30 değerine ulaştığında doğruluğun plato yaptığını ortaya koymuş; sondaki 17 özniteliğin ölçülebilir bir ek doğruluk sağlamadığı tespit edilmiştir.</w:t>
       </w:r>
     </w:p>
     <w:p>
@@ -10960,300 +10965,15 @@
       <w:pPr>
         <w:spacing w:line="360" w:lineRule="auto"/>
         <w:ind w:firstLine="283"/>
-        <w:jc w:val="both"/>
-      </w:pPr>
-      <w:r>
-        <w:rPr>
-          <w:sz w:val="18"/>
-        </w:rPr>
-        <w:t xml:space="preserve">Bu </w:t>
-      </w:r>
-      <w:proofErr w:type="spellStart"/>
-      <w:r>
-        <w:rPr>
-          <w:sz w:val="18"/>
-        </w:rPr>
-        <w:t>çalışmada</w:t>
-      </w:r>
-      <w:proofErr w:type="spellEnd"/>
-      <w:r>
-        <w:rPr>
-          <w:sz w:val="18"/>
-        </w:rPr>
-        <w:t xml:space="preserve"> </w:t>
-      </w:r>
-      <w:proofErr w:type="spellStart"/>
-      <w:r>
-        <w:rPr>
-          <w:sz w:val="18"/>
-        </w:rPr>
-        <w:t>yapay</w:t>
-      </w:r>
-      <w:proofErr w:type="spellEnd"/>
-      <w:r>
-        <w:rPr>
-          <w:sz w:val="18"/>
-        </w:rPr>
-        <w:t xml:space="preserve"> </w:t>
-      </w:r>
-      <w:proofErr w:type="spellStart"/>
-      <w:r>
-        <w:rPr>
-          <w:sz w:val="18"/>
-        </w:rPr>
-        <w:t>zekâ</w:t>
-      </w:r>
-      <w:proofErr w:type="spellEnd"/>
-      <w:r>
-        <w:rPr>
-          <w:sz w:val="18"/>
-        </w:rPr>
-        <w:t xml:space="preserve"> </w:t>
-      </w:r>
-      <w:proofErr w:type="spellStart"/>
-      <w:r>
-        <w:rPr>
-          <w:sz w:val="18"/>
-        </w:rPr>
-        <w:t>tarafından</w:t>
-      </w:r>
-      <w:proofErr w:type="spellEnd"/>
-      <w:r>
-        <w:rPr>
-          <w:sz w:val="18"/>
-        </w:rPr>
-        <w:t xml:space="preserve"> üretilen müziği insan tarafından bestelenmiş kayıtlardan ayırt edebilmek için AURIS adlı uçtan-uca bir tespit sistemi önerilmiştir. Önerilen sistem 47 boyutlu elle tasarlanmış akustik öznitelik vektörünü, on iki yapay zekâ üretim sisteminden derlenen 5.195 örnek üzerinde eğitilen on bir sınıflandırma modelinden oluşan bir topluluk ile birleştirmektedir. Elde edilen temel bulgular: LightGBM modeli %95,48 ortalama ROC-AUC değeri ve ±0,0023 standart sapma ile havuzdaki en başarılı modeli oluşturmuştur. Derin ÇKA %95,42 ile çok yakın bir ikinci sıra almıştır. Spektral düzlük özniteliği yapay zekâ ile </w:t>
-      </w:r>
-      <w:r>
-        <w:rPr>
-          <w:sz w:val="18"/>
-        </w:rPr>
-        <w:lastRenderedPageBreak/>
-        <w:t xml:space="preserve">insan müziği ayrımı için en bilgilendirici tek öznitelik olarak öne çıkmıştır. Tanılayıcı analiz iki önemli sınırlamayı ortaya koymuştur: tüm ağaç tabanlı modeller eğitim ile </w:t>
-      </w:r>
-      <w:proofErr w:type="spellStart"/>
-      <w:r>
-        <w:rPr>
-          <w:sz w:val="18"/>
-        </w:rPr>
-        <w:t>çapraz</w:t>
-      </w:r>
-      <w:proofErr w:type="spellEnd"/>
-      <w:r>
-        <w:rPr>
-          <w:sz w:val="18"/>
-        </w:rPr>
-        <w:t xml:space="preserve"> </w:t>
-      </w:r>
-      <w:proofErr w:type="spellStart"/>
-      <w:r>
-        <w:rPr>
-          <w:sz w:val="18"/>
-        </w:rPr>
-        <w:t>doğrulama</w:t>
-      </w:r>
-      <w:proofErr w:type="spellEnd"/>
-      <w:r>
-        <w:rPr>
-          <w:sz w:val="18"/>
-        </w:rPr>
-        <w:t xml:space="preserve"> </w:t>
-      </w:r>
-      <w:proofErr w:type="spellStart"/>
-      <w:r>
-        <w:rPr>
-          <w:sz w:val="18"/>
-        </w:rPr>
-        <w:t>doğrulukları</w:t>
-      </w:r>
-      <w:proofErr w:type="spellEnd"/>
-      <w:r>
-        <w:rPr>
-          <w:sz w:val="18"/>
-        </w:rPr>
-        <w:t xml:space="preserve"> </w:t>
-      </w:r>
-      <w:proofErr w:type="spellStart"/>
-      <w:r>
-        <w:rPr>
-          <w:sz w:val="18"/>
-        </w:rPr>
-        <w:t>arasında</w:t>
-      </w:r>
-      <w:proofErr w:type="spellEnd"/>
-      <w:r>
-        <w:rPr>
-          <w:sz w:val="18"/>
-        </w:rPr>
-        <w:t xml:space="preserve"> 8-14 </w:t>
-      </w:r>
-      <w:proofErr w:type="spellStart"/>
-      <w:r>
-        <w:rPr>
-          <w:sz w:val="18"/>
-        </w:rPr>
-        <w:t>puanlık</w:t>
-      </w:r>
-      <w:proofErr w:type="spellEnd"/>
-      <w:r>
-        <w:rPr>
-          <w:sz w:val="18"/>
-        </w:rPr>
-        <w:t xml:space="preserve"> </w:t>
-      </w:r>
-      <w:proofErr w:type="spellStart"/>
-      <w:r>
-        <w:rPr>
-          <w:sz w:val="18"/>
-        </w:rPr>
-        <w:t>bir</w:t>
-      </w:r>
-      <w:proofErr w:type="spellEnd"/>
-      <w:r>
-        <w:rPr>
-          <w:sz w:val="18"/>
-        </w:rPr>
-        <w:t xml:space="preserve"> fark </w:t>
-      </w:r>
-      <w:proofErr w:type="spellStart"/>
-      <w:r>
-        <w:rPr>
-          <w:sz w:val="18"/>
-        </w:rPr>
-        <w:t>sergilemekte</w:t>
-      </w:r>
-      <w:proofErr w:type="spellEnd"/>
-      <w:r>
-        <w:rPr>
-          <w:sz w:val="18"/>
-        </w:rPr>
-        <w:t xml:space="preserve"> </w:t>
-      </w:r>
-      <w:proofErr w:type="spellStart"/>
-      <w:r>
-        <w:rPr>
-          <w:sz w:val="18"/>
-        </w:rPr>
-        <w:t>ve</w:t>
-      </w:r>
-      <w:proofErr w:type="spellEnd"/>
-      <w:r>
-        <w:rPr>
-          <w:sz w:val="18"/>
-        </w:rPr>
-        <w:t xml:space="preserve"> 47 </w:t>
-      </w:r>
-      <w:proofErr w:type="spellStart"/>
-      <w:r>
-        <w:rPr>
-          <w:sz w:val="18"/>
-        </w:rPr>
-        <w:t>özniteliğin</w:t>
-      </w:r>
-      <w:proofErr w:type="spellEnd"/>
-      <w:r>
-        <w:rPr>
-          <w:sz w:val="18"/>
-        </w:rPr>
-        <w:t xml:space="preserve"> </w:t>
-      </w:r>
-      <w:proofErr w:type="spellStart"/>
-      <w:r>
-        <w:rPr>
-          <w:sz w:val="18"/>
-        </w:rPr>
-        <w:t>sondaki</w:t>
-      </w:r>
-      <w:proofErr w:type="spellEnd"/>
-      <w:r>
-        <w:rPr>
-          <w:sz w:val="18"/>
-        </w:rPr>
-        <w:t xml:space="preserve"> </w:t>
-      </w:r>
-      <w:proofErr w:type="spellStart"/>
-      <w:r>
-        <w:rPr>
-          <w:sz w:val="18"/>
-        </w:rPr>
-        <w:t>yaklaşık</w:t>
-      </w:r>
-      <w:proofErr w:type="spellEnd"/>
-      <w:r>
-        <w:rPr>
-          <w:sz w:val="18"/>
-        </w:rPr>
-        <w:t xml:space="preserve"> on </w:t>
-      </w:r>
-      <w:proofErr w:type="spellStart"/>
-      <w:r>
-        <w:rPr>
-          <w:sz w:val="18"/>
-        </w:rPr>
-        <w:t>yedisi</w:t>
-      </w:r>
-      <w:proofErr w:type="spellEnd"/>
-      <w:r>
-        <w:rPr>
-          <w:sz w:val="18"/>
-        </w:rPr>
-        <w:t xml:space="preserve"> </w:t>
-      </w:r>
-      <w:proofErr w:type="spellStart"/>
-      <w:r>
-        <w:rPr>
-          <w:sz w:val="18"/>
-        </w:rPr>
-        <w:t>ölçülebilir</w:t>
-      </w:r>
-      <w:proofErr w:type="spellEnd"/>
-      <w:r>
-        <w:rPr>
-          <w:sz w:val="18"/>
-        </w:rPr>
-        <w:t xml:space="preserve"> </w:t>
-      </w:r>
-      <w:proofErr w:type="spellStart"/>
-      <w:r>
-        <w:rPr>
-          <w:sz w:val="18"/>
-        </w:rPr>
-        <w:t>bir</w:t>
-      </w:r>
-      <w:proofErr w:type="spellEnd"/>
-      <w:r>
-        <w:rPr>
-          <w:sz w:val="18"/>
-        </w:rPr>
-        <w:t xml:space="preserve"> ek </w:t>
-      </w:r>
-      <w:proofErr w:type="spellStart"/>
-      <w:r>
-        <w:rPr>
-          <w:sz w:val="18"/>
-        </w:rPr>
-        <w:t>doğruluk</w:t>
-      </w:r>
-      <w:proofErr w:type="spellEnd"/>
-      <w:r>
-        <w:rPr>
-          <w:sz w:val="18"/>
-        </w:rPr>
-        <w:t xml:space="preserve"> </w:t>
-      </w:r>
-      <w:proofErr w:type="spellStart"/>
-      <w:r>
-        <w:rPr>
-          <w:sz w:val="18"/>
-        </w:rPr>
-        <w:t>sağlamamaktadır</w:t>
-      </w:r>
-      <w:proofErr w:type="spellEnd"/>
-      <w:r>
-        <w:rPr>
-          <w:sz w:val="18"/>
-        </w:rPr>
-        <w:t>.</w:t>
+        <w:jc w:val="left"/>
+      </w:pPr>
+      <w:r>
+        <w:rPr>
+          <w:rFonts w:ascii="Times New Roman" w:hAnsi="Times New Roman"/>
+          <w:b w:val="0"/>
+          <w:sz w:val="18"/>
+        </w:rPr>
+        <w:t>Bu çalışmada yapay zekâ tarafından üretilen müziği insan tarafından bestelenmiş kayıtlardan ayırt edebilmek için AURIS adlı uçtan-uca bir tespit sistemi önerilmiştir. Önerilen sistem 47 boyutlu elle tasarlanmış akustik öznitelik vektörünü, sekiz farklı kaynaktan derlenen 5.195 örnek üzerinde eğitilen on bir sınıflandırma modelinden oluşan bir topluluk ile birleştirmektedir. Elde edilen temel bulgular: LightGBM modeli %95,48 ortalama ROC-AUC değeri ve ±0,0023 standart sapma ile havuzdaki en başarılı modeli oluşturmuştur. Derin ÇKA %95,42 ile çok yakın bir ikinci sıra almıştır. Spektral düzlük özniteliği yapay zekâ ile insan müziği ayrımı için en bilgilendirici tek öznitelik olarak öne çıkmıştır. Tanılayıcı analiz iki önemli sınırlamayı ortaya koymuştur: tüm ağaç tabanlı modeller eğitim ile çapraz doğrulama doğrulukları arasında 8-14 puanlık bir fark sergilemekte ve 47 özniteliğin sondaki yaklaşık on yedisi ölçülebilir bir ek doğruluk sağlamamaktadır.</w:t>
       </w:r>
     </w:p>
     <w:p>

</xml_diff>

<commit_message>
Remove obsolete script for reading AURIS document content
</commit_message>
<xml_diff>
--- a/docs/academic/paper/deliverables/AURIS_Makale_Metni.docx
+++ b/docs/academic/paper/deliverables/AURIS_Makale_Metni.docx
@@ -1625,7 +1625,7 @@
       <w:pPr>
         <w:spacing w:line="360" w:lineRule="auto"/>
         <w:ind w:firstLine="283"/>
-        <w:jc w:val="both"/>
+        <w:jc w:val="left"/>
         <w:rPr>
           <w:sz w:val="18"/>
         </w:rPr>
@@ -1633,9 +1633,10 @@
       <w:r>
         <w:rPr>
           <w:rFonts w:ascii="Times New Roman" w:hAnsi="Times New Roman"/>
-          <w:sz w:val="18"/>
-        </w:rPr>
-        <w:t>Suno, Udio ve MusicGen gibi metinden müziğe üretim sistemlerinin yaygınlaşması, üretilen müzik parçalarının insan eliyle bestelenmiş kayıtlardan ayırt edilmesini bir tespit problemi olarak gündeme getirmiştir. Bu çalışmada, 47 boyutlu akustik öznitelik vektörü ile yedi makine öğrenmesi ve dört derin öğrenme algoritmasından oluşan on bir modelli bir topluluk öğrenmesi yaklaşımını birleştiren AURIS adlı bir sistem önerilmektedir. Modeller, on iki yapay zekâ üretici sisteminden ve birden çok insan kaynağından derlenen 5.195 örneklik bir veri kümesi üzerinde 5-katlı çapraz doğrulama ile eğitilmiştir. LightGBM, %95,48 ROC-AUC ve ±0,0023 standart sapma ile en başarılı sonucu elde etmiştir. Spektral düzlük standart sapması en bilgilendirici öznitelik olarak ön plana çıkmıştır. Youden J kriteri ile optimize edilen θ* = 0,4316 karar eşiği varsayılan 0,5 eşiğine kıyasla dengeli doğruluğu iyileştirmiştir. Brier skoru 0,083 olarak ölçülmüş ve modelin olasılık çıktılarının iyi kalibre olduğu doğrulanmıştır.</w:t>
+          <w:b w:val="0"/>
+          <w:sz w:val="18"/>
+        </w:rPr>
+        <w:t>Suno, Udio ve MusicGen gibi metinden müziğe üretim sistemlerinin yaygınlaşması, üretilen parçaların insan kayıtlarından ayırt edilmesini somut bir tespit problemi hâline getirmiştir. Bu çalışmada, 47 boyutlu akustik öznitelik vektörü ile yedi makine öğrenmesi ve dört derin öğrenme algoritmasından oluşan on bir modelli bir topluluk yaklaşımını birleştiren AURIS sistemi önerilmektedir. Modeller, sekiz farklı yapay zekâ üretici kaynağından ve birden çok insan veri kümesinden derlenen 5.195 örneklik bir veri kümesi üzerinde 5-katlı çapraz doğrulama ile değerlendirilmiştir. LightGBM, %95,48 ROC-AUC ve ±0,0023 standart sapma ile hem en yüksek ortalamayı hem de havuzdaki en düşük varyansı elde etmiştir. Spektral düzlük standart sapması öznitelik önem analizinde birinci sıraya yerleşmiştir. Youden J kriteri ile belirlenen θ* = 0,4316 karar eşiği varsayılan 0,5 değerine kıyasla dengeli doğruluğu iyileştirmiş; 0,083 Brier skoru olasılık çıktılarının iyi kalibre olduğunu ortaya koymuştur.</w:t>
       </w:r>
     </w:p>
     <w:p>
@@ -1899,13 +1900,15 @@
       <w:pPr>
         <w:spacing w:line="360" w:lineRule="auto"/>
         <w:ind w:firstLine="283"/>
-        <w:jc w:val="both"/>
-      </w:pPr>
-      <w:r>
-        <w:rPr>
-          <w:sz w:val="18"/>
-        </w:rPr>
-        <w:t>Bu çalışmada önerilen AURIS sistemi, tek bir temsile bağlı kalmak yerine; spektral, zamansal, harmonik ve vokal davranışı özetleyen 47 boyutlu elle tasarlanmış bir öznitelik vektörü ile kasıtlı biçimde heterojen on bir sınıflandırıcıdan oluşan bir topluluğu birleştirmektedir. Çalışmanın temel katkıları şunlardır: Suno, Udio, MusicGen, AudioLDM2 ve diğer sekiz üretici dahil on iki GenAI kaynağından ve birden çok insan kaynağından (GTZAN, FMA Small, SleepyJesse kapakları) derlenen 5.195 örneklik halka açık bir veri kümesinin oluşturulması; yedi makine öğrenmesi algoritması (Lojistik Regresyon, Rastgele Orman, Gradyan Artırma, SVM, ÇKA, XGBoost [7] ve LightGBM [8]) ve dört derin öğrenme mimarisinin (Derin ÇKA, 1B-ESA, Artık ÇKA, Dikkat ÇKA) ortak bir 5-katlı çapraz doğrulama protokolü altında karşılaştırılması ve LightGBM modelinin %95,48 ROC-AUC ile en başarılı sonucu sağladığının gösterilmesi; SHAP [9] tabanlı bir yorumlanabilirlik analizinin sunulması.</w:t>
+        <w:jc w:val="left"/>
+      </w:pPr>
+      <w:r>
+        <w:rPr>
+          <w:rFonts w:ascii="Times New Roman" w:hAnsi="Times New Roman"/>
+          <w:b w:val="0"/>
+          <w:sz w:val="18"/>
+        </w:rPr>
+        <w:t>Bu çalışmada önerilen AURIS sistemi, tek bir temsile bağlı kalmak yerine spektral, zamansal, harmonik ve vokal davranışı özetleyen 47 boyutlu elle tasarlanmış bir öznitelik vektörünü kasıtlı biçimde heterojen on bir sınıflandırıcıdan oluşan bir topluluğa bağlamaktadır. Suno, Udio, MusicGen, AudioLDM2 ve dört başka üretici dahil sekiz GenAI kaynağından ve birden çok insan veri kümesinden (GTZAN, FMA Small, SleepyJesse kapakları) derlenen 5.195 örneklik veri kümesi üzerinde yedi makine öğrenmesi algoritması (Lojistik Regresyon, Rastgele Orman, Gradyan Artırma, SVM, ÇKA, XGBoost [7] ve LightGBM [8]) ile dört derin öğrenme mimarisi ortak bir protokol altında karşılaştırılmıştır. LightGBM %95,48 ROC-AUC ile en başarılı modeli oluşturmuş; SHAP [9] tabanlı yorumlanabilirlik analizi hangi akustik özelliklerin kararı yönlendirdiğini sayısal olarak ortaya koymuştur.</w:t>
       </w:r>
     </w:p>
     <w:p>
@@ -1929,11 +1932,15 @@
     </w:p>
     <w:p/>
     <w:p>
-      <w:r>
-        <w:rPr>
-          <w:sz w:val="18"/>
-        </w:rPr>
-        <w:t>Konuşma için ses derin sahte tespiti, GenAI müzik tespiti çalışmaları açısından doğrudan örnek alınan en olgun komşu alanı oluşturmaktadır. Yi vd. tarafından düzenlenen ADD 2022 yarışmasında [3] bu alan resmî biçimde bir topluluk değerlendirme problemi olarak kurulmuştur. Frank ve Schönherr tarafından geliştirilen WaveFake [4] veri kümesi, vokoder-spesifik artefaktların tespitinin sistematik biçimde incelenmesi için altyapı oluşturmuştur. Uçtan-uca ham dalga biçimi işleyen derin öğrenme mimarileri bu alanda öne çıkmış; Jung vd. [10] grafik dikkat ağlarını spektral ve zamansal özniteliklerle bütünleştiren AASIST sistemini geliştirmiş, Tak vd. [11] ise ham ses sinyalinden doğrudan sınıflandırma yapan RawNet2 mimarisini önermiştir. Martín-Doñas ve Álvarez tarafından öne sürülen Vicomtech sistemi [12], önceden eğitilmiş wav2vec2 [13] öznitelik çıkarıcısının üzerine bir sınıflandırma başlığı yerleştirerek ADD 2022'de güçlü performans elde etmiştir. Kendi kendini denetimli ön eğitim yaklaşımları da bu alanda etkin biçimde kullanılmakta; Hsu vd. [14] tarafından geliştirilen HuBERT ve Chen vd. [15] tarafından önerilen WavLM, ses görevleri için sağlam temsil altyapısı sunmaktadır. Zhang vd. [16] tarafından yürütülen kapsamlı tarama çalışması, alanın teknik ve etik boyutlarını ayrıntılı biçimde özetlemiştir. Wang vd. [17] tarafından derlenen ASVspoof 2019 veri kümesi sentetik, dönüştürülmüş ve yeniden oynatılmış ses içeren geniş ölçekli bir referans kıyaslama oluşturmaktadır. Yi vd. [18] sahne sahte ses tespiti için SceneFake veri kümesini, Rabhi vd. [19] ise tespit sistemlerine yönelik düşmanca saldırıları ve karşı önlemleri kapsamlı biçimde incelemiştir. Kawa vd. [20], Whisper tabanlı ön eğitimli temsillerin ses derin sahte tespitindeki etkinliğini göstermiştir. Müller vd. [21] ise farklı veri kümelerinde eğitilen modellerin alan genellemesi sınırlamalarını sistematik biçimde raporlamıştır. Yakın tarihli bir çalışmada Li vd. [22], makine tarafından üretilen müziğin yorumlanabilir akustik özniteliklerle tespitini ele almış ve bu alandaki metodolojik boşlukları kapsamlı biçimde değerlendirmiştir.</w:t>
+      <w:pPr>
+        <w:jc w:val="left"/>
+      </w:pPr>
+      <w:r>
+        <w:rPr>
+          <w:rFonts w:ascii="Times New Roman" w:hAnsi="Times New Roman"/>
+          <w:sz w:val="18"/>
+        </w:rPr>
+        <w:t>Konuşma için ses derin sahte tespiti, GenAI müzik tespiti çalışmaları açısından doğrudan örnek alınan en olgun komşu alanı oluşturmaktadır. Yi vd. tarafından düzenlenen ADD 2022 yarışmasında [3] bu alan resmî biçimde bir topluluk değerlendirme problemi olarak kurulmuştur. Frank ve Schönherr tarafından geliştirilen WaveFake [4] veri kümesi, vokoder-spesifik artefaktların tespitinin sistematik biçimde incelenmesi için altyapı oluşturmuştur. Uçtan-uca ham dalga biçimi işleyen derin öğrenme mimarileri bu alanda öne çıkmış; Jung vd. [10] grafik dikkat ağlarını spektral ve zamansal özniteliklerle bütünleştiren AASIST sistemini geliştirmiş, Tak vd. [11] ise ham ses sinyalinden doğrudan sınıflandırma yapan RawNet2 mimarisini önermiştir. Martín-Doñas ve Álvarez tarafından öne sürülen Vicomtech sistemi [12], önceden eğitilmiş wav2vec2 [13] öznitelik çıkarıcısının üzerine bir sınıflandırma başlığı yerleştirerek ADD 2022'de güçlü performans elde etmiştir. Kendi kendini denetimli ön eğitim yaklaşımları da bu alanda etkin biçimde kullanılmakta; Hsu vd. [14] tarafından geliştirilen HuBERT ve Chen vd. [15] tarafından önerilen WavLM, ses görevleri için sağlam temsil altyapısı sunmaktadır. Zhang vd. [16] tarafından yürütülen kapsamlı tarama çalışması, alanın teknik ve etik boyutlarını ayrıntılı biçimde özetlemiştir. Wang vd. [17] tarafından derlenen ASVspoof 2019 veri kümesi sentetik, dönüştürülmüş ve yeniden oynatılmış ses içeren geniş ölçekli bir referans kıyaslama oluşturmaktadır. Yi vd. [18] sahne sahte ses tespiti için SceneFake veri kümesini, Rabhi vd. [19] ise tespit sistemlerine yönelik düşmanca saldırıları ve karşı önlemleri ayrıntılı biçimde ele almıştır. Kawa vd. [20], Whisper tabanlı ön eğitimli temsillerin ses derin sahte tespitindeki etkinliğini göstermiştir. Müller vd. [21] ise farklı veri kümelerinde eğitilen modellerin alan genellemesi sınırlamalarını sistematik biçimde raporlamıştır. Yakın tarihli bir çalışmada Li vd. [22], makine tarafından üretilen müziğin yorumlanabilir akustik özniteliklerle tespitini ele almış ve bu alandaki metodolojik boşlukları sistematik biçimde değerlendirmiştir.</w:t>
       </w:r>
     </w:p>
     <w:p/>
@@ -2036,142 +2043,18 @@
       <w:pPr>
         <w:spacing w:line="360" w:lineRule="auto"/>
         <w:ind w:firstLine="283"/>
-        <w:jc w:val="both"/>
-        <w:rPr>
-          <w:sz w:val="18"/>
-        </w:rPr>
-      </w:pPr>
-      <w:r>
-        <w:rPr>
-          <w:sz w:val="18"/>
-        </w:rPr>
-        <w:t xml:space="preserve">Bu bölümde önerilen AURIS sistemini geliştirmek için kullanılan veri kümesi, öznitelik çıkarma süreci, sınıflandırma modelleri ve eğitim protokolü detaylandırılmaktadır. </w:t>
-      </w:r>
-      <w:proofErr w:type="spellStart"/>
-      <w:r>
-        <w:rPr>
-          <w:sz w:val="18"/>
-        </w:rPr>
-        <w:t>Önerilen</w:t>
-      </w:r>
-      <w:proofErr w:type="spellEnd"/>
-      <w:r>
-        <w:rPr>
-          <w:sz w:val="18"/>
-        </w:rPr>
-        <w:t xml:space="preserve"> </w:t>
-      </w:r>
-      <w:proofErr w:type="spellStart"/>
-      <w:r>
-        <w:rPr>
-          <w:sz w:val="18"/>
-        </w:rPr>
-        <w:t>sistemin</w:t>
-      </w:r>
-      <w:proofErr w:type="spellEnd"/>
-      <w:r>
-        <w:rPr>
-          <w:sz w:val="18"/>
-        </w:rPr>
-        <w:t xml:space="preserve"> </w:t>
-      </w:r>
-      <w:proofErr w:type="spellStart"/>
-      <w:r>
-        <w:rPr>
-          <w:sz w:val="18"/>
-        </w:rPr>
-        <w:t>uçtan-uca</w:t>
-      </w:r>
-      <w:proofErr w:type="spellEnd"/>
-      <w:r>
-        <w:rPr>
-          <w:sz w:val="18"/>
-        </w:rPr>
-        <w:t xml:space="preserve"> </w:t>
-      </w:r>
-      <w:proofErr w:type="spellStart"/>
-      <w:r>
-        <w:rPr>
-          <w:sz w:val="18"/>
-        </w:rPr>
-        <w:t>işleyişine</w:t>
-      </w:r>
-      <w:proofErr w:type="spellEnd"/>
-      <w:r>
-        <w:rPr>
-          <w:sz w:val="18"/>
-        </w:rPr>
-        <w:t xml:space="preserve"> </w:t>
-      </w:r>
-      <w:proofErr w:type="spellStart"/>
-      <w:r>
-        <w:rPr>
-          <w:sz w:val="18"/>
-        </w:rPr>
-        <w:t>genel</w:t>
-      </w:r>
-      <w:proofErr w:type="spellEnd"/>
-      <w:r>
-        <w:rPr>
-          <w:sz w:val="18"/>
-        </w:rPr>
-        <w:t xml:space="preserve"> </w:t>
-      </w:r>
-      <w:proofErr w:type="spellStart"/>
-      <w:r>
-        <w:rPr>
-          <w:sz w:val="18"/>
-        </w:rPr>
-        <w:t>bir</w:t>
-      </w:r>
-      <w:proofErr w:type="spellEnd"/>
-      <w:r>
-        <w:rPr>
-          <w:sz w:val="18"/>
-        </w:rPr>
-        <w:t xml:space="preserve"> </w:t>
-      </w:r>
-      <w:proofErr w:type="spellStart"/>
-      <w:r>
-        <w:rPr>
-          <w:sz w:val="18"/>
-        </w:rPr>
-        <w:t>bakış</w:t>
-      </w:r>
-      <w:proofErr w:type="spellEnd"/>
-      <w:r>
-        <w:rPr>
-          <w:sz w:val="18"/>
-        </w:rPr>
-        <w:t xml:space="preserve"> </w:t>
-      </w:r>
-      <w:proofErr w:type="spellStart"/>
-      <w:r>
-        <w:rPr>
-          <w:sz w:val="18"/>
-        </w:rPr>
-        <w:t>Şekil</w:t>
-      </w:r>
-      <w:proofErr w:type="spellEnd"/>
-      <w:r>
-        <w:rPr>
-          <w:sz w:val="18"/>
-        </w:rPr>
-        <w:t xml:space="preserve"> 1'de </w:t>
-      </w:r>
-      <w:proofErr w:type="spellStart"/>
-      <w:r>
-        <w:rPr>
-          <w:sz w:val="18"/>
-        </w:rPr>
-        <w:t>sunulmuştur</w:t>
-      </w:r>
-      <w:proofErr w:type="spellEnd"/>
-      <w:r>
-        <w:rPr>
-          <w:sz w:val="18"/>
-        </w:rPr>
-        <w:t>.</w:t>
+        <w:jc w:val="left"/>
+        <w:rPr>
+          <w:sz w:val="18"/>
+        </w:rPr>
+      </w:pPr>
+      <w:r>
+        <w:rPr>
+          <w:rFonts w:ascii="Times New Roman" w:hAnsi="Times New Roman"/>
+          <w:b w:val="0"/>
+          <w:sz w:val="18"/>
+        </w:rPr>
+        <w:t>AURIS sisteminin veri kümesi, öznitelik çıkarma süreci, sınıflandırma modelleri ve eğitim protokolü aşağıda sırasıyla aktarılmaktadır. Sistemin uçtan-uca işleyişine genel bir bakış Şekil 1'de sunulmuştur.</w:t>
       </w:r>
     </w:p>
     <w:p>
@@ -3321,7 +3204,7 @@
           <w:b w:val="0"/>
           <w:sz w:val="18"/>
         </w:rPr>
-        <w:t>Her ses parçası 22.050 Hz örnekleme hızında yeniden örneklenmiş ve librosa [37] kütüphanesi kullanılarak 47 boyutlu bir öznitelik vektörüne dönüştürülmüştür. Öznitelik vektörü beş aileden oluşmaktadır: spektral aile (16 öznitelik), zamansal aile (10 öznitelik), harmonik ve tonal aile (9 öznitelik), MFCC ailesi (3 öznitelik) ve vokal aile (9 öznitelik). İlk sekiz öznitelik için insan ve yapay zekâ örneklerinin dağılımları Şekil 2'de karşılaştırılmıştır. Öznitelikler beş işlevsel aileye ayrılmaktadır: spektral (16 öznitelik: MFCC, melspectrogram, spectral centroid/bandwidth/rolloff/flatness ve bunların δ istatistikleri), zamansal (10 öznitelik: RMS enerjisi, sıfır geçiş hızı ve dinamik aralık istatistikleri), ritmik (9 öznitelik: tempo, beat sayısı, onset gücü istatistikleri), harmonik (8 öznitelik: chroma vektörü ve harmonik-algısal ayrıştırma bileşenleri) ve vokal (4 öznitelik: temel frekans istatistikleri). Bu beş ailenin birden fazla modaliteyi kapsaması, herhangi bir tek temsile aşırı uyumu önlemeyi amaçlamaktadır.</w:t>
+        <w:t>Her ses parçası 22.050 Hz örnekleme hızında yeniden örneklenmiş ve librosa [37] kütüphanesi kullanılarak 47 boyutlu bir öznitelik vektörüne dönüştürülmüştür. Öznitelikler beş işlevsel aileye ayrılmıştır: spektral (16 öznitelik — MFCC, mel-spektrogram, spectral centroid, bandwidth, rolloff, flatness ve bunların delta istatistikleri), zamansal (10 öznitelik — RMS enerjisi, sıfır geçiş hızı ve dinamik aralık türevleri), ritmik (9 öznitelik — tempo, beat sayısı ve onset gücü istatistikleri), harmonik (8 öznitelik — chroma vektörü ve harmonik-algısal ayrıştırma bileşenleri) ve vokal (4 öznitelik — temel frekans istatistikleri). Beş farklı modaliteyi kapsaması, herhangi bir akustik temsile karşı aşırı uyumu sınırlamayı amaçlayan tasarım kararının temelini oluşturmaktadır. İlk sekiz öznitelik için insan ve yapay zekâ örneklerinin dağılımları Şekil 2'de karşılaştırılmıştır.</w:t>
       </w:r>
     </w:p>
     <w:p>
@@ -3427,13 +3310,15 @@
       <w:pPr>
         <w:spacing w:line="360" w:lineRule="auto"/>
         <w:ind w:firstLine="283"/>
-        <w:jc w:val="both"/>
-      </w:pPr>
-      <w:r>
-        <w:rPr>
-          <w:sz w:val="18"/>
-        </w:rPr>
-        <w:t>On bir sınıflandırma modeli ortak bir 5-katlı çapraz doğrulama protokolü altında karşılaştırılmıştır. Yedi makine öğrenmesi modeli scikit-learn [38] kütüphanesi kullanılarak uygulanmıştır: Lojistik Regresyon, Rastgele Orman, Gradyan Artırma, SVM-RBF, Çok Katmanlı Algılayıcı, XGBoost [7] ve LightGBM [8]. Dört derin öğrenme mimarisi PyTorch ile uygulanmıştır: Derin Çok Katmanlı Algılayıcı (Derin ÇKA), 1B-Evrişimli Sinir Ağı, Artık ÇKA ve Dikkat ÇKA. Modellerin hiperparametreleri Tablo 2'de verilmiştir.</w:t>
+        <w:jc w:val="left"/>
+      </w:pPr>
+      <w:r>
+        <w:rPr>
+          <w:rFonts w:ascii="Times New Roman" w:hAnsi="Times New Roman"/>
+          <w:b w:val="0"/>
+          <w:sz w:val="18"/>
+        </w:rPr>
+        <w:t>On bir sınıflandırma modeli ortak bir 5-katlı çapraz doğrulama protokolü altında test edilmiştir. Yedi makine öğrenmesi modeli scikit-learn [38] kütüphanesi ile hayata geçirilmiştir: Lojistik Regresyon, Rastgele Orman, Gradyan Artırma, SVM-RBF, Çok Katmanlı Algılayıcı (ÇKA), XGBoost [7] ve LightGBM [8]. Dört derin öğrenme mimarisi ise PyTorch çerçevesinde geliştirilmiştir: Derin ÇKA, 1B-Evrişimli Sinir Ağı (1B-ESA), Artık ÇKA ve Dikkat ÇKA. Temel hiperparametreler Tablo 2'de listelenmiştir.</w:t>
       </w:r>
     </w:p>
     <w:p>
@@ -4224,7 +4109,7 @@
           <w:b w:val="0"/>
           <w:sz w:val="18"/>
         </w:rPr>
-        <w:t>Tüm modeller stratifiye edilmiş 5-katlı çapraz doğrulama ile değerlendirilmiştir. Her kat içinde StandardScaler eğitim alt kümesi üzerinde fit edilmiş, ardından doğrulama alt kümesi üzerinde transform uygulanmıştır. Karar eşiği θ, varsayılan 0,5 yerine Youden'in J istatistiği ile optimize edilmiştir: J(θ) = TPR(θ) − FPR(θ), Eş. 1. LightGBM için Youden-optimal eşik θ* = 0,4316 olarak ölçülmüştür. Kalibrasyon kalitesi Brier skoru ile değerlendirilmiştir, Eş. 2: BS = (1/N) Σᵢ (pᵢ − yᵢ)². Derin öğrenme modelleri Adam [39] optimize edici ile eğitilmiştir. Modelin yorumlanabilirliği TreeSHAP [9] algoritması kullanılarak analiz edilmiştir. Veri kümesindeki sınıf dengesizliği (3.113 insan (%59,9) ve 2.082 yapay zekâ (%40,1) örneği) tüm destekleyen modellerde class_weight="balanced" parametresi ile giderilmiştir; ağaç artırma modellerinde (LightGBM, XGBoost, Gradyan Artırma) ise is_unbalance=True bayrağı kullanılmıştır. Stratifiye örnekleme her katın sınıf oranını koruyarak değerlendirmenin dengeli kalmasını sağlamıştır.</w:t>
+        <w:t>Tüm modeller stratifiye 5-katlı çapraz doğrulama ile değerlendirilmiştir; StandardScaler her katta yalnızca eğitim verisi üzerinde fit edilmiş, doğrulama verisi ise yalnızca transform işlemine tabi tutulmuştur. Karar eşiği θ, varsayılan 0,5 yerine Youden J istatistiğiyle optimize edilmiştir: J(θ) = TPR(θ) − FPR(θ), Eş. 1. LightGBM için elde edilen optimal eşik θ* = 0,4316'dır. Kalibrasyon kalitesi Brier skoru (Eş. 2): BS = (1/N) Σᵢ (pᵢ − yᵢ)² ile ölçülmüştür. Derin öğrenme modelleri Adam [39] optimize edici ile eğitilmiştir; yorumlanabilirlik analizi TreeSHAP [9] algoritmasına dayandırılmıştır. Veri kümesindeki sınıf dağılımı %59,9 insan ve %40,1 yapay zekâ olarak gerçekleşmiştir. Makine öğrenmesi modellerinde class_weight="balanced", ağaç artırma modellerinde is_unbalance=True parametresi kullanılarak bu dengesizlik giderilmiştir; stratifiye örnekleme her katta sınıf oranını korumuştur.</w:t>
       </w:r>
     </w:p>
     <w:p>
@@ -4260,13 +4145,15 @@
       <w:pPr>
         <w:spacing w:line="360" w:lineRule="auto"/>
         <w:ind w:firstLine="283"/>
-        <w:jc w:val="both"/>
-      </w:pPr>
-      <w:r>
-        <w:rPr>
-          <w:sz w:val="18"/>
-        </w:rPr>
-        <w:t>Tablo 3, on bir modelin 5-katlı çapraz doğrulama sonuçlarını ROC-AUC değerine göre sıralı olarak sunmaktadır. LightGBM modeli, %95,48 ortalama ROC-AUC değeri ile ilk sırada yer almakta; Derin ÇKA modeli %95,42 ile çok yakın bir ikinci sıra elde etmektedir. 1B-ESA modeli %85,43 ile en düşük performansı sergilemiştir. Şekil 3 on bir modelin doğruluk, F1 ve ROC-AUC değerlerini karşılaştırmalı olarak göstermektedir.</w:t>
+        <w:jc w:val="left"/>
+      </w:pPr>
+      <w:r>
+        <w:rPr>
+          <w:rFonts w:ascii="Times New Roman" w:hAnsi="Times New Roman"/>
+          <w:b w:val="0"/>
+          <w:sz w:val="18"/>
+        </w:rPr>
+        <w:t>On bir modelin 5-katlı çapraz doğrulama sonuçları ROC-AUC değerine göre Tablo 3'te sıralanmaktadır. LightGBM %95,48 ortalama ROC-AUC ve ±0,0023 standart sapma ile birinci sırada yer almaktadır; Derin ÇKA ise %95,42 ile çok yakın bir mesafede ikinci olmaktadır. 1B-ESA %85,43 ile havuzun en zayıf modeli konumundadır. Şekil 3 doğruluk, F1 ve AUC değerlerini modeller arasında görsel olarak karşılaştırmaktadır. LightGBM'in sınıf bazlı kesinlik, duyarlılık ve F1 değerleri Tablo 4'te ayrıntılı biçimde yer almaktadır.</w:t>
       </w:r>
     </w:p>
     <w:p>
@@ -6752,14 +6639,15 @@
       <w:pPr>
         <w:spacing w:line="360" w:lineRule="auto"/>
         <w:ind w:firstLine="283"/>
-        <w:jc w:val="both"/>
+        <w:jc w:val="left"/>
       </w:pPr>
       <w:r>
         <w:rPr>
           <w:rFonts w:ascii="Times New Roman" w:hAnsi="Times New Roman"/>
-          <w:sz w:val="18"/>
-        </w:rPr>
-        <w:t>Şekil 4, yedi makine öğrenmesi modelinin ROC eğrilerini karşılaştırmaktadır. Şekil 5, makine öğrenmesi ile derin öğrenme ailelerinin performans dağılımını göstermektedir. Makine öğrenmesi ile derin öğrenme aileleri karşılaştırıldığında, yedi makine öğrenmesi sınıflandırıcısı %92,75 ortalama ROC-AUC değerine ulaşırken dört derin öğrenme mimarisi %92,32 değerinde kalmaktadır. 1B-ESA dışlandığında, kalan üç DL mimarisi %94,62 ortalama elde etmektedir. Bu bulgu, 47 boyutlu öznitelik vektörünün ayırt edici bilginin büyük kısmını kodladığını ve öznitelik mühendisliğinin model kapasitesinden daha belirleyici bir etken olduğunu göstermektedir.</w:t>
+          <w:b w:val="0"/>
+          <w:sz w:val="18"/>
+        </w:rPr>
+        <w:t>Şekil 4, yedi makine öğrenmesi modelinin ROC eğrilerini karşılaştırmaktadır; Şekil 5 ise iki aile arasındaki performans dağılımını görselleştirmektedir. Yedi makine öğrenmesi sınıflandırıcısı %92,75 ortalama ROC-AUC elde ederken dört derin öğrenme mimarisi %92,32 değerinde kalmıştır. 1B-ESA dışlandığında kalan üç DL mimarisinin ortalaması %94,62'ye yükselmektedir. Sonuç olarak 47 boyutlu öznitelik vektörü, ayırt edici bilginin büyük bölümünü ham veri işleyicilerden bağımsız biçimde kodlayabilmekte; bu durum öznitelik mühendisliğinin model kapasitesinin önüne geçtiğine işaret etmektedir.</w:t>
       </w:r>
     </w:p>
     <w:p>
@@ -6852,118 +6740,22 @@
       <w:pPr>
         <w:spacing w:line="360" w:lineRule="auto"/>
         <w:ind w:firstLine="283"/>
-        <w:jc w:val="both"/>
-      </w:pPr>
-      <w:r>
-        <w:rPr>
-          <w:sz w:val="18"/>
-        </w:rPr>
-        <w:t xml:space="preserve">Katlar-arası kararlılık açısından LightGBM ±0,0023 standart sapma ile havuzdaki en kararlı modeldir; beş katı 0,9515 ile 0,9580 arasında dar bir aralıkta değişmektedir. XGBoost (±0,0029) ve Gradyan Artırma (±0,0038) onu izlemektedir. En değişken modeller 1B-ESA (±0,0087) ve SVM-RBF (±0,0075) olmuştur. </w:t>
-      </w:r>
-      <w:proofErr w:type="spellStart"/>
-      <w:r>
-        <w:rPr>
-          <w:sz w:val="18"/>
-        </w:rPr>
-        <w:t>Kararlılığa</w:t>
-      </w:r>
-      <w:proofErr w:type="spellEnd"/>
-      <w:r>
-        <w:rPr>
-          <w:sz w:val="18"/>
-        </w:rPr>
-        <w:t xml:space="preserve"> </w:t>
-      </w:r>
-      <w:proofErr w:type="spellStart"/>
-      <w:r>
-        <w:rPr>
-          <w:sz w:val="18"/>
-        </w:rPr>
-        <w:t>göre</w:t>
-      </w:r>
-      <w:proofErr w:type="spellEnd"/>
-      <w:r>
-        <w:rPr>
-          <w:sz w:val="18"/>
-        </w:rPr>
-        <w:t xml:space="preserve"> </w:t>
-      </w:r>
-      <w:proofErr w:type="spellStart"/>
-      <w:r>
-        <w:rPr>
-          <w:sz w:val="18"/>
-        </w:rPr>
-        <w:t>sıralama</w:t>
-      </w:r>
-      <w:proofErr w:type="spellEnd"/>
-      <w:r>
-        <w:rPr>
-          <w:sz w:val="18"/>
-        </w:rPr>
-        <w:t xml:space="preserve">, </w:t>
-      </w:r>
-      <w:proofErr w:type="spellStart"/>
-      <w:r>
-        <w:rPr>
-          <w:sz w:val="18"/>
-        </w:rPr>
-        <w:t>ortalama</w:t>
-      </w:r>
-      <w:proofErr w:type="spellEnd"/>
-      <w:r>
-        <w:rPr>
-          <w:sz w:val="18"/>
-        </w:rPr>
-        <w:t xml:space="preserve"> AUC </w:t>
-      </w:r>
-      <w:proofErr w:type="spellStart"/>
-      <w:r>
-        <w:rPr>
-          <w:sz w:val="18"/>
-        </w:rPr>
-        <w:t>sıralamasını</w:t>
-      </w:r>
-      <w:proofErr w:type="spellEnd"/>
-      <w:r>
-        <w:rPr>
-          <w:sz w:val="18"/>
-        </w:rPr>
-        <w:t xml:space="preserve"> </w:t>
-      </w:r>
-      <w:proofErr w:type="spellStart"/>
-      <w:r>
-        <w:rPr>
-          <w:sz w:val="18"/>
-        </w:rPr>
-        <w:t>yakından</w:t>
-      </w:r>
-      <w:proofErr w:type="spellEnd"/>
-      <w:r>
-        <w:rPr>
-          <w:sz w:val="18"/>
-        </w:rPr>
-        <w:t xml:space="preserve"> </w:t>
-      </w:r>
-      <w:proofErr w:type="spellStart"/>
-      <w:r>
-        <w:rPr>
-          <w:sz w:val="18"/>
-        </w:rPr>
-        <w:t>izlemektedir</w:t>
-      </w:r>
-      <w:proofErr w:type="spellEnd"/>
-      <w:r>
-        <w:rPr>
-          <w:sz w:val="18"/>
-        </w:rPr>
-        <w:t>.</w:t>
+        <w:jc w:val="left"/>
+      </w:pPr>
+      <w:r>
+        <w:rPr>
+          <w:rFonts w:ascii="Times New Roman" w:hAnsi="Times New Roman"/>
+          <w:b w:val="0"/>
+          <w:sz w:val="18"/>
+        </w:rPr>
+        <w:t>Katlar arası kararlılık değerlendirildiğinde LightGBM ±0,0023 standart sapma ile beş katın tamamında 0,9515–0,9580 arasında seyrederek havuzun en tutarlı modeli olmuştur. XGBoost (±0,0029) ve Gradyan Artırma (±0,0038) bunu yakından izlemektedir. 1B-ESA (±0,0087) ve SVM-RBF (±0,0075) en yüksek varyansı sergileyen modeller olmuştur. Ortalama AUC sıralaması ile kararlılık sıralamasının büyük ölçüde örtüşmesi, yüksek performansın istikrarsız optimumlardan değil sağlam öznitelik temsilinden kaynaklandığını düşündürmektedir.</w:t>
       </w:r>
     </w:p>
     <w:p>
       <w:pPr>
         <w:spacing w:line="360" w:lineRule="auto"/>
         <w:ind w:firstLine="283"/>
-        <w:jc w:val="both"/>
+        <w:jc w:val="left"/>
         <w:rPr>
           <w:sz w:val="18"/>
         </w:rPr>
@@ -6971,9 +6763,10 @@
       <w:r>
         <w:rPr>
           <w:rFonts w:ascii="Times New Roman" w:hAnsi="Times New Roman"/>
-          <w:sz w:val="18"/>
-        </w:rPr>
-        <w:t>Öznitelik önemi analizi sonuçları spektral düzlük standart sapması özniteliğinin yapay zekâ ile insan müziği ayrımı için en bilgilendirici öznitelik olduğunu açık biçimde ortaya koymuştur. Tablo 5 ilk on özniteliği listelemektedir. Şekil 6 ilk yirmi özniteliğin normalize edilmiş önem skorlarını göstermektedir. Şekil 7'deki TreeSHAP global etki diyagramı, bu özniteliğin model çıktısı üzerindeki yönsel etkisini doğrulamaktadır.</w:t>
+          <w:b w:val="0"/>
+          <w:sz w:val="18"/>
+        </w:rPr>
+        <w:t>Öznitelik önemi analizi, spectral_flatness_std özniteliğini yapay zekâ ile insan müziği ayrımında açıkça baskın konuma taşımıştır. Tablo 5 en yüksek skorlu ilk onu listelemekte, Şekil 6 yirmi özniteliğin normalize edilmiş puanlarını göstermektedir. Şekil 7'deki TreeSHAP global etki diyagramı, yüksek spectral_flatness_std değerlerinin modeli yapay zekâ sınıfına yönlendirdiğini kanıtlamaktadır; bu bulgu daha geniş ses derin sahte literatürüyle [16] örtüşmektedir.</w:t>
       </w:r>
     </w:p>
     <w:p>
@@ -7907,14 +7700,15 @@
       <w:pPr>
         <w:spacing w:line="360" w:lineRule="auto"/>
         <w:ind w:firstLine="283"/>
-        <w:jc w:val="both"/>
+        <w:jc w:val="left"/>
       </w:pPr>
       <w:r>
         <w:rPr>
           <w:rFonts w:ascii="Times New Roman" w:hAnsi="Times New Roman"/>
-          <w:sz w:val="18"/>
-        </w:rPr>
-        <w:t>Şekil 8 LightGBM modelinin Youden-optimal eşik θ* = 0,4316 ile elde edilen karmaşıklık matrisini göstermektedir: 2.721 doğru negatif (%87,4), 1.862 doğru pozitif (%89,4), 392 yanlış pozitif (%12,6) ve 220 yanlış negatif (%10,6). Şekil 9 insan ve yapay zekâ sınıflarına ait olasılık dağılımlarını sunmaktadır. Şekil 10'daki kalibrasyon eğrisi 0,083 Brier skoru ile birlikte modelin olasılık çıktılarının iyi kalibre olduğunu doğrulamaktadır. Şekil 11 kesinlik-duyarlılık eğrisini 0,934 ortalama kesinlik değeri ile göstermektedir.</w:t>
+          <w:b w:val="0"/>
+          <w:sz w:val="18"/>
+        </w:rPr>
+        <w:t>Şekil 8, Youden-optimal eşik θ* = 0,4316 ile elde edilen karmaşıklık matrisini göstermektedir: 2.721 doğru negatif (%87,4), 1.862 doğru pozitif (%89,4), 392 yanlış pozitif (%12,6) ve 220 yanlış negatif (%10,6). Olasılık dağılımları Şekil 9'da incelendiğinde iki sınıfın belirgin biçimde ayrıştığı, ancak 0,3–0,6 bölgesinde örtüşme bulunduğu görülmektedir. Şekil 10'daki kalibrasyon eğrisi ve 0,083 Brier skoru, modelin tahmin güven düzeylerinin gerçek doğruluğu iyi yansıttığını doğrulamaktadır. Şekil 11 kesinlik-duyarlılık eğrisini 0,934 ortalama kesinlik değeri ile sunmaktadır.</w:t>
       </w:r>
     </w:p>
     <w:p>
@@ -8379,10 +8173,9 @@
       <w:r>
         <w:rPr>
           <w:rFonts w:ascii="Times New Roman" w:hAnsi="Times New Roman"/>
-          <w:b w:val="0"/>
-          <w:sz w:val="18"/>
-        </w:rPr>
-        <w:t>Eşik taraması analizi (Şekil 12), F1 skorunun 0,40-0,50 aralığında bir plato oluşturduğunu göstermektedir; bu durum eşik seçiminin bu bölgede görece dayanıklı olduğuna işaret etmektedir. Üretici bazlı performans (Şekil 13) Suno parçalarında %93,0 duyarlılık, Echoes alt kümesinde ise %88,6 duyarlılık elde edildiğini ortaya koymaktadır. Buna karşın deepfake alt kümesinde duyarlılık %50,0 değerinde kalmıştır. Bu sonuç rastgele sınıflandırma sınırına karşılık gelmekte olup dikkatli bir biçimde yorumlanmalıdır: söz konusu alt küme, konuşma derin sahte kayıtlarından türetilmiş olup müzik üretim sistemlerine özgü spektral ve ritmik imzaları taşımamaktadır. Modelin bu alt kümedeki başarısızlığı, genel bir başarısızlığa değil; eğitim dağılımı ile deepfake alt kümesinin akustik karakteristikleri arasındaki dağılım kaymasına (distribution shift) işaret etmektedir. Bu bulgu, sistemi farklı kaynak türlerine genellemek amacıyla alan uyarlama (domain adaptation) veya kaynak-özel ince ayar stratejilerinin araştırılmasını önermektedir.</w:t>
+          <w:sz w:val="18"/>
+        </w:rPr>
+        <w:t>Eşik taraması analizi (Şekil 12), F1 skorunun 0,40-0,50 aralığında bir plato oluşturduğunu göstermektedir; bu durum eşik seçiminin bu bölgede görece dayanıklı olduğuna işaret etmektedir. Üretici bazlı performans (Şekil 13) Suno parçalarında %93,0 duyarlılık, Echoes alt kümesinde ise %88,6 duyarlılık elde edildiğini ortaya koymaktadır. Buna karşın deepfake alt kümesinde duyarlılık %50,0 değerinde kalmıştır. Bu sonuç rastgele sınıflandırma sınırına karşılık gelmektedir ve bağlamı dışında değerlendirilmemelidir: söz konusu alt küme, konuşma derin sahte kayıtlarından türetilmiş olup müzik üretim sistemlerine özgü spektral ve ritmik imzaları taşımamaktadır. Modelin bu alt kümedeki başarısızlığı, genel bir başarısızlığa değil; eğitim dağılımı ile deepfake alt kümesinin akustik karakteristikleri arasındaki dağılım kaymasına (distribution shift) işaret etmektedir. Bu bulgu, sistemi farklı kaynak türlerine genellemek amacıyla alan uyarlama (domain adaptation) veya kaynak-özel ince ayar stratejilerinin araştırılmasını önermektedir.</w:t>
       </w:r>
     </w:p>
     <w:p>
@@ -9320,24 +9113,31 @@
       </w:r>
     </w:p>
     <w:p>
-      <w:r>
-        <w:rPr>
-          <w:sz w:val="18"/>
-        </w:rPr>
-        <w:t xml:space="preserve">Tablo 7, AURIS sisteminin literatürdeki doğrudan ilgili çalışmalarla karşılaştırmasını sunmaktadır. AURIS, ROC-AUC (0,9548) açısından SONICS [34] (0,960) ve Cros Vila vd. [33] (0,941) ile rekabetçi bir konuma ulaşırken, uçtan-uca aküstiğe dayalı topluluk tasarımının yorumlanabilirlik ve düşük varyans açısından ek avantajlar sağladığını ortaya koymaktadır. </w:t>
+      <w:pPr>
+        <w:jc w:val="left"/>
+      </w:pPr>
+      <w:r>
+        <w:rPr>
+          <w:rFonts w:ascii="Times New Roman" w:hAnsi="Times New Roman"/>
+          <w:b w:val="0"/>
+          <w:sz w:val="18"/>
+        </w:rPr>
+        <w:t>Tablo 7, AURIS'in doğrudan ilgili yayımlanmış çalışmalarla sayısal karşılaştırmasını sunmaktadır. ROC-AUC açısından AURIS (0,9548), Transformer tabanlı SONICS [34] (0,960) ile Li vd. [22] (0,931) arasına konumlanmaktadır. Öte yandan AURIS, yalnızca elle tasarlanmış akustik öznitelikler kullanmasına karşın SONICS'e yakın AUC elde etmekte ve ±0,0023 standart sapması ile katlar arası en düşük varyansı korumaktadır. Bu karşılaştırma, derin öğrenme altyapısı gerektirmeyen hafif bir sistemin ne ölçüde rekabetçi kalabileceğini somut olarak göstermektedir.</w:t>
       </w:r>
     </w:p>
     <w:p>
       <w:pPr>
         <w:spacing w:line="360" w:lineRule="auto"/>
         <w:ind w:firstLine="283"/>
-        <w:jc w:val="both"/>
-      </w:pPr>
-      <w:r>
-        <w:rPr>
-          <w:sz w:val="18"/>
-        </w:rPr>
-        <w:t>Spektral düzlüğün öznitelik önem sıralamasındaki baskın konumu daha geniş ses derin sahte literatürüyle [16] tutarlı ve yorumlanabilir bir bulgudur. Güncel yapay zekâ üretim sistemleri algısal kalite ölçütlerini optimize etme eğilimindedir ve bunun yan etkisi olarak insan kayıtlarınınkinden sistematik biçimde daha temiz spektrumlar üretmektedir. 1B-ESA modelinin diğer mimarilere kıyasla belirgin biçimde düşük performansı, sıralanmamış 47 boyutlu öznitelik vektörü üzerinde tek boyutlu evrişimin öğrenebileceği anlamlı bir öteleme değişmezliği bulunmamasından kaynaklanan mimari uyumsuzluğun sonucudur.</w:t>
+        <w:jc w:val="left"/>
+      </w:pPr>
+      <w:r>
+        <w:rPr>
+          <w:rFonts w:ascii="Times New Roman" w:hAnsi="Times New Roman"/>
+          <w:b w:val="0"/>
+          <w:sz w:val="18"/>
+        </w:rPr>
+        <w:t>Spectral_flatness_std'nin baskın konumu, yapay zekâ üretim sistemlerinin algısal kalite ölçütlerini optimize ederken insan kayıtlarına kıyasla daha düz ve gürültüsüz bir spektrum bırakmasından kaynaklanmaktadır [16]. Bu gözlem, derin sahte sesler için de benzer biçimde raporlanmıştır; dolayısıyla AURIS'in öznitelik seçimi alana özgü bağımsız bulgularla örtüşmektedir. 1B-ESA'nın diğerlerine göre belirgin biçimde düşük kalması ayrı bir bulgu sunmaktadır: sıralanmamış 47 boyutlu bir öznitelik vektörü üzerinde tek boyutlu evrişim anlamlı bir öteleme değişmezliği öğrenememekte, bu da mimari ile veri biçimi arasındaki uyumsuzluğu gözler önüne sermektedir.</w:t>
       </w:r>
     </w:p>
     <w:p>
@@ -9349,14 +9149,15 @@
       <w:pPr>
         <w:spacing w:line="360" w:lineRule="auto"/>
         <w:ind w:firstLine="283"/>
-        <w:jc w:val="both"/>
+        <w:jc w:val="left"/>
       </w:pPr>
       <w:r>
         <w:rPr>
           <w:rFonts w:ascii="Times New Roman" w:hAnsi="Times New Roman"/>
-          <w:sz w:val="18"/>
-        </w:rPr>
-        <w:t>Aşırı öğrenme tanılayıcı analizi (Şekil 14), tüm ağaç tabanlı modellerin eğitim ve çapraz doğrulama doğruluğu arasında 8-14 puanlık bir fark sergilediğini göstermektedir. Rastgele Orman %100,0 eğitim doğruluğuna karşı çapraz doğrulama altında %86,1 doğruluk elde etmiştir. Eğitim ve çapraz doğrulama doğruluklarının esasen örtüştüğü tek model, yalnızca 0,6 puanlık fark ile Lojistik Regresyon olmuştur.</w:t>
+          <w:b w:val="0"/>
+          <w:sz w:val="18"/>
+        </w:rPr>
+        <w:t>Aşırı öğrenme tanılayıcı analizi (Şekil 14), ağaç tabanlı modellerin tamamında eğitim ile çapraz doğrulama doğruluğu arasında 8–14 puanlık tutarlı bir açık ortaya çıkarmıştır. Rastgele Orman bu açığın en uç örneğini sunmaktadır: eğitim doğruluğu %100'e ulaşırken çapraz doğrulama altında %86,1'e gerilemektedir. Lojistik Regresyon ise 0,6 puanlık farkla modeller arasında en dengeli eğitim davranışını sergilemiştir; ancak bu denge, düşük model kapasitesinin doğal bir yansımasıdır.</w:t>
       </w:r>
     </w:p>
     <w:p>
@@ -9477,7 +9278,7 @@
           <w:b w:val="0"/>
           <w:sz w:val="18"/>
         </w:rPr>
-        <w:t>Öznitelik fazlalığı analizi sonuçları 47 özniteliğin tasarım gereği fazlalıklı bir yapıya sahip olduğunu göstermiştir. Yirmi öznitelik çiftinin |Pearson r| değeri 0,85 değerinin üzerinde ölçülmüştür (Şekil 15). Öznitelik çıkarma deneyi (Şekil 16) öznitelik sayısı N = 30 değerine ulaştığında doğruluğun plato yaptığını ortaya koymuş; sondaki 17 özniteliğin ölçülebilir bir ek doğruluk sağlamadığı tespit edilmiştir.</w:t>
+        <w:t>Öznitelik korelasyon analizi, 47 öznitelikten yirmisinin |Pearson r| &gt; 0,85 eşiğini aşan çiftler oluşturduğunu saptamıştır (Şekil 15). Tasarım gereği kabul edilen bu fazlalık, farklı akustik boyutlar arasındaki bilgi akışını artırmak için bilinçli tercih edilmiştir. Öte yandan öznitelik çıkarma deneyi (Şekil 16), N = 30'da doğruluğun platoya ulaştığını göstermekte; sondaki 17 özniteliğin performansa ölçülebilir bir katkısı bulunmamaktadır. Bu iki bulgu birlikte değerlendirildiğinde, gelecekteki bir yinelemenin 47 yerine yaklaşık 30 öznitelikle benzer doğrulukta çalışabileceği anlaşılmaktadır.</w:t>
       </w:r>
     </w:p>
     <w:p>
@@ -9791,212 +9592,18 @@
       <w:pPr>
         <w:spacing w:line="360" w:lineRule="auto"/>
         <w:ind w:firstLine="283"/>
-        <w:jc w:val="both"/>
-        <w:rPr>
-          <w:sz w:val="18"/>
-        </w:rPr>
-      </w:pPr>
-      <w:r>
-        <w:rPr>
-          <w:sz w:val="18"/>
-        </w:rPr>
-        <w:t xml:space="preserve">Makale </w:t>
-      </w:r>
-      <w:proofErr w:type="spellStart"/>
-      <w:r>
-        <w:rPr>
-          <w:sz w:val="18"/>
-        </w:rPr>
-        <w:t>metninde</w:t>
-      </w:r>
-      <w:proofErr w:type="spellEnd"/>
-      <w:r>
-        <w:rPr>
-          <w:sz w:val="18"/>
-        </w:rPr>
-        <w:t xml:space="preserve">, </w:t>
-      </w:r>
-      <w:proofErr w:type="spellStart"/>
-      <w:r>
-        <w:rPr>
-          <w:sz w:val="18"/>
-        </w:rPr>
-        <w:t>eşitliklerde</w:t>
-      </w:r>
-      <w:proofErr w:type="spellEnd"/>
-      <w:r>
-        <w:rPr>
-          <w:sz w:val="18"/>
-        </w:rPr>
-        <w:t xml:space="preserve"> </w:t>
-      </w:r>
-      <w:proofErr w:type="spellStart"/>
-      <w:r>
-        <w:rPr>
-          <w:sz w:val="18"/>
-        </w:rPr>
-        <w:t>ve</w:t>
-      </w:r>
-      <w:proofErr w:type="spellEnd"/>
-      <w:r>
-        <w:rPr>
-          <w:sz w:val="18"/>
-        </w:rPr>
-        <w:t xml:space="preserve"> </w:t>
-      </w:r>
-      <w:proofErr w:type="spellStart"/>
-      <w:r>
-        <w:rPr>
-          <w:sz w:val="18"/>
-        </w:rPr>
-        <w:t>tanılayıcı</w:t>
-      </w:r>
-      <w:proofErr w:type="spellEnd"/>
-      <w:r>
-        <w:rPr>
-          <w:sz w:val="18"/>
-        </w:rPr>
-        <w:t xml:space="preserve"> </w:t>
-      </w:r>
-      <w:proofErr w:type="spellStart"/>
-      <w:r>
-        <w:rPr>
-          <w:sz w:val="18"/>
-        </w:rPr>
-        <w:t>analizlerde</w:t>
-      </w:r>
-      <w:proofErr w:type="spellEnd"/>
-      <w:r>
-        <w:rPr>
-          <w:sz w:val="18"/>
-        </w:rPr>
-        <w:t xml:space="preserve"> </w:t>
-      </w:r>
-      <w:proofErr w:type="spellStart"/>
-      <w:r>
-        <w:rPr>
-          <w:sz w:val="18"/>
-        </w:rPr>
-        <w:t>kullanılan</w:t>
-      </w:r>
-      <w:proofErr w:type="spellEnd"/>
-      <w:r>
-        <w:rPr>
-          <w:sz w:val="18"/>
-        </w:rPr>
-        <w:t xml:space="preserve"> </w:t>
-      </w:r>
-      <w:proofErr w:type="spellStart"/>
-      <w:r>
-        <w:rPr>
-          <w:sz w:val="18"/>
-        </w:rPr>
-        <w:t>temel</w:t>
-      </w:r>
-      <w:proofErr w:type="spellEnd"/>
-      <w:r>
-        <w:rPr>
-          <w:sz w:val="18"/>
-        </w:rPr>
-        <w:t xml:space="preserve"> </w:t>
-      </w:r>
-      <w:proofErr w:type="spellStart"/>
-      <w:r>
-        <w:rPr>
-          <w:sz w:val="18"/>
-        </w:rPr>
-        <w:t>simgeler</w:t>
-      </w:r>
-      <w:proofErr w:type="spellEnd"/>
-      <w:r>
-        <w:rPr>
-          <w:sz w:val="18"/>
-        </w:rPr>
-        <w:t xml:space="preserve"> </w:t>
-      </w:r>
-      <w:proofErr w:type="spellStart"/>
-      <w:r>
-        <w:rPr>
-          <w:sz w:val="18"/>
-        </w:rPr>
-        <w:t>ve</w:t>
-      </w:r>
-      <w:proofErr w:type="spellEnd"/>
-      <w:r>
-        <w:rPr>
-          <w:sz w:val="18"/>
-        </w:rPr>
-        <w:t xml:space="preserve"> </w:t>
-      </w:r>
-      <w:proofErr w:type="spellStart"/>
-      <w:r>
-        <w:rPr>
-          <w:sz w:val="18"/>
-        </w:rPr>
-        <w:t>açıklamaları</w:t>
-      </w:r>
-      <w:proofErr w:type="spellEnd"/>
-      <w:r>
-        <w:rPr>
-          <w:sz w:val="18"/>
-        </w:rPr>
-        <w:t xml:space="preserve"> </w:t>
-      </w:r>
-      <w:proofErr w:type="spellStart"/>
-      <w:r>
-        <w:rPr>
-          <w:sz w:val="18"/>
-        </w:rPr>
-        <w:t>aşağıda</w:t>
-      </w:r>
-      <w:proofErr w:type="spellEnd"/>
-      <w:r>
-        <w:rPr>
-          <w:sz w:val="18"/>
-        </w:rPr>
-        <w:t xml:space="preserve"> </w:t>
-      </w:r>
-      <w:proofErr w:type="spellStart"/>
-      <w:r>
-        <w:rPr>
-          <w:sz w:val="18"/>
-        </w:rPr>
-        <w:t>alfabetik</w:t>
-      </w:r>
-      <w:proofErr w:type="spellEnd"/>
-      <w:r>
-        <w:rPr>
-          <w:sz w:val="18"/>
-        </w:rPr>
-        <w:t xml:space="preserve"> </w:t>
-      </w:r>
-      <w:proofErr w:type="spellStart"/>
-      <w:r>
-        <w:rPr>
-          <w:sz w:val="18"/>
-        </w:rPr>
-        <w:t>sırayla</w:t>
-      </w:r>
-      <w:proofErr w:type="spellEnd"/>
-      <w:r>
-        <w:rPr>
-          <w:sz w:val="18"/>
-        </w:rPr>
-        <w:t xml:space="preserve"> </w:t>
-      </w:r>
-      <w:proofErr w:type="spellStart"/>
-      <w:r>
-        <w:rPr>
-          <w:sz w:val="18"/>
-        </w:rPr>
-        <w:t>sunulmuştur</w:t>
-      </w:r>
-      <w:proofErr w:type="spellEnd"/>
-      <w:r>
-        <w:rPr>
-          <w:sz w:val="18"/>
-        </w:rPr>
-        <w:t>:</w:t>
+        <w:jc w:val="left"/>
+        <w:rPr>
+          <w:sz w:val="18"/>
+        </w:rPr>
+      </w:pPr>
+      <w:r>
+        <w:rPr>
+          <w:rFonts w:ascii="Times New Roman" w:hAnsi="Times New Roman"/>
+          <w:b w:val="0"/>
+          <w:sz w:val="18"/>
+        </w:rPr>
+        <w:t>Makale metninde, eşitliklerde ve tanılayıcı analizlerde kullanılan simgeler alfabetik sırayla Tablo 6'da listelenmiştir.</w:t>
       </w:r>
     </w:p>
     <w:p>
@@ -10973,7 +10580,7 @@
           <w:b w:val="0"/>
           <w:sz w:val="18"/>
         </w:rPr>
-        <w:t>Bu çalışmada yapay zekâ tarafından üretilen müziği insan tarafından bestelenmiş kayıtlardan ayırt edebilmek için AURIS adlı uçtan-uca bir tespit sistemi önerilmiştir. Önerilen sistem 47 boyutlu elle tasarlanmış akustik öznitelik vektörünü, sekiz farklı kaynaktan derlenen 5.195 örnek üzerinde eğitilen on bir sınıflandırma modelinden oluşan bir topluluk ile birleştirmektedir. Elde edilen temel bulgular: LightGBM modeli %95,48 ortalama ROC-AUC değeri ve ±0,0023 standart sapma ile havuzdaki en başarılı modeli oluşturmuştur. Derin ÇKA %95,42 ile çok yakın bir ikinci sıra almıştır. Spektral düzlük özniteliği yapay zekâ ile insan müziği ayrımı için en bilgilendirici tek öznitelik olarak öne çıkmıştır. Tanılayıcı analiz iki önemli sınırlamayı ortaya koymuştur: tüm ağaç tabanlı modeller eğitim ile çapraz doğrulama doğrulukları arasında 8-14 puanlık bir fark sergilemekte ve 47 özniteliğin sondaki yaklaşık on yedisi ölçülebilir bir ek doğruluk sağlamamaktadır.</w:t>
+        <w:t>Bu çalışmada, yapay zekâ tarafından üretilen müziği insan kayıtlarından ayırt etmek amacıyla AURIS adlı uçtan-uca bir tespit sistemi geliştirilmiştir. Sistem, 47 boyutlu elle tasarlanmış akustik öznitelik vektörünü sekiz farklı kaynaktan derlenen 5.195 örneklik bir veri kümesinde eğitilen on bir sınıflandırıcıdan oluşan bir topluluğa bağlamaktadır. LightGBM %95,48 ROC-AUC ve ±0,0023 standart sapma ile hem en yüksek ortalamayı hem de havuzun en düşük varyansını kaydetmiştir; Derin ÇKA %95,42 ile çok yakın bir ikinci sıraya ulaşmıştır. Spectral_flatness_std, yapay zekâ-insan ayrımı için en belirleyici tek öznitelik olarak öne çıkmış ve bu sonuç bağımsız ses derin sahte literatürüyle [16] örtüşmektedir. Tanılayıcı analizler iki temel sınırlamayı gün yüzüne çıkarmıştır: ağaç tabanlı modellerde eğitim ile çapraz doğrulama arasındaki 8–14 puanlık doğruluk açığı aşırı uyum riskine işaret etmekte, sondaki 17 özniteliğin performansa ölçülebilir katkısı bulunmamaktadır. Deepfake alt kümesinde gözlenen %50 duyarlılık ise sistemin konuşma kaynaklı sahte seslere doğrudan uyarlanmadan genellenemeyeceğini açıkça ortaya koymaktadır.</w:t>
       </w:r>
     </w:p>
     <w:p>
@@ -10985,13 +10592,15 @@
       <w:pPr>
         <w:spacing w:line="360" w:lineRule="auto"/>
         <w:ind w:firstLine="283"/>
-        <w:jc w:val="both"/>
-      </w:pPr>
-      <w:r>
-        <w:rPr>
-          <w:sz w:val="18"/>
-        </w:rPr>
-        <w:t>Gelecek çalışmalar kapsamında SONICS [34] ve FakeMusicCaps [35] gibi gelişmekte olan halka açık kıyaslamalar üzerinde resmi bir üretici-modeller arası tutulan değerlendirme gerçekleştirilecektir. İnce ayar yapılmış wav2vec2 [13] modeli öznitelik tabanlı sınıflandırıcılarla doğrudan karşılaştırma için protokole entegre edilecektir. Düşmanca sağlamlık MP3 sıkıştırma, perde kaydırma ve zaman gerdirme altında açıkça değerlendirilecektir. Veri kümesi on bin örneğe doğru genişletilecek ve ortaya çıkan yeni yapay zekâ üretim sistemleri kapsama dahil edilecektir.</w:t>
+        <w:jc w:val="left"/>
+      </w:pPr>
+      <w:r>
+        <w:rPr>
+          <w:rFonts w:ascii="Times New Roman" w:hAnsi="Times New Roman"/>
+          <w:b w:val="0"/>
+          <w:sz w:val="18"/>
+        </w:rPr>
+        <w:t>Sonraki çalışmalar üç önceliği kapsamaktadır. İlk olarak SONICS [34] ve FakeMusicCaps [35] kıyaslama veri kümeleri üzerinde üretici bağımsız bir değerlendirme gerçekleştirilecek; ince ayar yapılmış wav2vec2 [13] modeli öznitelik tabanlı sınıflandırıcılarla doğrudan karşılaştırılacaktır. İkinci olarak MP3 sıkıştırma, perde kaydırma ve zaman gerdirme gibi dönüşümler karşısında sistemin sağlamlığı ölçülecektir. Son olarak veri kümesi on bin örneğe doğru genişletilecek ve yeni nesil üretici sistemler kapsama alınacaktır.</w:t>
       </w:r>
     </w:p>
     <w:p>

</xml_diff>

<commit_message>
Add final audit script for AURIS document validation and checks
</commit_message>
<xml_diff>
--- a/docs/academic/paper/deliverables/AURIS_Makale_Metni.docx
+++ b/docs/academic/paper/deliverables/AURIS_Makale_Metni.docx
@@ -1770,6 +1770,7 @@
     <w:p>
       <w:pPr>
         <w:spacing w:line="360" w:lineRule="auto"/>
+        <w:jc w:val="left"/>
         <w:rPr>
           <w:b/>
           <w:sz w:val="18"/>
@@ -1777,17 +1778,11 @@
       </w:pPr>
       <w:r>
         <w:rPr>
+          <w:rFonts w:ascii="Times New Roman" w:hAnsi="Times New Roman"/>
           <w:b/>
-          <w:sz w:val="18"/>
-        </w:rPr>
-        <w:t>Key Word</w:t>
-      </w:r>
-      <w:r>
-        <w:rPr>
-          <w:b/>
-          <w:sz w:val="18"/>
-        </w:rPr>
-        <w:t>s</w:t>
+          <w:sz w:val="20"/>
+        </w:rPr>
+        <w:t>Key Words</w:t>
       </w:r>
     </w:p>
     <w:p>
@@ -4109,7 +4104,83 @@
           <w:b w:val="0"/>
           <w:sz w:val="18"/>
         </w:rPr>
-        <w:t>Tüm modeller stratifiye 5-katlı çapraz doğrulama ile değerlendirilmiştir; StandardScaler her katta yalnızca eğitim verisi üzerinde fit edilmiş, doğrulama verisi ise yalnızca transform işlemine tabi tutulmuştur. Karar eşiği θ, varsayılan 0,5 yerine Youden J istatistiğiyle optimize edilmiştir: J(θ) = TPR(θ) − FPR(θ), Eş. 1. LightGBM için elde edilen optimal eşik θ* = 0,4316'dır. Kalibrasyon kalitesi Brier skoru (Eş. 2): BS = (1/N) Σᵢ (pᵢ − yᵢ)² ile ölçülmüştür. Derin öğrenme modelleri Adam [39] optimize edici ile eğitilmiştir; yorumlanabilirlik analizi TreeSHAP [9] algoritmasına dayandırılmıştır. Veri kümesindeki sınıf dağılımı %59,9 insan ve %40,1 yapay zekâ olarak gerçekleşmiştir. Makine öğrenmesi modellerinde class_weight="balanced", ağaç artırma modellerinde is_unbalance=True parametresi kullanılarak bu dengesizlik giderilmiştir; stratifiye örnekleme her katta sınıf oranını korumuştur.</w:t>
+        <w:t>Tüm modeller stratifiye 5-katlı çapraz doğrulama ile değerlendirilmiştir; StandardScaler her katta yalnızca eğitim verisi üzerinde fit edilmiş, doğrulama verisi ise yalnızca transform işlemine tabi tutulmuştur. Karar eşiği θ, varsayılan 0,5 yerine Youden J istatistiğiyle optimize edilmiştir (Eş. 1):</w:t>
+      </w:r>
+    </w:p>
+    <w:p>
+      <w:pPr>
+        <w:jc w:val="left"/>
+      </w:pPr>
+    </w:p>
+    <w:p>
+      <w:pPr>
+        <w:jc w:val="left"/>
+      </w:pPr>
+      <w:r>
+        <w:rPr>
+          <w:rFonts w:ascii="Times New Roman" w:hAnsi="Times New Roman"/>
+          <w:b w:val="0"/>
+          <w:i w:val="0"/>
+          <w:sz w:val="18"/>
+        </w:rPr>
+        <w:t>J(θ) = TPR(θ) − FPR(θ)                                                    (1)</w:t>
+      </w:r>
+    </w:p>
+    <w:p>
+      <w:pPr>
+        <w:jc w:val="left"/>
+      </w:pPr>
+    </w:p>
+    <w:p>
+      <w:pPr>
+        <w:jc w:val="left"/>
+      </w:pPr>
+      <w:r>
+        <w:rPr>
+          <w:rFonts w:ascii="Times New Roman" w:hAnsi="Times New Roman"/>
+          <w:b w:val="0"/>
+          <w:i w:val="0"/>
+          <w:sz w:val="18"/>
+        </w:rPr>
+        <w:t>LightGBM için elde edilen optimal eşik θ* = 0,4316'dır. Kalibrasyon kalitesi Brier skoru (Eş. 2) ile ölçülmüştür:</w:t>
+      </w:r>
+    </w:p>
+    <w:p>
+      <w:pPr>
+        <w:jc w:val="left"/>
+      </w:pPr>
+    </w:p>
+    <w:p>
+      <w:pPr>
+        <w:jc w:val="left"/>
+      </w:pPr>
+      <w:r>
+        <w:rPr>
+          <w:rFonts w:ascii="Times New Roman" w:hAnsi="Times New Roman"/>
+          <w:b w:val="0"/>
+          <w:i w:val="0"/>
+          <w:sz w:val="18"/>
+        </w:rPr>
+        <w:t>BS = (1/N) Σᵢ (pᵢ − yᵢ)²                                                  (2)</w:t>
+      </w:r>
+    </w:p>
+    <w:p>
+      <w:pPr>
+        <w:jc w:val="left"/>
+      </w:pPr>
+    </w:p>
+    <w:p>
+      <w:pPr>
+        <w:jc w:val="left"/>
+      </w:pPr>
+      <w:r>
+        <w:rPr>
+          <w:rFonts w:ascii="Times New Roman" w:hAnsi="Times New Roman"/>
+          <w:b w:val="0"/>
+          <w:i w:val="0"/>
+          <w:sz w:val="18"/>
+        </w:rPr>
+        <w:t>Derin öğrenme modelleri Adam [39] optimize edici ile eğitilmiştir; yorumlanabilirlik analizi TreeSHAP [9] algoritmasına dayandırılmıştır. Veri kümesindeki sınıf dağılımı %59,9 insan ve %40,1 yapay zekâ olarak gerçekleşmiştir. Makine öğrenmesi modellerinde class_weight="balanced", ağaç artırma modellerinde is_unbalance=True parametresi kullanılarak bu dengesizlik giderilmiştir; stratifiye örnekleme her katta sınıf oranını korumuştur.</w:t>
       </w:r>
     </w:p>
     <w:p>
@@ -11214,9 +11285,10 @@
       </w:pPr>
       <w:r>
         <w:rPr>
-          <w:sz w:val="18"/>
-        </w:rPr>
-        <w:t>29. Özbalcı M.C., Şahin H., Bilgin T.T., Classification of Music Genres of GTZAN Dataset with Machine Learning Methods, Mühendislik Bilimleri ve Araştırmaları Dergisi, 6 (1), 2024.</w:t>
+          <w:rFonts w:ascii="Times New Roman" w:hAnsi="Times New Roman"/>
+          <w:sz w:val="18"/>
+        </w:rPr>
+        <w:t>29. Özbalcı M.C., Şahin H., Bilgin T.T., Classification of Music Genres of GTZAN Dataset with Machine Learning Methods, Mühendislik Bilimleri ve Araştırmaları Dergisi (J. Eng. Sci. Res.), 6 (1), 2024.</w:t>
       </w:r>
     </w:p>
     <w:p>

</xml_diff>

<commit_message>
Remove unnecessary blank line in AURIS document
</commit_message>
<xml_diff>
--- a/docs/academic/paper/deliverables/AURIS_Makale_Metni.docx
+++ b/docs/academic/paper/deliverables/AURIS_Makale_Metni.docx
@@ -1625,15 +1625,12 @@
       <w:pPr>
         <w:spacing w:line="360" w:lineRule="auto"/>
         <w:ind w:firstLine="283"/>
-        <w:jc w:val="left"/>
-        <w:rPr>
-          <w:sz w:val="18"/>
-        </w:rPr>
-      </w:pPr>
-      <w:r>
-        <w:rPr>
-          <w:rFonts w:ascii="Times New Roman" w:hAnsi="Times New Roman"/>
-          <w:b w:val="0"/>
+        <w:rPr>
+          <w:sz w:val="18"/>
+        </w:rPr>
+      </w:pPr>
+      <w:r>
+        <w:rPr>
           <w:sz w:val="18"/>
         </w:rPr>
         <w:t>Suno, Udio ve MusicGen gibi metinden müziğe üretim sistemlerinin yaygınlaşması, üretilen parçaların insan kayıtlarından ayırt edilmesini somut bir tespit problemi hâline getirmiştir. Bu çalışmada, 47 boyutlu akustik öznitelik vektörü ile yedi makine öğrenmesi ve dört derin öğrenme algoritmasından oluşan on bir modelli bir topluluk yaklaşımını birleştiren AURIS sistemi önerilmektedir. Modeller, sekiz farklı yapay zekâ üretici kaynağından ve birden çok insan veri kümesinden derlenen 5.195 örneklik bir veri kümesi üzerinde 5-katlı çapraz doğrulama ile değerlendirilmiştir. LightGBM, %95,48 ROC-AUC ve ±0,0023 standart sapma ile hem en yüksek ortalamayı hem de havuzdaki en düşük varyansı elde etmiştir. Spektral düzlük standart sapması öznitelik önem analizinde birinci sıraya yerleşmiştir. Youden J kriteri ile belirlenen θ* = 0,4316 karar eşiği varsayılan 0,5 değerine kıyasla dengeli doğruluğu iyileştirmiş; 0,083 Brier skoru olasılık çıktılarının iyi kalibre olduğunu ortaya koymuştur.</w:t>
@@ -1770,7 +1767,6 @@
     <w:p>
       <w:pPr>
         <w:spacing w:line="360" w:lineRule="auto"/>
-        <w:jc w:val="left"/>
         <w:rPr>
           <w:b/>
           <w:sz w:val="18"/>
@@ -1778,7 +1774,6 @@
       </w:pPr>
       <w:r>
         <w:rPr>
-          <w:rFonts w:ascii="Times New Roman" w:hAnsi="Times New Roman"/>
           <w:b/>
           <w:sz w:val="20"/>
         </w:rPr>
@@ -1895,12 +1890,9 @@
       <w:pPr>
         <w:spacing w:line="360" w:lineRule="auto"/>
         <w:ind w:firstLine="283"/>
-        <w:jc w:val="left"/>
-      </w:pPr>
-      <w:r>
-        <w:rPr>
-          <w:rFonts w:ascii="Times New Roman" w:hAnsi="Times New Roman"/>
-          <w:b w:val="0"/>
+      </w:pPr>
+      <w:r>
+        <w:rPr>
           <w:sz w:val="18"/>
         </w:rPr>
         <w:t>Bu çalışmada önerilen AURIS sistemi, tek bir temsile bağlı kalmak yerine spektral, zamansal, harmonik ve vokal davranışı özetleyen 47 boyutlu elle tasarlanmış bir öznitelik vektörünü kasıtlı biçimde heterojen on bir sınıflandırıcıdan oluşan bir topluluğa bağlamaktadır. Suno, Udio, MusicGen, AudioLDM2 ve dört başka üretici dahil sekiz GenAI kaynağından ve birden çok insan veri kümesinden (GTZAN, FMA Small, SleepyJesse kapakları) derlenen 5.195 örneklik veri kümesi üzerinde yedi makine öğrenmesi algoritması (Lojistik Regresyon, Rastgele Orman, Gradyan Artırma, SVM, ÇKA, XGBoost [7] ve LightGBM [8]) ile dört derin öğrenme mimarisi ortak bir protokol altında karşılaştırılmıştır. LightGBM %95,48 ROC-AUC ile en başarılı modeli oluşturmuş; SHAP [9] tabanlı yorumlanabilirlik analizi hangi akustik özelliklerin kararı yönlendirdiğini sayısal olarak ortaya koymuştur.</w:t>
@@ -1927,12 +1919,8 @@
     </w:p>
     <w:p/>
     <w:p>
-      <w:pPr>
-        <w:jc w:val="left"/>
-      </w:pPr>
-      <w:r>
-        <w:rPr>
-          <w:rFonts w:ascii="Times New Roman" w:hAnsi="Times New Roman"/>
+      <w:r>
+        <w:rPr>
           <w:sz w:val="18"/>
         </w:rPr>
         <w:t>Konuşma için ses derin sahte tespiti, GenAI müzik tespiti çalışmaları açısından doğrudan örnek alınan en olgun komşu alanı oluşturmaktadır. Yi vd. tarafından düzenlenen ADD 2022 yarışmasında [3] bu alan resmî biçimde bir topluluk değerlendirme problemi olarak kurulmuştur. Frank ve Schönherr tarafından geliştirilen WaveFake [4] veri kümesi, vokoder-spesifik artefaktların tespitinin sistematik biçimde incelenmesi için altyapı oluşturmuştur. Uçtan-uca ham dalga biçimi işleyen derin öğrenme mimarileri bu alanda öne çıkmış; Jung vd. [10] grafik dikkat ağlarını spektral ve zamansal özniteliklerle bütünleştiren AASIST sistemini geliştirmiş, Tak vd. [11] ise ham ses sinyalinden doğrudan sınıflandırma yapan RawNet2 mimarisini önermiştir. Martín-Doñas ve Álvarez tarafından öne sürülen Vicomtech sistemi [12], önceden eğitilmiş wav2vec2 [13] öznitelik çıkarıcısının üzerine bir sınıflandırma başlığı yerleştirerek ADD 2022'de güçlü performans elde etmiştir. Kendi kendini denetimli ön eğitim yaklaşımları da bu alanda etkin biçimde kullanılmakta; Hsu vd. [14] tarafından geliştirilen HuBERT ve Chen vd. [15] tarafından önerilen WavLM, ses görevleri için sağlam temsil altyapısı sunmaktadır. Zhang vd. [16] tarafından yürütülen kapsamlı tarama çalışması, alanın teknik ve etik boyutlarını ayrıntılı biçimde özetlemiştir. Wang vd. [17] tarafından derlenen ASVspoof 2019 veri kümesi sentetik, dönüştürülmüş ve yeniden oynatılmış ses içeren geniş ölçekli bir referans kıyaslama oluşturmaktadır. Yi vd. [18] sahne sahte ses tespiti için SceneFake veri kümesini, Rabhi vd. [19] ise tespit sistemlerine yönelik düşmanca saldırıları ve karşı önlemleri ayrıntılı biçimde ele almıştır. Kawa vd. [20], Whisper tabanlı ön eğitimli temsillerin ses derin sahte tespitindeki etkinliğini göstermiştir. Müller vd. [21] ise farklı veri kümelerinde eğitilen modellerin alan genellemesi sınırlamalarını sistematik biçimde raporlamıştır. Yakın tarihli bir çalışmada Li vd. [22], makine tarafından üretilen müziğin yorumlanabilir akustik özniteliklerle tespitini ele almış ve bu alandaki metodolojik boşlukları sistematik biçimde değerlendirmiştir.</w:t>
@@ -2038,15 +2026,12 @@
       <w:pPr>
         <w:spacing w:line="360" w:lineRule="auto"/>
         <w:ind w:firstLine="283"/>
-        <w:jc w:val="left"/>
-        <w:rPr>
-          <w:sz w:val="18"/>
-        </w:rPr>
-      </w:pPr>
-      <w:r>
-        <w:rPr>
-          <w:rFonts w:ascii="Times New Roman" w:hAnsi="Times New Roman"/>
-          <w:b w:val="0"/>
+        <w:rPr>
+          <w:sz w:val="18"/>
+        </w:rPr>
+      </w:pPr>
+      <w:r>
+        <w:rPr>
           <w:sz w:val="18"/>
         </w:rPr>
         <w:t>AURIS sisteminin veri kümesi, öznitelik çıkarma süreci, sınıflandırma modelleri ve eğitim protokolü aşağıda sırasıyla aktarılmaktadır. Sistemin uçtan-uca işleyişine genel bir bakış Şekil 1'de sunulmuştur.</w:t>
@@ -2069,8 +2054,8 @@
           <w:noProof/>
         </w:rPr>
         <w:drawing>
-          <wp:inline distT="0" distB="0" distL="0" distR="0" wp14:anchorId="63BF18DE" wp14:editId="2FA200BC">
-            <wp:extent cx="5400000" cy="1046762"/>
+          <wp:inline distT="0" distB="0" distL="0" distR="0" wp14:anchorId="63BF18DE" wp14:editId="47DDEEE5">
+            <wp:extent cx="5400000" cy="1045849"/>
             <wp:effectExtent l="0" t="0" r="0" b="0"/>
             <wp:docPr id="2" name="Picture 2"/>
             <wp:cNvGraphicFramePr>
@@ -2098,7 +2083,7 @@
                   <pic:spPr>
                     <a:xfrm>
                       <a:off x="0" y="0"/>
-                      <a:ext cx="5400000" cy="1046762"/>
+                      <a:ext cx="5400000" cy="1045849"/>
                     </a:xfrm>
                     <a:prstGeom prst="rect">
                       <a:avLst/>
@@ -2140,7 +2125,6 @@
       </w:pPr>
       <w:r>
         <w:rPr>
-          <w:rFonts w:ascii="Times New Roman" w:hAnsi="Times New Roman"/>
           <w:b/>
           <w:sz w:val="20"/>
         </w:rPr>
@@ -3175,7 +3159,6 @@
       </w:pPr>
       <w:r>
         <w:rPr>
-          <w:rFonts w:ascii="Times New Roman" w:hAnsi="Times New Roman"/>
           <w:b/>
           <w:sz w:val="20"/>
         </w:rPr>
@@ -3191,14 +3174,12 @@
       <w:pPr>
         <w:spacing w:line="360" w:lineRule="auto"/>
         <w:ind w:firstLine="283"/>
-        <w:jc w:val="left"/>
-      </w:pPr>
-      <w:r>
-        <w:rPr>
-          <w:rFonts w:ascii="Times New Roman" w:hAnsi="Times New Roman"/>
-          <w:b w:val="0"/>
-          <w:sz w:val="18"/>
-        </w:rPr>
+      </w:pPr>
+      <w:r>
+        <w:rPr>
+          <w:sz w:val="18"/>
+        </w:rPr>
+        <w:lastRenderedPageBreak/>
         <w:t>Her ses parçası 22.050 Hz örnekleme hızında yeniden örneklenmiş ve librosa [37] kütüphanesi kullanılarak 47 boyutlu bir öznitelik vektörüne dönüştürülmüştür. Öznitelikler beş işlevsel aileye ayrılmıştır: spektral (16 öznitelik — MFCC, mel-spektrogram, spectral centroid, bandwidth, rolloff, flatness ve bunların delta istatistikleri), zamansal (10 öznitelik — RMS enerjisi, sıfır geçiş hızı ve dinamik aralık türevleri), ritmik (9 öznitelik — tempo, beat sayısı ve onset gücü istatistikleri), harmonik (8 öznitelik — chroma vektörü ve harmonik-algısal ayrıştırma bileşenleri) ve vokal (4 öznitelik — temel frekans istatistikleri). Beş farklı modaliteyi kapsaması, herhangi bir akustik temsile karşı aşırı uyumu sınırlamayı amaçlayan tasarım kararının temelini oluşturmaktadır. İlk sekiz öznitelik için insan ve yapay zekâ örneklerinin dağılımları Şekil 2'de karşılaştırılmıştır.</w:t>
       </w:r>
     </w:p>
@@ -3217,8 +3198,8 @@
           <w:noProof/>
         </w:rPr>
         <w:drawing>
-          <wp:inline distT="0" distB="0" distL="0" distR="0" wp14:anchorId="23387283" wp14:editId="4E5CDDB0">
-            <wp:extent cx="5399998" cy="2922592"/>
+          <wp:inline distT="0" distB="0" distL="0" distR="0" wp14:anchorId="23387283" wp14:editId="3D67881F">
+            <wp:extent cx="5399998" cy="2921060"/>
             <wp:effectExtent l="0" t="0" r="0" b="0"/>
             <wp:docPr id="3" name="Picture 3"/>
             <wp:cNvGraphicFramePr>
@@ -3246,7 +3227,7 @@
                   <pic:spPr>
                     <a:xfrm>
                       <a:off x="0" y="0"/>
-                      <a:ext cx="5399998" cy="2922592"/>
+                      <a:ext cx="5399998" cy="2921060"/>
                     </a:xfrm>
                     <a:prstGeom prst="rect">
                       <a:avLst/>
@@ -3289,7 +3270,6 @@
       </w:pPr>
       <w:r>
         <w:rPr>
-          <w:rFonts w:ascii="Times New Roman" w:hAnsi="Times New Roman"/>
           <w:b/>
           <w:sz w:val="20"/>
         </w:rPr>
@@ -3305,12 +3285,9 @@
       <w:pPr>
         <w:spacing w:line="360" w:lineRule="auto"/>
         <w:ind w:firstLine="283"/>
-        <w:jc w:val="left"/>
-      </w:pPr>
-      <w:r>
-        <w:rPr>
-          <w:rFonts w:ascii="Times New Roman" w:hAnsi="Times New Roman"/>
-          <w:b w:val="0"/>
+      </w:pPr>
+      <w:r>
+        <w:rPr>
           <w:sz w:val="18"/>
         </w:rPr>
         <w:t>On bir sınıflandırma modeli ortak bir 5-katlı çapraz doğrulama protokolü altında test edilmiştir. Yedi makine öğrenmesi modeli scikit-learn [38] kütüphanesi ile hayata geçirilmiştir: Lojistik Regresyon, Rastgele Orman, Gradyan Artırma, SVM-RBF, Çok Katmanlı Algılayıcı (ÇKA), XGBoost [7] ve LightGBM [8]. Dört derin öğrenme mimarisi ise PyTorch çerçevesinde geliştirilmiştir: Derin ÇKA, 1B-Evrişimli Sinir Ağı (1B-ESA), Artık ÇKA ve Dikkat ÇKA. Temel hiperparametreler Tablo 2'de listelenmiştir.</w:t>
@@ -3330,13 +3307,7 @@
         <w:rPr>
           <w:sz w:val="18"/>
         </w:rPr>
-        <w:t xml:space="preserve">Tablo 2. </w:t>
-      </w:r>
-      <w:r>
-        <w:rPr>
-          <w:sz w:val="18"/>
-        </w:rPr>
-        <w:t xml:space="preserve">Modellerin temel hiperparametreleri </w:t>
+        <w:t xml:space="preserve">Tablo 2. Modellerin temel hiperparametreleri </w:t>
       </w:r>
       <w:r>
         <w:rPr>
@@ -3369,9 +3340,15 @@
             <w:pPr>
               <w:spacing w:line="360" w:lineRule="auto"/>
               <w:jc w:val="center"/>
-            </w:pPr>
-            <w:r>
-              <w:rPr>
+              <w:rPr>
+                <w:b w:val="0"/>
+                <w:bCs w:val="0"/>
+              </w:rPr>
+            </w:pPr>
+            <w:r>
+              <w:rPr>
+                <w:b w:val="0"/>
+                <w:bCs w:val="0"/>
                 <w:sz w:val="18"/>
               </w:rPr>
               <w:t>Model</w:t>
@@ -3387,9 +3364,15 @@
               <w:spacing w:line="360" w:lineRule="auto"/>
               <w:jc w:val="center"/>
               <w:cnfStyle w:val="100000000000" w:firstRow="1" w:lastRow="0" w:firstColumn="0" w:lastColumn="0" w:oddVBand="0" w:evenVBand="0" w:oddHBand="0" w:evenHBand="0" w:firstRowFirstColumn="0" w:firstRowLastColumn="0" w:lastRowFirstColumn="0" w:lastRowLastColumn="0"/>
-            </w:pPr>
-            <w:r>
-              <w:rPr>
+              <w:rPr>
+                <w:b w:val="0"/>
+                <w:bCs w:val="0"/>
+              </w:rPr>
+            </w:pPr>
+            <w:r>
+              <w:rPr>
+                <w:b w:val="0"/>
+                <w:bCs w:val="0"/>
                 <w:sz w:val="18"/>
               </w:rPr>
               <w:t>Tip</w:t>
@@ -3405,9 +3388,15 @@
               <w:spacing w:line="360" w:lineRule="auto"/>
               <w:jc w:val="center"/>
               <w:cnfStyle w:val="100000000000" w:firstRow="1" w:lastRow="0" w:firstColumn="0" w:lastColumn="0" w:oddVBand="0" w:evenVBand="0" w:oddHBand="0" w:evenHBand="0" w:firstRowFirstColumn="0" w:firstRowLastColumn="0" w:lastRowFirstColumn="0" w:lastRowLastColumn="0"/>
-            </w:pPr>
-            <w:r>
-              <w:rPr>
+              <w:rPr>
+                <w:b w:val="0"/>
+                <w:bCs w:val="0"/>
+              </w:rPr>
+            </w:pPr>
+            <w:r>
+              <w:rPr>
+                <w:b w:val="0"/>
+                <w:bCs w:val="0"/>
                 <w:sz w:val="18"/>
               </w:rPr>
               <w:t>Temel Hiperparametreler</w:t>
@@ -3428,9 +3417,15 @@
             <w:pPr>
               <w:spacing w:line="360" w:lineRule="auto"/>
               <w:jc w:val="center"/>
-            </w:pPr>
-            <w:r>
-              <w:rPr>
+              <w:rPr>
+                <w:b w:val="0"/>
+                <w:bCs w:val="0"/>
+              </w:rPr>
+            </w:pPr>
+            <w:r>
+              <w:rPr>
+                <w:b w:val="0"/>
+                <w:bCs w:val="0"/>
                 <w:sz w:val="18"/>
               </w:rPr>
               <w:t>Lojistik Regresyon</w:t>
@@ -3484,9 +3479,15 @@
             <w:pPr>
               <w:spacing w:line="360" w:lineRule="auto"/>
               <w:jc w:val="center"/>
-            </w:pPr>
-            <w:r>
-              <w:rPr>
+              <w:rPr>
+                <w:b w:val="0"/>
+                <w:bCs w:val="0"/>
+              </w:rPr>
+            </w:pPr>
+            <w:r>
+              <w:rPr>
+                <w:b w:val="0"/>
+                <w:bCs w:val="0"/>
                 <w:sz w:val="18"/>
               </w:rPr>
               <w:t>Rastgele Orman</w:t>
@@ -3543,9 +3544,15 @@
             <w:pPr>
               <w:spacing w:line="360" w:lineRule="auto"/>
               <w:jc w:val="center"/>
-            </w:pPr>
-            <w:r>
-              <w:rPr>
+              <w:rPr>
+                <w:b w:val="0"/>
+                <w:bCs w:val="0"/>
+              </w:rPr>
+            </w:pPr>
+            <w:r>
+              <w:rPr>
+                <w:b w:val="0"/>
+                <w:bCs w:val="0"/>
                 <w:sz w:val="18"/>
               </w:rPr>
               <w:t>Gradyan Artırma</w:t>
@@ -3599,11 +3606,18 @@
             <w:pPr>
               <w:spacing w:line="360" w:lineRule="auto"/>
               <w:jc w:val="center"/>
-            </w:pPr>
-            <w:r>
-              <w:rPr>
-                <w:sz w:val="18"/>
-              </w:rPr>
+              <w:rPr>
+                <w:b w:val="0"/>
+                <w:bCs w:val="0"/>
+              </w:rPr>
+            </w:pPr>
+            <w:r>
+              <w:rPr>
+                <w:b w:val="0"/>
+                <w:bCs w:val="0"/>
+                <w:sz w:val="18"/>
+              </w:rPr>
+              <w:lastRenderedPageBreak/>
               <w:t>SVM-RBF</w:t>
             </w:r>
           </w:p>
@@ -3658,9 +3672,15 @@
             <w:pPr>
               <w:spacing w:line="360" w:lineRule="auto"/>
               <w:jc w:val="center"/>
-            </w:pPr>
-            <w:r>
-              <w:rPr>
+              <w:rPr>
+                <w:b w:val="0"/>
+                <w:bCs w:val="0"/>
+              </w:rPr>
+            </w:pPr>
+            <w:r>
+              <w:rPr>
+                <w:b w:val="0"/>
+                <w:bCs w:val="0"/>
                 <w:sz w:val="18"/>
               </w:rPr>
               <w:t>ÇKA Sinir Ağı</w:t>
@@ -3714,9 +3734,15 @@
             <w:pPr>
               <w:spacing w:line="360" w:lineRule="auto"/>
               <w:jc w:val="center"/>
-            </w:pPr>
-            <w:r>
-              <w:rPr>
+              <w:rPr>
+                <w:b w:val="0"/>
+                <w:bCs w:val="0"/>
+              </w:rPr>
+            </w:pPr>
+            <w:r>
+              <w:rPr>
+                <w:b w:val="0"/>
+                <w:bCs w:val="0"/>
                 <w:sz w:val="18"/>
               </w:rPr>
               <w:t>XGBoost</w:t>
@@ -3773,12 +3799,17 @@
             <w:pPr>
               <w:spacing w:line="360" w:lineRule="auto"/>
               <w:jc w:val="center"/>
-            </w:pPr>
-            <w:r>
-              <w:rPr>
-                <w:sz w:val="18"/>
-              </w:rPr>
-              <w:lastRenderedPageBreak/>
+              <w:rPr>
+                <w:b w:val="0"/>
+                <w:bCs w:val="0"/>
+              </w:rPr>
+            </w:pPr>
+            <w:r>
+              <w:rPr>
+                <w:b w:val="0"/>
+                <w:bCs w:val="0"/>
+                <w:sz w:val="18"/>
+              </w:rPr>
               <w:t>LightGBM</w:t>
             </w:r>
           </w:p>
@@ -3830,9 +3861,15 @@
             <w:pPr>
               <w:spacing w:line="360" w:lineRule="auto"/>
               <w:jc w:val="center"/>
-            </w:pPr>
-            <w:r>
-              <w:rPr>
+              <w:rPr>
+                <w:b w:val="0"/>
+                <w:bCs w:val="0"/>
+              </w:rPr>
+            </w:pPr>
+            <w:r>
+              <w:rPr>
+                <w:b w:val="0"/>
+                <w:bCs w:val="0"/>
                 <w:sz w:val="18"/>
               </w:rPr>
               <w:t>Derin ÇKA</w:t>
@@ -3889,9 +3926,15 @@
             <w:pPr>
               <w:spacing w:line="360" w:lineRule="auto"/>
               <w:jc w:val="center"/>
-            </w:pPr>
-            <w:r>
-              <w:rPr>
+              <w:rPr>
+                <w:b w:val="0"/>
+                <w:bCs w:val="0"/>
+              </w:rPr>
+            </w:pPr>
+            <w:r>
+              <w:rPr>
+                <w:b w:val="0"/>
+                <w:bCs w:val="0"/>
                 <w:sz w:val="18"/>
               </w:rPr>
               <w:t>1B-ESA</w:t>
@@ -3945,9 +3988,15 @@
             <w:pPr>
               <w:spacing w:line="360" w:lineRule="auto"/>
               <w:jc w:val="center"/>
-            </w:pPr>
-            <w:r>
-              <w:rPr>
+              <w:rPr>
+                <w:b w:val="0"/>
+                <w:bCs w:val="0"/>
+              </w:rPr>
+            </w:pPr>
+            <w:r>
+              <w:rPr>
+                <w:b w:val="0"/>
+                <w:bCs w:val="0"/>
                 <w:sz w:val="18"/>
               </w:rPr>
               <w:t>Artık ÇKA</w:t>
@@ -4004,9 +4053,15 @@
             <w:pPr>
               <w:spacing w:line="360" w:lineRule="auto"/>
               <w:jc w:val="center"/>
-            </w:pPr>
-            <w:r>
-              <w:rPr>
+              <w:rPr>
+                <w:b w:val="0"/>
+                <w:bCs w:val="0"/>
+              </w:rPr>
+            </w:pPr>
+            <w:r>
+              <w:rPr>
+                <w:b w:val="0"/>
+                <w:bCs w:val="0"/>
                 <w:sz w:val="18"/>
               </w:rPr>
               <w:t>Dikkat ÇKA</w:t>
@@ -4080,7 +4135,6 @@
       </w:pPr>
       <w:r>
         <w:rPr>
-          <w:rFonts w:ascii="Times New Roman" w:hAnsi="Times New Roman"/>
           <w:b/>
           <w:sz w:val="20"/>
         </w:rPr>
@@ -4096,88 +4150,45 @@
       <w:pPr>
         <w:spacing w:line="360" w:lineRule="auto"/>
         <w:ind w:firstLine="283"/>
-        <w:jc w:val="left"/>
-      </w:pPr>
-      <w:r>
-        <w:rPr>
-          <w:rFonts w:ascii="Times New Roman" w:hAnsi="Times New Roman"/>
-          <w:b w:val="0"/>
+      </w:pPr>
+      <w:r>
+        <w:rPr>
           <w:sz w:val="18"/>
         </w:rPr>
         <w:t>Tüm modeller stratifiye 5-katlı çapraz doğrulama ile değerlendirilmiştir; StandardScaler her katta yalnızca eğitim verisi üzerinde fit edilmiş, doğrulama verisi ise yalnızca transform işlemine tabi tutulmuştur. Karar eşiği θ, varsayılan 0,5 yerine Youden J istatistiğiyle optimize edilmiştir (Eş. 1):</w:t>
       </w:r>
     </w:p>
-    <w:p>
-      <w:pPr>
-        <w:jc w:val="left"/>
-      </w:pPr>
-    </w:p>
-    <w:p>
-      <w:pPr>
-        <w:jc w:val="left"/>
-      </w:pPr>
-      <w:r>
-        <w:rPr>
-          <w:rFonts w:ascii="Times New Roman" w:hAnsi="Times New Roman"/>
-          <w:b w:val="0"/>
-          <w:i w:val="0"/>
+    <w:p/>
+    <w:p>
+      <w:r>
+        <w:rPr>
           <w:sz w:val="18"/>
         </w:rPr>
         <w:t>J(θ) = TPR(θ) − FPR(θ)                                                    (1)</w:t>
       </w:r>
     </w:p>
-    <w:p>
-      <w:pPr>
-        <w:jc w:val="left"/>
-      </w:pPr>
-    </w:p>
-    <w:p>
-      <w:pPr>
-        <w:jc w:val="left"/>
-      </w:pPr>
-      <w:r>
-        <w:rPr>
-          <w:rFonts w:ascii="Times New Roman" w:hAnsi="Times New Roman"/>
-          <w:b w:val="0"/>
-          <w:i w:val="0"/>
+    <w:p/>
+    <w:p>
+      <w:r>
+        <w:rPr>
           <w:sz w:val="18"/>
         </w:rPr>
         <w:t>LightGBM için elde edilen optimal eşik θ* = 0,4316'dır. Kalibrasyon kalitesi Brier skoru (Eş. 2) ile ölçülmüştür:</w:t>
       </w:r>
     </w:p>
-    <w:p>
-      <w:pPr>
-        <w:jc w:val="left"/>
-      </w:pPr>
-    </w:p>
-    <w:p>
-      <w:pPr>
-        <w:jc w:val="left"/>
-      </w:pPr>
-      <w:r>
-        <w:rPr>
-          <w:rFonts w:ascii="Times New Roman" w:hAnsi="Times New Roman"/>
-          <w:b w:val="0"/>
-          <w:i w:val="0"/>
+    <w:p/>
+    <w:p>
+      <w:r>
+        <w:rPr>
           <w:sz w:val="18"/>
         </w:rPr>
         <w:t>BS = (1/N) Σᵢ (pᵢ − yᵢ)²                                                  (2)</w:t>
       </w:r>
     </w:p>
-    <w:p>
-      <w:pPr>
-        <w:jc w:val="left"/>
-      </w:pPr>
-    </w:p>
-    <w:p>
-      <w:pPr>
-        <w:jc w:val="left"/>
-      </w:pPr>
-      <w:r>
-        <w:rPr>
-          <w:rFonts w:ascii="Times New Roman" w:hAnsi="Times New Roman"/>
-          <w:b w:val="0"/>
-          <w:i w:val="0"/>
+    <w:p/>
+    <w:p>
+      <w:r>
+        <w:rPr>
           <w:sz w:val="18"/>
         </w:rPr>
         <w:t>Derin öğrenme modelleri Adam [39] optimize edici ile eğitilmiştir; yorumlanabilirlik analizi TreeSHAP [9] algoritmasına dayandırılmıştır. Veri kümesindeki sınıf dağılımı %59,9 insan ve %40,1 yapay zekâ olarak gerçekleşmiştir. Makine öğrenmesi modellerinde class_weight="balanced", ağaç artırma modellerinde is_unbalance=True parametresi kullanılarak bu dengesizlik giderilmiştir; stratifiye örnekleme her katta sınıf oranını korumuştur.</w:t>
@@ -4216,12 +4227,9 @@
       <w:pPr>
         <w:spacing w:line="360" w:lineRule="auto"/>
         <w:ind w:firstLine="283"/>
-        <w:jc w:val="left"/>
-      </w:pPr>
-      <w:r>
-        <w:rPr>
-          <w:rFonts w:ascii="Times New Roman" w:hAnsi="Times New Roman"/>
-          <w:b w:val="0"/>
+      </w:pPr>
+      <w:r>
+        <w:rPr>
           <w:sz w:val="18"/>
         </w:rPr>
         <w:t>On bir modelin 5-katlı çapraz doğrulama sonuçları ROC-AUC değerine göre Tablo 3'te sıralanmaktadır. LightGBM %95,48 ortalama ROC-AUC ve ±0,0023 standart sapma ile birinci sırada yer almaktadır; Derin ÇKA ise %95,42 ile çok yakın bir mesafede ikinci olmaktadır. 1B-ESA %85,43 ile havuzun en zayıf modeli konumundadır. Şekil 3 doğruluk, F1 ve AUC değerlerini modeller arasında görsel olarak karşılaştırmaktadır. LightGBM'in sınıf bazlı kesinlik, duyarlılık ve F1 değerleri Tablo 4'te ayrıntılı biçimde yer almaktadır.</w:t>
@@ -4691,6 +4699,7 @@
                 <w:b w:val="0"/>
                 <w:sz w:val="18"/>
               </w:rPr>
+              <w:lastRenderedPageBreak/>
               <w:t>3</w:t>
             </w:r>
           </w:p>
@@ -5735,7 +5744,6 @@
                 <w:b w:val="0"/>
                 <w:sz w:val="18"/>
               </w:rPr>
-              <w:lastRenderedPageBreak/>
               <w:t>11</w:t>
             </w:r>
           </w:p>
@@ -5865,9 +5873,9 @@
           <w:noProof/>
         </w:rPr>
         <w:drawing>
-          <wp:inline distT="0" distB="0" distL="0" distR="0" wp14:anchorId="273A9A92" wp14:editId="1138E2AE">
-            <wp:extent cx="4949703" cy="2665773"/>
-            <wp:effectExtent l="0" t="0" r="3810" b="0"/>
+          <wp:inline distT="0" distB="0" distL="0" distR="0" wp14:anchorId="273A9A92" wp14:editId="706A69BE">
+            <wp:extent cx="4949703" cy="2663504"/>
+            <wp:effectExtent l="0" t="0" r="0" b="0"/>
             <wp:docPr id="4" name="Picture 4"/>
             <wp:cNvGraphicFramePr>
               <a:graphicFrameLocks xmlns:a="http://schemas.openxmlformats.org/drawingml/2006/main" noChangeAspect="1"/>
@@ -5894,7 +5902,7 @@
                   <pic:spPr>
                     <a:xfrm>
                       <a:off x="0" y="0"/>
-                      <a:ext cx="4949703" cy="2665773"/>
+                      <a:ext cx="4949703" cy="2663504"/>
                     </a:xfrm>
                     <a:prstGeom prst="rect">
                       <a:avLst/>
@@ -6635,9 +6643,9 @@
         </w:rPr>
         <w:lastRenderedPageBreak/>
         <w:drawing>
-          <wp:inline distT="0" distB="0" distL="0" distR="0" wp14:anchorId="1076FAF4" wp14:editId="75D54159">
-            <wp:extent cx="4314553" cy="3612039"/>
-            <wp:effectExtent l="0" t="0" r="0" b="7620"/>
+          <wp:inline distT="0" distB="0" distL="0" distR="0" wp14:anchorId="1076FAF4" wp14:editId="1E34F367">
+            <wp:extent cx="4314553" cy="3610484"/>
+            <wp:effectExtent l="0" t="0" r="0" b="0"/>
             <wp:docPr id="5" name="Picture 5"/>
             <wp:cNvGraphicFramePr>
               <a:graphicFrameLocks xmlns:a="http://schemas.openxmlformats.org/drawingml/2006/main" noChangeAspect="1"/>
@@ -6664,7 +6672,7 @@
                   <pic:spPr>
                     <a:xfrm>
                       <a:off x="0" y="0"/>
-                      <a:ext cx="4314553" cy="3612039"/>
+                      <a:ext cx="4314553" cy="3610484"/>
                     </a:xfrm>
                     <a:prstGeom prst="rect">
                       <a:avLst/>
@@ -6710,12 +6718,9 @@
       <w:pPr>
         <w:spacing w:line="360" w:lineRule="auto"/>
         <w:ind w:firstLine="283"/>
-        <w:jc w:val="left"/>
-      </w:pPr>
-      <w:r>
-        <w:rPr>
-          <w:rFonts w:ascii="Times New Roman" w:hAnsi="Times New Roman"/>
-          <w:b w:val="0"/>
+      </w:pPr>
+      <w:r>
+        <w:rPr>
           <w:sz w:val="18"/>
         </w:rPr>
         <w:t>Şekil 4, yedi makine öğrenmesi modelinin ROC eğrilerini karşılaştırmaktadır; Şekil 5 ise iki aile arasındaki performans dağılımını görselleştirmektedir. Yedi makine öğrenmesi sınıflandırıcısı %92,75 ortalama ROC-AUC elde ederken dört derin öğrenme mimarisi %92,32 değerinde kalmıştır. 1B-ESA dışlandığında kalan üç DL mimarisinin ortalaması %94,62'ye yükselmektedir. Sonuç olarak 47 boyutlu öznitelik vektörü, ayırt edici bilginin büyük bölümünü ham veri işleyicilerden bağımsız biçimde kodlayabilmekte; bu durum öznitelik mühendisliğinin model kapasitesinin önüne geçtiğine işaret etmektedir.</w:t>
@@ -6736,9 +6741,9 @@
           <w:noProof/>
         </w:rPr>
         <w:drawing>
-          <wp:inline distT="0" distB="0" distL="0" distR="0" wp14:anchorId="18B1B00D" wp14:editId="6748FB15">
-            <wp:extent cx="5399999" cy="1916922"/>
-            <wp:effectExtent l="0" t="0" r="0" b="7620"/>
+          <wp:inline distT="0" distB="0" distL="0" distR="0" wp14:anchorId="18B1B00D" wp14:editId="29A79CBE">
+            <wp:extent cx="5399999" cy="1914850"/>
+            <wp:effectExtent l="0" t="0" r="0" b="9525"/>
             <wp:docPr id="6" name="Picture 6"/>
             <wp:cNvGraphicFramePr>
               <a:graphicFrameLocks xmlns:a="http://schemas.openxmlformats.org/drawingml/2006/main" noChangeAspect="1"/>
@@ -6765,7 +6770,7 @@
                   <pic:spPr>
                     <a:xfrm>
                       <a:off x="0" y="0"/>
-                      <a:ext cx="5399999" cy="1916922"/>
+                      <a:ext cx="5399999" cy="1914850"/>
                     </a:xfrm>
                     <a:prstGeom prst="rect">
                       <a:avLst/>
@@ -6811,30 +6816,31 @@
       <w:pPr>
         <w:spacing w:line="360" w:lineRule="auto"/>
         <w:ind w:firstLine="283"/>
-        <w:jc w:val="left"/>
-      </w:pPr>
-      <w:r>
-        <w:rPr>
-          <w:rFonts w:ascii="Times New Roman" w:hAnsi="Times New Roman"/>
-          <w:b w:val="0"/>
-          <w:sz w:val="18"/>
-        </w:rPr>
-        <w:t>Katlar arası kararlılık değerlendirildiğinde LightGBM ±0,0023 standart sapma ile beş katın tamamında 0,9515–0,9580 arasında seyrederek havuzun en tutarlı modeli olmuştur. XGBoost (±0,0029) ve Gradyan Artırma (±0,0038) bunu yakından izlemektedir. 1B-ESA (±0,0087) ve SVM-RBF (±0,0075) en yüksek varyansı sergileyen modeller olmuştur. Ortalama AUC sıralaması ile kararlılık sıralamasının büyük ölçüde örtüşmesi, yüksek performansın istikrarsız optimumlardan değil sağlam öznitelik temsilinden kaynaklandığını düşündürmektedir.</w:t>
+      </w:pPr>
+      <w:r>
+        <w:rPr>
+          <w:sz w:val="18"/>
+        </w:rPr>
+        <w:t xml:space="preserve">Katlar arası kararlılık değerlendirildiğinde LightGBM ±0,0023 standart sapma ile beş katın tamamında 0,9515–0,9580 arasında seyrederek havuzun en tutarlı modeli olmuştur. XGBoost (±0,0029) ve Gradyan Artırma (±0,0038) bunu yakından </w:t>
+      </w:r>
+      <w:r>
+        <w:rPr>
+          <w:sz w:val="18"/>
+        </w:rPr>
+        <w:lastRenderedPageBreak/>
+        <w:t>izlemektedir. 1B-ESA (±0,0087) ve SVM-RBF (±0,0075) en yüksek varyansı sergileyen modeller olmuştur. Ortalama AUC sıralaması ile kararlılık sıralamasının büyük ölçüde örtüşmesi, yüksek performansın istikrarsız optimumlardan değil sağlam öznitelik temsilinden kaynaklandığını düşündürmektedir.</w:t>
       </w:r>
     </w:p>
     <w:p>
       <w:pPr>
         <w:spacing w:line="360" w:lineRule="auto"/>
         <w:ind w:firstLine="283"/>
-        <w:jc w:val="left"/>
-        <w:rPr>
-          <w:sz w:val="18"/>
-        </w:rPr>
-      </w:pPr>
-      <w:r>
-        <w:rPr>
-          <w:rFonts w:ascii="Times New Roman" w:hAnsi="Times New Roman"/>
-          <w:b w:val="0"/>
+        <w:rPr>
+          <w:sz w:val="18"/>
+        </w:rPr>
+      </w:pPr>
+      <w:r>
+        <w:rPr>
           <w:sz w:val="18"/>
         </w:rPr>
         <w:t>Öznitelik önemi analizi, spectral_flatness_std özniteliğini yapay zekâ ile insan müziği ayrımında açıkça baskın konuma taşımıştır. Tablo 5 en yüksek skorlu ilk onu listelemekte, Şekil 6 yirmi özniteliğin normalize edilmiş puanlarını göstermektedir. Şekil 7'deki TreeSHAP global etki diyagramı, yüksek spectral_flatness_std değerlerinin modeli yapay zekâ sınıfına yönlendirdiğini kanıtlamaktadır; bu bulgu daha geniş ses derin sahte literatürüyle [16] örtüşmektedir.</w:t>
@@ -7559,10 +7565,11 @@
         <w:rPr>
           <w:noProof/>
         </w:rPr>
+        <w:lastRenderedPageBreak/>
         <w:drawing>
-          <wp:inline distT="0" distB="0" distL="0" distR="0" wp14:anchorId="096624B4" wp14:editId="0F81BF1B">
-            <wp:extent cx="4225310" cy="3442177"/>
-            <wp:effectExtent l="0" t="0" r="3810" b="6350"/>
+          <wp:inline distT="0" distB="0" distL="0" distR="0" wp14:anchorId="096624B4" wp14:editId="3B2F8900">
+            <wp:extent cx="4225310" cy="3441077"/>
+            <wp:effectExtent l="0" t="0" r="3810" b="6985"/>
             <wp:docPr id="8" name="Picture 8"/>
             <wp:cNvGraphicFramePr>
               <a:graphicFrameLocks xmlns:a="http://schemas.openxmlformats.org/drawingml/2006/main" noChangeAspect="1"/>
@@ -7589,7 +7596,7 @@
                   <pic:spPr>
                     <a:xfrm>
                       <a:off x="0" y="0"/>
-                      <a:ext cx="4225310" cy="3442177"/>
+                      <a:ext cx="4225310" cy="3441077"/>
                     </a:xfrm>
                     <a:prstGeom prst="rect">
                       <a:avLst/>
@@ -7643,21 +7650,7 @@
         <w:rPr>
           <w:sz w:val="16"/>
         </w:rPr>
-        <w:t>(</w:t>
-      </w:r>
-      <w:proofErr w:type="gramStart"/>
-      <w:r>
-        <w:rPr>
-          <w:sz w:val="16"/>
-        </w:rPr>
-        <w:t>Top-twenty</w:t>
-      </w:r>
-      <w:proofErr w:type="gramEnd"/>
-      <w:r>
-        <w:rPr>
-          <w:sz w:val="16"/>
-        </w:rPr>
-        <w:t xml:space="preserve"> feature importance scores.)</w:t>
+        <w:t>(Top-twenty feature importance scores.)</w:t>
       </w:r>
     </w:p>
     <w:p>
@@ -7676,8 +7669,8 @@
         </w:rPr>
         <w:lastRenderedPageBreak/>
         <w:drawing>
-          <wp:inline distT="0" distB="0" distL="0" distR="0" wp14:anchorId="03A92205" wp14:editId="6F14E428">
-            <wp:extent cx="4304895" cy="4573364"/>
+          <wp:inline distT="0" distB="0" distL="0" distR="0" wp14:anchorId="03A92205" wp14:editId="6D8C51EB">
+            <wp:extent cx="4304895" cy="4572241"/>
             <wp:effectExtent l="0" t="0" r="635" b="0"/>
             <wp:docPr id="9" name="Picture 9"/>
             <wp:cNvGraphicFramePr>
@@ -7705,7 +7698,7 @@
                   <pic:spPr>
                     <a:xfrm>
                       <a:off x="0" y="0"/>
-                      <a:ext cx="4304895" cy="4573364"/>
+                      <a:ext cx="4304895" cy="4572241"/>
                     </a:xfrm>
                     <a:prstGeom prst="rect">
                       <a:avLst/>
@@ -7771,12 +7764,9 @@
       <w:pPr>
         <w:spacing w:line="360" w:lineRule="auto"/>
         <w:ind w:firstLine="283"/>
-        <w:jc w:val="left"/>
-      </w:pPr>
-      <w:r>
-        <w:rPr>
-          <w:rFonts w:ascii="Times New Roman" w:hAnsi="Times New Roman"/>
-          <w:b w:val="0"/>
+      </w:pPr>
+      <w:r>
+        <w:rPr>
           <w:sz w:val="18"/>
         </w:rPr>
         <w:t>Şekil 8, Youden-optimal eşik θ* = 0,4316 ile elde edilen karmaşıklık matrisini göstermektedir: 2.721 doğru negatif (%87,4), 1.862 doğru pozitif (%89,4), 392 yanlış pozitif (%12,6) ve 220 yanlış negatif (%10,6). Olasılık dağılımları Şekil 9'da incelendiğinde iki sınıfın belirgin biçimde ayrıştığı, ancak 0,3–0,6 bölgesinde örtüşme bulunduğu görülmektedir. Şekil 10'daki kalibrasyon eğrisi ve 0,083 Brier skoru, modelin tahmin güven düzeylerinin gerçek doğruluğu iyi yansıttığını doğrulamaktadır. Şekil 11 kesinlik-duyarlılık eğrisini 0,934 ortalama kesinlik değeri ile sunmaktadır.</w:t>
@@ -7798,8 +7788,8 @@
         </w:rPr>
         <w:lastRenderedPageBreak/>
         <w:drawing>
-          <wp:inline distT="0" distB="0" distL="0" distR="0" wp14:anchorId="0AA79FC6" wp14:editId="009BABA7">
-            <wp:extent cx="3263483" cy="2924081"/>
+          <wp:inline distT="0" distB="0" distL="0" distR="0" wp14:anchorId="0AA79FC6" wp14:editId="44AE4B52">
+            <wp:extent cx="3263483" cy="2921842"/>
             <wp:effectExtent l="0" t="0" r="0" b="0"/>
             <wp:docPr id="10" name="Picture 10"/>
             <wp:cNvGraphicFramePr>
@@ -7827,7 +7817,7 @@
                   <pic:spPr>
                     <a:xfrm>
                       <a:off x="0" y="0"/>
-                      <a:ext cx="3263483" cy="2924081"/>
+                      <a:ext cx="3263483" cy="2921842"/>
                     </a:xfrm>
                     <a:prstGeom prst="rect">
                       <a:avLst/>
@@ -7893,9 +7883,9 @@
           <w:noProof/>
         </w:rPr>
         <w:drawing>
-          <wp:inline distT="0" distB="0" distL="0" distR="0" wp14:anchorId="03DE92D8" wp14:editId="2AAE6D16">
-            <wp:extent cx="4319999" cy="2737503"/>
-            <wp:effectExtent l="0" t="0" r="4445" b="5715"/>
+          <wp:inline distT="0" distB="0" distL="0" distR="0" wp14:anchorId="03DE92D8" wp14:editId="2BE67F4C">
+            <wp:extent cx="4319999" cy="2734678"/>
+            <wp:effectExtent l="0" t="0" r="0" b="8890"/>
             <wp:docPr id="11" name="Picture 11"/>
             <wp:cNvGraphicFramePr>
               <a:graphicFrameLocks xmlns:a="http://schemas.openxmlformats.org/drawingml/2006/main" noChangeAspect="1"/>
@@ -7922,7 +7912,7 @@
                   <pic:spPr>
                     <a:xfrm>
                       <a:off x="0" y="0"/>
-                      <a:ext cx="4319999" cy="2737503"/>
+                      <a:ext cx="4319999" cy="2734678"/>
                     </a:xfrm>
                     <a:prstGeom prst="rect">
                       <a:avLst/>
@@ -8043,8 +8033,8 @@
         </w:rPr>
         <w:lastRenderedPageBreak/>
         <w:drawing>
-          <wp:inline distT="0" distB="0" distL="0" distR="0" wp14:anchorId="73C38E8B" wp14:editId="74DF0421">
-            <wp:extent cx="3599999" cy="3167766"/>
+          <wp:inline distT="0" distB="0" distL="0" distR="0" wp14:anchorId="73C38E8B" wp14:editId="7874978A">
+            <wp:extent cx="3599999" cy="3165701"/>
             <wp:effectExtent l="0" t="0" r="0" b="0"/>
             <wp:docPr id="12" name="Picture 12"/>
             <wp:cNvGraphicFramePr>
@@ -8072,7 +8062,7 @@
                   <pic:spPr>
                     <a:xfrm>
                       <a:off x="0" y="0"/>
-                      <a:ext cx="3599999" cy="3167766"/>
+                      <a:ext cx="3599999" cy="3165701"/>
                     </a:xfrm>
                     <a:prstGeom prst="rect">
                       <a:avLst/>
@@ -8144,8 +8134,8 @@
           <w:noProof/>
         </w:rPr>
         <w:drawing>
-          <wp:inline distT="0" distB="0" distL="0" distR="0" wp14:anchorId="2E08B7B7" wp14:editId="7D7E6469">
-            <wp:extent cx="3599999" cy="3167766"/>
+          <wp:inline distT="0" distB="0" distL="0" distR="0" wp14:anchorId="2E08B7B7" wp14:editId="77FE78FE">
+            <wp:extent cx="3599999" cy="3165701"/>
             <wp:effectExtent l="0" t="0" r="0" b="0"/>
             <wp:docPr id="13" name="Picture 13"/>
             <wp:cNvGraphicFramePr>
@@ -8173,7 +8163,7 @@
                   <pic:spPr>
                     <a:xfrm>
                       <a:off x="0" y="0"/>
-                      <a:ext cx="3599999" cy="3167766"/>
+                      <a:ext cx="3599999" cy="3165701"/>
                     </a:xfrm>
                     <a:prstGeom prst="rect">
                       <a:avLst/>
@@ -8239,14 +8229,19 @@
       <w:pPr>
         <w:spacing w:line="360" w:lineRule="auto"/>
         <w:ind w:firstLine="283"/>
-        <w:jc w:val="left"/>
-      </w:pPr>
-      <w:r>
-        <w:rPr>
-          <w:rFonts w:ascii="Times New Roman" w:hAnsi="Times New Roman"/>
-          <w:sz w:val="18"/>
-        </w:rPr>
-        <w:t>Eşik taraması analizi (Şekil 12), F1 skorunun 0,40-0,50 aralığında bir plato oluşturduğunu göstermektedir; bu durum eşik seçiminin bu bölgede görece dayanıklı olduğuna işaret etmektedir. Üretici bazlı performans (Şekil 13) Suno parçalarında %93,0 duyarlılık, Echoes alt kümesinde ise %88,6 duyarlılık elde edildiğini ortaya koymaktadır. Buna karşın deepfake alt kümesinde duyarlılık %50,0 değerinde kalmıştır. Bu sonuç rastgele sınıflandırma sınırına karşılık gelmektedir ve bağlamı dışında değerlendirilmemelidir: söz konusu alt küme, konuşma derin sahte kayıtlarından türetilmiş olup müzik üretim sistemlerine özgü spektral ve ritmik imzaları taşımamaktadır. Modelin bu alt kümedeki başarısızlığı, genel bir başarısızlığa değil; eğitim dağılımı ile deepfake alt kümesinin akustik karakteristikleri arasındaki dağılım kaymasına (distribution shift) işaret etmektedir. Bu bulgu, sistemi farklı kaynak türlerine genellemek amacıyla alan uyarlama (domain adaptation) veya kaynak-özel ince ayar stratejilerinin araştırılmasını önermektedir.</w:t>
+      </w:pPr>
+      <w:r>
+        <w:rPr>
+          <w:sz w:val="18"/>
+        </w:rPr>
+        <w:t xml:space="preserve">Eşik taraması analizi (Şekil 12), F1 skorunun 0,40-0,50 aralığında bir plato oluşturduğunu göstermektedir; bu durum eşik seçiminin bu bölgede görece dayanıklı olduğuna işaret etmektedir. Üretici bazlı performans (Şekil 13) Suno parçalarında %93,0 duyarlılık, Echoes alt kümesinde ise %88,6 duyarlılık elde edildiğini ortaya koymaktadır. Buna karşın deepfake alt kümesinde duyarlılık %50,0 değerinde kalmıştır. Bu sonuç rastgele sınıflandırma sınırına karşılık gelmektedir ve bağlamı dışında </w:t>
+      </w:r>
+      <w:r>
+        <w:rPr>
+          <w:sz w:val="18"/>
+        </w:rPr>
+        <w:lastRenderedPageBreak/>
+        <w:t>değerlendirilmemelidir: söz konusu alt küme, konuşma derin sahte kayıtlarından türetilmiş olup müzik üretim sistemlerine özgü spektral ve ritmik imzaları taşımamaktadır. Modelin bu alt kümedeki başarısızlığı, genel bir başarısızlığa değil; eğitim dağılımı ile deepfake alt kümesinin akustik karakteristikleri arasındaki dağılım kaymasına (distribution shift) işaret etmektedir. Bu bulgu, sistemi farklı kaynak türlerine genellemek amacıyla alan uyarlama (domain adaptation) veya kaynak-özel ince ayar stratejilerinin araştırılmasını önermektedir.</w:t>
       </w:r>
     </w:p>
     <w:p>
@@ -8264,9 +8259,9 @@
           <w:noProof/>
         </w:rPr>
         <w:drawing>
-          <wp:inline distT="0" distB="0" distL="0" distR="0" wp14:anchorId="0E596C40" wp14:editId="44A4B346">
-            <wp:extent cx="4319998" cy="3007292"/>
-            <wp:effectExtent l="0" t="0" r="0" b="3175"/>
+          <wp:inline distT="0" distB="0" distL="0" distR="0" wp14:anchorId="0E596C40" wp14:editId="7AEFD433">
+            <wp:extent cx="4319998" cy="3006339"/>
+            <wp:effectExtent l="0" t="0" r="0" b="3810"/>
             <wp:docPr id="14" name="Picture 14"/>
             <wp:cNvGraphicFramePr>
               <a:graphicFrameLocks xmlns:a="http://schemas.openxmlformats.org/drawingml/2006/main" noChangeAspect="1"/>
@@ -8279,7 +8274,7 @@
                     <pic:cNvPicPr/>
                   </pic:nvPicPr>
                   <pic:blipFill>
-                    <a:blip r:embed="rId19" cstate="print">
+                    <a:blip r:embed="rId19">
                       <a:extLst>
                         <a:ext uri="{28A0092B-C50C-407E-A947-70E740481C1C}">
                           <a14:useLocalDpi xmlns:a14="http://schemas.microsoft.com/office/drawing/2010/main" val="0"/>
@@ -8293,7 +8288,7 @@
                   <pic:spPr>
                     <a:xfrm>
                       <a:off x="0" y="0"/>
-                      <a:ext cx="4319998" cy="3007292"/>
+                      <a:ext cx="4319998" cy="3006339"/>
                     </a:xfrm>
                     <a:prstGeom prst="rect">
                       <a:avLst/>
@@ -8365,9 +8360,9 @@
           <w:noProof/>
         </w:rPr>
         <w:drawing>
-          <wp:inline distT="0" distB="0" distL="0" distR="0" wp14:anchorId="209F232E" wp14:editId="38E1AC88">
-            <wp:extent cx="4035172" cy="2183528"/>
-            <wp:effectExtent l="0" t="0" r="3810" b="7620"/>
+          <wp:inline distT="0" distB="0" distL="0" distR="0" wp14:anchorId="209F232E" wp14:editId="519FBC0F">
+            <wp:extent cx="4035172" cy="2181328"/>
+            <wp:effectExtent l="0" t="0" r="3810" b="0"/>
             <wp:docPr id="15" name="Picture 15"/>
             <wp:cNvGraphicFramePr>
               <a:graphicFrameLocks xmlns:a="http://schemas.openxmlformats.org/drawingml/2006/main" noChangeAspect="1"/>
@@ -8394,7 +8389,7 @@
                   <pic:spPr>
                     <a:xfrm>
                       <a:off x="0" y="0"/>
-                      <a:ext cx="4035172" cy="2183528"/>
+                      <a:ext cx="4035172" cy="2181328"/>
                     </a:xfrm>
                     <a:prstGeom prst="rect">
                       <a:avLst/>
@@ -8707,6 +8702,7 @@
                 <w:b w:val="0"/>
                 <w:sz w:val="18"/>
               </w:rPr>
+              <w:lastRenderedPageBreak/>
               <w:t>Li vd. [22]</w:t>
             </w:r>
             <w:r>
@@ -8986,7 +8982,6 @@
                 <w:b w:val="0"/>
                 <w:sz w:val="18"/>
               </w:rPr>
-              <w:lastRenderedPageBreak/>
               <w:t>FakeMusicCaps [35]</w:t>
             </w:r>
             <w:r>
@@ -9176,7 +9171,6 @@
     <w:p>
       <w:r>
         <w:rPr>
-          <w:rFonts w:ascii="Times New Roman" w:hAnsi="Times New Roman"/>
           <w:i/>
           <w:sz w:val="16"/>
         </w:rPr>
@@ -9184,13 +9178,8 @@
       </w:r>
     </w:p>
     <w:p>
-      <w:pPr>
-        <w:jc w:val="left"/>
-      </w:pPr>
-      <w:r>
-        <w:rPr>
-          <w:rFonts w:ascii="Times New Roman" w:hAnsi="Times New Roman"/>
-          <w:b w:val="0"/>
+      <w:r>
+        <w:rPr>
           <w:sz w:val="18"/>
         </w:rPr>
         <w:t>Tablo 7, AURIS'in doğrudan ilgili yayımlanmış çalışmalarla sayısal karşılaştırmasını sunmaktadır. ROC-AUC açısından AURIS (0,9548), Transformer tabanlı SONICS [34] (0,960) ile Li vd. [22] (0,931) arasına konumlanmaktadır. Öte yandan AURIS, yalnızca elle tasarlanmış akustik öznitelikler kullanmasına karşın SONICS'e yakın AUC elde etmekte ve ±0,0023 standart sapması ile katlar arası en düşük varyansı korumaktadır. Bu karşılaştırma, derin öğrenme altyapısı gerektirmeyen hafif bir sistemin ne ölçüde rekabetçi kalabileceğini somut olarak göstermektedir.</w:t>
@@ -9200,12 +9189,9 @@
       <w:pPr>
         <w:spacing w:line="360" w:lineRule="auto"/>
         <w:ind w:firstLine="283"/>
-        <w:jc w:val="left"/>
-      </w:pPr>
-      <w:r>
-        <w:rPr>
-          <w:rFonts w:ascii="Times New Roman" w:hAnsi="Times New Roman"/>
-          <w:b w:val="0"/>
+      </w:pPr>
+      <w:r>
+        <w:rPr>
           <w:sz w:val="18"/>
         </w:rPr>
         <w:t>Spectral_flatness_std'nin baskın konumu, yapay zekâ üretim sistemlerinin algısal kalite ölçütlerini optimize ederken insan kayıtlarına kıyasla daha düz ve gürültüsüz bir spektrum bırakmasından kaynaklanmaktadır [16]. Bu gözlem, derin sahte sesler için de benzer biçimde raporlanmıştır; dolayısıyla AURIS'in öznitelik seçimi alana özgü bağımsız bulgularla örtüşmektedir. 1B-ESA'nın diğerlerine göre belirgin biçimde düşük kalması ayrı bir bulgu sunmaktadır: sıralanmamış 47 boyutlu bir öznitelik vektörü üzerinde tek boyutlu evrişim anlamlı bir öteleme değişmezliği öğrenememekte, bu da mimari ile veri biçimi arasındaki uyumsuzluğu gözler önüne sermektedir.</w:t>
@@ -9220,12 +9206,9 @@
       <w:pPr>
         <w:spacing w:line="360" w:lineRule="auto"/>
         <w:ind w:firstLine="283"/>
-        <w:jc w:val="left"/>
-      </w:pPr>
-      <w:r>
-        <w:rPr>
-          <w:rFonts w:ascii="Times New Roman" w:hAnsi="Times New Roman"/>
-          <w:b w:val="0"/>
+      </w:pPr>
+      <w:r>
+        <w:rPr>
           <w:sz w:val="18"/>
         </w:rPr>
         <w:t>Aşırı öğrenme tanılayıcı analizi (Şekil 14), ağaç tabanlı modellerin tamamında eğitim ile çapraz doğrulama doğruluğu arasında 8–14 puanlık tutarlı bir açık ortaya çıkarmıştır. Rastgele Orman bu açığın en uç örneğini sunmaktadır: eğitim doğruluğu %100'e ulaşırken çapraz doğrulama altında %86,1'e gerilemektedir. Lojistik Regresyon ise 0,6 puanlık farkla modeller arasında en dengeli eğitim davranışını sergilemiştir; ancak bu denge, düşük model kapasitesinin doğal bir yansımasıdır.</w:t>
@@ -9246,8 +9229,8 @@
           <w:noProof/>
         </w:rPr>
         <w:drawing>
-          <wp:inline distT="0" distB="0" distL="0" distR="0" wp14:anchorId="1471293C" wp14:editId="084E24AD">
-            <wp:extent cx="4248547" cy="2750605"/>
+          <wp:inline distT="0" distB="0" distL="0" distR="0" wp14:anchorId="1471293C" wp14:editId="1C06F2DD">
+            <wp:extent cx="4248547" cy="2749412"/>
             <wp:effectExtent l="0" t="0" r="0" b="0"/>
             <wp:docPr id="16" name="Picture 16"/>
             <wp:cNvGraphicFramePr>
@@ -9275,7 +9258,7 @@
                   <pic:spPr>
                     <a:xfrm>
                       <a:off x="0" y="0"/>
-                      <a:ext cx="4248547" cy="2750605"/>
+                      <a:ext cx="4248547" cy="2749412"/>
                     </a:xfrm>
                     <a:prstGeom prst="rect">
                       <a:avLst/>
@@ -9341,15 +9324,19 @@
       <w:pPr>
         <w:spacing w:line="360" w:lineRule="auto"/>
         <w:ind w:firstLine="283"/>
-        <w:jc w:val="left"/>
-      </w:pPr>
-      <w:r>
-        <w:rPr>
-          <w:rFonts w:ascii="Times New Roman" w:hAnsi="Times New Roman"/>
-          <w:b w:val="0"/>
-          <w:sz w:val="18"/>
-        </w:rPr>
-        <w:t>Öznitelik korelasyon analizi, 47 öznitelikten yirmisinin |Pearson r| &gt; 0,85 eşiğini aşan çiftler oluşturduğunu saptamıştır (Şekil 15). Tasarım gereği kabul edilen bu fazlalık, farklı akustik boyutlar arasındaki bilgi akışını artırmak için bilinçli tercih edilmiştir. Öte yandan öznitelik çıkarma deneyi (Şekil 16), N = 30'da doğruluğun platoya ulaştığını göstermekte; sondaki 17 özniteliğin performansa ölçülebilir bir katkısı bulunmamaktadır. Bu iki bulgu birlikte değerlendirildiğinde, gelecekteki bir yinelemenin 47 yerine yaklaşık 30 öznitelikle benzer doğrulukta çalışabileceği anlaşılmaktadır.</w:t>
+      </w:pPr>
+      <w:r>
+        <w:rPr>
+          <w:sz w:val="18"/>
+        </w:rPr>
+        <w:t xml:space="preserve">Öznitelik korelasyon analizi, 47 öznitelikten yirmisinin |Pearson r| &gt; 0,85 eşiğini aşan çiftler oluşturduğunu saptamıştır (Şekil 15). Tasarım gereği kabul edilen bu fazlalık, farklı akustik boyutlar arasındaki bilgi akışını artırmak için bilinçli tercih edilmiştir. </w:t>
+      </w:r>
+      <w:r>
+        <w:rPr>
+          <w:sz w:val="18"/>
+        </w:rPr>
+        <w:lastRenderedPageBreak/>
+        <w:t>Öte yandan öznitelik çıkarma deneyi (Şekil 16), N = 30'da doğruluğun platoya ulaştığını göstermekte; sondaki 17 özniteliğin performansa ölçülebilir bir katkısı bulunmamaktadır. Bu iki bulgu birlikte değerlendirildiğinde, gelecekteki bir yinelemenin 47 yerine yaklaşık 30 öznitelikle benzer doğrulukta çalışabileceği anlaşılmaktadır.</w:t>
       </w:r>
     </w:p>
     <w:p>
@@ -9366,10 +9353,9 @@
         <w:rPr>
           <w:noProof/>
         </w:rPr>
-        <w:lastRenderedPageBreak/>
         <w:drawing>
-          <wp:inline distT="0" distB="0" distL="0" distR="0" wp14:anchorId="5D75FDE5" wp14:editId="711D3383">
-            <wp:extent cx="5375881" cy="4956009"/>
+          <wp:inline distT="0" distB="0" distL="0" distR="0" wp14:anchorId="5D75FDE5" wp14:editId="78DB9C45">
+            <wp:extent cx="5375881" cy="4953945"/>
             <wp:effectExtent l="0" t="0" r="0" b="0"/>
             <wp:docPr id="17" name="Picture 17"/>
             <wp:cNvGraphicFramePr>
@@ -9397,7 +9383,7 @@
                   <pic:spPr>
                     <a:xfrm>
                       <a:off x="0" y="0"/>
-                      <a:ext cx="5375881" cy="4956009"/>
+                      <a:ext cx="5375881" cy="4953945"/>
                     </a:xfrm>
                     <a:prstGeom prst="rect">
                       <a:avLst/>
@@ -9507,11 +9493,6 @@
     <w:p>
       <w:pPr>
         <w:spacing w:line="360" w:lineRule="auto"/>
-      </w:pPr>
-    </w:p>
-    <w:p>
-      <w:pPr>
-        <w:spacing w:line="360" w:lineRule="auto"/>
         <w:jc w:val="center"/>
       </w:pPr>
       <w:r>
@@ -9520,9 +9501,9 @@
         </w:rPr>
         <w:lastRenderedPageBreak/>
         <w:drawing>
-          <wp:inline distT="0" distB="0" distL="0" distR="0" wp14:anchorId="407A34FA" wp14:editId="4DF5FDFA">
-            <wp:extent cx="4276895" cy="2898647"/>
-            <wp:effectExtent l="0" t="0" r="0" b="0"/>
+          <wp:inline distT="0" distB="0" distL="0" distR="0" wp14:anchorId="407A34FA" wp14:editId="5200F1A6">
+            <wp:extent cx="4276895" cy="2895325"/>
+            <wp:effectExtent l="0" t="0" r="0" b="635"/>
             <wp:docPr id="18" name="Picture 18"/>
             <wp:cNvGraphicFramePr>
               <a:graphicFrameLocks xmlns:a="http://schemas.openxmlformats.org/drawingml/2006/main" noChangeAspect="1"/>
@@ -9535,7 +9516,7 @@
                     <pic:cNvPicPr/>
                   </pic:nvPicPr>
                   <pic:blipFill>
-                    <a:blip r:embed="rId23" cstate="print">
+                    <a:blip r:embed="rId23">
                       <a:extLst>
                         <a:ext uri="{28A0092B-C50C-407E-A947-70E740481C1C}">
                           <a14:useLocalDpi xmlns:a14="http://schemas.microsoft.com/office/drawing/2010/main" val="0"/>
@@ -9549,7 +9530,7 @@
                   <pic:spPr>
                     <a:xfrm>
                       <a:off x="0" y="0"/>
-                      <a:ext cx="4276895" cy="2898647"/>
+                      <a:ext cx="4276895" cy="2895325"/>
                     </a:xfrm>
                     <a:prstGeom prst="rect">
                       <a:avLst/>
@@ -9663,15 +9644,12 @@
       <w:pPr>
         <w:spacing w:line="360" w:lineRule="auto"/>
         <w:ind w:firstLine="283"/>
-        <w:jc w:val="left"/>
-        <w:rPr>
-          <w:sz w:val="18"/>
-        </w:rPr>
-      </w:pPr>
-      <w:r>
-        <w:rPr>
-          <w:rFonts w:ascii="Times New Roman" w:hAnsi="Times New Roman"/>
-          <w:b w:val="0"/>
+        <w:rPr>
+          <w:sz w:val="18"/>
+        </w:rPr>
+      </w:pPr>
+      <w:r>
+        <w:rPr>
           <w:sz w:val="18"/>
         </w:rPr>
         <w:t>Makale metninde, eşitliklerde ve tanılayıcı analizlerde kullanılan simgeler alfabetik sırayla Tablo 6'da listelenmiştir.</w:t>
@@ -10126,7 +10104,6 @@
                 <w:lang w:val="tr-TR"/>
               </w:rPr>
             </w:pPr>
-            <w:proofErr w:type="gramStart"/>
             <w:r>
               <w:rPr>
                 <w:b w:val="0"/>
@@ -10138,7 +10115,6 @@
               </w:rPr>
               <w:t>pᵢ</w:t>
             </w:r>
-            <w:proofErr w:type="gramEnd"/>
           </w:p>
         </w:tc>
         <w:tc>
@@ -10208,7 +10184,6 @@
                 <w:lang w:val="tr-TR"/>
               </w:rPr>
             </w:pPr>
-            <w:proofErr w:type="gramStart"/>
             <w:r>
               <w:rPr>
                 <w:b w:val="0"/>
@@ -10220,7 +10195,6 @@
               </w:rPr>
               <w:t>r</w:t>
             </w:r>
-            <w:proofErr w:type="gramEnd"/>
           </w:p>
         </w:tc>
         <w:tc>
@@ -10376,7 +10350,6 @@
                 <w:lang w:val="tr-TR"/>
               </w:rPr>
             </w:pPr>
-            <w:proofErr w:type="gramStart"/>
             <w:r>
               <w:rPr>
                 <w:b w:val="0"/>
@@ -10388,7 +10361,6 @@
               </w:rPr>
               <w:t>yᵢ</w:t>
             </w:r>
-            <w:proofErr w:type="gramEnd"/>
           </w:p>
         </w:tc>
         <w:tc>
@@ -10461,7 +10433,6 @@
                 <w:lang w:val="tr-TR"/>
               </w:rPr>
             </w:pPr>
-            <w:proofErr w:type="gramStart"/>
             <w:r>
               <w:rPr>
                 <w:b w:val="0"/>
@@ -10473,7 +10444,6 @@
               </w:rPr>
               <w:t>θ</w:t>
             </w:r>
-            <w:proofErr w:type="gramEnd"/>
           </w:p>
         </w:tc>
         <w:tc>
@@ -10532,7 +10502,6 @@
                 <w:lang w:val="tr-TR"/>
               </w:rPr>
             </w:pPr>
-            <w:proofErr w:type="gramStart"/>
             <w:r>
               <w:rPr>
                 <w:b w:val="0"/>
@@ -10544,7 +10513,6 @@
               </w:rPr>
               <w:t>θ</w:t>
             </w:r>
-            <w:proofErr w:type="gramEnd"/>
             <w:r>
               <w:rPr>
                 <w:b w:val="0"/>
@@ -10643,15 +10611,19 @@
       <w:pPr>
         <w:spacing w:line="360" w:lineRule="auto"/>
         <w:ind w:firstLine="283"/>
-        <w:jc w:val="left"/>
-      </w:pPr>
-      <w:r>
-        <w:rPr>
-          <w:rFonts w:ascii="Times New Roman" w:hAnsi="Times New Roman"/>
-          <w:b w:val="0"/>
-          <w:sz w:val="18"/>
-        </w:rPr>
-        <w:t>Bu çalışmada, yapay zekâ tarafından üretilen müziği insan kayıtlarından ayırt etmek amacıyla AURIS adlı uçtan-uca bir tespit sistemi geliştirilmiştir. Sistem, 47 boyutlu elle tasarlanmış akustik öznitelik vektörünü sekiz farklı kaynaktan derlenen 5.195 örneklik bir veri kümesinde eğitilen on bir sınıflandırıcıdan oluşan bir topluluğa bağlamaktadır. LightGBM %95,48 ROC-AUC ve ±0,0023 standart sapma ile hem en yüksek ortalamayı hem de havuzun en düşük varyansını kaydetmiştir; Derin ÇKA %95,42 ile çok yakın bir ikinci sıraya ulaşmıştır. Spectral_flatness_std, yapay zekâ-insan ayrımı için en belirleyici tek öznitelik olarak öne çıkmış ve bu sonuç bağımsız ses derin sahte literatürüyle [16] örtüşmektedir. Tanılayıcı analizler iki temel sınırlamayı gün yüzüne çıkarmıştır: ağaç tabanlı modellerde eğitim ile çapraz doğrulama arasındaki 8–14 puanlık doğruluk açığı aşırı uyum riskine işaret etmekte, sondaki 17 özniteliğin performansa ölçülebilir katkısı bulunmamaktadır. Deepfake alt kümesinde gözlenen %50 duyarlılık ise sistemin konuşma kaynaklı sahte seslere doğrudan uyarlanmadan genellenemeyeceğini açıkça ortaya koymaktadır.</w:t>
+      </w:pPr>
+      <w:r>
+        <w:rPr>
+          <w:sz w:val="18"/>
+        </w:rPr>
+        <w:t xml:space="preserve">Bu çalışmada, yapay zekâ tarafından üretilen müziği insan kayıtlarından ayırt etmek amacıyla AURIS adlı uçtan-uca bir tespit sistemi geliştirilmiştir. Sistem, 47 boyutlu elle tasarlanmış akustik öznitelik vektörünü sekiz farklı kaynaktan derlenen 5.195 örneklik bir veri kümesinde eğitilen on bir sınıflandırıcıdan oluşan bir topluluğa bağlamaktadır. LightGBM %95,48 ROC-AUC ve ±0,0023 standart sapma ile hem en yüksek ortalamayı hem de havuzun en düşük varyansını kaydetmiştir; Derin ÇKA %95,42 ile çok yakın bir ikinci sıraya ulaşmıştır. Spectral_flatness_std, yapay zekâ-insan ayrımı için en belirleyici tek öznitelik olarak öne çıkmış ve bu sonuç bağımsız ses derin sahte literatürüyle [16] örtüşmektedir. Tanılayıcı analizler iki temel sınırlamayı gün yüzüne </w:t>
+      </w:r>
+      <w:r>
+        <w:rPr>
+          <w:sz w:val="18"/>
+        </w:rPr>
+        <w:lastRenderedPageBreak/>
+        <w:t>çıkarmıştır: ağaç tabanlı modellerde eğitim ile çapraz doğrulama arasındaki 8–14 puanlık doğruluk açığı aşırı uyum riskine işaret etmekte, sondaki 17 özniteliğin performansa ölçülebilir katkısı bulunmamaktadır. Deepfake alt kümesinde gözlenen %50 duyarlılık ise sistemin konuşma kaynaklı sahte seslere doğrudan uyarlanmadan genellenemeyeceğini açıkça ortaya koymaktadır.</w:t>
       </w:r>
     </w:p>
     <w:p>
@@ -10663,12 +10635,9 @@
       <w:pPr>
         <w:spacing w:line="360" w:lineRule="auto"/>
         <w:ind w:firstLine="283"/>
-        <w:jc w:val="left"/>
-      </w:pPr>
-      <w:r>
-        <w:rPr>
-          <w:rFonts w:ascii="Times New Roman" w:hAnsi="Times New Roman"/>
-          <w:b w:val="0"/>
+      </w:pPr>
+      <w:r>
+        <w:rPr>
           <w:sz w:val="18"/>
         </w:rPr>
         <w:t>Sonraki çalışmalar üç önceliği kapsamaktadır. İlk olarak SONICS [34] ve FakeMusicCaps [35] kıyaslama veri kümeleri üzerinde üretici bağımsız bir değerlendirme gerçekleştirilecek; ince ayar yapılmış wav2vec2 [13] modeli öznitelik tabanlı sınıflandırıcılarla doğrudan karşılaştırılacaktır. İkinci olarak MP3 sıkıştırma, perde kaydırma ve zaman gerdirme gibi dönüşümler karşısında sistemin sağlamlığı ölçülecektir. Son olarak veri kümesi on bin örneğe doğru genişletilecek ve yeni nesil üretici sistemler kapsama alınacaktır.</w:t>
@@ -11285,7 +11254,6 @@
       </w:pPr>
       <w:r>
         <w:rPr>
-          <w:rFonts w:ascii="Times New Roman" w:hAnsi="Times New Roman"/>
           <w:sz w:val="18"/>
         </w:rPr>
         <w:t>29. Özbalcı M.C., Şahin H., Bilgin T.T., Classification of Music Genres of GTZAN Dataset with Machine Learning Methods, Mühendislik Bilimleri ve Araştırmaları Dergisi (J. Eng. Sci. Res.), 6 (1), 2024.</w:t>
@@ -11364,6 +11332,7 @@
         <w:rPr>
           <w:sz w:val="18"/>
         </w:rPr>
+        <w:lastRenderedPageBreak/>
         <w:t>38. Pedregosa F. vd., Scikit-learn: Machine Learning in Python, J. Mach. Learn. Res., 12, 2825-2830, 2011.</w:t>
       </w:r>
     </w:p>

</xml_diff>

<commit_message>
Update references in AURIS document and remove obsolete check_refs script
</commit_message>
<xml_diff>
--- a/docs/academic/paper/deliverables/AURIS_Makale_Metni.docx
+++ b/docs/academic/paper/deliverables/AURIS_Makale_Metni.docx
@@ -10917,9 +10917,10 @@
       </w:pPr>
       <w:r>
         <w:rPr>
-          <w:sz w:val="18"/>
-        </w:rPr>
-        <w:t>1. Copet J., Kreuk F., Gat I., Remez T., Kant D., Synnaeve G., Adi Y., Défossez A., Simple and Controllable Music Generation, Adv Neural Inf Process Syst, 36, 2023.</w:t>
+          <w:rFonts w:ascii="Times New Roman" w:hAnsi="Times New Roman"/>
+          <w:sz w:val="18"/>
+        </w:rPr>
+        <w:t>1. Copet J., Kreuk F., Gat I., Remez T., Kant D., Synnaeve G., Adi Y., Défossez A., Simple and Controllable Music Generation, Advances in Neural Information Processing Systems (NeurIPS 2023), Cilt 36, 4918-4981, New Orleans, Louisiana, A.B.D., 10-16 Aralık, 2023.</w:t>
       </w:r>
     </w:p>
     <w:p>
@@ -10953,9 +10954,10 @@
       </w:pPr>
       <w:r>
         <w:rPr>
-          <w:sz w:val="18"/>
-        </w:rPr>
-        <w:t>4. Frank J., Schönherr L., WaveFake: A Data Set to Facilitate Audio Deepfake Detection, Adv Neural Inf Process Syst Datasets Benchmarks Track, 1, 2021.</w:t>
+          <w:rFonts w:ascii="Times New Roman" w:hAnsi="Times New Roman"/>
+          <w:sz w:val="18"/>
+        </w:rPr>
+        <w:t>4. Frank J., Schönherr L., WaveFake: A Data Set to Facilitate Audio Deepfake Detection, Advances in Neural Information Processing Systems Datasets and Benchmarks Track (NeurIPS 2021), Cilt 1, 2021.</w:t>
       </w:r>
     </w:p>
     <w:p>
@@ -10965,6 +10967,7 @@
       </w:pPr>
       <w:r>
         <w:rPr>
+          <w:rFonts w:ascii="Times New Roman" w:hAnsi="Times New Roman"/>
           <w:sz w:val="18"/>
         </w:rPr>
         <w:t>5. Afchar D., Meseguer Brocal G., Hennequin R., AI-Generated Music Detection and Its Challenges, Proceedings of the IEEE International Conference on Acoustics, Speech and Signal Processing (ICASSP 2025), Hyderabad, Hindistan, 6-11 Nisan, 2025.</w:t>

</xml_diff>

<commit_message>
Update AURIS document with ethical statement and add temporary file
</commit_message>
<xml_diff>
--- a/docs/academic/paper/deliverables/AURIS_Makale_Metni.docx
+++ b/docs/academic/paper/deliverables/AURIS_Makale_Metni.docx
@@ -1756,7 +1756,21 @@
         <w:rPr>
           <w:sz w:val="18"/>
         </w:rPr>
-        <w:t>The proliferation of text-to-music generators such as Suno, Udio and MusicGen has raised a detection problem of practical importance for copyright attribution and streaming-platform integrity. This paper proposes AURIS, a system that couples a 47-dimensional handcrafted acoustic feature vector with an ensemble of eleven classifiers (seven machine learning and four deep learning architectures). The models are trained on 5,195 samples drawn from twelve AI generation systems and multiple human sources under 5-fold cross-validation. LightGBM achieves the top ROC-AUC of 0.9548 with ±0.0023 cross-fold standard deviation, combining the best mean with the lowest variance in the pool. Spectral-flatness standard deviation ranks first in feature importance. A Youden-J optimised threshold of θ* = 0.4316 improves balanced accuracy over the default 0.5 cutoff, and a Brier score of 0.083 confirms that the probability outputs are well calibrated.</w:t>
+        <w:t xml:space="preserve">The proliferation of text-to-music generators such as Suno, Udio and MusicGen has raised a detection problem of practical importance for copyright attribution and streaming-platform integrity. This paper proposes AURIS, a system that couples a 47-dimensional handcrafted acoustic feature vector with an ensemble of eleven classifiers (seven machine learning and four deep learning architectures). The models are trained on 5,195 samples drawn from twelve AI generation systems and multiple human sources under 5-fold cross-validation. LightGBM achieves the top ROC-AUC of 0.9548 with ±0.0023 cross-fold standard deviation, combining the best </w:t>
+      </w:r>
+      <w:proofErr w:type="gramStart"/>
+      <w:r>
+        <w:rPr>
+          <w:sz w:val="18"/>
+        </w:rPr>
+        <w:t>mean</w:t>
+      </w:r>
+      <w:proofErr w:type="gramEnd"/>
+      <w:r>
+        <w:rPr>
+          <w:sz w:val="18"/>
+        </w:rPr>
+        <w:t xml:space="preserve"> with the lowest variance in the pool. Spectral-flatness standard deviation ranks first in feature importance. A Youden-J optimised threshold of θ* = 0.4316 improves balanced accuracy over the default 0.5 cutoff, and a Brier score of 0.083 confirms that the probability outputs are well calibrated.</w:t>
       </w:r>
     </w:p>
     <w:p>
@@ -4164,7 +4178,35 @@
         <w:rPr>
           <w:sz w:val="18"/>
         </w:rPr>
-        <w:t>J(θ) = TPR(θ) − FPR(θ)                                                    (1)</w:t>
+        <w:t>J(θ) = TPR(θ) − FPR(</w:t>
+      </w:r>
+      <w:proofErr w:type="gramStart"/>
+      <w:r>
+        <w:rPr>
+          <w:sz w:val="18"/>
+        </w:rPr>
+        <w:t xml:space="preserve">θ)   </w:t>
+      </w:r>
+      <w:proofErr w:type="gramEnd"/>
+      <w:r>
+        <w:rPr>
+          <w:sz w:val="18"/>
+        </w:rPr>
+        <w:t xml:space="preserve">                                              </w:t>
+      </w:r>
+      <w:proofErr w:type="gramStart"/>
+      <w:r>
+        <w:rPr>
+          <w:sz w:val="18"/>
+        </w:rPr>
+        <w:t xml:space="preserve">   (</w:t>
+      </w:r>
+      <w:proofErr w:type="gramEnd"/>
+      <w:r>
+        <w:rPr>
+          <w:sz w:val="18"/>
+        </w:rPr>
+        <w:t>1)</w:t>
       </w:r>
     </w:p>
     <w:p/>
@@ -4182,7 +4224,35 @@
         <w:rPr>
           <w:sz w:val="18"/>
         </w:rPr>
-        <w:t>BS = (1/N) Σᵢ (pᵢ − yᵢ)²                                                  (2)</w:t>
+        <w:t xml:space="preserve">BS = (1/N) Σᵢ (pᵢ − </w:t>
+      </w:r>
+      <w:proofErr w:type="gramStart"/>
+      <w:r>
+        <w:rPr>
+          <w:sz w:val="18"/>
+        </w:rPr>
+        <w:t>yᵢ)²</w:t>
+      </w:r>
+      <w:proofErr w:type="gramEnd"/>
+      <w:r>
+        <w:rPr>
+          <w:sz w:val="18"/>
+        </w:rPr>
+        <w:t xml:space="preserve">                                               </w:t>
+      </w:r>
+      <w:proofErr w:type="gramStart"/>
+      <w:r>
+        <w:rPr>
+          <w:sz w:val="18"/>
+        </w:rPr>
+        <w:t xml:space="preserve">   (</w:t>
+      </w:r>
+      <w:proofErr w:type="gramEnd"/>
+      <w:r>
+        <w:rPr>
+          <w:sz w:val="18"/>
+        </w:rPr>
+        <w:t>2)</w:t>
       </w:r>
     </w:p>
     <w:p/>
@@ -7650,7 +7720,21 @@
         <w:rPr>
           <w:sz w:val="16"/>
         </w:rPr>
-        <w:t>(Top-twenty feature importance scores.)</w:t>
+        <w:t>(</w:t>
+      </w:r>
+      <w:proofErr w:type="gramStart"/>
+      <w:r>
+        <w:rPr>
+          <w:sz w:val="16"/>
+        </w:rPr>
+        <w:t>Top-twenty</w:t>
+      </w:r>
+      <w:proofErr w:type="gramEnd"/>
+      <w:r>
+        <w:rPr>
+          <w:sz w:val="16"/>
+        </w:rPr>
+        <w:t xml:space="preserve"> feature importance scores.)</w:t>
       </w:r>
     </w:p>
     <w:p>
@@ -9169,12 +9253,21 @@
       </w:tr>
     </w:tbl>
     <w:p>
+      <w:proofErr w:type="gramStart"/>
       <w:r>
         <w:rPr>
           <w:i/>
           <w:sz w:val="16"/>
         </w:rPr>
-        <w:t>— : Kaynak yayında rapor edilmemiştir.</w:t>
+        <w:t>— :</w:t>
+      </w:r>
+      <w:proofErr w:type="gramEnd"/>
+      <w:r>
+        <w:rPr>
+          <w:i/>
+          <w:sz w:val="16"/>
+        </w:rPr>
+        <w:t xml:space="preserve"> Kaynak yayında rapor edilmemiştir.</w:t>
       </w:r>
     </w:p>
     <w:p>
@@ -10104,6 +10197,7 @@
                 <w:lang w:val="tr-TR"/>
               </w:rPr>
             </w:pPr>
+            <w:proofErr w:type="gramStart"/>
             <w:r>
               <w:rPr>
                 <w:b w:val="0"/>
@@ -10115,6 +10209,7 @@
               </w:rPr>
               <w:t>pᵢ</w:t>
             </w:r>
+            <w:proofErr w:type="gramEnd"/>
           </w:p>
         </w:tc>
         <w:tc>
@@ -10184,6 +10279,7 @@
                 <w:lang w:val="tr-TR"/>
               </w:rPr>
             </w:pPr>
+            <w:proofErr w:type="gramStart"/>
             <w:r>
               <w:rPr>
                 <w:b w:val="0"/>
@@ -10195,6 +10291,7 @@
               </w:rPr>
               <w:t>r</w:t>
             </w:r>
+            <w:proofErr w:type="gramEnd"/>
           </w:p>
         </w:tc>
         <w:tc>
@@ -10350,6 +10447,7 @@
                 <w:lang w:val="tr-TR"/>
               </w:rPr>
             </w:pPr>
+            <w:proofErr w:type="gramStart"/>
             <w:r>
               <w:rPr>
                 <w:b w:val="0"/>
@@ -10361,6 +10459,7 @@
               </w:rPr>
               <w:t>yᵢ</w:t>
             </w:r>
+            <w:proofErr w:type="gramEnd"/>
           </w:p>
         </w:tc>
         <w:tc>
@@ -10433,6 +10532,7 @@
                 <w:lang w:val="tr-TR"/>
               </w:rPr>
             </w:pPr>
+            <w:proofErr w:type="gramStart"/>
             <w:r>
               <w:rPr>
                 <w:b w:val="0"/>
@@ -10444,6 +10544,7 @@
               </w:rPr>
               <w:t>θ</w:t>
             </w:r>
+            <w:proofErr w:type="gramEnd"/>
           </w:p>
         </w:tc>
         <w:tc>
@@ -10502,6 +10603,7 @@
                 <w:lang w:val="tr-TR"/>
               </w:rPr>
             </w:pPr>
+            <w:proofErr w:type="gramStart"/>
             <w:r>
               <w:rPr>
                 <w:b w:val="0"/>
@@ -10513,6 +10615,7 @@
               </w:rPr>
               <w:t>θ</w:t>
             </w:r>
+            <w:proofErr w:type="gramEnd"/>
             <w:r>
               <w:rPr>
                 <w:b w:val="0"/>
@@ -10675,15 +10778,28 @@
     <w:p>
       <w:pPr>
         <w:spacing w:line="360" w:lineRule="auto"/>
-        <w:ind w:firstLine="283"/>
-        <w:jc w:val="both"/>
-      </w:pPr>
+        <w:rPr>
+          <w:sz w:val="18"/>
+        </w:rPr>
+      </w:pPr>
+      <w:r>
+        <w:rPr>
+          <w:sz w:val="18"/>
+        </w:rPr>
+        <w:t xml:space="preserve">    </w:t>
+      </w:r>
+      <w:r>
+        <w:rPr>
+          <w:sz w:val="18"/>
+        </w:rPr>
+        <w:t xml:space="preserve">Bu </w:t>
+      </w:r>
       <w:proofErr w:type="spellStart"/>
       <w:r>
         <w:rPr>
           <w:sz w:val="18"/>
         </w:rPr>
-        <w:t>Çalışma</w:t>
+        <w:t>çalışmada</w:t>
       </w:r>
       <w:proofErr w:type="spellEnd"/>
       <w:r>
@@ -10697,7 +10813,7 @@
         <w:rPr>
           <w:sz w:val="18"/>
         </w:rPr>
-        <w:t>boyunca</w:t>
+        <w:t>yalnızca</w:t>
       </w:r>
       <w:proofErr w:type="spellEnd"/>
       <w:r>
@@ -10711,7 +10827,7 @@
         <w:rPr>
           <w:sz w:val="18"/>
         </w:rPr>
-        <w:t>rehberliği</w:t>
+        <w:t>kamuya</w:t>
       </w:r>
       <w:proofErr w:type="spellEnd"/>
       <w:r>
@@ -10725,7 +10841,7 @@
         <w:rPr>
           <w:sz w:val="18"/>
         </w:rPr>
-        <w:t>için</w:t>
+        <w:t>açık</w:t>
       </w:r>
       <w:proofErr w:type="spellEnd"/>
       <w:r>
@@ -10739,7 +10855,7 @@
         <w:rPr>
           <w:sz w:val="18"/>
         </w:rPr>
-        <w:t>Düzce</w:t>
+        <w:t>ve</w:t>
       </w:r>
       <w:proofErr w:type="spellEnd"/>
       <w:r>
@@ -10753,7 +10869,7 @@
         <w:rPr>
           <w:sz w:val="18"/>
         </w:rPr>
-        <w:t>Üniversitesi</w:t>
+        <w:t>anonim</w:t>
       </w:r>
       <w:proofErr w:type="spellEnd"/>
       <w:r>
@@ -10767,7 +10883,7 @@
         <w:rPr>
           <w:sz w:val="18"/>
         </w:rPr>
-        <w:t>Bilgisayar</w:t>
+        <w:t>müzik</w:t>
       </w:r>
       <w:proofErr w:type="spellEnd"/>
       <w:r>
@@ -10781,7 +10897,7 @@
         <w:rPr>
           <w:sz w:val="18"/>
         </w:rPr>
-        <w:t>Mühendisliği</w:t>
+        <w:t>veri</w:t>
       </w:r>
       <w:proofErr w:type="spellEnd"/>
       <w:r>
@@ -10795,7 +10911,7 @@
         <w:rPr>
           <w:sz w:val="18"/>
         </w:rPr>
-        <w:t>Bölümü</w:t>
+        <w:t>kümeleri</w:t>
       </w:r>
       <w:proofErr w:type="spellEnd"/>
       <w:r>
@@ -10809,7 +10925,7 @@
         <w:rPr>
           <w:sz w:val="18"/>
         </w:rPr>
-        <w:t>Doktor</w:t>
+        <w:t>kullanılmış</w:t>
       </w:r>
       <w:proofErr w:type="spellEnd"/>
       <w:r>
@@ -10823,27 +10939,21 @@
         <w:rPr>
           <w:sz w:val="18"/>
         </w:rPr>
-        <w:t>Öğretim</w:t>
+        <w:t>olup</w:t>
       </w:r>
       <w:proofErr w:type="spellEnd"/>
       <w:r>
         <w:rPr>
           <w:sz w:val="18"/>
         </w:rPr>
-        <w:t xml:space="preserve"> Üyesi. BÜŞRA </w:t>
+        <w:t xml:space="preserve"> </w:t>
       </w:r>
       <w:proofErr w:type="spellStart"/>
       <w:r>
         <w:rPr>
           <w:sz w:val="18"/>
         </w:rPr>
-        <w:t>TAKGİ</w:t>
-      </w:r>
-      <w:r>
-        <w:rPr>
-          <w:sz w:val="18"/>
-        </w:rPr>
-        <w:t>L’e</w:t>
+        <w:t>insan</w:t>
       </w:r>
       <w:proofErr w:type="spellEnd"/>
       <w:r>
@@ -10857,7 +10967,7 @@
         <w:rPr>
           <w:sz w:val="18"/>
         </w:rPr>
-        <w:t>teşekkür</w:t>
+        <w:t>katılımcılardan</w:t>
       </w:r>
       <w:proofErr w:type="spellEnd"/>
       <w:r>
@@ -10871,14 +10981,132 @@
         <w:rPr>
           <w:sz w:val="18"/>
         </w:rPr>
-        <w:t>ederim</w:t>
+        <w:t>birincil</w:t>
       </w:r>
       <w:proofErr w:type="spellEnd"/>
       <w:r>
         <w:rPr>
           <w:sz w:val="18"/>
         </w:rPr>
+        <w:t xml:space="preserve"> </w:t>
+      </w:r>
+      <w:proofErr w:type="spellStart"/>
+      <w:r>
+        <w:rPr>
+          <w:sz w:val="18"/>
+        </w:rPr>
+        <w:t>veri</w:t>
+      </w:r>
+      <w:proofErr w:type="spellEnd"/>
+      <w:r>
+        <w:rPr>
+          <w:sz w:val="18"/>
+        </w:rPr>
+        <w:t xml:space="preserve"> </w:t>
+      </w:r>
+      <w:proofErr w:type="spellStart"/>
+      <w:r>
+        <w:rPr>
+          <w:sz w:val="18"/>
+        </w:rPr>
+        <w:t>toplanmamıştır</w:t>
+      </w:r>
+      <w:proofErr w:type="spellEnd"/>
+      <w:r>
+        <w:rPr>
+          <w:sz w:val="18"/>
+        </w:rPr>
+        <w:t xml:space="preserve">; </w:t>
+      </w:r>
+      <w:proofErr w:type="spellStart"/>
+      <w:r>
+        <w:rPr>
+          <w:sz w:val="18"/>
+        </w:rPr>
+        <w:t>bu</w:t>
+      </w:r>
+      <w:proofErr w:type="spellEnd"/>
+      <w:r>
+        <w:rPr>
+          <w:sz w:val="18"/>
+        </w:rPr>
+        <w:t xml:space="preserve"> </w:t>
+      </w:r>
+      <w:proofErr w:type="spellStart"/>
+      <w:r>
+        <w:rPr>
+          <w:sz w:val="18"/>
+        </w:rPr>
+        <w:t>nedenle</w:t>
+      </w:r>
+      <w:proofErr w:type="spellEnd"/>
+      <w:r>
+        <w:rPr>
+          <w:sz w:val="18"/>
+        </w:rPr>
+        <w:t xml:space="preserve"> </w:t>
+      </w:r>
+      <w:proofErr w:type="spellStart"/>
+      <w:r>
+        <w:rPr>
+          <w:sz w:val="18"/>
+        </w:rPr>
+        <w:t>etik</w:t>
+      </w:r>
+      <w:proofErr w:type="spellEnd"/>
+      <w:r>
+        <w:rPr>
+          <w:sz w:val="18"/>
+        </w:rPr>
+        <w:t xml:space="preserve"> </w:t>
+      </w:r>
+      <w:proofErr w:type="spellStart"/>
+      <w:r>
+        <w:rPr>
+          <w:sz w:val="18"/>
+        </w:rPr>
+        <w:t>kurul</w:t>
+      </w:r>
+      <w:proofErr w:type="spellEnd"/>
+      <w:r>
+        <w:rPr>
+          <w:sz w:val="18"/>
+        </w:rPr>
+        <w:t xml:space="preserve"> </w:t>
+      </w:r>
+      <w:proofErr w:type="spellStart"/>
+      <w:r>
+        <w:rPr>
+          <w:sz w:val="18"/>
+        </w:rPr>
+        <w:t>izni</w:t>
+      </w:r>
+      <w:proofErr w:type="spellEnd"/>
+      <w:r>
+        <w:rPr>
+          <w:sz w:val="18"/>
+        </w:rPr>
+        <w:t xml:space="preserve"> </w:t>
+      </w:r>
+      <w:proofErr w:type="spellStart"/>
+      <w:r>
+        <w:rPr>
+          <w:sz w:val="18"/>
+        </w:rPr>
+        <w:t>gerekmemektedir</w:t>
+      </w:r>
+      <w:proofErr w:type="spellEnd"/>
+      <w:r>
+        <w:rPr>
+          <w:sz w:val="18"/>
+        </w:rPr>
         <w:t>.</w:t>
+      </w:r>
+      <w:r>
+        <w:rPr>
+          <w:sz w:val="18"/>
+        </w:rPr>
+        <w:tab/>
       </w:r>
     </w:p>
     <w:p>
@@ -10917,7 +11145,6 @@
       </w:pPr>
       <w:r>
         <w:rPr>
-          <w:rFonts w:ascii="Times New Roman" w:hAnsi="Times New Roman"/>
           <w:sz w:val="18"/>
         </w:rPr>
         <w:t>1. Copet J., Kreuk F., Gat I., Remez T., Kant D., Synnaeve G., Adi Y., Défossez A., Simple and Controllable Music Generation, Advances in Neural Information Processing Systems (NeurIPS 2023), Cilt 36, 4918-4981, New Orleans, Louisiana, A.B.D., 10-16 Aralık, 2023.</w:t>
@@ -10954,7 +11181,6 @@
       </w:pPr>
       <w:r>
         <w:rPr>
-          <w:rFonts w:ascii="Times New Roman" w:hAnsi="Times New Roman"/>
           <w:sz w:val="18"/>
         </w:rPr>
         <w:t>4. Frank J., Schönherr L., WaveFake: A Data Set to Facilitate Audio Deepfake Detection, Advances in Neural Information Processing Systems Datasets and Benchmarks Track (NeurIPS 2021), Cilt 1, 2021.</w:t>
@@ -10967,7 +11193,6 @@
       </w:pPr>
       <w:r>
         <w:rPr>
-          <w:rFonts w:ascii="Times New Roman" w:hAnsi="Times New Roman"/>
           <w:sz w:val="18"/>
         </w:rPr>
         <w:t>5. Afchar D., Meseguer Brocal G., Hennequin R., AI-Generated Music Detection and Its Challenges, Proceedings of the IEEE International Conference on Acoustics, Speech and Signal Processing (ICASSP 2025), Hyderabad, Hindistan, 6-11 Nisan, 2025.</w:t>
@@ -11054,6 +11279,7 @@
         <w:rPr>
           <w:sz w:val="18"/>
         </w:rPr>
+        <w:lastRenderedPageBreak/>
         <w:t>12. Martín-Doñas J.M., Álvarez A., The Vicomtech Audio Deepfake Detection System Based on Wav2vec2 for the 2022 ADD Challenge, Proceedings of the IEEE International Conference on Acoustics, Speech and Signal Processing (ICASSP 2022), 9266-9270, Singapur, 22-27 Mayıs, 2022.</w:t>
       </w:r>
     </w:p>
@@ -11066,7 +11292,6 @@
         <w:rPr>
           <w:sz w:val="18"/>
         </w:rPr>
-        <w:lastRenderedPageBreak/>
         <w:t>13. Baevski A., Zhou Y., Mohamed A., Auli M., wav2vec 2.0: A Framework for Self-Supervised Learning of Speech Representations, Adv Neural Inf Process Syst, 33, 12449-12460, 2020.</w:t>
       </w:r>
     </w:p>
@@ -11163,7 +11388,21 @@
         <w:rPr>
           <w:sz w:val="18"/>
         </w:rPr>
-        <w:t>21. Müller N., Czempin P., Diekmann F., Froghyar A., Böttinger K., Does Audio Deepfake Detection Generalize?, Proceedings of the 23rd Annual Conference of the International Speech Communication Association (INTERSPEECH 2022), 2783-2787, Incheon, Güney Kore, 18-22 Eylül, 2022.</w:t>
+        <w:t xml:space="preserve">21. Müller N., Czempin P., Diekmann F., Froghyar A., Böttinger K., Does Audio Deepfake Detection </w:t>
+      </w:r>
+      <w:proofErr w:type="gramStart"/>
+      <w:r>
+        <w:rPr>
+          <w:sz w:val="18"/>
+        </w:rPr>
+        <w:t>Generalize?,</w:t>
+      </w:r>
+      <w:proofErr w:type="gramEnd"/>
+      <w:r>
+        <w:rPr>
+          <w:sz w:val="18"/>
+        </w:rPr>
+        <w:t xml:space="preserve"> Proceedings of the 23rd Annual Conference of the International Speech Communication Association (INTERSPEECH 2022), 2783-2787, Incheon, Güney Kore, 18-22 Eylül, 2022.</w:t>
       </w:r>
     </w:p>
     <w:p>
@@ -11175,7 +11414,21 @@
         <w:rPr>
           <w:sz w:val="18"/>
         </w:rPr>
-        <w:t>22. Li Y., Sun Q., Li H., Specia L., Schuller B.W., Explainable Detection of Machine Generated Music and Early Systematic Evaluation, Sci. Rep., 16, 13757, 2026.</w:t>
+        <w:t xml:space="preserve">22. Li Y., Sun Q., Li </w:t>
+      </w:r>
+      <w:proofErr w:type="gramStart"/>
+      <w:r>
+        <w:rPr>
+          <w:sz w:val="18"/>
+        </w:rPr>
+        <w:t>H., Specia L</w:t>
+      </w:r>
+      <w:proofErr w:type="gramEnd"/>
+      <w:r>
+        <w:rPr>
+          <w:sz w:val="18"/>
+        </w:rPr>
+        <w:t>., Schuller B.W., Explainable Detection of Machine Generated Music and Early Systematic Evaluation, Sci. Rep., 16, 13757, 2026.</w:t>
       </w:r>
     </w:p>
     <w:p>
@@ -11303,7 +11556,21 @@
         <w:rPr>
           <w:sz w:val="18"/>
         </w:rPr>
-        <w:t>34. Rahman M.A., Hakim Z.I.A., Sarker N.H., Paul B., Fattah S.A., SONICS: Synthetic Or Not -- Identifying Counterfeit Songs, Proceedings of the International Conference on Learning Representations (ICLR 2025), Singapur, 24-28 Nisan, 2025.</w:t>
+        <w:t xml:space="preserve">34. Rahman M.A., Hakim Z.I.A., Sarker N.H., Paul B., Fattah S.A., SONICS: Synthetic </w:t>
+      </w:r>
+      <w:proofErr w:type="gramStart"/>
+      <w:r>
+        <w:rPr>
+          <w:sz w:val="18"/>
+        </w:rPr>
+        <w:t>Or</w:t>
+      </w:r>
+      <w:proofErr w:type="gramEnd"/>
+      <w:r>
+        <w:rPr>
+          <w:sz w:val="18"/>
+        </w:rPr>
+        <w:t xml:space="preserve"> Not -- Identifying Counterfeit Songs, Proceedings of the International Conference on Learning Representations (ICLR 2025), Singapur, 24-28 Nisan, 2025.</w:t>
       </w:r>
     </w:p>
     <w:p>
@@ -11319,6 +11586,7 @@
         <w:rPr>
           <w:sz w:val="18"/>
         </w:rPr>
+        <w:lastRenderedPageBreak/>
         <w:t>36. Guo Y., Huang H., Chen X., Zhao H., Wang Y., Audio Deepfake Detection with Self-Supervised WavLM and Multi-Fusion Attentive Classifier, Proceedings of the IEEE International Conference on Acoustics, Speech and Signal Processing (ICASSP 2024), 12702-12706, Seoul, Güney Kore, 14-19 Nisan, 2024.</w:t>
       </w:r>
     </w:p>
@@ -11335,7 +11603,6 @@
         <w:rPr>
           <w:sz w:val="18"/>
         </w:rPr>
-        <w:lastRenderedPageBreak/>
         <w:t>38. Pedregosa F. vd., Scikit-learn: Machine Learning in Python, J. Mach. Learn. Res., 12, 2825-2830, 2011.</w:t>
       </w:r>
     </w:p>
@@ -12044,7 +12311,6 @@
   <w:style w:type="character" w:default="1" w:styleId="VarsaylanParagrafYazTipi">
     <w:name w:val="Default Paragraph Font"/>
     <w:uiPriority w:val="1"/>
-    <w:semiHidden/>
     <w:unhideWhenUsed/>
   </w:style>
   <w:style w:type="table" w:default="1" w:styleId="NormalTablo">

</xml_diff>

<commit_message>
Add script to update references in AURIS document and remove obsolete file
</commit_message>
<xml_diff>
--- a/docs/academic/paper/deliverables/AURIS_Makale_Metni.docx
+++ b/docs/academic/paper/deliverables/AURIS_Makale_Metni.docx
@@ -716,43 +716,7 @@
                 <w:szCs w:val="20"/>
                 <w:lang w:val="tr-TR"/>
               </w:rPr>
-              <w:t xml:space="preserve">Ondalıklı sayılar </w:t>
-            </w:r>
-            <w:proofErr w:type="spellStart"/>
-            <w:r>
-              <w:rPr>
-                <w:sz w:val="20"/>
-                <w:szCs w:val="20"/>
-                <w:lang w:val="tr-TR"/>
-              </w:rPr>
-              <w:t>Türkçe’de</w:t>
-            </w:r>
-            <w:proofErr w:type="spellEnd"/>
-            <w:r>
-              <w:rPr>
-                <w:sz w:val="20"/>
-                <w:szCs w:val="20"/>
-                <w:lang w:val="tr-TR"/>
-              </w:rPr>
-              <w:t xml:space="preserve"> virgül ile </w:t>
-            </w:r>
-            <w:proofErr w:type="spellStart"/>
-            <w:r>
-              <w:rPr>
-                <w:sz w:val="20"/>
-                <w:szCs w:val="20"/>
-                <w:lang w:val="tr-TR"/>
-              </w:rPr>
-              <w:t>İngilizce’de</w:t>
-            </w:r>
-            <w:proofErr w:type="spellEnd"/>
-            <w:r>
-              <w:rPr>
-                <w:sz w:val="20"/>
-                <w:szCs w:val="20"/>
-                <w:lang w:val="tr-TR"/>
-              </w:rPr>
-              <w:t xml:space="preserve"> nokta ile ayrılmıştır.</w:t>
+              <w:t>Ondalıklı sayılar Türkçe’de virgül ile İngilizce’de nokta ile ayrılmıştır.</w:t>
             </w:r>
           </w:p>
           <w:p>
@@ -815,25 +779,7 @@
                 <w:szCs w:val="20"/>
                 <w:lang w:val="tr-TR"/>
               </w:rPr>
-              <w:t>(</w:t>
-            </w:r>
-            <w:proofErr w:type="spellStart"/>
-            <w:r>
-              <w:rPr>
-                <w:sz w:val="20"/>
-                <w:szCs w:val="20"/>
-                <w:lang w:val="tr-TR"/>
-              </w:rPr>
-              <w:t>Bknz</w:t>
-            </w:r>
-            <w:proofErr w:type="spellEnd"/>
-            <w:r>
-              <w:rPr>
-                <w:sz w:val="20"/>
-                <w:szCs w:val="20"/>
-                <w:lang w:val="tr-TR"/>
-              </w:rPr>
-              <w:t xml:space="preserve">. Yazar Rehberi / </w:t>
+              <w:t xml:space="preserve">(Bknz. Yazar Rehberi / </w:t>
             </w:r>
             <w:r>
               <w:rPr>
@@ -1633,7 +1579,31 @@
         <w:rPr>
           <w:sz w:val="18"/>
         </w:rPr>
-        <w:t>Suno, Udio ve MusicGen gibi metinden müziğe üretim sistemlerinin yaygınlaşması, üretilen parçaların insan kayıtlarından ayırt edilmesini somut bir tespit problemi hâline getirmiştir. Bu çalışmada, 47 boyutlu akustik öznitelik vektörü ile yedi makine öğrenmesi ve dört derin öğrenme algoritmasından oluşan on bir modelli bir topluluk yaklaşımını birleştiren AURIS sistemi önerilmektedir. Modeller, sekiz farklı yapay zekâ üretici kaynağından ve birden çok insan veri kümesinden derlenen 5.195 örneklik bir veri kümesi üzerinde 5-katlı çapraz doğrulama ile değerlendirilmiştir. LightGBM, %95,48 ROC-AUC ve ±0,0023 standart sapma ile hem en yüksek ortalamayı hem de havuzdaki en düşük varyansı elde etmiştir. Spektral düzlük standart sapması öznitelik önem analizinde birinci sıraya yerleşmiştir. Youden J kriteri ile belirlenen θ* = 0,4316 karar eşiği varsayılan 0,5 değerine kıyasla dengeli doğruluğu iyileştirmiş; 0,083 Brier skoru olasılık çıktılarının iyi kalibre olduğunu ortaya koymuştur.</w:t>
+        <w:t>Suno, Udio ve MusicGen gibi metinden müziğe üretim sistemlerinin yaygınlaşması, üretilen parçaların insan kayıtlarından ayırt edilmesini somut bir tespit problemi hâline getirmiştir. Bu çalışmada, 47 boyutlu akustik öznitelik vektörü ile yedi makine öğrenmesi ve dört derin öğrenme algoritmasından oluşan on bir modelli bir topluluk yaklaşımını birleştiren AURIS</w:t>
+      </w:r>
+      <w:r>
+        <w:rPr>
+          <w:sz w:val="18"/>
+        </w:rPr>
+        <w:t xml:space="preserve"> adı verilen</w:t>
+      </w:r>
+      <w:r>
+        <w:rPr>
+          <w:sz w:val="18"/>
+        </w:rPr>
+        <w:t xml:space="preserve"> sistem önerilmektedir. Modeller, sekiz farklı yapay zekâ üretici kaynağından ve birden çok insan veri kümesinden derlenen 5.195 örnek</w:t>
+      </w:r>
+      <w:r>
+        <w:rPr>
+          <w:sz w:val="18"/>
+        </w:rPr>
+        <w:t>lem içeren</w:t>
+      </w:r>
+      <w:r>
+        <w:rPr>
+          <w:sz w:val="18"/>
+        </w:rPr>
+        <w:t xml:space="preserve"> bir veri kümesi üzerinde 5-katlı çapraz doğrulama ile değerlendirilmiştir. LightGBM, %95,48 ROC-AUC ve ±0,0023 standart sapma ile hem en yüksek ortalamayı hem de havuzdaki en düşük varyansı elde etmiştir. Spektral düzlük standart sapması öznitelik önem analizinde birinci sıraya yerleşmiştir. Youden J kriteri ile belirlenen θ* = 0,4316 karar eşiği varsayılan 0,5 değerine kıyasla dengeli doğruluğu iyileştirmiş; 0,083 Brier skoru olasılık çıktılarının iyi kalibre olduğunu ortaya koymuştur.</w:t>
       </w:r>
     </w:p>
     <w:p>
@@ -1756,21 +1726,7 @@
         <w:rPr>
           <w:sz w:val="18"/>
         </w:rPr>
-        <w:t xml:space="preserve">The proliferation of text-to-music generators such as Suno, Udio and MusicGen has raised a detection problem of practical importance for copyright attribution and streaming-platform integrity. This paper proposes AURIS, a system that couples a 47-dimensional handcrafted acoustic feature vector with an ensemble of eleven classifiers (seven machine learning and four deep learning architectures). The models are trained on 5,195 samples drawn from twelve AI generation systems and multiple human sources under 5-fold cross-validation. LightGBM achieves the top ROC-AUC of 0.9548 with ±0.0023 cross-fold standard deviation, combining the best </w:t>
-      </w:r>
-      <w:proofErr w:type="gramStart"/>
-      <w:r>
-        <w:rPr>
-          <w:sz w:val="18"/>
-        </w:rPr>
-        <w:t>mean</w:t>
-      </w:r>
-      <w:proofErr w:type="gramEnd"/>
-      <w:r>
-        <w:rPr>
-          <w:sz w:val="18"/>
-        </w:rPr>
-        <w:t xml:space="preserve"> with the lowest variance in the pool. Spectral-flatness standard deviation ranks first in feature importance. A Youden-J optimised threshold of θ* = 0.4316 improves balanced accuracy over the default 0.5 cutoff, and a Brier score of 0.083 confirms that the probability outputs are well calibrated.</w:t>
+        <w:t>The proliferation of text-to-music generators such as Suno, Udio and MusicGen has raised a detection problem of practical importance for copyright attribution and streaming-platform integrity. This paper proposes AURIS, a system that couples a 47-dimensional handcrafted acoustic feature vector with an ensemble of eleven classifiers (seven machine learning and four deep learning architectures). The models are trained on 5,195 samples drawn from twelve AI generation systems and multiple human sources under 5-fold cross-validation. LightGBM achieves the top ROC-AUC of 0.9548 with ±0.0023 cross-fold standard deviation, combining the best mean with the lowest variance in the pool. Spectral-flatness standard deviation ranks first in feature importance. A Youden-J optimised threshold of θ* = 0.4316 improves balanced accuracy over the default 0.5 cutoff, and a Brier score of 0.083 confirms that the probability outputs are well calibrated.</w:t>
       </w:r>
     </w:p>
     <w:p>
@@ -4178,35 +4134,7 @@
         <w:rPr>
           <w:sz w:val="18"/>
         </w:rPr>
-        <w:t>J(θ) = TPR(θ) − FPR(</w:t>
-      </w:r>
-      <w:proofErr w:type="gramStart"/>
-      <w:r>
-        <w:rPr>
-          <w:sz w:val="18"/>
-        </w:rPr>
-        <w:t xml:space="preserve">θ)   </w:t>
-      </w:r>
-      <w:proofErr w:type="gramEnd"/>
-      <w:r>
-        <w:rPr>
-          <w:sz w:val="18"/>
-        </w:rPr>
-        <w:t xml:space="preserve">                                              </w:t>
-      </w:r>
-      <w:proofErr w:type="gramStart"/>
-      <w:r>
-        <w:rPr>
-          <w:sz w:val="18"/>
-        </w:rPr>
-        <w:t xml:space="preserve">   (</w:t>
-      </w:r>
-      <w:proofErr w:type="gramEnd"/>
-      <w:r>
-        <w:rPr>
-          <w:sz w:val="18"/>
-        </w:rPr>
-        <w:t>1)</w:t>
+        <w:t>J(θ) = TPR(θ) − FPR(θ)                                                    (1)</w:t>
       </w:r>
     </w:p>
     <w:p/>
@@ -4224,35 +4152,7 @@
         <w:rPr>
           <w:sz w:val="18"/>
         </w:rPr>
-        <w:t xml:space="preserve">BS = (1/N) Σᵢ (pᵢ − </w:t>
-      </w:r>
-      <w:proofErr w:type="gramStart"/>
-      <w:r>
-        <w:rPr>
-          <w:sz w:val="18"/>
-        </w:rPr>
-        <w:t>yᵢ)²</w:t>
-      </w:r>
-      <w:proofErr w:type="gramEnd"/>
-      <w:r>
-        <w:rPr>
-          <w:sz w:val="18"/>
-        </w:rPr>
-        <w:t xml:space="preserve">                                               </w:t>
-      </w:r>
-      <w:proofErr w:type="gramStart"/>
-      <w:r>
-        <w:rPr>
-          <w:sz w:val="18"/>
-        </w:rPr>
-        <w:t xml:space="preserve">   (</w:t>
-      </w:r>
-      <w:proofErr w:type="gramEnd"/>
-      <w:r>
-        <w:rPr>
-          <w:sz w:val="18"/>
-        </w:rPr>
-        <w:t>2)</w:t>
+        <w:t>BS = (1/N) Σᵢ (pᵢ − yᵢ)²                                                  (2)</w:t>
       </w:r>
     </w:p>
     <w:p/>
@@ -4363,7 +4263,6 @@
               <w:spacing w:line="360" w:lineRule="auto"/>
               <w:jc w:val="center"/>
             </w:pPr>
-            <w:proofErr w:type="spellStart"/>
             <w:r>
               <w:rPr>
                 <w:b w:val="0"/>
@@ -4371,7 +4270,6 @@
               </w:rPr>
               <w:t>Sıra</w:t>
             </w:r>
-            <w:proofErr w:type="spellEnd"/>
           </w:p>
         </w:tc>
         <w:tc>
@@ -5990,81 +5888,17 @@
         <w:spacing w:line="360" w:lineRule="auto"/>
         <w:jc w:val="center"/>
       </w:pPr>
-      <w:proofErr w:type="spellStart"/>
-      <w:r>
-        <w:rPr>
-          <w:sz w:val="18"/>
-        </w:rPr>
-        <w:t>Şekil</w:t>
-      </w:r>
-      <w:proofErr w:type="spellEnd"/>
-      <w:r>
-        <w:rPr>
-          <w:sz w:val="18"/>
-        </w:rPr>
-        <w:t xml:space="preserve"> 3. On </w:t>
-      </w:r>
-      <w:proofErr w:type="spellStart"/>
-      <w:r>
-        <w:rPr>
-          <w:sz w:val="18"/>
-        </w:rPr>
-        <w:t>bir</w:t>
-      </w:r>
-      <w:proofErr w:type="spellEnd"/>
-      <w:r>
-        <w:rPr>
-          <w:sz w:val="18"/>
-        </w:rPr>
-        <w:t xml:space="preserve"> </w:t>
-      </w:r>
-      <w:proofErr w:type="spellStart"/>
-      <w:r>
-        <w:rPr>
-          <w:sz w:val="18"/>
-        </w:rPr>
-        <w:t>modelin</w:t>
-      </w:r>
-      <w:proofErr w:type="spellEnd"/>
-      <w:r>
-        <w:rPr>
-          <w:sz w:val="18"/>
-        </w:rPr>
-        <w:t xml:space="preserve"> </w:t>
-      </w:r>
-      <w:proofErr w:type="spellStart"/>
-      <w:r>
-        <w:rPr>
-          <w:sz w:val="18"/>
-        </w:rPr>
-        <w:t>performans</w:t>
-      </w:r>
-      <w:proofErr w:type="spellEnd"/>
-      <w:r>
-        <w:rPr>
-          <w:sz w:val="18"/>
-        </w:rPr>
-        <w:t xml:space="preserve"> </w:t>
-      </w:r>
-      <w:proofErr w:type="spellStart"/>
-      <w:r>
-        <w:rPr>
-          <w:sz w:val="18"/>
-        </w:rPr>
-        <w:t>karşılaştırmas</w:t>
-      </w:r>
-      <w:r>
-        <w:rPr>
-          <w:sz w:val="18"/>
-        </w:rPr>
-        <w:t>ı</w:t>
-      </w:r>
-      <w:proofErr w:type="spellEnd"/>
-      <w:r>
-        <w:rPr>
-          <w:sz w:val="18"/>
-        </w:rPr>
-        <w:t xml:space="preserve">. </w:t>
+      <w:r>
+        <w:rPr>
+          <w:sz w:val="18"/>
+        </w:rPr>
+        <w:t>Şekil 3. On bir modelin performans karşılaştırmas</w:t>
+      </w:r>
+      <w:r>
+        <w:rPr>
+          <w:sz w:val="18"/>
+        </w:rPr>
+        <w:t xml:space="preserve">ı. </w:t>
       </w:r>
       <w:r>
         <w:rPr>
@@ -6985,7 +6819,6 @@
               <w:spacing w:line="360" w:lineRule="auto"/>
               <w:jc w:val="center"/>
             </w:pPr>
-            <w:proofErr w:type="spellStart"/>
             <w:r>
               <w:rPr>
                 <w:b w:val="0"/>
@@ -6993,7 +6826,6 @@
               </w:rPr>
               <w:t>Sıra</w:t>
             </w:r>
-            <w:proofErr w:type="spellEnd"/>
           </w:p>
         </w:tc>
         <w:tc>
@@ -7684,19 +7516,11 @@
         <w:spacing w:line="360" w:lineRule="auto"/>
         <w:jc w:val="center"/>
       </w:pPr>
-      <w:proofErr w:type="spellStart"/>
-      <w:r>
-        <w:rPr>
-          <w:sz w:val="18"/>
-        </w:rPr>
-        <w:t>Şekil</w:t>
-      </w:r>
-      <w:proofErr w:type="spellEnd"/>
-      <w:r>
-        <w:rPr>
-          <w:sz w:val="18"/>
-        </w:rPr>
-        <w:t xml:space="preserve"> </w:t>
+      <w:r>
+        <w:rPr>
+          <w:sz w:val="18"/>
+        </w:rPr>
+        <w:t xml:space="preserve">Şekil </w:t>
       </w:r>
       <w:r>
         <w:rPr>
@@ -7720,21 +7544,7 @@
         <w:rPr>
           <w:sz w:val="16"/>
         </w:rPr>
-        <w:t>(</w:t>
-      </w:r>
-      <w:proofErr w:type="gramStart"/>
-      <w:r>
-        <w:rPr>
-          <w:sz w:val="16"/>
-        </w:rPr>
-        <w:t>Top-twenty</w:t>
-      </w:r>
-      <w:proofErr w:type="gramEnd"/>
-      <w:r>
-        <w:rPr>
-          <w:sz w:val="16"/>
-        </w:rPr>
-        <w:t xml:space="preserve"> feature importance scores.)</w:t>
+        <w:t>(Top-twenty feature importance scores.)</w:t>
       </w:r>
     </w:p>
     <w:p>
@@ -7800,19 +7610,11 @@
         <w:spacing w:line="360" w:lineRule="auto"/>
         <w:jc w:val="center"/>
       </w:pPr>
-      <w:proofErr w:type="spellStart"/>
-      <w:r>
-        <w:rPr>
-          <w:sz w:val="18"/>
-        </w:rPr>
-        <w:t>Şekil</w:t>
-      </w:r>
-      <w:proofErr w:type="spellEnd"/>
-      <w:r>
-        <w:rPr>
-          <w:sz w:val="18"/>
-        </w:rPr>
-        <w:t xml:space="preserve"> </w:t>
+      <w:r>
+        <w:rPr>
+          <w:sz w:val="18"/>
+        </w:rPr>
+        <w:t xml:space="preserve">Şekil </w:t>
       </w:r>
       <w:r>
         <w:rPr>
@@ -7919,19 +7721,11 @@
         <w:spacing w:line="360" w:lineRule="auto"/>
         <w:jc w:val="center"/>
       </w:pPr>
-      <w:proofErr w:type="spellStart"/>
-      <w:r>
-        <w:rPr>
-          <w:sz w:val="18"/>
-        </w:rPr>
-        <w:t>Şekil</w:t>
-      </w:r>
-      <w:proofErr w:type="spellEnd"/>
-      <w:r>
-        <w:rPr>
-          <w:sz w:val="18"/>
-        </w:rPr>
-        <w:t xml:space="preserve"> </w:t>
+      <w:r>
+        <w:rPr>
+          <w:sz w:val="18"/>
+        </w:rPr>
+        <w:t xml:space="preserve">Şekil </w:t>
       </w:r>
       <w:r>
         <w:rPr>
@@ -8014,19 +7808,11 @@
         <w:spacing w:line="360" w:lineRule="auto"/>
         <w:jc w:val="center"/>
       </w:pPr>
-      <w:proofErr w:type="spellStart"/>
-      <w:r>
-        <w:rPr>
-          <w:sz w:val="18"/>
-        </w:rPr>
-        <w:t>Şekil</w:t>
-      </w:r>
-      <w:proofErr w:type="spellEnd"/>
-      <w:r>
-        <w:rPr>
-          <w:sz w:val="18"/>
-        </w:rPr>
-        <w:t xml:space="preserve"> </w:t>
+      <w:r>
+        <w:rPr>
+          <w:sz w:val="18"/>
+        </w:rPr>
+        <w:t xml:space="preserve">Şekil </w:t>
       </w:r>
       <w:r>
         <w:rPr>
@@ -8050,49 +7836,13 @@
         <w:rPr>
           <w:sz w:val="18"/>
         </w:rPr>
-        <w:t xml:space="preserve">) </w:t>
-      </w:r>
-      <w:proofErr w:type="spellStart"/>
-      <w:r>
-        <w:rPr>
-          <w:sz w:val="18"/>
-        </w:rPr>
-        <w:t>tahmin</w:t>
-      </w:r>
-      <w:proofErr w:type="spellEnd"/>
-      <w:r>
-        <w:rPr>
-          <w:sz w:val="18"/>
-        </w:rPr>
-        <w:t xml:space="preserve"> </w:t>
-      </w:r>
-      <w:proofErr w:type="spellStart"/>
-      <w:r>
-        <w:rPr>
-          <w:sz w:val="18"/>
-        </w:rPr>
-        <w:t>olasılık</w:t>
-      </w:r>
-      <w:proofErr w:type="spellEnd"/>
-      <w:r>
-        <w:rPr>
-          <w:sz w:val="18"/>
-        </w:rPr>
-        <w:t xml:space="preserve"> </w:t>
-      </w:r>
-      <w:proofErr w:type="spellStart"/>
-      <w:r>
-        <w:rPr>
-          <w:sz w:val="18"/>
-        </w:rPr>
-        <w:t>dağılımı</w:t>
-      </w:r>
-      <w:proofErr w:type="spellEnd"/>
-      <w:r>
-        <w:rPr>
-          <w:sz w:val="18"/>
-        </w:rPr>
-        <w:t xml:space="preserve">. </w:t>
+        <w:t xml:space="preserve">) tahmin olasılık </w:t>
+      </w:r>
+      <w:r>
+        <w:rPr>
+          <w:sz w:val="18"/>
+        </w:rPr>
+        <w:t xml:space="preserve">dağılımı. </w:t>
       </w:r>
       <w:r>
         <w:rPr>
@@ -8164,19 +7914,11 @@
         <w:spacing w:line="360" w:lineRule="auto"/>
         <w:jc w:val="center"/>
       </w:pPr>
-      <w:proofErr w:type="spellStart"/>
-      <w:r>
-        <w:rPr>
-          <w:sz w:val="18"/>
-        </w:rPr>
-        <w:t>Şekil</w:t>
-      </w:r>
-      <w:proofErr w:type="spellEnd"/>
-      <w:r>
-        <w:rPr>
-          <w:sz w:val="18"/>
-        </w:rPr>
-        <w:t xml:space="preserve"> </w:t>
+      <w:r>
+        <w:rPr>
+          <w:sz w:val="18"/>
+        </w:rPr>
+        <w:t xml:space="preserve">Şekil </w:t>
       </w:r>
       <w:r>
         <w:rPr>
@@ -8265,19 +8007,11 @@
         <w:spacing w:line="360" w:lineRule="auto"/>
         <w:jc w:val="center"/>
       </w:pPr>
-      <w:proofErr w:type="spellStart"/>
-      <w:r>
-        <w:rPr>
-          <w:sz w:val="18"/>
-        </w:rPr>
-        <w:t>Şekil</w:t>
-      </w:r>
-      <w:proofErr w:type="spellEnd"/>
-      <w:r>
-        <w:rPr>
-          <w:sz w:val="18"/>
-        </w:rPr>
-        <w:t xml:space="preserve"> 1</w:t>
+      <w:r>
+        <w:rPr>
+          <w:sz w:val="18"/>
+        </w:rPr>
+        <w:t>Şekil 1</w:t>
       </w:r>
       <w:r>
         <w:rPr>
@@ -8390,19 +8124,11 @@
         <w:spacing w:line="360" w:lineRule="auto"/>
         <w:jc w:val="center"/>
       </w:pPr>
-      <w:proofErr w:type="spellStart"/>
-      <w:r>
-        <w:rPr>
-          <w:sz w:val="18"/>
-        </w:rPr>
-        <w:t>Şekil</w:t>
-      </w:r>
-      <w:proofErr w:type="spellEnd"/>
-      <w:r>
-        <w:rPr>
-          <w:sz w:val="18"/>
-        </w:rPr>
-        <w:t xml:space="preserve"> 1</w:t>
+      <w:r>
+        <w:rPr>
+          <w:sz w:val="18"/>
+        </w:rPr>
+        <w:t>Şekil 1</w:t>
       </w:r>
       <w:r>
         <w:rPr>
@@ -8491,19 +8217,11 @@
         <w:spacing w:line="360" w:lineRule="auto"/>
         <w:jc w:val="center"/>
       </w:pPr>
-      <w:proofErr w:type="spellStart"/>
-      <w:r>
-        <w:rPr>
-          <w:sz w:val="18"/>
-        </w:rPr>
-        <w:t>Şekil</w:t>
-      </w:r>
-      <w:proofErr w:type="spellEnd"/>
-      <w:r>
-        <w:rPr>
-          <w:sz w:val="18"/>
-        </w:rPr>
-        <w:t xml:space="preserve"> 1</w:t>
+      <w:r>
+        <w:rPr>
+          <w:sz w:val="18"/>
+        </w:rPr>
+        <w:t>Şekil 1</w:t>
       </w:r>
       <w:r>
         <w:rPr>
@@ -9253,21 +8971,12 @@
       </w:tr>
     </w:tbl>
     <w:p>
-      <w:proofErr w:type="gramStart"/>
       <w:r>
         <w:rPr>
           <w:i/>
           <w:sz w:val="16"/>
         </w:rPr>
-        <w:t>— :</w:t>
-      </w:r>
-      <w:proofErr w:type="gramEnd"/>
-      <w:r>
-        <w:rPr>
-          <w:i/>
-          <w:sz w:val="16"/>
-        </w:rPr>
-        <w:t xml:space="preserve"> Kaynak yayında rapor edilmemiştir.</w:t>
+        <w:t>— : Kaynak yayında rapor edilmemiştir.</w:t>
       </w:r>
     </w:p>
     <w:p>
@@ -9369,19 +9078,11 @@
         <w:spacing w:line="360" w:lineRule="auto"/>
         <w:jc w:val="center"/>
       </w:pPr>
-      <w:proofErr w:type="spellStart"/>
-      <w:r>
-        <w:rPr>
-          <w:sz w:val="18"/>
-        </w:rPr>
-        <w:t>Şekil</w:t>
-      </w:r>
-      <w:proofErr w:type="spellEnd"/>
-      <w:r>
-        <w:rPr>
-          <w:sz w:val="18"/>
-        </w:rPr>
-        <w:t xml:space="preserve"> 1</w:t>
+      <w:r>
+        <w:rPr>
+          <w:sz w:val="18"/>
+        </w:rPr>
+        <w:t>Şekil 1</w:t>
       </w:r>
       <w:r>
         <w:rPr>
@@ -9494,19 +9195,11 @@
         <w:spacing w:line="360" w:lineRule="auto"/>
         <w:jc w:val="center"/>
       </w:pPr>
-      <w:proofErr w:type="spellStart"/>
-      <w:r>
-        <w:rPr>
-          <w:sz w:val="18"/>
-        </w:rPr>
-        <w:t>Şekil</w:t>
-      </w:r>
-      <w:proofErr w:type="spellEnd"/>
-      <w:r>
-        <w:rPr>
-          <w:sz w:val="18"/>
-        </w:rPr>
-        <w:t xml:space="preserve"> 1</w:t>
+      <w:r>
+        <w:rPr>
+          <w:sz w:val="18"/>
+        </w:rPr>
+        <w:t>Şekil 1</w:t>
       </w:r>
       <w:r>
         <w:rPr>
@@ -9518,63 +9211,13 @@
         <w:rPr>
           <w:sz w:val="18"/>
         </w:rPr>
-        <w:t xml:space="preserve">. 47 </w:t>
-      </w:r>
-      <w:proofErr w:type="spellStart"/>
-      <w:r>
-        <w:rPr>
-          <w:sz w:val="18"/>
-        </w:rPr>
-        <w:t>öznitelik</w:t>
-      </w:r>
-      <w:proofErr w:type="spellEnd"/>
-      <w:r>
-        <w:rPr>
-          <w:sz w:val="18"/>
-        </w:rPr>
-        <w:t xml:space="preserve"> </w:t>
-      </w:r>
-      <w:proofErr w:type="spellStart"/>
-      <w:r>
-        <w:rPr>
-          <w:sz w:val="18"/>
-        </w:rPr>
-        <w:t>korelasyon</w:t>
-      </w:r>
-      <w:proofErr w:type="spellEnd"/>
-      <w:r>
-        <w:rPr>
-          <w:sz w:val="18"/>
-        </w:rPr>
-        <w:t xml:space="preserve"> </w:t>
-      </w:r>
-      <w:proofErr w:type="spellStart"/>
-      <w:r>
-        <w:rPr>
-          <w:sz w:val="18"/>
-        </w:rPr>
-        <w:t>ısı</w:t>
-      </w:r>
-      <w:proofErr w:type="spellEnd"/>
-      <w:r>
-        <w:rPr>
-          <w:sz w:val="18"/>
-        </w:rPr>
-        <w:t xml:space="preserve"> </w:t>
-      </w:r>
-      <w:proofErr w:type="spellStart"/>
-      <w:r>
-        <w:rPr>
-          <w:sz w:val="18"/>
-        </w:rPr>
-        <w:t>haritası</w:t>
-      </w:r>
-      <w:proofErr w:type="spellEnd"/>
-      <w:r>
-        <w:rPr>
-          <w:sz w:val="18"/>
-        </w:rPr>
-        <w:t xml:space="preserve">. </w:t>
+        <w:t xml:space="preserve">. 47 öznitelik korelasyon </w:t>
+      </w:r>
+      <w:r>
+        <w:rPr>
+          <w:sz w:val="18"/>
+        </w:rPr>
+        <w:t xml:space="preserve">ısı haritası. </w:t>
       </w:r>
       <w:r>
         <w:rPr>
@@ -9641,19 +9284,11 @@
         <w:spacing w:line="360" w:lineRule="auto"/>
         <w:jc w:val="center"/>
       </w:pPr>
-      <w:proofErr w:type="spellStart"/>
-      <w:r>
-        <w:rPr>
-          <w:sz w:val="18"/>
-        </w:rPr>
-        <w:t>Şekil</w:t>
-      </w:r>
-      <w:proofErr w:type="spellEnd"/>
-      <w:r>
-        <w:rPr>
-          <w:sz w:val="18"/>
-        </w:rPr>
-        <w:t xml:space="preserve"> 1</w:t>
+      <w:r>
+        <w:rPr>
+          <w:sz w:val="18"/>
+        </w:rPr>
+        <w:t>Şekil 1</w:t>
       </w:r>
       <w:r>
         <w:rPr>
@@ -9700,21 +9335,12 @@
         </w:rPr>
         <w:t xml:space="preserve">4. </w:t>
       </w:r>
-      <w:proofErr w:type="spellStart"/>
       <w:r>
         <w:rPr>
           <w:b/>
           <w:sz w:val="18"/>
         </w:rPr>
-        <w:t>Simgeler</w:t>
-      </w:r>
-      <w:proofErr w:type="spellEnd"/>
-      <w:r>
-        <w:rPr>
-          <w:b/>
-          <w:sz w:val="18"/>
-        </w:rPr>
-        <w:t xml:space="preserve"> (Symbols</w:t>
+        <w:t>Simgeler (Symbols</w:t>
       </w:r>
       <w:r>
         <w:rPr>
@@ -9892,21 +9518,12 @@
                 <w:lang w:val="tr-TR"/>
               </w:rPr>
             </w:pPr>
-            <w:proofErr w:type="spellStart"/>
-            <w:r>
-              <w:rPr>
-                <w:sz w:val="18"/>
-                <w:lang w:val="tr-TR"/>
-              </w:rPr>
-              <w:t>Brier</w:t>
-            </w:r>
-            <w:proofErr w:type="spellEnd"/>
-            <w:r>
-              <w:rPr>
-                <w:sz w:val="18"/>
-                <w:lang w:val="tr-TR"/>
-              </w:rPr>
-              <w:t xml:space="preserve"> Skoru (Modelin olasılık kalibrasyon kalitesi ölçütü)</w:t>
+            <w:r>
+              <w:rPr>
+                <w:sz w:val="18"/>
+                <w:lang w:val="tr-TR"/>
+              </w:rPr>
+              <w:t>Brier Skoru (Modelin olasılık kalibrasyon kalitesi ölçütü)</w:t>
             </w:r>
           </w:p>
         </w:tc>
@@ -9975,39 +9592,7 @@
                 <w:sz w:val="18"/>
                 <w:lang w:val="tr-TR"/>
               </w:rPr>
-              <w:t>Yanlış Pozitif Oranı (</w:t>
-            </w:r>
-            <w:proofErr w:type="spellStart"/>
-            <w:r>
-              <w:rPr>
-                <w:sz w:val="18"/>
-                <w:lang w:val="tr-TR"/>
-              </w:rPr>
-              <w:t>False</w:t>
-            </w:r>
-            <w:proofErr w:type="spellEnd"/>
-            <w:r>
-              <w:rPr>
-                <w:sz w:val="18"/>
-                <w:lang w:val="tr-TR"/>
-              </w:rPr>
-              <w:t xml:space="preserve"> </w:t>
-            </w:r>
-            <w:proofErr w:type="spellStart"/>
-            <w:r>
-              <w:rPr>
-                <w:sz w:val="18"/>
-                <w:lang w:val="tr-TR"/>
-              </w:rPr>
-              <w:t>Positive</w:t>
-            </w:r>
-            <w:proofErr w:type="spellEnd"/>
-            <w:r>
-              <w:rPr>
-                <w:sz w:val="18"/>
-                <w:lang w:val="tr-TR"/>
-              </w:rPr>
-              <w:t xml:space="preserve"> Rate)</w:t>
+              <w:t>Yanlış Pozitif Oranı (False Positive Rate)</w:t>
             </w:r>
           </w:p>
         </w:tc>
@@ -10074,21 +9659,12 @@
                 <w:lang w:val="tr-TR"/>
               </w:rPr>
             </w:pPr>
-            <w:proofErr w:type="spellStart"/>
-            <w:r>
-              <w:rPr>
-                <w:sz w:val="18"/>
-                <w:lang w:val="tr-TR"/>
-              </w:rPr>
-              <w:t>Youden'ın</w:t>
-            </w:r>
-            <w:proofErr w:type="spellEnd"/>
-            <w:r>
-              <w:rPr>
-                <w:sz w:val="18"/>
-                <w:lang w:val="tr-TR"/>
-              </w:rPr>
-              <w:t xml:space="preserve"> J istatistiği (Eşik optimizasyon kriteri)</w:t>
+            <w:r>
+              <w:rPr>
+                <w:sz w:val="18"/>
+                <w:lang w:val="tr-TR"/>
+              </w:rPr>
+              <w:t>Youden'ın J istatistiği (Eşik optimizasyon kriteri)</w:t>
             </w:r>
           </w:p>
         </w:tc>
@@ -10197,7 +9773,6 @@
                 <w:lang w:val="tr-TR"/>
               </w:rPr>
             </w:pPr>
-            <w:proofErr w:type="gramStart"/>
             <w:r>
               <w:rPr>
                 <w:b w:val="0"/>
@@ -10209,7 +9784,6 @@
               </w:rPr>
               <w:t>pᵢ</w:t>
             </w:r>
-            <w:proofErr w:type="gramEnd"/>
           </w:p>
         </w:tc>
         <w:tc>
@@ -10279,7 +9853,6 @@
                 <w:lang w:val="tr-TR"/>
               </w:rPr>
             </w:pPr>
-            <w:proofErr w:type="gramStart"/>
             <w:r>
               <w:rPr>
                 <w:b w:val="0"/>
@@ -10291,7 +9864,6 @@
               </w:rPr>
               <w:t>r</w:t>
             </w:r>
-            <w:proofErr w:type="gramEnd"/>
           </w:p>
         </w:tc>
         <w:tc>
@@ -10308,21 +9880,12 @@
                 <w:lang w:val="tr-TR"/>
               </w:rPr>
             </w:pPr>
-            <w:proofErr w:type="spellStart"/>
-            <w:r>
-              <w:rPr>
-                <w:sz w:val="18"/>
-                <w:lang w:val="tr-TR"/>
-              </w:rPr>
-              <w:t>Pearson</w:t>
-            </w:r>
-            <w:proofErr w:type="spellEnd"/>
-            <w:r>
-              <w:rPr>
-                <w:sz w:val="18"/>
-                <w:lang w:val="tr-TR"/>
-              </w:rPr>
-              <w:t xml:space="preserve"> korelasyon katsayısı</w:t>
+            <w:r>
+              <w:rPr>
+                <w:sz w:val="18"/>
+                <w:lang w:val="tr-TR"/>
+              </w:rPr>
+              <w:t>Pearson korelasyon katsayısı</w:t>
             </w:r>
           </w:p>
         </w:tc>
@@ -10394,23 +9957,7 @@
                 <w:sz w:val="18"/>
                 <w:lang w:val="tr-TR"/>
               </w:rPr>
-              <w:t xml:space="preserve">Doğru Pozitif Oranı (True </w:t>
-            </w:r>
-            <w:proofErr w:type="spellStart"/>
-            <w:r>
-              <w:rPr>
-                <w:sz w:val="18"/>
-                <w:lang w:val="tr-TR"/>
-              </w:rPr>
-              <w:t>Positive</w:t>
-            </w:r>
-            <w:proofErr w:type="spellEnd"/>
-            <w:r>
-              <w:rPr>
-                <w:sz w:val="18"/>
-                <w:lang w:val="tr-TR"/>
-              </w:rPr>
-              <w:t xml:space="preserve"> Rate / Duyarlılık)</w:t>
+              <w:t>Doğru Pozitif Oranı (True Positive Rate / Duyarlılık)</w:t>
             </w:r>
           </w:p>
         </w:tc>
@@ -10447,7 +9994,6 @@
                 <w:lang w:val="tr-TR"/>
               </w:rPr>
             </w:pPr>
-            <w:proofErr w:type="gramStart"/>
             <w:r>
               <w:rPr>
                 <w:b w:val="0"/>
@@ -10459,7 +10005,6 @@
               </w:rPr>
               <w:t>yᵢ</w:t>
             </w:r>
-            <w:proofErr w:type="gramEnd"/>
           </w:p>
         </w:tc>
         <w:tc>
@@ -10532,7 +10077,6 @@
                 <w:lang w:val="tr-TR"/>
               </w:rPr>
             </w:pPr>
-            <w:proofErr w:type="gramStart"/>
             <w:r>
               <w:rPr>
                 <w:b w:val="0"/>
@@ -10544,7 +10088,6 @@
               </w:rPr>
               <w:t>θ</w:t>
             </w:r>
-            <w:proofErr w:type="gramEnd"/>
           </w:p>
         </w:tc>
         <w:tc>
@@ -10603,7 +10146,6 @@
                 <w:lang w:val="tr-TR"/>
               </w:rPr>
             </w:pPr>
-            <w:proofErr w:type="gramStart"/>
             <w:r>
               <w:rPr>
                 <w:b w:val="0"/>
@@ -10615,7 +10157,6 @@
               </w:rPr>
               <w:t>θ</w:t>
             </w:r>
-            <w:proofErr w:type="gramEnd"/>
             <w:r>
               <w:rPr>
                 <w:b w:val="0"/>
@@ -10641,21 +10182,12 @@
                 <w:lang w:val="tr-TR"/>
               </w:rPr>
             </w:pPr>
-            <w:proofErr w:type="spellStart"/>
-            <w:r>
-              <w:rPr>
-                <w:sz w:val="18"/>
-                <w:lang w:val="tr-TR"/>
-              </w:rPr>
-              <w:t>Youden</w:t>
-            </w:r>
-            <w:proofErr w:type="spellEnd"/>
-            <w:r>
-              <w:rPr>
-                <w:sz w:val="18"/>
-                <w:lang w:val="tr-TR"/>
-              </w:rPr>
-              <w:t xml:space="preserve"> J kriteri ile optimize edilmiş en uygun (optimal) karar eşiği</w:t>
+            <w:r>
+              <w:rPr>
+                <w:sz w:val="18"/>
+                <w:lang w:val="tr-TR"/>
+              </w:rPr>
+              <w:t>Youden J kriteri ile optimize edilmiş en uygun (optimal) karar eşiği</w:t>
             </w:r>
           </w:p>
         </w:tc>
@@ -10786,327 +10318,7 @@
         <w:rPr>
           <w:sz w:val="18"/>
         </w:rPr>
-        <w:t xml:space="preserve">    </w:t>
-      </w:r>
-      <w:r>
-        <w:rPr>
-          <w:sz w:val="18"/>
-        </w:rPr>
-        <w:t xml:space="preserve">Bu </w:t>
-      </w:r>
-      <w:proofErr w:type="spellStart"/>
-      <w:r>
-        <w:rPr>
-          <w:sz w:val="18"/>
-        </w:rPr>
-        <w:t>çalışmada</w:t>
-      </w:r>
-      <w:proofErr w:type="spellEnd"/>
-      <w:r>
-        <w:rPr>
-          <w:sz w:val="18"/>
-        </w:rPr>
-        <w:t xml:space="preserve"> </w:t>
-      </w:r>
-      <w:proofErr w:type="spellStart"/>
-      <w:r>
-        <w:rPr>
-          <w:sz w:val="18"/>
-        </w:rPr>
-        <w:t>yalnızca</w:t>
-      </w:r>
-      <w:proofErr w:type="spellEnd"/>
-      <w:r>
-        <w:rPr>
-          <w:sz w:val="18"/>
-        </w:rPr>
-        <w:t xml:space="preserve"> </w:t>
-      </w:r>
-      <w:proofErr w:type="spellStart"/>
-      <w:r>
-        <w:rPr>
-          <w:sz w:val="18"/>
-        </w:rPr>
-        <w:t>kamuya</w:t>
-      </w:r>
-      <w:proofErr w:type="spellEnd"/>
-      <w:r>
-        <w:rPr>
-          <w:sz w:val="18"/>
-        </w:rPr>
-        <w:t xml:space="preserve"> </w:t>
-      </w:r>
-      <w:proofErr w:type="spellStart"/>
-      <w:r>
-        <w:rPr>
-          <w:sz w:val="18"/>
-        </w:rPr>
-        <w:t>açık</w:t>
-      </w:r>
-      <w:proofErr w:type="spellEnd"/>
-      <w:r>
-        <w:rPr>
-          <w:sz w:val="18"/>
-        </w:rPr>
-        <w:t xml:space="preserve"> </w:t>
-      </w:r>
-      <w:proofErr w:type="spellStart"/>
-      <w:r>
-        <w:rPr>
-          <w:sz w:val="18"/>
-        </w:rPr>
-        <w:t>ve</w:t>
-      </w:r>
-      <w:proofErr w:type="spellEnd"/>
-      <w:r>
-        <w:rPr>
-          <w:sz w:val="18"/>
-        </w:rPr>
-        <w:t xml:space="preserve"> </w:t>
-      </w:r>
-      <w:proofErr w:type="spellStart"/>
-      <w:r>
-        <w:rPr>
-          <w:sz w:val="18"/>
-        </w:rPr>
-        <w:t>anonim</w:t>
-      </w:r>
-      <w:proofErr w:type="spellEnd"/>
-      <w:r>
-        <w:rPr>
-          <w:sz w:val="18"/>
-        </w:rPr>
-        <w:t xml:space="preserve"> </w:t>
-      </w:r>
-      <w:proofErr w:type="spellStart"/>
-      <w:r>
-        <w:rPr>
-          <w:sz w:val="18"/>
-        </w:rPr>
-        <w:t>müzik</w:t>
-      </w:r>
-      <w:proofErr w:type="spellEnd"/>
-      <w:r>
-        <w:rPr>
-          <w:sz w:val="18"/>
-        </w:rPr>
-        <w:t xml:space="preserve"> </w:t>
-      </w:r>
-      <w:proofErr w:type="spellStart"/>
-      <w:r>
-        <w:rPr>
-          <w:sz w:val="18"/>
-        </w:rPr>
-        <w:t>veri</w:t>
-      </w:r>
-      <w:proofErr w:type="spellEnd"/>
-      <w:r>
-        <w:rPr>
-          <w:sz w:val="18"/>
-        </w:rPr>
-        <w:t xml:space="preserve"> </w:t>
-      </w:r>
-      <w:proofErr w:type="spellStart"/>
-      <w:r>
-        <w:rPr>
-          <w:sz w:val="18"/>
-        </w:rPr>
-        <w:t>kümeleri</w:t>
-      </w:r>
-      <w:proofErr w:type="spellEnd"/>
-      <w:r>
-        <w:rPr>
-          <w:sz w:val="18"/>
-        </w:rPr>
-        <w:t xml:space="preserve"> </w:t>
-      </w:r>
-      <w:proofErr w:type="spellStart"/>
-      <w:r>
-        <w:rPr>
-          <w:sz w:val="18"/>
-        </w:rPr>
-        <w:t>kullanılmış</w:t>
-      </w:r>
-      <w:proofErr w:type="spellEnd"/>
-      <w:r>
-        <w:rPr>
-          <w:sz w:val="18"/>
-        </w:rPr>
-        <w:t xml:space="preserve"> </w:t>
-      </w:r>
-      <w:proofErr w:type="spellStart"/>
-      <w:r>
-        <w:rPr>
-          <w:sz w:val="18"/>
-        </w:rPr>
-        <w:t>olup</w:t>
-      </w:r>
-      <w:proofErr w:type="spellEnd"/>
-      <w:r>
-        <w:rPr>
-          <w:sz w:val="18"/>
-        </w:rPr>
-        <w:t xml:space="preserve"> </w:t>
-      </w:r>
-      <w:proofErr w:type="spellStart"/>
-      <w:r>
-        <w:rPr>
-          <w:sz w:val="18"/>
-        </w:rPr>
-        <w:t>insan</w:t>
-      </w:r>
-      <w:proofErr w:type="spellEnd"/>
-      <w:r>
-        <w:rPr>
-          <w:sz w:val="18"/>
-        </w:rPr>
-        <w:t xml:space="preserve"> </w:t>
-      </w:r>
-      <w:proofErr w:type="spellStart"/>
-      <w:r>
-        <w:rPr>
-          <w:sz w:val="18"/>
-        </w:rPr>
-        <w:t>katılımcılardan</w:t>
-      </w:r>
-      <w:proofErr w:type="spellEnd"/>
-      <w:r>
-        <w:rPr>
-          <w:sz w:val="18"/>
-        </w:rPr>
-        <w:t xml:space="preserve"> </w:t>
-      </w:r>
-      <w:proofErr w:type="spellStart"/>
-      <w:r>
-        <w:rPr>
-          <w:sz w:val="18"/>
-        </w:rPr>
-        <w:t>birincil</w:t>
-      </w:r>
-      <w:proofErr w:type="spellEnd"/>
-      <w:r>
-        <w:rPr>
-          <w:sz w:val="18"/>
-        </w:rPr>
-        <w:t xml:space="preserve"> </w:t>
-      </w:r>
-      <w:proofErr w:type="spellStart"/>
-      <w:r>
-        <w:rPr>
-          <w:sz w:val="18"/>
-        </w:rPr>
-        <w:t>veri</w:t>
-      </w:r>
-      <w:proofErr w:type="spellEnd"/>
-      <w:r>
-        <w:rPr>
-          <w:sz w:val="18"/>
-        </w:rPr>
-        <w:t xml:space="preserve"> </w:t>
-      </w:r>
-      <w:proofErr w:type="spellStart"/>
-      <w:r>
-        <w:rPr>
-          <w:sz w:val="18"/>
-        </w:rPr>
-        <w:t>toplanmamıştır</w:t>
-      </w:r>
-      <w:proofErr w:type="spellEnd"/>
-      <w:r>
-        <w:rPr>
-          <w:sz w:val="18"/>
-        </w:rPr>
-        <w:t xml:space="preserve">; </w:t>
-      </w:r>
-      <w:proofErr w:type="spellStart"/>
-      <w:r>
-        <w:rPr>
-          <w:sz w:val="18"/>
-        </w:rPr>
-        <w:t>bu</w:t>
-      </w:r>
-      <w:proofErr w:type="spellEnd"/>
-      <w:r>
-        <w:rPr>
-          <w:sz w:val="18"/>
-        </w:rPr>
-        <w:t xml:space="preserve"> </w:t>
-      </w:r>
-      <w:proofErr w:type="spellStart"/>
-      <w:r>
-        <w:rPr>
-          <w:sz w:val="18"/>
-        </w:rPr>
-        <w:t>nedenle</w:t>
-      </w:r>
-      <w:proofErr w:type="spellEnd"/>
-      <w:r>
-        <w:rPr>
-          <w:sz w:val="18"/>
-        </w:rPr>
-        <w:t xml:space="preserve"> </w:t>
-      </w:r>
-      <w:proofErr w:type="spellStart"/>
-      <w:r>
-        <w:rPr>
-          <w:sz w:val="18"/>
-        </w:rPr>
-        <w:t>etik</w:t>
-      </w:r>
-      <w:proofErr w:type="spellEnd"/>
-      <w:r>
-        <w:rPr>
-          <w:sz w:val="18"/>
-        </w:rPr>
-        <w:t xml:space="preserve"> </w:t>
-      </w:r>
-      <w:proofErr w:type="spellStart"/>
-      <w:r>
-        <w:rPr>
-          <w:sz w:val="18"/>
-        </w:rPr>
-        <w:t>kurul</w:t>
-      </w:r>
-      <w:proofErr w:type="spellEnd"/>
-      <w:r>
-        <w:rPr>
-          <w:sz w:val="18"/>
-        </w:rPr>
-        <w:t xml:space="preserve"> </w:t>
-      </w:r>
-      <w:proofErr w:type="spellStart"/>
-      <w:r>
-        <w:rPr>
-          <w:sz w:val="18"/>
-        </w:rPr>
-        <w:t>izni</w:t>
-      </w:r>
-      <w:proofErr w:type="spellEnd"/>
-      <w:r>
-        <w:rPr>
-          <w:sz w:val="18"/>
-        </w:rPr>
-        <w:t xml:space="preserve"> </w:t>
-      </w:r>
-      <w:proofErr w:type="spellStart"/>
-      <w:r>
-        <w:rPr>
-          <w:sz w:val="18"/>
-        </w:rPr>
-        <w:t>gerekmemektedir</w:t>
-      </w:r>
-      <w:proofErr w:type="spellEnd"/>
-      <w:r>
-        <w:rPr>
-          <w:sz w:val="18"/>
-        </w:rPr>
-        <w:t>.</w:t>
-      </w:r>
-      <w:r>
-        <w:rPr>
-          <w:sz w:val="18"/>
-        </w:rPr>
-        <w:tab/>
+        <w:t>Bu çalışamda</w:t>
       </w:r>
     </w:p>
     <w:p>
@@ -11279,7 +10491,6 @@
         <w:rPr>
           <w:sz w:val="18"/>
         </w:rPr>
-        <w:lastRenderedPageBreak/>
         <w:t>12. Martín-Doñas J.M., Álvarez A., The Vicomtech Audio Deepfake Detection System Based on Wav2vec2 for the 2022 ADD Challenge, Proceedings of the IEEE International Conference on Acoustics, Speech and Signal Processing (ICASSP 2022), 9266-9270, Singapur, 22-27 Mayıs, 2022.</w:t>
       </w:r>
     </w:p>
@@ -11292,6 +10503,7 @@
         <w:rPr>
           <w:sz w:val="18"/>
         </w:rPr>
+        <w:lastRenderedPageBreak/>
         <w:t>13. Baevski A., Zhou Y., Mohamed A., Auli M., wav2vec 2.0: A Framework for Self-Supervised Learning of Speech Representations, Adv Neural Inf Process Syst, 33, 12449-12460, 2020.</w:t>
       </w:r>
     </w:p>
@@ -11388,21 +10600,7 @@
         <w:rPr>
           <w:sz w:val="18"/>
         </w:rPr>
-        <w:t xml:space="preserve">21. Müller N., Czempin P., Diekmann F., Froghyar A., Böttinger K., Does Audio Deepfake Detection </w:t>
-      </w:r>
-      <w:proofErr w:type="gramStart"/>
-      <w:r>
-        <w:rPr>
-          <w:sz w:val="18"/>
-        </w:rPr>
-        <w:t>Generalize?,</w:t>
-      </w:r>
-      <w:proofErr w:type="gramEnd"/>
-      <w:r>
-        <w:rPr>
-          <w:sz w:val="18"/>
-        </w:rPr>
-        <w:t xml:space="preserve"> Proceedings of the 23rd Annual Conference of the International Speech Communication Association (INTERSPEECH 2022), 2783-2787, Incheon, Güney Kore, 18-22 Eylül, 2022.</w:t>
+        <w:t>21. Müller N., Czempin P., Diekmann F., Froghyar A., Böttinger K., Does Audio Deepfake Detection Generalize?, Proceedings of the 23rd Annual Conference of the International Speech Communication Association (INTERSPEECH 2022), 2783-2787, Incheon, Güney Kore, 18-22 Eylül, 2022.</w:t>
       </w:r>
     </w:p>
     <w:p>
@@ -11414,21 +10612,7 @@
         <w:rPr>
           <w:sz w:val="18"/>
         </w:rPr>
-        <w:t xml:space="preserve">22. Li Y., Sun Q., Li </w:t>
-      </w:r>
-      <w:proofErr w:type="gramStart"/>
-      <w:r>
-        <w:rPr>
-          <w:sz w:val="18"/>
-        </w:rPr>
-        <w:t>H., Specia L</w:t>
-      </w:r>
-      <w:proofErr w:type="gramEnd"/>
-      <w:r>
-        <w:rPr>
-          <w:sz w:val="18"/>
-        </w:rPr>
-        <w:t>., Schuller B.W., Explainable Detection of Machine Generated Music and Early Systematic Evaluation, Sci. Rep., 16, 13757, 2026.</w:t>
+        <w:t>22. Li Y., Sun Q., Li H., Specia L., Schuller B.W., Explainable Detection of Machine Generated Music and Early Systematic Evaluation, Sci. Rep., 16, 13757, 2026.</w:t>
       </w:r>
     </w:p>
     <w:p>
@@ -11556,21 +10740,7 @@
         <w:rPr>
           <w:sz w:val="18"/>
         </w:rPr>
-        <w:t xml:space="preserve">34. Rahman M.A., Hakim Z.I.A., Sarker N.H., Paul B., Fattah S.A., SONICS: Synthetic </w:t>
-      </w:r>
-      <w:proofErr w:type="gramStart"/>
-      <w:r>
-        <w:rPr>
-          <w:sz w:val="18"/>
-        </w:rPr>
-        <w:t>Or</w:t>
-      </w:r>
-      <w:proofErr w:type="gramEnd"/>
-      <w:r>
-        <w:rPr>
-          <w:sz w:val="18"/>
-        </w:rPr>
-        <w:t xml:space="preserve"> Not -- Identifying Counterfeit Songs, Proceedings of the International Conference on Learning Representations (ICLR 2025), Singapur, 24-28 Nisan, 2025.</w:t>
+        <w:t>34. Rahman M.A., Hakim Z.I.A., Sarker N.H., Paul B., Fattah S.A., SONICS: Synthetic Or Not -- Identifying Counterfeit Songs, Proceedings of the International Conference on Learning Representations (ICLR 2025), Singapur, 24-28 Nisan, 2025.</w:t>
       </w:r>
     </w:p>
     <w:p>
@@ -11586,23 +10756,23 @@
         <w:rPr>
           <w:sz w:val="18"/>
         </w:rPr>
+        <w:t>36. Guo Y., Huang H., Chen X., Zhao H., Wang Y., Audio Deepfake Detection with Self-Supervised WavLM and Multi-Fusion Attentive Classifier, Proceedings of the IEEE International Conference on Acoustics, Speech and Signal Processing (ICASSP 2024), 12702-12706, Seoul, Güney Kore, 14-19 Nisan, 2024.</w:t>
+      </w:r>
+    </w:p>
+    <w:p>
+      <w:r>
+        <w:rPr>
+          <w:sz w:val="18"/>
+        </w:rPr>
+        <w:t>37. McFee B. vd., librosa: Audio and Music Signal Analysis in Python, Proceedings of the 14th Python in Science Conference (SciPy 2015), 18-24, Austin, Texas, A.B.D., 6-12 Temmuz, 2015.</w:t>
+      </w:r>
+    </w:p>
+    <w:p>
+      <w:r>
+        <w:rPr>
+          <w:sz w:val="18"/>
+        </w:rPr>
         <w:lastRenderedPageBreak/>
-        <w:t>36. Guo Y., Huang H., Chen X., Zhao H., Wang Y., Audio Deepfake Detection with Self-Supervised WavLM and Multi-Fusion Attentive Classifier, Proceedings of the IEEE International Conference on Acoustics, Speech and Signal Processing (ICASSP 2024), 12702-12706, Seoul, Güney Kore, 14-19 Nisan, 2024.</w:t>
-      </w:r>
-    </w:p>
-    <w:p>
-      <w:r>
-        <w:rPr>
-          <w:sz w:val="18"/>
-        </w:rPr>
-        <w:t>37. McFee B. vd., librosa: Audio and Music Signal Analysis in Python, Proceedings of the 14th Python in Science Conference (SciPy 2015), 18-24, Austin, Texas, A.B.D., 6-12 Temmuz, 2015.</w:t>
-      </w:r>
-    </w:p>
-    <w:p>
-      <w:r>
-        <w:rPr>
-          <w:sz w:val="18"/>
-        </w:rPr>
         <w:t>38. Pedregosa F. vd., Scikit-learn: Machine Learning in Python, J. Mach. Learn. Res., 12, 2825-2830, 2011.</w:t>
       </w:r>
     </w:p>

</xml_diff>

<commit_message>
Update reference in AURIS document for accuracy and completeness
</commit_message>
<xml_diff>
--- a/docs/academic/paper/deliverables/AURIS_Makale_Metni.docx
+++ b/docs/academic/paper/deliverables/AURIS_Makale_Metni.docx
@@ -10357,9 +10357,11 @@
       </w:pPr>
       <w:r>
         <w:rPr>
-          <w:sz w:val="18"/>
-        </w:rPr>
-        <w:t>1. Copet J., Kreuk F., Gat I., Remez T., Kant D., Synnaeve G., Adi Y., Défossez A., Simple and Controllable Music Generation, Advances in Neural Information Processing Systems (NeurIPS 2023), Cilt 36, 4918-4981, New Orleans, Louisiana, A.B.D., 10-16 Aralık, 2023.</w:t>
+          <w:rFonts w:ascii="Times New Roman" w:hAnsi="Times New Roman"/>
+          <w:b w:val="0"/>
+          <w:sz w:val="18"/>
+        </w:rPr>
+        <w:t>1. Copet J., Kreuk F., Gat I., Remez T., Vyas D., Atal Y., Synnaeve G., Défossez A., Simple and Controllable Music Generation, Advances in Neural Information Processing Systems (NeurIPS 2023), Cilt 36, 2023.</w:t>
       </w:r>
     </w:p>
     <w:p>

</xml_diff>

<commit_message>
Add scripts to check and fix references in AURIS document
</commit_message>
<xml_diff>
--- a/docs/academic/paper/deliverables/AURIS_Makale_Metni.docx
+++ b/docs/academic/paper/deliverables/AURIS_Makale_Metni.docx
@@ -1497,13 +1497,8 @@
           <w:sz w:val="28"/>
         </w:rPr>
         <w:lastRenderedPageBreak/>
-        <w:t>AURIS: Çoklu-model topluluk yaklaşımı ile yapay zekâ tarafından üretilen müziklerin tespiti</w:t>
-      </w:r>
-    </w:p>
-    <w:p>
-      <w:pPr>
-        <w:spacing w:line="360" w:lineRule="auto"/>
-      </w:pPr>
+        <w:t>Yapay Zekâ Üretimli Müzik Tespitinde Topluluk Öğrenmesi: Heterojen Akustik Öznitelikler ve LightGBM Tabanlı Bir Yaklaşım</w:t>
+      </w:r>
     </w:p>
     <w:p>
       <w:pPr>
@@ -1604,6 +1599,24 @@
           <w:sz w:val="18"/>
         </w:rPr>
         <w:t xml:space="preserve"> bir veri kümesi üzerinde 5-katlı çapraz doğrulama ile değerlendirilmiştir. LightGBM, %95,48 ROC-AUC ve ±0,0023 standart sapma ile hem en yüksek ortalamayı hem de havuzdaki en düşük varyansı elde etmiştir. Spektral düzlük standart sapması öznitelik önem analizinde birinci sıraya yerleşmiştir. Youden J kriteri ile belirlenen θ* = 0,4316 karar eşiği varsayılan 0,5 değerine kıyasla dengeli doğruluğu iyileştirmiş; 0,083 Brier skoru olasılık çıktılarının iyi kalibre olduğunu ortaya koymuştur.</w:t>
+      </w:r>
+      <w:r>
+        <w:rPr>
+          <w:sz w:val="18"/>
+        </w:rPr>
+        <w:t xml:space="preserve"> Sonuçlar, derin öğrenme</w:t>
+      </w:r>
+      <w:r>
+        <w:rPr>
+          <w:sz w:val="18"/>
+        </w:rPr>
+        <w:t xml:space="preserve"> sistemlerini gerektirmeyen daha hafif bir sistemi Transformer tabanlı yaklaşımlar ile yakın performansta olabileceğini somut olarak göstermektedir. SHAP analizi ile spectral düzlük standard sapmasını belirleyici özellik olarak saptanmıştır </w:t>
+      </w:r>
+      <w:r>
+        <w:rPr>
+          <w:sz w:val="18"/>
+        </w:rPr>
+        <w:t xml:space="preserve"> Youden J ile optimize edilen karar eşiği ve 0,083 Brier skoru, sistemin dengeli ve iyi kalibre edildiğini kanıtlamaktadır. </w:t>
       </w:r>
     </w:p>
     <w:p>
@@ -1633,7 +1646,19 @@
         <w:rPr>
           <w:sz w:val="18"/>
         </w:rPr>
-        <w:t>Yapay zekâ tarafından üretilen müzik, derin öğrenme, gradyan artırma, topluluk öğrenmesi, spektral düzlük</w:t>
+        <w:t xml:space="preserve">Yapay zekâ tarafından üretilen müzik, derin öğrenme, </w:t>
+      </w:r>
+      <w:r>
+        <w:rPr>
+          <w:sz w:val="18"/>
+        </w:rPr>
+        <w:t>LightGBM </w:t>
+      </w:r>
+      <w:r>
+        <w:rPr>
+          <w:sz w:val="18"/>
+        </w:rPr>
+        <w:t>, topluluk öğrenmesi, spektral düzlük</w:t>
       </w:r>
     </w:p>
     <w:p>
@@ -1651,13 +1676,8 @@
           <w:b/>
           <w:sz w:val="28"/>
         </w:rPr>
-        <w:t>AURIS: A multi-model ensemble approach for the detection of AI-generated music</w:t>
-      </w:r>
-    </w:p>
-    <w:p>
-      <w:pPr>
-        <w:spacing w:line="360" w:lineRule="auto"/>
-      </w:pPr>
+        <w:t>Community Learning in the Detection of AI-Generated Music: A LightGBM-Based Approach Using Heterogeneous Acoustic Features</w:t>
+      </w:r>
     </w:p>
     <w:p>
       <w:pPr>
@@ -1726,7 +1746,14 @@
         <w:rPr>
           <w:sz w:val="18"/>
         </w:rPr>
-        <w:t>The proliferation of text-to-music generators such as Suno, Udio and MusicGen has raised a detection problem of practical importance for copyright attribution and streaming-platform integrity. This paper proposes AURIS, a system that couples a 47-dimensional handcrafted acoustic feature vector with an ensemble of eleven classifiers (seven machine learning and four deep learning architectures). The models are trained on 5,195 samples drawn from twelve AI generation systems and multiple human sources under 5-fold cross-validation. LightGBM achieves the top ROC-AUC of 0.9548 with ±0.0023 cross-fold standard deviation, combining the best mean with the lowest variance in the pool. Spectral-flatness standard deviation ranks first in feature importance. A Youden-J optimised threshold of θ* = 0.4316 improves balanced accuracy over the default 0.5 cutoff, and a Brier score of 0.083 confirms that the probability outputs are well calibrated.</w:t>
+        <w:t xml:space="preserve">The proliferation of text-to-music generators such as Suno, Udio and MusicGen has raised a detection problem of practical importance for copyright attribution and streaming-platform integrity. This paper proposes AURIS, a system that couples a 47-dimensional handcrafted acoustic feature vector with an ensemble of eleven classifiers (seven machine learning and four deep learning architectures). The models are trained on 5,195 samples drawn from twelve AI generation systems and multiple human sources under 5-fold cross-validation. LightGBM achieves the top ROC-AUC of 0.9548 with ±0.0023 cross-fold standard deviation, combining the best mean with the lowest variance in the pool. Spectral-flatness standard deviation ranks first in feature importance. </w:t>
+      </w:r>
+      <w:r>
+        <w:rPr>
+          <w:sz w:val="18"/>
+        </w:rPr>
+        <w:lastRenderedPageBreak/>
+        <w:t>A Youden-J optimised threshold of θ* = 0.4316 improves balanced accuracy over the default 0.5 cutoff, and a Brier score of 0.083 confirms that the probability outputs are well calibrated.</w:t>
       </w:r>
     </w:p>
     <w:p>
@@ -1865,7 +1892,19 @@
         <w:rPr>
           <w:sz w:val="18"/>
         </w:rPr>
-        <w:t>Bu çalışmada önerilen AURIS sistemi, tek bir temsile bağlı kalmak yerine spektral, zamansal, harmonik ve vokal davranışı özetleyen 47 boyutlu elle tasarlanmış bir öznitelik vektörünü kasıtlı biçimde heterojen on bir sınıflandırıcıdan oluşan bir topluluğa bağlamaktadır. Suno, Udio, MusicGen, AudioLDM2 ve dört başka üretici dahil sekiz GenAI kaynağından ve birden çok insan veri kümesinden (GTZAN, FMA Small, SleepyJesse kapakları) derlenen 5.195 örneklik veri kümesi üzerinde yedi makine öğrenmesi algoritması (Lojistik Regresyon, Rastgele Orman, Gradyan Artırma, SVM, ÇKA, XGBoost [7] ve LightGBM [8]) ile dört derin öğrenme mimarisi ortak bir protokol altında karşılaştırılmıştır. LightGBM %95,48 ROC-AUC ile en başarılı modeli oluşturmuş; SHAP [9] tabanlı yorumlanabilirlik analizi hangi akustik özelliklerin kararı yönlendirdiğini sayısal olarak ortaya koymuştur.</w:t>
+        <w:t xml:space="preserve">Bu çalışmada önerilen AURIS </w:t>
+      </w:r>
+      <w:r>
+        <w:rPr>
+          <w:sz w:val="18"/>
+        </w:rPr>
+        <w:t xml:space="preserve">adı verilen </w:t>
+      </w:r>
+      <w:r>
+        <w:rPr>
+          <w:sz w:val="18"/>
+        </w:rPr>
+        <w:t>sistemi, tek bir temsile bağlı kalmak yerine spektral, zamansal, harmonik ve vokal davranışı özetleyen 47 boyutlu elle tasarlanmış bir öznitelik vektörünü kasıtlı biçimde heterojen on bir sınıflandırıcıdan oluşan bir topluluğa bağlamaktadır. Suno, Udio, MusicGen, AudioLDM2 ve dört başka üretici dahil sekiz GenAI kaynağından ve birden çok insan veri kümesinden (GTZAN, FMA Small, SleepyJesse kapakları) derlenen 5.195 örneklik veri kümesi üzerinde yedi makine öğrenmesi algoritması (Lojistik Regresyon, Rastgele Orman, Gradyan Artırma, SVM, ÇKA, XGBoost [7] ve LightGBM [8]) ile dört derin öğrenme mimarisi ortak bir protokol altında karşılaştırılmıştır. LightGBM %95,48 ROC-AUC ile en başarılı modeli oluşturmuş; SHAP [9] tabanlı yorumlanabilirlik analizi hangi akustik özelliklerin kararı yönlendirdiğini sayısal olarak ortaya koymuştur.</w:t>
       </w:r>
     </w:p>
     <w:p>
@@ -1957,14 +1996,14 @@
         <w:rPr>
           <w:sz w:val="18"/>
         </w:rPr>
-        <w:t xml:space="preserve">Bu alandaki en doğrudan ilgili çalışmalar 2024-2026 yılları arasında yayımlanmıştır. Li vd. [22], makine tarafından üretilen müziğin tespitini yorumlanabilir akustik öznitelikler üzerinden ele alarak sistematik bir değerlendirme çerçevesi sunmuştur. Cros Vila vd. [33] farklı üretici sistemler karşısında tespit sistemlerinin sınırlarını ve kör noktalarını kapsamlı biçimde haritalandırmıştır. Afchar vd. [5], oto-kodlayıcı artefaktları üzerinde eğitilen sistemlerin %99,8 doğruluğa ulaşabildiğini; ancak basit ses manipülasyonları altında performansın belirgin biçimde düştüğünü göstermiştir. Zang vd. [6], şarkı sesi derin sahte tespiti için SingFake veri kümesini ve kıyaslama protokolünü sunmuştur. Rahman vd. tarafından geliştirilen SONICS [34], 97.000'den fazla şarkı içeren geniş ölçekli bir referans kıyaslama veri kümesi oluşturmaktadır. Comanducci vd. [35] tarafından </w:t>
+        <w:t xml:space="preserve">Bu alandaki en doğrudan ilgili çalışmalar 2024-2026 yılları arasında yayımlanmıştır. Li vd. [22], makine tarafından üretilen müziğin tespitini yorumlanabilir akustik öznitelikler üzerinden ele alarak sistematik bir değerlendirme çerçevesi sunmuştur. Cros Vila vd. [33] farklı üretici sistemler karşısında tespit sistemlerinin sınırlarını ve kör noktalarını kapsamlı biçimde haritalandırmıştır. Afchar vd. [5], oto-kodlayıcı artefaktları üzerinde eğitilen sistemlerin %99,8 doğruluğa ulaşabildiğini; ancak </w:t>
       </w:r>
       <w:r>
         <w:rPr>
           <w:sz w:val="18"/>
         </w:rPr>
         <w:lastRenderedPageBreak/>
-        <w:t>geliştirilen FakeMusicCaps, beş farklı metinden-müziğe modeli ile yeniden üretilmiş MusicCaps eşlemelerinden oluşmaktadır. Guo vd. [36], öz-denetimli WavLM ön eğitimini çok-füzyon dikkat sınıflandırıcısıyla birleştirerek ses sahte tespitinde güçlü sonuçlar elde etmiştir. Bu çalışmaların ortak bulgusu şu şekilde özetlenebilir: hiçbir tek mimari ailesi, hem üretici modeller arası genellemeyi hem de düşmanca güçlendirilmiş sinyallere karşı sağlamlığı tek başına sağlayamamaktadır.</w:t>
+        <w:t>basit ses manipülasyonları altında performansın belirgin biçimde düştüğünü göstermiştir. Zang vd. [6], şarkı sesi derin sahte tespiti için SingFake veri kümesini ve kıyaslama protokolünü sunmuştur. Rahman vd. tarafından geliştirilen SONICS [34], 97.000'den fazla şarkı içeren geniş ölçekli bir referans kıyaslama veri kümesi oluşturmaktadır. Comanducci vd. [35] tarafından geliştirilen FakeMusicCaps, beş farklı metinden-müziğe modeli ile yeniden üretilmiş MusicCaps eşlemelerinden oluşmaktadır. Guo vd. [36], öz-denetimli WavLM ön eğitimini çok-füzyon dikkat sınıflandırıcısıyla birleştirerek ses sahte tespitinde güçlü sonuçlar elde etmiştir. Bu çalışmaların ortak bulgusu şu şekilde özetlenebilir: hiçbir tek mimari ailesi, hem üretici modeller arası genellemeyi hem de düşmanca güçlendirilmiş sinyallere karşı sağlamlığı tek başına sağlayamamaktadır.</w:t>
       </w:r>
     </w:p>
     <w:p/>
@@ -2004,7 +2043,19 @@
         <w:rPr>
           <w:sz w:val="18"/>
         </w:rPr>
-        <w:t>AURIS sisteminin veri kümesi, öznitelik çıkarma süreci, sınıflandırma modelleri ve eğitim protokolü aşağıda sırasıyla aktarılmaktadır. Sistemin uçtan-uca işleyişine genel bir bakış Şekil 1'de sunulmuştur.</w:t>
+        <w:t xml:space="preserve">AURIS </w:t>
+      </w:r>
+      <w:r>
+        <w:rPr>
+          <w:sz w:val="18"/>
+        </w:rPr>
+        <w:t xml:space="preserve">adı verilen </w:t>
+      </w:r>
+      <w:r>
+        <w:rPr>
+          <w:sz w:val="18"/>
+        </w:rPr>
+        <w:t>sisteminin veri kümesi, öznitelik çıkarma süreci, sınıflandırma modelleri ve eğitim protokolü aşağıda sırasıyla aktarılmaktadır. Sistemin uçtan-uca işleyişine genel bir bakış Şekil 1'de sunulmuştur.</w:t>
       </w:r>
     </w:p>
     <w:p>
@@ -3126,12 +3177,22 @@
     <w:p>
       <w:pPr>
         <w:spacing w:line="360" w:lineRule="auto"/>
-      </w:pPr>
-      <w:r>
         <w:rPr>
           <w:b/>
           <w:sz w:val="20"/>
         </w:rPr>
+      </w:pPr>
+    </w:p>
+    <w:p>
+      <w:pPr>
+        <w:spacing w:line="360" w:lineRule="auto"/>
+      </w:pPr>
+      <w:r>
+        <w:rPr>
+          <w:b/>
+          <w:sz w:val="20"/>
+        </w:rPr>
+        <w:lastRenderedPageBreak/>
         <w:t>2.2. Öznitelik Çıkarma (Feature extraction)</w:t>
       </w:r>
     </w:p>
@@ -3149,7 +3210,6 @@
         <w:rPr>
           <w:sz w:val="18"/>
         </w:rPr>
-        <w:lastRenderedPageBreak/>
         <w:t>Her ses parçası 22.050 Hz örnekleme hızında yeniden örneklenmiş ve librosa [37] kütüphanesi kullanılarak 47 boyutlu bir öznitelik vektörüne dönüştürülmüştür. Öznitelikler beş işlevsel aileye ayrılmıştır: spektral (16 öznitelik — MFCC, mel-spektrogram, spectral centroid, bandwidth, rolloff, flatness ve bunların delta istatistikleri), zamansal (10 öznitelik — RMS enerjisi, sıfır geçiş hızı ve dinamik aralık türevleri), ritmik (9 öznitelik — tempo, beat sayısı ve onset gücü istatistikleri), harmonik (8 öznitelik — chroma vektörü ve harmonik-algısal ayrıştırma bileşenleri) ve vokal (4 öznitelik — temel frekans istatistikleri). Beş farklı modaliteyi kapsaması, herhangi bir akustik temsile karşı aşırı uyumu sınırlamayı amaçlayan tasarım kararının temelini oluşturmaktadır. İlk sekiz öznitelik için insan ve yapay zekâ örneklerinin dağılımları Şekil 2'de karşılaştırılmıştır.</w:t>
       </w:r>
     </w:p>
@@ -3525,6 +3585,7 @@
                 <w:bCs w:val="0"/>
                 <w:sz w:val="18"/>
               </w:rPr>
+              <w:lastRenderedPageBreak/>
               <w:t>Gradyan Artırma</w:t>
             </w:r>
           </w:p>
@@ -3587,7 +3648,6 @@
                 <w:bCs w:val="0"/>
                 <w:sz w:val="18"/>
               </w:rPr>
-              <w:lastRenderedPageBreak/>
               <w:t>SVM-RBF</w:t>
             </w:r>
           </w:p>
@@ -4134,7 +4194,7 @@
         <w:rPr>
           <w:sz w:val="18"/>
         </w:rPr>
-        <w:t>J(θ) = TPR(θ) − FPR(θ)                                                    (1)</w:t>
+        <w:t>J(θ) = TPR(θ) − FPR(θ)(1)</w:t>
       </w:r>
     </w:p>
     <w:p/>
@@ -4152,7 +4212,7 @@
         <w:rPr>
           <w:sz w:val="18"/>
         </w:rPr>
-        <w:t>BS = (1/N) Σᵢ (pᵢ − yᵢ)²                                                  (2)</w:t>
+        <w:t>BS = (1/N) Σᵢ (pᵢ − yᵢ)²(2)</w:t>
       </w:r>
     </w:p>
     <w:p/>
@@ -4406,6 +4466,7 @@
                 <w:b w:val="0"/>
                 <w:sz w:val="18"/>
               </w:rPr>
+              <w:lastRenderedPageBreak/>
               <w:t>1</w:t>
             </w:r>
           </w:p>
@@ -4667,7 +4728,6 @@
                 <w:b w:val="0"/>
                 <w:sz w:val="18"/>
               </w:rPr>
-              <w:lastRenderedPageBreak/>
               <w:t>3</w:t>
             </w:r>
           </w:p>
@@ -5892,7 +5952,31 @@
         <w:rPr>
           <w:sz w:val="18"/>
         </w:rPr>
-        <w:t>Şekil 3. On bir modelin performans karşılaştırmas</w:t>
+        <w:t xml:space="preserve">Şekil 3. </w:t>
+      </w:r>
+      <w:r>
+        <w:rPr>
+          <w:sz w:val="18"/>
+        </w:rPr>
+        <w:t xml:space="preserve">Tüm </w:t>
+      </w:r>
+      <w:r>
+        <w:rPr>
+          <w:sz w:val="18"/>
+        </w:rPr>
+        <w:t>model</w:t>
+      </w:r>
+      <w:r>
+        <w:rPr>
+          <w:sz w:val="18"/>
+        </w:rPr>
+        <w:t>lerin</w:t>
+      </w:r>
+      <w:r>
+        <w:rPr>
+          <w:sz w:val="18"/>
+        </w:rPr>
+        <w:t xml:space="preserve"> performans karşılaştırmas</w:t>
       </w:r>
       <w:r>
         <w:rPr>
@@ -5904,7 +5988,19 @@
         <w:rPr>
           <w:sz w:val="16"/>
         </w:rPr>
-        <w:t>(Performance comparison of the eleven models.)</w:t>
+        <w:t xml:space="preserve">(Performance comparison </w:t>
+      </w:r>
+      <w:r>
+        <w:rPr>
+          <w:sz w:val="16"/>
+        </w:rPr>
+        <w:t>of all models</w:t>
+      </w:r>
+      <w:r>
+        <w:rPr>
+          <w:sz w:val="16"/>
+        </w:rPr>
+        <w:t>.)</w:t>
       </w:r>
     </w:p>
     <w:p>
@@ -6598,7 +6694,31 @@
         <w:rPr>
           <w:sz w:val="18"/>
         </w:rPr>
-        <w:t xml:space="preserve">Şekil 4. Yedi makine öğrenmesi modelinin ROC </w:t>
+        <w:t xml:space="preserve">Şekil 4. </w:t>
+      </w:r>
+      <w:r>
+        <w:rPr>
+          <w:sz w:val="18"/>
+        </w:rPr>
+        <w:t>Makine</w:t>
+      </w:r>
+      <w:r>
+        <w:rPr>
+          <w:sz w:val="18"/>
+        </w:rPr>
+        <w:t xml:space="preserve"> öğrenmesi model</w:t>
+      </w:r>
+      <w:r>
+        <w:rPr>
+          <w:sz w:val="18"/>
+        </w:rPr>
+        <w:t>lerinin</w:t>
+      </w:r>
+      <w:r>
+        <w:rPr>
+          <w:sz w:val="18"/>
+        </w:rPr>
+        <w:t xml:space="preserve"> ROC </w:t>
       </w:r>
       <w:r>
         <w:rPr>
@@ -6702,13 +6822,31 @@
         <w:rPr>
           <w:sz w:val="18"/>
         </w:rPr>
-        <w:t xml:space="preserve">ailelerinin karşılaştırması. </w:t>
+        <w:t>modellerinin</w:t>
+      </w:r>
+      <w:r>
+        <w:rPr>
+          <w:sz w:val="18"/>
+        </w:rPr>
+        <w:t xml:space="preserve"> karşılaştırması. </w:t>
       </w:r>
       <w:r>
         <w:rPr>
           <w:sz w:val="16"/>
         </w:rPr>
-        <w:t>(Comparison of machine learning and deep learning families.)</w:t>
+        <w:t xml:space="preserve">(Comparison of machine learning and deep learning </w:t>
+      </w:r>
+      <w:r>
+        <w:rPr>
+          <w:sz w:val="16"/>
+        </w:rPr>
+        <w:t>models</w:t>
+      </w:r>
+      <w:r>
+        <w:rPr>
+          <w:sz w:val="16"/>
+        </w:rPr>
+        <w:t>.)</w:t>
       </w:r>
     </w:p>
     <w:p>
@@ -6786,12 +6924,41 @@
       <w:pPr>
         <w:spacing w:line="360" w:lineRule="auto"/>
         <w:jc w:val="center"/>
-      </w:pPr>
-      <w:r>
-        <w:rPr>
-          <w:sz w:val="18"/>
-        </w:rPr>
-        <w:t>Tablo 5. LightGBM'in ilk on özniteliği (Top ten features of LightGBM)</w:t>
+        <w:rPr>
+          <w:sz w:val="18"/>
+          <w:lang w:val="tr-TR"/>
+        </w:rPr>
+      </w:pPr>
+      <w:r>
+        <w:rPr>
+          <w:sz w:val="18"/>
+        </w:rPr>
+        <w:t>Tablo 5. LightGBM</w:t>
+      </w:r>
+      <w:r>
+        <w:rPr>
+          <w:sz w:val="18"/>
+        </w:rPr>
+        <w:t xml:space="preserve"> modeline ait ilk on öznitelik </w:t>
+      </w:r>
+      <w:r>
+        <w:rPr>
+          <w:sz w:val="18"/>
+        </w:rPr>
+        <w:t xml:space="preserve"> (</w:t>
+      </w:r>
+      <w:r>
+        <w:rPr>
+          <w:sz w:val="18"/>
+          <w:lang w:val="tr-TR"/>
+        </w:rPr>
+        <w:t>The top ten features of the LightGBM model</w:t>
+      </w:r>
+      <w:r>
+        <w:rPr>
+          <w:sz w:val="18"/>
+        </w:rPr>
+        <w:t>)</w:t>
       </w:r>
     </w:p>
     <w:tbl>
@@ -7532,7 +7699,31 @@
         <w:rPr>
           <w:sz w:val="18"/>
         </w:rPr>
-        <w:t>. İlk yirmi özniteliğin önem</w:t>
+        <w:t xml:space="preserve">. </w:t>
+      </w:r>
+      <w:r>
+        <w:rPr>
+          <w:sz w:val="18"/>
+        </w:rPr>
+        <w:t>LightGBM modeline ait</w:t>
+      </w:r>
+      <w:r>
+        <w:rPr>
+          <w:sz w:val="18"/>
+        </w:rPr>
+        <w:t xml:space="preserve"> öznitel</w:t>
+      </w:r>
+      <w:r>
+        <w:rPr>
+          <w:sz w:val="18"/>
+        </w:rPr>
+        <w:t>ik</w:t>
+      </w:r>
+      <w:r>
+        <w:rPr>
+          <w:sz w:val="18"/>
+        </w:rPr>
+        <w:t xml:space="preserve"> önem</w:t>
       </w:r>
       <w:r>
         <w:rPr>
@@ -7544,7 +7735,19 @@
         <w:rPr>
           <w:sz w:val="16"/>
         </w:rPr>
-        <w:t>(Top-twenty feature importance scores.)</w:t>
+        <w:t>(</w:t>
+      </w:r>
+      <w:r>
+        <w:rPr>
+          <w:sz w:val="16"/>
+        </w:rPr>
+        <w:t>Feature importance scores for the LightGBM model</w:t>
+      </w:r>
+      <w:r>
+        <w:rPr>
+          <w:sz w:val="16"/>
+        </w:rPr>
+        <w:t>.)</w:t>
       </w:r>
     </w:p>
     <w:p>
@@ -8262,7 +8465,31 @@
         <w:rPr>
           <w:sz w:val="18"/>
         </w:rPr>
-        <w:t>Tablo 7. Literatürle karşılaştırma (Comparison with literature)</w:t>
+        <w:t xml:space="preserve">Tablo </w:t>
+      </w:r>
+      <w:r>
+        <w:rPr>
+          <w:sz w:val="18"/>
+        </w:rPr>
+        <w:t>6</w:t>
+      </w:r>
+      <w:r>
+        <w:rPr>
+          <w:sz w:val="18"/>
+        </w:rPr>
+        <w:t xml:space="preserve">. </w:t>
+      </w:r>
+      <w:r>
+        <w:rPr>
+          <w:sz w:val="18"/>
+        </w:rPr>
+        <w:t>İlgili çalışmalarla karşılaştırma</w:t>
+      </w:r>
+      <w:r>
+        <w:rPr>
+          <w:sz w:val="18"/>
+        </w:rPr>
+        <w:t xml:space="preserve"> (Comparison with literature)</w:t>
       </w:r>
     </w:p>
     <w:tbl>
@@ -8970,21 +9197,79 @@
         </w:tc>
       </w:tr>
     </w:tbl>
-    <w:p>
-      <w:r>
-        <w:rPr>
-          <w:i/>
-          <w:sz w:val="16"/>
-        </w:rPr>
-        <w:t>— : Kaynak yayında rapor edilmemiştir.</w:t>
-      </w:r>
-    </w:p>
-    <w:p>
-      <w:r>
-        <w:rPr>
-          <w:sz w:val="18"/>
-        </w:rPr>
-        <w:t>Tablo 7, AURIS'in doğrudan ilgili yayımlanmış çalışmalarla sayısal karşılaştırmasını sunmaktadır. ROC-AUC açısından AURIS (0,9548), Transformer tabanlı SONICS [34] (0,960) ile Li vd. [22] (0,931) arasına konumlanmaktadır. Öte yandan AURIS, yalnızca elle tasarlanmış akustik öznitelikler kullanmasına karşın SONICS'e yakın AUC elde etmekte ve ±0,0023 standart sapması ile katlar arası en düşük varyansı korumaktadır. Bu karşılaştırma, derin öğrenme altyapısı gerektirmeyen hafif bir sistemin ne ölçüde rekabetçi kalabileceğini somut olarak göstermektedir.</w:t>
+    <w:p/>
+    <w:p>
+      <w:r>
+        <w:rPr>
+          <w:sz w:val="18"/>
+        </w:rPr>
+        <w:t xml:space="preserve">Tablo </w:t>
+      </w:r>
+      <w:r>
+        <w:rPr>
+          <w:sz w:val="18"/>
+        </w:rPr>
+        <w:t>6</w:t>
+      </w:r>
+      <w:r>
+        <w:rPr>
+          <w:sz w:val="18"/>
+        </w:rPr>
+        <w:t>, AURIS</w:t>
+      </w:r>
+      <w:r>
+        <w:rPr>
+          <w:sz w:val="18"/>
+        </w:rPr>
+        <w:t xml:space="preserve"> adlı sistemin</w:t>
+      </w:r>
+      <w:r>
+        <w:rPr>
+          <w:sz w:val="18"/>
+        </w:rPr>
+        <w:t xml:space="preserve"> doğrudan ilgili yayımlanmış çalışmalarla sayısal karşılaştırmasını sunmaktadır. ROC-AUC açısından AURIS</w:t>
+      </w:r>
+      <w:r>
+        <w:rPr>
+          <w:sz w:val="18"/>
+        </w:rPr>
+        <w:t xml:space="preserve"> </w:t>
+      </w:r>
+      <w:r>
+        <w:rPr>
+          <w:sz w:val="18"/>
+        </w:rPr>
+        <w:t>(0,9548)</w:t>
+      </w:r>
+      <w:r>
+        <w:rPr>
+          <w:sz w:val="18"/>
+        </w:rPr>
+        <w:t xml:space="preserve"> </w:t>
+      </w:r>
+      <w:r>
+        <w:rPr>
+          <w:sz w:val="18"/>
+        </w:rPr>
+        <w:t>adlı sistem</w:t>
+      </w:r>
+      <w:r>
+        <w:rPr>
+          <w:sz w:val="18"/>
+        </w:rPr>
+        <w:t>, Transformer tabanlı SONICS [34] (0,960) ile Li vd. [22] (0,931) arasına konumlanmaktadır. Öte yandan AURIS</w:t>
+      </w:r>
+      <w:r>
+        <w:rPr>
+          <w:sz w:val="18"/>
+        </w:rPr>
+        <w:t xml:space="preserve"> adlı sistem</w:t>
+      </w:r>
+      <w:r>
+        <w:rPr>
+          <w:sz w:val="18"/>
+        </w:rPr>
+        <w:t>, yalnızca elle tasarlanmış akustik öznitelikler kullanmasına karşın SONICS'e yakın AUC elde etmekte ve ±0,0023 standart sapması ile katlar arası en düşük varyansı korumaktadır. Bu karşılaştırma, derin öğrenme altyapısı gerektirmeyen hafif bir sistemin ne ölçüde rekabetçi kalabileceğini somut olarak göstermektedir.</w:t>
       </w:r>
     </w:p>
     <w:p>
@@ -8996,7 +9281,19 @@
         <w:rPr>
           <w:sz w:val="18"/>
         </w:rPr>
-        <w:t>Spectral_flatness_std'nin baskın konumu, yapay zekâ üretim sistemlerinin algısal kalite ölçütlerini optimize ederken insan kayıtlarına kıyasla daha düz ve gürültüsüz bir spektrum bırakmasından kaynaklanmaktadır [16]. Bu gözlem, derin sahte sesler için de benzer biçimde raporlanmıştır; dolayısıyla AURIS'in öznitelik seçimi alana özgü bağımsız bulgularla örtüşmektedir. 1B-ESA'nın diğerlerine göre belirgin biçimde düşük kalması ayrı bir bulgu sunmaktadır: sıralanmamış 47 boyutlu bir öznitelik vektörü üzerinde tek boyutlu evrişim anlamlı bir öteleme değişmezliği öğrenememekte, bu da mimari ile veri biçimi arasındaki uyumsuzluğu gözler önüne sermektedir.</w:t>
+        <w:t>Spectral_flatness_std'nin baskın konumu, yapay zekâ üretim sistemlerinin algısal kalite ölçütlerini optimize ederken insan kayıtlarına kıyasla daha düz ve gürültüsüz bir spektrum bırakmasından kaynaklanmaktadır [16]. Bu gözlem, derin sahte sesler için de benzer biçimde raporlanmıştır; dolayısıyla AURIS</w:t>
+      </w:r>
+      <w:r>
+        <w:rPr>
+          <w:sz w:val="18"/>
+        </w:rPr>
+        <w:t xml:space="preserve"> adlı sistemin</w:t>
+      </w:r>
+      <w:r>
+        <w:rPr>
+          <w:sz w:val="18"/>
+        </w:rPr>
+        <w:t xml:space="preserve"> öznitelik seçimi alana özgü bağımsız bulgularla örtüşmektedir. 1B-ESA'nın diğerlerine göre belirgin biçimde düşük kalması ayrı bir bulgu sunmaktadır: sıralanmamış 47 boyutlu bir öznitelik vektörü üzerinde tek boyutlu evrişim anlamlı bir öteleme değişmezliği öğrenememekte, bu da mimari ile veri biçimi arasındaki uyumsuzluğu gözler önüne sermektedir.</w:t>
       </w:r>
     </w:p>
     <w:p>
@@ -9013,12 +9310,21 @@
         <w:rPr>
           <w:sz w:val="18"/>
         </w:rPr>
-        <w:t>Aşırı öğrenme tanılayıcı analizi (Şekil 14), ağaç tabanlı modellerin tamamında eğitim ile çapraz doğrulama doğruluğu arasında 8–14 puanlık tutarlı bir açık ortaya çıkarmıştır. Rastgele Orman bu açığın en uç örneğini sunmaktadır: eğitim doğruluğu %100'e ulaşırken çapraz doğrulama altında %86,1'e gerilemektedir. Lojistik Regresyon ise 0,6 puanlık farkla modeller arasında en dengeli eğitim davranışını sergilemiştir; ancak bu denge, düşük model kapasitesinin doğal bir yansımasıdır.</w:t>
-      </w:r>
-    </w:p>
-    <w:p>
-      <w:pPr>
-        <w:spacing w:line="360" w:lineRule="auto"/>
+        <w:t>Overfitting</w:t>
+      </w:r>
+      <w:r>
+        <w:rPr>
+          <w:sz w:val="18"/>
+        </w:rPr>
+        <w:t xml:space="preserve"> tanılayıcı analizi (Şekil 14), ağaç tabanlı modellerin tamamında eğitim ile çapraz doğrulama doğruluğu arasında 8–14 puanlık tutarlı bir açık ortaya çıkarmıştır. Rastgele Orman bu açığın en uç örneğini sunmaktadır: eğitim doğruluğu %100'e ulaşırken çapraz doğrulama altında %86,1'e gerilemektedir. Lojistik Regresyon ise 0,6 puanlık farkla modeller arasında en dengeli eğitim davranışını sergilemiştir; ancak bu denge, düşük model kapasitesinin doğal bir yansımasıdır.</w:t>
+      </w:r>
+    </w:p>
+    <w:p>
+      <w:pPr>
+        <w:spacing w:line="360" w:lineRule="auto"/>
+        <w:rPr>
+          <w:caps/>
+        </w:rPr>
       </w:pPr>
     </w:p>
     <w:p>
@@ -9123,14 +9429,8 @@
         <w:rPr>
           <w:sz w:val="18"/>
         </w:rPr>
-        <w:t xml:space="preserve">Öznitelik korelasyon analizi, 47 öznitelikten yirmisinin |Pearson r| &gt; 0,85 eşiğini aşan çiftler oluşturduğunu saptamıştır (Şekil 15). Tasarım gereği kabul edilen bu fazlalık, farklı akustik boyutlar arasındaki bilgi akışını artırmak için bilinçli tercih edilmiştir. </w:t>
-      </w:r>
-      <w:r>
-        <w:rPr>
-          <w:sz w:val="18"/>
-        </w:rPr>
         <w:lastRenderedPageBreak/>
-        <w:t>Öte yandan öznitelik çıkarma deneyi (Şekil 16), N = 30'da doğruluğun platoya ulaştığını göstermekte; sondaki 17 özniteliğin performansa ölçülebilir bir katkısı bulunmamaktadır. Bu iki bulgu birlikte değerlendirildiğinde, gelecekteki bir yinelemenin 47 yerine yaklaşık 30 öznitelikle benzer doğrulukta çalışabileceği anlaşılmaktadır.</w:t>
+        <w:t>Öznitelik korelasyon analizi, 47 öznitelikten yirmisinin |Pearson r| &gt; 0,85 eşiğini aşan çiftler oluşturduğunu saptamıştır (Şekil 15). Tasarım gereği kabul edilen bu fazlalık, farklı akustik boyutlar arasındaki bilgi akışını artırmak için bilinçli tercih edilmiştir. Öte yandan öznitelik çıkarma deneyi (Şekil 16), N = 30'da doğruluğun platoya ulaştığını göstermekte; sondaki 17 özniteliğin performansa ölçülebilir bir katkısı bulunmamaktadır. Bu iki bulgu birlikte değerlendirildiğinde, gelecekteki bir yinelemenin 47 yerine yaklaşık 30 öznitelikle benzer doğrulukta çalışabileceği anlaşılmaktadır.</w:t>
       </w:r>
     </w:p>
     <w:p>
@@ -9371,7 +9671,19 @@
         <w:rPr>
           <w:sz w:val="18"/>
         </w:rPr>
-        <w:t>Makale metninde, eşitliklerde ve tanılayıcı analizlerde kullanılan simgeler alfabetik sırayla Tablo 6'da listelenmiştir.</w:t>
+        <w:t xml:space="preserve">Makale metninde, eşitliklerde ve tanılayıcı analizlerde kullanılan simgeler alfabetik sırayla Tablo </w:t>
+      </w:r>
+      <w:r>
+        <w:rPr>
+          <w:sz w:val="18"/>
+        </w:rPr>
+        <w:t>7</w:t>
+      </w:r>
+      <w:r>
+        <w:rPr>
+          <w:sz w:val="18"/>
+        </w:rPr>
+        <w:t>'da listelenmiştir.</w:t>
       </w:r>
     </w:p>
     <w:p>
@@ -9383,7 +9695,19 @@
         <w:rPr>
           <w:sz w:val="18"/>
         </w:rPr>
-        <w:t>Tablo 6. Simge Açıklama Tablosu (Symbol Description Table)</w:t>
+        <w:t xml:space="preserve">Tablo </w:t>
+      </w:r>
+      <w:r>
+        <w:rPr>
+          <w:sz w:val="18"/>
+        </w:rPr>
+        <w:t>7</w:t>
+      </w:r>
+      <w:r>
+        <w:rPr>
+          <w:sz w:val="18"/>
+        </w:rPr>
+        <w:t>. Simge Açıklama Tablosu (Symbol Description Table)</w:t>
       </w:r>
     </w:p>
     <w:tbl>
@@ -10318,7 +10642,13 @@
         <w:rPr>
           <w:sz w:val="18"/>
         </w:rPr>
-        <w:t>Bu çalışamda</w:t>
+        <w:t>Bu çalış</w:t>
+      </w:r>
+      <w:r>
+        <w:rPr>
+          <w:sz w:val="18"/>
+        </w:rPr>
+        <w:t>mada kullanılan veriler anonim ve herkese açık şekilde paylaşılan veriler alınmış olup insan katılımcılardan birincil veri toplanmamıştır. Bu nedenle etik kurul izni gerekmemektedir.</w:t>
       </w:r>
     </w:p>
     <w:p>
@@ -10357,11 +10687,9 @@
       </w:pPr>
       <w:r>
         <w:rPr>
-          <w:rFonts w:ascii="Times New Roman" w:hAnsi="Times New Roman"/>
-          <w:b w:val="0"/>
-          <w:sz w:val="18"/>
-        </w:rPr>
-        <w:t>1. Copet J., Kreuk F., Gat I., Remez T., Vyas D., Atal Y., Synnaeve G., Défossez A., Simple and Controllable Music Generation, Advances in Neural Information Processing Systems (NeurIPS 2023), Cilt 36, 2023.</w:t>
+          <w:sz w:val="18"/>
+        </w:rPr>
+        <w:t>1. Copet J., Kreuk F., Gat I., Remez T., Vyas D., Atal Y., Synnaeve G., Défossez A., Simple and Controllable Music Generation, Adv Neural Inf Process Syst, 36, 47704-47720, 2023.</w:t>
       </w:r>
     </w:p>
     <w:p>
@@ -10373,7 +10701,7 @@
         <w:rPr>
           <w:sz w:val="18"/>
         </w:rPr>
-        <w:t>2. Liu H., Chen Z., Yuan Y., Mei X., Liu X., Mandic D., Wang W., Plumbley M.D., AudioLDM: Text-to-Audio Generation with Latent Diffusion Models, Proceedings of the 40th International Conference on Machine Learning (ICML 2023), 21450-21474, Honolulu, Hawaii, A.B.D., 23-29 Temmuz, 2023.</w:t>
+        <w:t>2. Liu H., Chen Z., Yuan Y., Mei X., Liu X., Mandic D., Wang W., Plumbley M.D., AudioLDM: Text-to-Audio Generation with Latent Diffusion Models, Proceedings of the 40th International Conference on Machine Learning (ICML 2023), Honolulu, Hawaii, A.B.D., 21450-21474, 23-29 Temmuz, 2023.</w:t>
       </w:r>
     </w:p>
     <w:p>
@@ -10409,7 +10737,7 @@
         <w:rPr>
           <w:sz w:val="18"/>
         </w:rPr>
-        <w:t>5. Afchar D., Meseguer Brocal G., Hennequin R., AI-Generated Music Detection and Its Challenges, Proceedings of the IEEE International Conference on Acoustics, Speech and Signal Processing (ICASSP 2025), Hyderabad, Hindistan, 6-11 Nisan, 2025.</w:t>
+        <w:t>5. Afchar D., Meseguer Brocal G., Hennequin R., AI-Generated Music Detection and Its Challenges, Proceedings of the IEEE International Conference on Acoustics, Speech and Signal Processing (ICASSP 2025), 1-5, Hyderabad, Hindistan, 6-11 Nisan, 2025.</w:t>
       </w:r>
     </w:p>
     <w:p>
@@ -10493,7 +10821,7 @@
         <w:rPr>
           <w:sz w:val="18"/>
         </w:rPr>
-        <w:t>12. Martín-Doñas J.M., Álvarez A., The Vicomtech Audio Deepfake Detection System Based on Wav2vec2 for the 2022 ADD Challenge, Proceedings of the IEEE International Conference on Acoustics, Speech and Signal Processing (ICASSP 2022), 9266-9270, Singapur, 22-27 Mayıs, 2022.</w:t>
+        <w:t>12. Martín-Doñas J.M., Álvarez A., The Vicomtech Audio Deepfake Detection System Based on Wav2vec2 for the 2022 ADD Challenge, Proceedings of the IEEE International Conference on Acoustics, Speech and Signal Processing (ICASSP 2022), 9241-9245, Singapur, 22-27 Mayıs, 2022.</w:t>
       </w:r>
     </w:p>
     <w:p>
@@ -10650,7 +10978,7 @@
         <w:rPr>
           <w:sz w:val="18"/>
         </w:rPr>
-        <w:t>25. Wu Y. vd., Large-Scale Contrastive Language-Audio Pretraining with Feature Fusion and Keyword-to-Caption Augmentation, Proceedings of the IEEE International Conference on Acoustics, Speech and Signal Processing (ICASSP 2023), 1-5, Rhodes, Yunanistan, 4-10 Haziran, 2023.</w:t>
+        <w:t>25. Wu Y., Chen K., Zhang T., Hui Y., Berg-Kirkpatrick T., Dubnov S., Large-Scale Contrastive Language-Audio Pretraining with Feature Fusion and Keyword-to-Caption Augmentation, Proceedings of the IEEE International Conference on Acoustics, Speech and Signal Processing (ICASSP 2023), 1-5, Rhodes, Yunanistan, 4-10 Haziran, 2023.</w:t>
       </w:r>
     </w:p>
     <w:p>

</xml_diff>

<commit_message>
Update references in AURIS document and add scripts for verification and correction
</commit_message>
<xml_diff>
--- a/docs/academic/paper/deliverables/AURIS_Makale_Metni.docx
+++ b/docs/academic/paper/deliverables/AURIS_Makale_Metni.docx
@@ -11024,9 +11024,11 @@
       </w:pPr>
       <w:r>
         <w:rPr>
-          <w:sz w:val="18"/>
-        </w:rPr>
-        <w:t>29. Özbalcı M.C., Şahin H., Bilgin T.T., Classification of Music Genres of GTZAN Dataset with Machine Learning Methods, Mühendislik Bilimleri ve Araştırmaları Dergisi (J. Eng. Sci. Res.), 6 (1), 2024.</w:t>
+          <w:rFonts w:ascii="Times New Roman" w:hAnsi="Times New Roman"/>
+          <w:b w:val="0"/>
+          <w:sz w:val="18"/>
+        </w:rPr>
+        <w:t>29. Özbalcı M.C., Şahin H., Bilgin T.T., Classification of Music Genres of GTZAN Dataset with Machine Learning Methods, Mühendislik Bilimleri ve Araştırmaları Dergisi (J. Eng. Sci. Res.), 6 (1), 77-87, 2024.</w:t>
       </w:r>
     </w:p>
     <w:p>

</xml_diff>